<commit_message>
Add Nadia stage-25 prompt tokenization contract
</commit_message>
<xml_diff>
--- a/docs/latticra-system-substrate/the-latticra-system-substrate.docx
+++ b/docs/latticra-system-substrate/the-latticra-system-substrate.docx
@@ -105,7 +105,7 @@
           <w:color w:val="475569"/>
           <w:sz w:val="20"/>
         </w:rPr>
-        <w:t>Working Draft 0.1 - 2026-05-24</w:t>
+        <w:t>Working Draft 0.2 - 2026-05-25</w:t>
       </w:r>
     </w:p>
     <w:p>
@@ -158,6 +158,30 @@
           <w:rFonts w:ascii="Liberation Serif" w:hAnsi="Liberation Serif"/>
         </w:rPr>
         <w:t>Source posture: the source material available for this edition included the uploaded Seal handbook and recent project evidence around the Latticra Panel installer, guarded user-local installation, receipts, component markers, Fedora validation traces, and a one-pass field-engine browser artifact. Where the broader project is not fully specified by those materials, this book defines a conservative model rather than asserting unverified implementation details.</w:t>
+      </w:r>
+    </w:p>
+    <w:p>
+      <w:pPr>
+        <w:pStyle w:val="Heading2"/>
+      </w:pPr>
+      <w:r>
+        <w:t>Living handbook cadence</w:t>
+      </w:r>
+    </w:p>
+    <w:p>
+      <w:pPr>
+        <w:pStyle w:val="BodyTight"/>
+      </w:pPr>
+      <w:r>
+        <w:t>This edition is a working artifact. As repository notes, status records, validation lanes, command contracts, and capability boundaries change, the durable changes should be folded back into this handbook instead of living only in scattered logs.</w:t>
+      </w:r>
+    </w:p>
+    <w:p>
+      <w:pPr>
+        <w:pStyle w:val="BodyTight"/>
+      </w:pPr>
+      <w:r>
+        <w:t>The update rule is evidence-bound: record what is implemented, tested, measured, planned, or explicitly out of scope, and keep future runtime, enforcement, host-protection, packaging, and production claims behind reproducible evidence.</w:t>
       </w:r>
     </w:p>
     <w:p>
@@ -7397,7 +7421,7 @@
         <w:rPr>
           <w:rFonts w:ascii="Liberation Serif" w:hAnsi="Liberation Serif"/>
         </w:rPr>
-        <w:t>The available evidence names Lat tooling and LIR contracts as installed components. This edition treats them as contract surfaces until fuller language or IR specifications are available.</w:t>
+        <w:t>The Lat and LIR lanes have moved from placeholder component names into a bounded, no-effect contract pipeline: grammar parsing, semantic validation, model normalization, model-aware lowering, and deterministic report/diagnostic surfaces.</w:t>
       </w:r>
     </w:p>
     <w:p>
@@ -7408,7 +7432,7 @@
         <w:rPr>
           <w:rFonts w:ascii="Liberation Serif" w:hAnsi="Liberation Serif"/>
         </w:rPr>
-        <w:t>A project book should include Lat and LIR, but it should not invent semantics that the available documents do not prove. The disciplined phrasing is: Lat tooling and LIR contracts appear as Latticra component lanes, installed alongside Seal, docs/examples, and developer CLI helpers. Their project role should be formalized through interface contracts, examples, and validation tests.</w:t>
+        <w:t>A project book should include Lat and LIR without inventing execution semantics. The current disciplined phrasing is: Lat is the contract/declaration lane; LIR is the intermediate representation lane; both are presently evidence and metadata surfaces. They preserve source spans, no-effect flags, declaration and clause metadata, and denial posture so that future runtime work has typed witnesses before it has authority.</w:t>
       </w:r>
     </w:p>
     <w:p>
@@ -7431,6 +7455,62 @@
           <w:rFonts w:ascii="Liberation Serif" w:hAnsi="Liberation Serif"/>
         </w:rPr>
         <w:t>The most useful way to present Lat and LIR today is as names for a language/tooling lane and an intermediate-representation or contract lane. A future edition can replace this conservative explanation with a full specification. For now, the important architectural claim is that they should obey the same Latticra substrate rules as Seal and the installer: declare effects, emit evidence, fail closed on unsupported authority, and keep public claims tied to tests.</w:t>
+      </w:r>
+    </w:p>
+    <w:p>
+      <w:pPr>
+        <w:pStyle w:val="Heading2"/>
+      </w:pPr>
+      <w:r>
+        <w:t>7.2 Current no-effect pipeline</w:t>
+      </w:r>
+    </w:p>
+    <w:p>
+      <w:pPr>
+        <w:pStyle w:val="BodyTight"/>
+      </w:pPr>
+      <w:r>
+        <w:t>As of the May 25 notes, the Lat path is parser -&gt; semantic validation -&gt; normalized model -&gt; model-aware Lat-to-LIR lowering -&gt; pipeline and diagnostic reports. This gives the project a stronger internal story than a raw parser: declarations, clauses, transition sources, operators, and first-item report metadata can be inspected without evaluating the language.</w:t>
+      </w:r>
+    </w:p>
+    <w:p>
+      <w:pPr>
+        <w:pStyle w:val="ListBullet"/>
+      </w:pPr>
+      <w:r>
+        <w:t>Grammar and semantic layers bound the source shape and reject unsupported states before downstream metadata is trusted.</w:t>
+      </w:r>
+    </w:p>
+    <w:p>
+      <w:pPr>
+        <w:pStyle w:val="ListBullet"/>
+      </w:pPr>
+      <w:r>
+        <w:t>Model normalization builds typed declaration and clause tables for states, policies, transitions, assertions, and effect declarations.</w:t>
+      </w:r>
+    </w:p>
+    <w:p>
+      <w:pPr>
+        <w:pStyle w:val="ListBullet"/>
+      </w:pPr>
+      <w:r>
+        <w:t>Lat-to-LIR lowering consumes the normalized model, emits a lat_module LIR shape, and preserves source-span, no-effect, and authority-denial metadata.</w:t>
+      </w:r>
+    </w:p>
+    <w:p>
+      <w:pPr>
+        <w:pStyle w:val="ListBullet"/>
+      </w:pPr>
+      <w:r>
+        <w:t>Pipeline and diagnostic reports copy first declaration, first clause, lowering, and error-class metadata for deterministic audit visibility.</w:t>
+      </w:r>
+    </w:p>
+    <w:p>
+      <w:pPr>
+        <w:pStyle w:val="BodyTight"/>
+      </w:pPr>
+      <w:r>
+        <w:t>The boundary is still explicit: this pipeline does not execute Lat, execute LIR, evaluate operators, mutate state, perform file or network I/O, call recovery behavior, touch hardware, or grant runtime authority.</w:t>
       </w:r>
     </w:p>
     <w:tbl>
@@ -7780,7 +7860,7 @@
         <w:rPr>
           <w:rFonts w:ascii="Liberation Serif" w:hAnsi="Liberation Serif"/>
         </w:rPr>
-        <w:t>7.2 Suggested formal shape</w:t>
+        <w:t>7.3 Suggested formal shape</w:t>
       </w:r>
     </w:p>
     <w:p>
@@ -16950,7 +17030,7 @@
         <w:rPr>
           <w:rFonts w:ascii="Liberation Serif" w:hAnsi="Liberation Serif"/>
         </w:rPr>
-        <w:t>This edition was derived from the uploaded Latticra Seal handbook and broadened with recent File Library material containing Panel installer notes, dry-run and local-prefix install transcripts, receipt and component-marker evidence, Fedora validation snippets, and the one-pass field-engine browser artifact. The expansion is conservative: it treats the broader project as a substrate architecture and does not claim production security readiness, runtime enforcement, network authority, root authority, kernel integration, SELinux integration, systemd enforcement, or Fedora approval.</w:t>
+        <w:t>This edition was derived from the uploaded Latticra Seal handbook and broadened with recent repository material containing Panel installer notes, dry-run and local-prefix install transcripts, receipt and component-marker evidence, Fedora validation snippets, the one-pass field-engine browser artifact, and May 25 Lat/LIR no-effect implementation records. The expansion is conservative: it treats the broader project as a substrate architecture and does not claim production security readiness, runtime enforcement, network authority, root authority, kernel integration, SELinux integration, systemd enforcement, or Fedora approval.</w:t>
       </w:r>
     </w:p>
     <w:tbl>

</xml_diff>

<commit_message>
Refactor core flows and UI state handling
</commit_message>
<xml_diff>
--- a/docs/latticra-system-substrate/the-latticra-system-substrate.docx
+++ b/docs/latticra-system-substrate/the-latticra-system-substrate.docx
@@ -105,7 +105,7 @@
           <w:color w:val="475569"/>
           <w:sz w:val="20"/>
         </w:rPr>
-        <w:t>Working Draft 0.2 - 2026-05-25</w:t>
+        <w:t>Working Draft 0.3 - 2026-05-25</w:t>
       </w:r>
     </w:p>
     <w:p>
@@ -157,7 +157,7 @@
         <w:rPr>
           <w:rFonts w:ascii="Liberation Serif" w:hAnsi="Liberation Serif"/>
         </w:rPr>
-        <w:t>Source posture: the source material available for this edition included the uploaded Seal handbook and recent project evidence around the Latticra Panel installer, guarded user-local installation, receipts, component markers, Fedora validation traces, and a one-pass field-engine browser artifact. Where the broader project is not fully specified by those materials, this book defines a conservative model rather than asserting unverified implementation details.</w:t>
+        <w:t>Source posture: the source material available for this edition included the uploaded Seal handbook and recent project evidence around the Latticra Panel installer, guarded user-local installation, receipts, component markers, Fedora validation traces, a one-pass field-engine browser artifact, Lat/LIR implementation records, defensive threat-model validation, runtime-boundary policy expansion, and abuse-case fixtures. Where the broader project is not fully specified by those materials, this book defines a conservative model rather than asserting unverified implementation details.</w:t>
       </w:r>
     </w:p>
     <w:p>
@@ -1393,19 +1393,6 @@
         </w:tc>
       </w:tr>
     </w:tbl>
-    <w:p>
-      <w:pPr>
-        <w:pStyle w:val="BodyTight"/>
-      </w:pPr>
-    </w:p>
-    <w:p>
-      <w:r>
-        <w:rPr>
-          <w:rFonts w:ascii="Liberation Serif" w:hAnsi="Liberation Serif"/>
-        </w:rPr>
-        <w:br w:type="page"/>
-      </w:r>
-    </w:p>
     <w:p>
       <w:pPr>
         <w:pStyle w:val="Heading1"/>
@@ -4164,57 +4151,50 @@
                 <w:rFonts w:ascii="Liberation Mono" w:hAnsi="Liberation Mono"/>
                 <w:sz w:val="16"/>
               </w:rPr>
-              <w:t>For every public claim c in ClaimSet:</w:t>
-            </w:r>
-            <w:r>
+              <w:t>For each public claim c:</w:t>
               <w:br/>
-            </w:r>
+              <w:t xml:space="preserve">    require evidence e</w:t>
+              <w:br/>
+              <w:t xml:space="preserve">    require test t reproducing e</w:t>
+              <w:br/>
+              <w:t xml:space="preserve">    require implementation effect supports c</w:t>
+              <w:br/>
+              <w:t xml:space="preserve">    otherwise deny c or mark future</w:t>
+            </w:r>
+            <w:r/>
             <w:r>
               <w:rPr>
                 <w:rFonts w:ascii="Liberation Mono" w:hAnsi="Liberation Mono"/>
                 <w:sz w:val="16"/>
               </w:rPr>
-              <w:t xml:space="preserve">    require exists evidence e</w:t>
-            </w:r>
-            <w:r>
-              <w:br/>
-            </w:r>
+            </w:r>
+            <w:r/>
             <w:r>
               <w:rPr>
                 <w:rFonts w:ascii="Liberation Mono" w:hAnsi="Liberation Mono"/>
                 <w:sz w:val="16"/>
               </w:rPr>
-              <w:t xml:space="preserve">    require exists test t</w:t>
-            </w:r>
-            <w:r>
-              <w:br/>
-            </w:r>
+            </w:r>
+            <w:r/>
             <w:r>
               <w:rPr>
                 <w:rFonts w:ascii="Liberation Mono" w:hAnsi="Liberation Mono"/>
                 <w:sz w:val="16"/>
               </w:rPr>
-              <w:t xml:space="preserve">    require t reproduces e</w:t>
-            </w:r>
-            <w:r>
-              <w:br/>
-            </w:r>
+            </w:r>
+            <w:r/>
             <w:r>
               <w:rPr>
                 <w:rFonts w:ascii="Liberation Mono" w:hAnsi="Liberation Mono"/>
                 <w:sz w:val="16"/>
               </w:rPr>
-              <w:t xml:space="preserve">    require implementation effect supports c</w:t>
-            </w:r>
-            <w:r>
-              <w:br/>
-            </w:r>
+            </w:r>
+            <w:r/>
             <w:r>
               <w:rPr>
                 <w:rFonts w:ascii="Liberation Mono" w:hAnsi="Liberation Mono"/>
                 <w:sz w:val="16"/>
               </w:rPr>
-              <w:t xml:space="preserve">    otherwise deny c or mark c as future work</w:t>
             </w:r>
           </w:p>
         </w:tc>
@@ -10912,6 +10892,54 @@
         <w:t>12.1 Threat model</w:t>
       </w:r>
     </w:p>
+    <w:p>
+      <w:pPr>
+        <w:pStyle w:val="BodyTight"/>
+      </w:pPr>
+      <w:r>
+        <w:t>The current threat model is defensive and evidence-led. It treats project claims, operator confusion, malformed inputs, unknown requests, unknown effects, failed prerequisites, and future-gated behavior as risks that must be represented before they can be safely relaxed.</w:t>
+      </w:r>
+    </w:p>
+    <w:p>
+      <w:pPr>
+        <w:pStyle w:val="ListBullet"/>
+      </w:pPr>
+      <w:r>
+        <w:t>Protected assets include source text integrity, parse results, diagnostic metadata, source spans, semantic validation results, LIR metadata, Lat parse metadata, report records, authority audit records, and project status claims.</w:t>
+      </w:r>
+    </w:p>
+    <w:p>
+      <w:pPr>
+        <w:pStyle w:val="ListBullet"/>
+      </w:pPr>
+      <w:r>
+        <w:t>Trust boundaries include parser input, semantic validation, LIR lowering, L-UI rendering, Nucleus task classification, runtime-boundary classification, authority validation, operator reports, and repository documentation.</w:t>
+      </w:r>
+    </w:p>
+    <w:p>
+      <w:pPr>
+        <w:pStyle w:val="ListBullet"/>
+      </w:pPr>
+      <w:r>
+        <w:t>External standards are used as source-awareness inputs only; they do not create NSA, CISA, FBI, certification, compliance, or protection claims.</w:t>
+      </w:r>
+    </w:p>
+    <w:p>
+      <w:pPr>
+        <w:pStyle w:val="ListBullet"/>
+      </w:pPr>
+      <w:r>
+        <w:t>The validation posture is guarded by scripts and records gaps rather than pretending they are closed by documentation alone.</w:t>
+      </w:r>
+    </w:p>
+    <w:p>
+      <w:pPr>
+        <w:pStyle w:val="BodyTight"/>
+      </w:pPr>
+      <w:r>
+        <w:t>This turns the threat model into a development constraint: if a boundary is named, the repo should eventually contain a contract, implementation plan, implementation record, guard, status record, and public wording check for that boundary. Until then, the handbook should label the gap clearly.</w:t>
+      </w:r>
+    </w:p>
     <w:tbl>
       <w:tblPr>
         <w:tblStyle w:val="TableGrid"/>
@@ -11602,6 +11630,62 @@
           <w:rFonts w:ascii="Liberation Serif" w:hAnsi="Liberation Serif"/>
         </w:rPr>
         <w:t>This rule should remain visible in the repository, the Panel, and the handbook. It is the clearest expression of Latticra as a substrate for modern security: the system is allowed to grow, but every growth step must leave a trail.</w:t>
+      </w:r>
+    </w:p>
+    <w:p>
+      <w:pPr>
+        <w:pStyle w:val="Heading2"/>
+      </w:pPr>
+      <w:r>
+        <w:t>12.4 Runtime-boundary policy expansion</w:t>
+      </w:r>
+    </w:p>
+    <w:p>
+      <w:pPr>
+        <w:pStyle w:val="BodyTight"/>
+      </w:pPr>
+      <w:r>
+        <w:t>The runtime-boundary work is the clearest example of how Latticra should mature. After the threat-model refinement named runtime policy as the next evidence gap, the project expanded the policy vocabulary before adding behavior.</w:t>
+      </w:r>
+    </w:p>
+    <w:p>
+      <w:pPr>
+        <w:pStyle w:val="ListBullet"/>
+      </w:pPr>
+      <w:r>
+        <w:t>No-effect report, validation, and classification requests remain allowed only under matching report-only, validation-only, or classification-only modes with prerequisites satisfied.</w:t>
+      </w:r>
+    </w:p>
+    <w:p>
+      <w:pPr>
+        <w:pStyle w:val="ListBullet"/>
+      </w:pPr>
+      <w:r>
+        <w:t>Operational runtime, host interaction, network interaction, recovery/update/rollback, hardware/boot, unknown, and malformed request families remain denied or future-gated.</w:t>
+      </w:r>
+    </w:p>
+    <w:p>
+      <w:pPr>
+        <w:pStyle w:val="ListBullet"/>
+      </w:pPr>
+      <w:r>
+        <w:t>Authority prerequisites must include known request/effect identity, mode compatibility, authority summaries, no-effect flags, deterministic denial reasons, matrix cells, domain cells, and negative tests.</w:t>
+      </w:r>
+    </w:p>
+    <w:p>
+      <w:pPr>
+        <w:pStyle w:val="ListBullet"/>
+      </w:pPr>
+      <w:r>
+        <w:t>Abuse-case fixtures now cover unknown requests, unknown effects, future-gated execution, operator-confirmation non-override, denial-reason reporting, authority failure, invalid LIR prerequisites, and blocked effects.</w:t>
+      </w:r>
+    </w:p>
+    <w:p>
+      <w:pPr>
+        <w:pStyle w:val="BodyTight"/>
+      </w:pPr>
+      <w:r>
+        <w:t>The important security property is not that Latticra can execute runtime behavior today. It cannot. The property is that future runtime authority is being forced through named gates, negative tests, report fields, and non-claim review before any promotion is possible.</w:t>
       </w:r>
     </w:p>
     <w:p>
@@ -17030,7 +17114,7 @@
         <w:rPr>
           <w:rFonts w:ascii="Liberation Serif" w:hAnsi="Liberation Serif"/>
         </w:rPr>
-        <w:t>This edition was derived from the uploaded Latticra Seal handbook and broadened with recent repository material containing Panel installer notes, dry-run and local-prefix install transcripts, receipt and component-marker evidence, Fedora validation snippets, the one-pass field-engine browser artifact, and May 25 Lat/LIR no-effect implementation records. The expansion is conservative: it treats the broader project as a substrate architecture and does not claim production security readiness, runtime enforcement, network authority, root authority, kernel integration, SELinux integration, systemd enforcement, or Fedora approval.</w:t>
+        <w:t>This edition was derived from the uploaded Latticra Seal handbook and broadened with recent repository material containing Panel installer notes, dry-run and local-prefix install transcripts, receipt and component-marker evidence, Fedora validation snippets, the one-pass field-engine browser artifact, May 25 Lat/LIR no-effect implementation records, defensive threat-model validation, runtime-boundary policy expansion, and abuse-case fixture records. The expansion is conservative: it treats the broader project as a substrate architecture and does not claim production security readiness, runtime enforcement, network authority, root authority, kernel integration, SELinux integration, systemd enforcement, or Fedora approval.</w:t>
       </w:r>
     </w:p>
     <w:tbl>

</xml_diff>

<commit_message>
Add completion estimate README/status alignment
</commit_message>
<xml_diff>
--- a/docs/latticra-system-substrate/the-latticra-system-substrate.docx
+++ b/docs/latticra-system-substrate/the-latticra-system-substrate.docx
@@ -4151,13 +4151,9 @@
                 <w:rFonts w:ascii="Liberation Mono" w:hAnsi="Liberation Mono"/>
                 <w:sz w:val="16"/>
               </w:rPr>
-              <w:t>For each public claim c:</w:t>
+              <w:t>For each claim c:</w:t>
               <w:br/>
-              <w:t xml:space="preserve">    require evidence e</w:t>
-              <w:br/>
-              <w:t xml:space="preserve">    require test t reproducing e</w:t>
-              <w:br/>
-              <w:t xml:space="preserve">    require implementation effect supports c</w:t>
+              <w:t xml:space="preserve">    require evidence, tests, and implementation support</w:t>
               <w:br/>
               <w:t xml:space="preserve">    otherwise deny c or mark future</w:t>
             </w:r>
@@ -4204,25 +4200,6 @@
       <w:pPr>
         <w:pStyle w:val="BodyTight"/>
       </w:pPr>
-    </w:p>
-    <w:p>
-      <w:pPr>
-        <w:pStyle w:val="BodyTight"/>
-      </w:pPr>
-      <w:r>
-        <w:rPr>
-          <w:rFonts w:ascii="Liberation Serif" w:hAnsi="Liberation Serif"/>
-        </w:rPr>
-        <w:t>This invariant is stronger than a checklist. It is a design philosophy that turns documentation into an enforceable development constraint. The Latticra project should treat exaggerated language as a failing test of the public interface.</w:t>
-      </w:r>
-    </w:p>
-    <w:p>
-      <w:r>
-        <w:rPr>
-          <w:rFonts w:ascii="Liberation Serif" w:hAnsi="Liberation Serif"/>
-        </w:rPr>
-        <w:br w:type="page"/>
-      </w:r>
     </w:p>
     <w:p>
       <w:pPr>

</xml_diff>

<commit_message>
Add LC host embedding contract
</commit_message>
<xml_diff>
--- a/docs/latticra-system-substrate/the-latticra-system-substrate.docx
+++ b/docs/latticra-system-substrate/the-latticra-system-substrate.docx
@@ -105,7 +105,7 @@
           <w:color w:val="475569"/>
           <w:sz w:val="20"/>
         </w:rPr>
-        <w:t>Working Draft 0.3 - 2026-05-25</w:t>
+        <w:t>Working Draft 0.4 - 2026-05-25</w:t>
       </w:r>
     </w:p>
     <w:p>
@@ -157,7 +157,7 @@
         <w:rPr>
           <w:rFonts w:ascii="Liberation Serif" w:hAnsi="Liberation Serif"/>
         </w:rPr>
-        <w:t>Source posture: the source material available for this edition included the uploaded Seal handbook and recent project evidence around the Latticra Panel installer, guarded user-local installation, receipts, component markers, Fedora validation traces, a one-pass field-engine browser artifact, Lat/LIR implementation records, defensive threat-model validation, runtime-boundary policy expansion, and abuse-case fixtures. Where the broader project is not fully specified by those materials, this book defines a conservative model rather than asserting unverified implementation details.</w:t>
+        <w:t>Source posture: the source material available for this edition included the uploaded Seal handbook and recent project evidence around the Latticra Panel installer, guarded user-local installation, receipts, component markers, Fedora validation traces, a one-pass field-engine browser artifact, Lat/LIR implementation records, Latticra Console Stage-0 foundation records, defensive threat-model validation, runtime-boundary policy expansion, and abuse-case fixtures. Where the broader project is not fully specified by those materials, this book defines a conservative model rather than asserting unverified implementation details.</w:t>
       </w:r>
     </w:p>
     <w:p>
@@ -4264,7 +4264,7 @@
         <w:rPr>
           <w:rFonts w:ascii="Liberation Serif" w:hAnsi="Liberation Serif"/>
         </w:rPr>
-        <w:t>The available project evidence exposes several component names and workflows: Latticra Seal, Latticra CLI wrappers, Lat tooling, LIR contracts, the Latticra Panel, a guarded local-prefix installer, docs/examples, developer CLI helpers, Fedora/RPM validation lanes, and demonstration artifacts such as the one-pass field engine. This book treats those as separate lanes in a single substrate.</w:t>
+        <w:t>The available project evidence exposes several component names and workflows: Latticra Seal, Latticra Console, Latticra CLI wrappers, Lat tooling, LIR contracts, the Latticra Panel, a guarded local-prefix installer, docs/examples, developer CLI helpers, Fedora/RPM validation lanes, and demonstration artifacts such as the one-pass field engine. This book treats those as separate lanes in a single substrate.</w:t>
       </w:r>
     </w:p>
     <w:tbl>
@@ -4992,6 +4992,38 @@
                 <w:sz w:val="16"/>
               </w:rPr>
               <w:t>Demonstrate concepts without claiming security boundaries.</w:t>
+            </w:r>
+          </w:p>
+        </w:tc>
+      </w:tr>
+      <w:tr>
+        <w:tc>
+          <w:tcPr>
+            <w:tcW w:type="dxa" w:w="3331"/>
+          </w:tcPr>
+          <w:p>
+            <w:r>
+              <w:t>LC</w:t>
+            </w:r>
+          </w:p>
+        </w:tc>
+        <w:tc>
+          <w:tcPr>
+            <w:tcW w:type="dxa" w:w="3331"/>
+          </w:tcPr>
+          <w:p>
+            <w:r>
+              <w:t>latticra-lc, command registry, profiles</w:t>
+            </w:r>
+          </w:p>
+        </w:tc>
+        <w:tc>
+          <w:tcPr>
+            <w:tcW w:type="dxa" w:w="3331"/>
+          </w:tcPr>
+          <w:p>
+            <w:r>
+              <w:t>Operator command surface with no-effect metadata and future gates.</w:t>
             </w:r>
           </w:p>
         </w:tc>
@@ -5282,6 +5314,46 @@
           <w:rFonts w:ascii="Liberation Serif" w:hAnsi="Liberation Serif"/>
         </w:rPr>
         <w:t>Validation-to-README seam: CI results should constrain public wording and prevent stale status claims.</w:t>
+      </w:r>
+    </w:p>
+    <w:p>
+      <w:pPr>
+        <w:pStyle w:val="Heading2"/>
+      </w:pPr>
+      <w:r>
+        <w:t>4.3 Latticra Console as operator surface</w:t>
+      </w:r>
+    </w:p>
+    <w:p>
+      <w:pPr>
+        <w:pStyle w:val="BodyTight"/>
+      </w:pPr>
+      <w:r>
+        <w:t>Latticra Console, or LC, is the planned operator base for the substrate. Stage 0 makes LC visible without granting host authority: it is panel-installable, configurable, backed by a seed command registry, and bound to Runtime Boundary classification plus Seal capability labels.</w:t>
+      </w:r>
+    </w:p>
+    <w:p>
+      <w:pPr>
+        <w:pStyle w:val="ListBullet"/>
+      </w:pPr>
+      <w:r>
+        <w:t>LC command metadata records name, usage, category, effect, capability label, no-effect status, panel visibility, host-process launch status, and future-gate requirements.</w:t>
+      </w:r>
+    </w:p>
+    <w:p>
+      <w:pPr>
+        <w:pStyle w:val="ListBullet"/>
+      </w:pPr>
+      <w:r>
+        <w:t>The current report surface is ready-report-only: command registry no-effect is preserved, host process launch is denied, and execution, host mutation, network, runtime enforcement, and boot authority remain zero.</w:t>
+      </w:r>
+    </w:p>
+    <w:p>
+      <w:pPr>
+        <w:pStyle w:val="ListBullet"/>
+      </w:pPr>
+      <w:r>
+        <w:t>Future host embedding and OS-base directions are planning profiles only; they do not replace a host OS, launch shell commands, or create boot/runtime authority.</w:t>
       </w:r>
     </w:p>
     <w:p>
@@ -8465,14 +8537,6 @@
       </w:r>
     </w:p>
     <w:p>
-      <w:r>
-        <w:rPr>
-          <w:rFonts w:ascii="Liberation Serif" w:hAnsi="Liberation Serif"/>
-        </w:rPr>
-        <w:br w:type="page"/>
-      </w:r>
-    </w:p>
-    <w:p>
       <w:pPr>
         <w:pStyle w:val="Heading1"/>
         <w:jc w:val="center"/>
@@ -13013,6 +13077,54 @@
     </w:p>
     <w:p>
       <w:pPr>
+        <w:pStyle w:val="Heading2"/>
+      </w:pPr>
+      <w:r>
+        <w:t>13.4 Latticra Console registry contract</w:t>
+      </w:r>
+    </w:p>
+    <w:p>
+      <w:pPr>
+        <w:pStyle w:val="BodyTight"/>
+      </w:pPr>
+      <w:r>
+        <w:t>LC turns the command-contract idea into an explicit registry surface. A command is not just a string in a help menu; it is a metadata record that can be reviewed by Panel, Runtime Boundary, Seal, docs, and future tooling before any host-facing behavior exists.</w:t>
+      </w:r>
+    </w:p>
+    <w:p>
+      <w:pPr>
+        <w:pStyle w:val="ListBullet"/>
+      </w:pPr>
+      <w:r>
+        <w:t>Allowed Stage-0 commands are help, status, plan, save, dry-run, reset, uninstall, clear, LC inspection commands, and navigation placeholders, all under a metadata/report boundary.</w:t>
+      </w:r>
+    </w:p>
+    <w:p>
+      <w:pPr>
+        <w:pStyle w:val="ListBullet"/>
+      </w:pPr>
+      <w:r>
+        <w:t>The registry-backed help and manpage renderers expose command names, categories, effects, and capability labels from the same seed metadata used by installed wrappers.</w:t>
+      </w:r>
+    </w:p>
+    <w:p>
+      <w:pPr>
+        <w:pStyle w:val="ListBullet"/>
+      </w:pPr>
+      <w:r>
+        <w:t>Future-facing commands such as lc host and lc os are intentionally future-gated: they can describe planned authority boundaries, but they cannot launch host processes or claim OS-base behavior.</w:t>
+      </w:r>
+    </w:p>
+    <w:p>
+      <w:pPr>
+        <w:pStyle w:val="ListBullet"/>
+      </w:pPr>
+      <w:r>
+        <w:t>The review rule is simple: adding a command means adding its effect label, capability label, no-effect flag, future-gate status, report surface, and denial behavior before widening authority.</w:t>
+      </w:r>
+    </w:p>
+    <w:p>
+      <w:pPr>
         <w:pStyle w:val="Heading1"/>
       </w:pPr>
       <w:r>
@@ -17091,7 +17203,7 @@
         <w:rPr>
           <w:rFonts w:ascii="Liberation Serif" w:hAnsi="Liberation Serif"/>
         </w:rPr>
-        <w:t>This edition was derived from the uploaded Latticra Seal handbook and broadened with recent repository material containing Panel installer notes, dry-run and local-prefix install transcripts, receipt and component-marker evidence, Fedora validation snippets, the one-pass field-engine browser artifact, May 25 Lat/LIR no-effect implementation records, defensive threat-model validation, runtime-boundary policy expansion, and abuse-case fixture records. The expansion is conservative: it treats the broader project as a substrate architecture and does not claim production security readiness, runtime enforcement, network authority, root authority, kernel integration, SELinux integration, systemd enforcement, or Fedora approval.</w:t>
+        <w:t>This edition was derived from the uploaded Latticra Seal handbook and broadened with recent repository material containing Panel installer notes, dry-run and local-prefix install transcripts, receipt and component-marker evidence, Fedora validation snippets, the one-pass field-engine browser artifact, May 25 Lat/LIR no-effect implementation records, Latticra Console Stage-0 foundation records, defensive threat-model validation, runtime-boundary policy expansion, and abuse-case fixture records. The expansion is conservative: it treats the broader project as a substrate architecture and does not claim production security readiness, runtime enforcement, network authority, root authority, kernel integration, SELinux integration, systemd enforcement, or Fedora approval.</w:t>
       </w:r>
     </w:p>
     <w:tbl>
@@ -17427,6 +17539,28 @@
           </w:p>
         </w:tc>
       </w:tr>
+      <w:tr>
+        <w:tc>
+          <w:tcPr>
+            <w:tcW w:type="dxa" w:w="4997"/>
+          </w:tcPr>
+          <w:p>
+            <w:r>
+              <w:t>Latticra Console foundation</w:t>
+            </w:r>
+          </w:p>
+        </w:tc>
+        <w:tc>
+          <w:tcPr>
+            <w:tcW w:type="dxa" w:w="4997"/>
+          </w:tcPr>
+          <w:p>
+            <w:r>
+              <w:t>Stage-0 command registry, Panel installability, runtime-boundary binding, and no-effect operator-surface posture.</w:t>
+            </w:r>
+          </w:p>
+        </w:tc>
+      </w:tr>
     </w:tbl>
     <w:p>
       <w:pPr>
@@ -17441,7 +17575,7 @@
         <w:rPr>
           <w:rFonts w:ascii="Liberation Serif" w:hAnsi="Liberation Serif"/>
         </w:rPr>
-        <w:t>Future editions should replace inferred project-level connective tissue with canonical repository documents as they mature: a root architecture spec, Lat/LIR spec, Panel UX contract, installer readiness contract, report schema, receipt schema, and runtime-handoff specification.</w:t>
+        <w:t>Future editions should replace inferred project-level connective tissue with canonical repository documents as they mature: a root architecture spec, Lat/LIR spec, Panel UX contract, Latticra Console host-embedding contract, installer readiness contract, report schema, receipt schema, and runtime-handoff specification.</w:t>
       </w:r>
     </w:p>
     <w:p>

</xml_diff>

<commit_message>
Add Nadia prompt token sequence contract stage 26
</commit_message>
<xml_diff>
--- a/docs/latticra-system-substrate/the-latticra-system-substrate.docx
+++ b/docs/latticra-system-substrate/the-latticra-system-substrate.docx
@@ -5002,7 +5002,12 @@
             <w:tcW w:type="dxa" w:w="3331"/>
           </w:tcPr>
           <w:p>
-            <w:r>
+            <w:pPr/>
+            <w:r>
+              <w:rPr>
+                <w:rFonts w:ascii="Liberation Sans" w:hAnsi="Liberation Sans"/>
+                <w:sz w:val="16"/>
+              </w:rPr>
               <w:t>LC</w:t>
             </w:r>
           </w:p>
@@ -5012,7 +5017,12 @@
             <w:tcW w:type="dxa" w:w="3331"/>
           </w:tcPr>
           <w:p>
-            <w:r>
+            <w:pPr/>
+            <w:r>
+              <w:rPr>
+                <w:rFonts w:ascii="Liberation Sans" w:hAnsi="Liberation Sans"/>
+                <w:sz w:val="16"/>
+              </w:rPr>
               <w:t>latticra-lc, command registry, profiles</w:t>
             </w:r>
           </w:p>
@@ -5022,7 +5032,12 @@
             <w:tcW w:type="dxa" w:w="3331"/>
           </w:tcPr>
           <w:p>
-            <w:r>
+            <w:pPr/>
+            <w:r>
+              <w:rPr>
+                <w:rFonts w:ascii="Liberation Sans" w:hAnsi="Liberation Sans"/>
+                <w:sz w:val="16"/>
+              </w:rPr>
               <w:t>Operator command surface with no-effect metadata and future gates.</w:t>
             </w:r>
           </w:p>
@@ -17545,7 +17560,12 @@
             <w:tcW w:type="dxa" w:w="4997"/>
           </w:tcPr>
           <w:p>
-            <w:r>
+            <w:pPr/>
+            <w:r>
+              <w:rPr>
+                <w:rFonts w:ascii="Liberation Sans" w:hAnsi="Liberation Sans"/>
+                <w:sz w:val="16"/>
+              </w:rPr>
               <w:t>Latticra Console foundation</w:t>
             </w:r>
           </w:p>
@@ -17555,7 +17575,12 @@
             <w:tcW w:type="dxa" w:w="4997"/>
           </w:tcPr>
           <w:p>
-            <w:r>
+            <w:pPr/>
+            <w:r>
+              <w:rPr>
+                <w:rFonts w:ascii="Liberation Sans" w:hAnsi="Liberation Sans"/>
+                <w:sz w:val="16"/>
+              </w:rPr>
               <w:t>Stage-0 command registry, Panel installability, runtime-boundary binding, and no-effect operator-surface posture.</w:t>
             </w:r>
           </w:p>

</xml_diff>

<commit_message>
Harden workflow pins and shell safety checks
</commit_message>
<xml_diff>
--- a/docs/latticra-system-substrate/the-latticra-system-substrate.docx
+++ b/docs/latticra-system-substrate/the-latticra-system-substrate.docx
@@ -105,7 +105,7 @@
           <w:color w:val="475569"/>
           <w:sz w:val="20"/>
         </w:rPr>
-        <w:t>Working Draft 0.4 - 2026-05-25</w:t>
+        <w:t>Working Draft 0.5 - 2026-05-25</w:t>
       </w:r>
     </w:p>
     <w:p>
@@ -157,7 +157,7 @@
         <w:rPr>
           <w:rFonts w:ascii="Liberation Serif" w:hAnsi="Liberation Serif"/>
         </w:rPr>
-        <w:t>Source posture: the source material available for this edition included the uploaded Seal handbook and recent project evidence around the Latticra Panel installer, guarded user-local installation, receipts, component markers, Fedora validation traces, a one-pass field-engine browser artifact, Lat/LIR implementation records, Latticra Console Stage-0 foundation records, defensive threat-model validation, runtime-boundary policy expansion, and abuse-case fixtures. Where the broader project is not fully specified by those materials, this book defines a conservative model rather than asserting unverified implementation details.</w:t>
+        <w:t>Source posture: the source material available for this edition included the uploaded Seal handbook and recent project evidence around the Latticra Panel installer, guarded user-local installation, receipts, component markers, Fedora validation traces, a one-pass field-engine browser artifact, Lat/LIR implementation records, Latticra Console Stage-0 foundation records, Nucleus report-only task-boundary records, Nadia offline AI staged contract records through Stage-27, defensive threat-model validation, runtime-boundary policy expansion, and abuse-case fixtures. Where the broader project is not fully specified by those materials, this book defines a conservative model rather than asserting unverified implementation details.</w:t>
       </w:r>
     </w:p>
     <w:p>
@@ -4059,6 +4059,142 @@
           </w:p>
         </w:tc>
       </w:tr>
+      <w:tr>
+        <w:tc>
+          <w:tcPr>
+            <w:tcW w:type="dxa" w:w="2592"/>
+            <w:tcMar>
+              <w:top w:w="60" w:type="dxa"/>
+              <w:start w:w="70" w:type="dxa"/>
+              <w:bottom w:w="60" w:type="dxa"/>
+              <w:end w:w="70" w:type="dxa"/>
+            </w:tcMar>
+            <w:vAlign w:val="top"/>
+          </w:tcPr>
+          <w:p>
+            <w:pPr/>
+            <w:r>
+              <w:rPr>
+                <w:rFonts w:ascii="Liberation Sans" w:hAnsi="Liberation Sans"/>
+                <w:sz w:val="16"/>
+              </w:rPr>
+              <w:t>Nucleus task boundary</w:t>
+            </w:r>
+          </w:p>
+        </w:tc>
+        <w:tc>
+          <w:tcPr>
+            <w:tcW w:type="dxa" w:w="2952"/>
+            <w:tcMar>
+              <w:top w:w="60" w:type="dxa"/>
+              <w:start w:w="70" w:type="dxa"/>
+              <w:bottom w:w="60" w:type="dxa"/>
+              <w:end w:w="70" w:type="dxa"/>
+            </w:tcMar>
+            <w:vAlign w:val="top"/>
+          </w:tcPr>
+          <w:p>
+            <w:pPr/>
+            <w:r>
+              <w:rPr>
+                <w:rFonts w:ascii="Liberation Sans" w:hAnsi="Liberation Sans"/>
+                <w:sz w:val="16"/>
+              </w:rPr>
+              <w:t>Report-only task records with no-effect alignment and execution/effect/runtime labels.</w:t>
+            </w:r>
+          </w:p>
+        </w:tc>
+        <w:tc>
+          <w:tcPr>
+            <w:tcW w:type="dxa" w:w="4176"/>
+            <w:tcMar>
+              <w:top w:w="60" w:type="dxa"/>
+              <w:start w:w="70" w:type="dxa"/>
+              <w:bottom w:w="60" w:type="dxa"/>
+              <w:end w:w="70" w:type="dxa"/>
+            </w:tcMar>
+            <w:vAlign w:val="top"/>
+          </w:tcPr>
+          <w:p>
+            <w:pPr/>
+            <w:r>
+              <w:rPr>
+                <w:rFonts w:ascii="Liberation Sans" w:hAnsi="Liberation Sans"/>
+                <w:sz w:val="16"/>
+              </w:rPr>
+              <w:t>Say it classifies and reports task-shaped requests; do not say it executes tasks.</w:t>
+            </w:r>
+          </w:p>
+        </w:tc>
+      </w:tr>
+      <w:tr>
+        <w:tc>
+          <w:tcPr>
+            <w:tcW w:type="dxa" w:w="2592"/>
+            <w:tcMar>
+              <w:top w:w="60" w:type="dxa"/>
+              <w:start w:w="70" w:type="dxa"/>
+              <w:bottom w:w="60" w:type="dxa"/>
+              <w:end w:w="70" w:type="dxa"/>
+            </w:tcMar>
+            <w:vAlign w:val="top"/>
+          </w:tcPr>
+          <w:p>
+            <w:pPr/>
+            <w:r>
+              <w:rPr>
+                <w:rFonts w:ascii="Liberation Sans" w:hAnsi="Liberation Sans"/>
+                <w:sz w:val="16"/>
+              </w:rPr>
+              <w:t>Nadia offline AI</w:t>
+            </w:r>
+          </w:p>
+        </w:tc>
+        <w:tc>
+          <w:tcPr>
+            <w:tcW w:type="dxa" w:w="2952"/>
+            <w:tcMar>
+              <w:top w:w="60" w:type="dxa"/>
+              <w:start w:w="70" w:type="dxa"/>
+              <w:bottom w:w="60" w:type="dxa"/>
+              <w:end w:w="70" w:type="dxa"/>
+            </w:tcMar>
+            <w:vAlign w:val="top"/>
+          </w:tcPr>
+          <w:p>
+            <w:pPr/>
+            <w:r>
+              <w:rPr>
+                <w:rFonts w:ascii="Liberation Sans" w:hAnsi="Liberation Sans"/>
+                <w:sz w:val="16"/>
+              </w:rPr>
+              <w:t>Stage-0 through Stage-27 contract metadata; no model runtime, tokenization, context-window assembly, inference, dialogue, or tools.</w:t>
+            </w:r>
+          </w:p>
+        </w:tc>
+        <w:tc>
+          <w:tcPr>
+            <w:tcW w:type="dxa" w:w="4176"/>
+            <w:tcMar>
+              <w:top w:w="60" w:type="dxa"/>
+              <w:start w:w="70" w:type="dxa"/>
+              <w:bottom w:w="60" w:type="dxa"/>
+              <w:end w:w="70" w:type="dxa"/>
+            </w:tcMar>
+            <w:vAlign w:val="top"/>
+          </w:tcPr>
+          <w:p>
+            <w:pPr/>
+            <w:r>
+              <w:rPr>
+                <w:rFonts w:ascii="Liberation Sans" w:hAnsi="Liberation Sans"/>
+                <w:sz w:val="16"/>
+              </w:rPr>
+              <w:t>Say it is an offline-AI contract ladder; do not say it is an active AI assistant.</w:t>
+            </w:r>
+          </w:p>
+        </w:tc>
+      </w:tr>
     </w:tbl>
     <w:p>
       <w:pPr>
@@ -5043,6 +5179,100 @@
           </w:p>
         </w:tc>
       </w:tr>
+      <w:tr>
+        <w:tc>
+          <w:tcPr>
+            <w:tcW w:type="dxa" w:w="3331"/>
+          </w:tcPr>
+          <w:p>
+            <w:pPr/>
+            <w:r>
+              <w:rPr>
+                <w:rFonts w:ascii="Liberation Sans" w:hAnsi="Liberation Sans"/>
+                <w:sz w:val="16"/>
+              </w:rPr>
+              <w:t>Nucleus</w:t>
+            </w:r>
+          </w:p>
+        </w:tc>
+        <w:tc>
+          <w:tcPr>
+            <w:tcW w:type="dxa" w:w="3331"/>
+          </w:tcPr>
+          <w:p>
+            <w:pPr/>
+            <w:r>
+              <w:rPr>
+                <w:rFonts w:ascii="Liberation Sans" w:hAnsi="Liberation Sans"/>
+                <w:sz w:val="16"/>
+              </w:rPr>
+              <w:t>nucleus task records and report-only runners</w:t>
+            </w:r>
+          </w:p>
+        </w:tc>
+        <w:tc>
+          <w:tcPr>
+            <w:tcW w:type="dxa" w:w="3331"/>
+          </w:tcPr>
+          <w:p>
+            <w:pPr/>
+            <w:r>
+              <w:rPr>
+                <w:rFonts w:ascii="Liberation Sans" w:hAnsi="Liberation Sans"/>
+                <w:sz w:val="16"/>
+              </w:rPr>
+              <w:t>Coordinate task-boundary metadata without effect-performing execution.</w:t>
+            </w:r>
+          </w:p>
+        </w:tc>
+      </w:tr>
+      <w:tr>
+        <w:tc>
+          <w:tcPr>
+            <w:tcW w:type="dxa" w:w="3331"/>
+          </w:tcPr>
+          <w:p>
+            <w:pPr/>
+            <w:r>
+              <w:rPr>
+                <w:rFonts w:ascii="Liberation Sans" w:hAnsi="Liberation Sans"/>
+                <w:sz w:val="16"/>
+              </w:rPr>
+              <w:t>Nadia</w:t>
+            </w:r>
+          </w:p>
+        </w:tc>
+        <w:tc>
+          <w:tcPr>
+            <w:tcW w:type="dxa" w:w="3331"/>
+          </w:tcPr>
+          <w:p>
+            <w:pPr/>
+            <w:r>
+              <w:rPr>
+                <w:rFonts w:ascii="Liberation Sans" w:hAnsi="Liberation Sans"/>
+                <w:sz w:val="16"/>
+              </w:rPr>
+              <w:t>latticra-nadia, Panel component, Console metadata</w:t>
+            </w:r>
+          </w:p>
+        </w:tc>
+        <w:tc>
+          <w:tcPr>
+            <w:tcW w:type="dxa" w:w="3331"/>
+          </w:tcPr>
+          <w:p>
+            <w:pPr/>
+            <w:r>
+              <w:rPr>
+                <w:rFonts w:ascii="Liberation Sans" w:hAnsi="Liberation Sans"/>
+                <w:sz w:val="16"/>
+              </w:rPr>
+              <w:t>Offline-AI contract ladder with denied model, tokenizer, prompt, runtime, and tool authority.</w:t>
+            </w:r>
+          </w:p>
+        </w:tc>
+      </w:tr>
     </w:tbl>
     <w:p>
       <w:pPr>
@@ -5369,6 +5599,46 @@
       </w:pPr>
       <w:r>
         <w:t>Future host embedding and OS-base directions are planning profiles only; they do not replace a host OS, launch shell commands, or create boot/runtime authority.</w:t>
+      </w:r>
+    </w:p>
+    <w:p>
+      <w:pPr>
+        <w:pStyle w:val="Heading2"/>
+      </w:pPr>
+      <w:r>
+        <w:t>4.4 Nucleus and Nadia as AI-era boundary surfaces</w:t>
+      </w:r>
+    </w:p>
+    <w:p>
+      <w:pPr>
+        <w:pStyle w:val="BodyTight"/>
+      </w:pPr>
+      <w:r>
+        <w:t>Nucleus and Nadia extend the substrate into AI-era work, but only as boundary surfaces first. Their value is not that they make the project autonomous today; it is that they force task requests, prompt chains, tokenizer artifacts, model readiness, tool authority, and future runtime entry points into explicit metadata before any effect-performing behavior can exist.</w:t>
+      </w:r>
+    </w:p>
+    <w:p>
+      <w:pPr>
+        <w:pStyle w:val="ListBullet"/>
+      </w:pPr>
+      <w:r>
+        <w:t>Nucleus currently records classification and policy posture for task-shaped requests. Its report refinements make execution_status=not-executed, effect_status=report-only, runtime_status=not-entered, no_effect_policy=preserved, and representation_gate=language-representation-reviewed visible in deterministic output.</w:t>
+      </w:r>
+    </w:p>
+    <w:p>
+      <w:pPr>
+        <w:pStyle w:val="ListBullet"/>
+      </w:pPr>
+      <w:r>
+        <w:t>Nadia is an optional offline-AI foundation, not an active AI assistant. Stage-0 through Stage-27 establish identity, Panel and Console surfaces, local context metadata, runtime/profile contracts, prompt and model contracts, tokenizer artifact contracts, prompt-tokenization contracts, and prompt-token-sequence contracts, and context-window assembly contracts while keeping model runtime, prompt reading, token creation, context-window assembly, prompt-evaluation-input creation, inference, dialogue generation, network access, source mutation, and tool execution denied.</w:t>
+      </w:r>
+    </w:p>
+    <w:p>
+      <w:pPr>
+        <w:pStyle w:val="ListBullet"/>
+      </w:pPr>
+      <w:r>
+        <w:t>The shared rule is evidence before capability. A future AI-adjacent command must pass through command-registry metadata, Nucleus task records, Runtime Boundary labels, Seal report surfaces, and explicit tests before any authority widens.</w:t>
       </w:r>
     </w:p>
     <w:p>
@@ -11754,6 +12024,46 @@
     </w:p>
     <w:p>
       <w:pPr>
+        <w:pStyle w:val="Heading2"/>
+      </w:pPr>
+      <w:r>
+        <w:t>12.5 AI-era authority and prompt-chain non-goals</w:t>
+      </w:r>
+    </w:p>
+    <w:p>
+      <w:pPr>
+        <w:pStyle w:val="BodyTight"/>
+      </w:pPr>
+      <w:r>
+        <w:t>AI-facing vocabulary can sound operational long before the system has authority to act. Latticra should therefore treat prompts, tokenizers, model registries, context windows, tool preflights, and task runners as authority-bearing surfaces even when every current implementation remains metadata-only.</w:t>
+      </w:r>
+    </w:p>
+    <w:p>
+      <w:pPr>
+        <w:pStyle w:val="ListBullet"/>
+      </w:pPr>
+      <w:r>
+        <w:t>A prompt contract is not prompt evaluation. It may describe source policy, inherited safety requirements, and promotion gates, but it must not imply prompt text receipt, prompt reading, prompt materialization, token creation, runtime invocation, inference, dialogue generation, or tool execution.</w:t>
+      </w:r>
+    </w:p>
+    <w:p>
+      <w:pPr>
+        <w:pStyle w:val="ListBullet"/>
+      </w:pPr>
+      <w:r>
+        <w:t>A tokenizer or model contract is not a loaded model. It may describe expected evidence, review fields, and future compatibility, but it must not open tokenizer files, read vocabularies, hash artifacts, attach tokenizers, create runtime sessions, or select model weights unless that behavior is separately implemented and guarded.</w:t>
+      </w:r>
+    </w:p>
+    <w:p>
+      <w:pPr>
+        <w:pStyle w:val="ListBullet"/>
+      </w:pPr>
+      <w:r>
+        <w:t>A task record is not task execution. Nucleus may classify, deny, preview, and report, but current records must not mutate state, call a shell, use the network, perform server interaction, recover a host, touch hardware, or enter runtime behavior.</w:t>
+      </w:r>
+    </w:p>
+    <w:p>
+      <w:pPr>
         <w:pStyle w:val="Heading1"/>
         <w:jc w:val="center"/>
       </w:pPr>
@@ -13140,6 +13450,46 @@
     </w:p>
     <w:p>
       <w:pPr>
+        <w:pStyle w:val="Heading2"/>
+      </w:pPr>
+      <w:r>
+        <w:t>13.5 Nucleus and Nadia command surfaces</w:t>
+      </w:r>
+    </w:p>
+    <w:p>
+      <w:pPr>
+        <w:pStyle w:val="BodyTight"/>
+      </w:pPr>
+      <w:r>
+        <w:t>The Nucleus and Nadia command surfaces should be read as report producers and contract generators. Their command names are intentionally useful to operators, but the commands remain bounded by the metadata they emit and by the authority they explicitly do not have.</w:t>
+      </w:r>
+    </w:p>
+    <w:p>
+      <w:pPr>
+        <w:pStyle w:val="ListBullet"/>
+      </w:pPr>
+      <w:r>
+        <w:t>Nucleus commands must expose request kind, effect label, policy result, denial reason, execution status, effect status, runtime status, no-effect policy, and representation gate. A successful report is not proof that a task ran; it is proof that the boundary was classified.</w:t>
+      </w:r>
+    </w:p>
+    <w:p>
+      <w:pPr>
+        <w:pStyle w:val="ListBullet"/>
+      </w:pPr>
+      <w:r>
+        <w:t>Nadia commands under the embedded Console and installed latticra-nadia wrapper must keep the current stage visible. Status, context-pack, runtime-profile, prompt-plan, tool-preflight, prompt, model, tokenizer, token-sequence, and context-window commands are metadata or contract surfaces until a later contract proves otherwise.</w:t>
+      </w:r>
+    </w:p>
+    <w:p>
+      <w:pPr>
+        <w:pStyle w:val="ListBullet"/>
+      </w:pPr>
+      <w:r>
+        <w:t>Command review should reject any help text, status output, README prose, or Panel label that implies autonomous coding, model inference, prompt evaluation, tokenizer attachment, runtime sessions, network access, source mutation, or tool execution ahead of evidence.</w:t>
+      </w:r>
+    </w:p>
+    <w:p>
+      <w:pPr>
         <w:pStyle w:val="Heading1"/>
       </w:pPr>
       <w:r>
@@ -13949,6 +14299,54 @@
       <w:pPr>
         <w:pStyle w:val="BodyTight"/>
       </w:pPr>
+    </w:p>
+    <w:p>
+      <w:pPr>
+        <w:pStyle w:val="Heading2"/>
+      </w:pPr>
+      <w:r>
+        <w:t>14.5 Prompt and tokenizer metadata ladder</w:t>
+      </w:r>
+    </w:p>
+    <w:p>
+      <w:pPr>
+        <w:pStyle w:val="BodyTight"/>
+      </w:pPr>
+      <w:r>
+        <w:t>Nadia gives the handbook a concrete example of schema-first AI design. Each stage records the next boundary without crossing it, so the ladder is useful even before inference exists.</w:t>
+      </w:r>
+    </w:p>
+    <w:p>
+      <w:pPr>
+        <w:pStyle w:val="ListBullet"/>
+      </w:pPr>
+      <w:r>
+        <w:t>Foundation and local-context records bind component identity, local install paths, context-pack generation, runtime profile metadata, workbench plans, mode labels, and productivity-ledger vocabulary to local, operator-invoked evidence.</w:t>
+      </w:r>
+    </w:p>
+    <w:p>
+      <w:pPr>
+        <w:pStyle w:val="ListBullet"/>
+      </w:pPr>
+      <w:r>
+        <w:t>Prompt and model records bind prompt-evaluation contracts, local model registry contracts, inference-readiness contracts, runtime-invocation contracts, model-load contracts, prompt receipts, prompt materialization, and prompt-evaluation handoff to denied runtime authority.</w:t>
+      </w:r>
+    </w:p>
+    <w:p>
+      <w:pPr>
+        <w:pStyle w:val="ListBullet"/>
+      </w:pPr>
+      <w:r>
+        <w:t>Tokenizer records bind tokenizer specification, manifest, artifact inventory, measurement, verification, binding, and runtime-attachment contracts without opening tokenizer files, loading vocabularies, attaching tokenizers, or creating runtime sessions.</w:t>
+      </w:r>
+    </w:p>
+    <w:p>
+      <w:pPr>
+        <w:pStyle w:val="ListBullet"/>
+      </w:pPr>
+      <w:r>
+        <w:t>Prompt-tokenization and prompt-token-sequence records reserve the future shape of token count, token order, offsets, masks, and position IDs; Stage-27 context-window records then reserve future context-window layout, token budget, truncation, and prompt-evaluation-input requirements while explicitly recording that those values are not produced today.</w:t>
+      </w:r>
     </w:p>
     <w:p>
       <w:pPr>
@@ -14799,6 +15197,46 @@
     </w:p>
     <w:p>
       <w:pPr>
+        <w:pStyle w:val="Heading2"/>
+      </w:pPr>
+      <w:r>
+        <w:t>15.4 Nucleus and Nadia validation lanes</w:t>
+      </w:r>
+    </w:p>
+    <w:p>
+      <w:pPr>
+        <w:pStyle w:val="BodyTight"/>
+      </w:pPr>
+      <w:r>
+        <w:t>The AI-era validation lane should prove non-effects as aggressively as it proves positive metadata. The important evidence is often the zero: no runtime entered, no prompt read, no model loaded, no tokenizer opened, no task executed, and no tool authority granted.</w:t>
+      </w:r>
+    </w:p>
+    <w:p>
+      <w:pPr>
+        <w:pStyle w:val="ListBullet"/>
+      </w:pPr>
+      <w:r>
+        <w:t>Nucleus focused tests should keep report-only execution labels, no-effect alignment labels, future-gated behavior, denied mutations, and disabled server/recovery/hardware/runtime behavior stable across refactors.</w:t>
+      </w:r>
+    </w:p>
+    <w:p>
+      <w:pPr>
+        <w:pStyle w:val="ListBullet"/>
+      </w:pPr>
+      <w:r>
+        <w:t>Nadia focused tests should cover Stage-0 through Stage-27 contract outputs, inherited protective-safety fields, installed command names, Panel/Console metadata, and denial fields for model, tokenizer, prompt, runtime, network, source-mutation, and tool authority.</w:t>
+      </w:r>
+    </w:p>
+    <w:p>
+      <w:pPr>
+        <w:pStyle w:val="ListBullet"/>
+      </w:pPr>
+      <w:r>
+        <w:t>A failing validation lane should weaken public wording before it widens capability. In this substrate, conservative status is a feature, not a lack of ambition.</w:t>
+      </w:r>
+    </w:p>
+    <w:p>
+      <w:pPr>
         <w:pStyle w:val="Heading1"/>
       </w:pPr>
       <w:r>
@@ -17218,7 +17656,7 @@
         <w:rPr>
           <w:rFonts w:ascii="Liberation Serif" w:hAnsi="Liberation Serif"/>
         </w:rPr>
-        <w:t>This edition was derived from the uploaded Latticra Seal handbook and broadened with recent repository material containing Panel installer notes, dry-run and local-prefix install transcripts, receipt and component-marker evidence, Fedora validation snippets, the one-pass field-engine browser artifact, May 25 Lat/LIR no-effect implementation records, Latticra Console Stage-0 foundation records, defensive threat-model validation, runtime-boundary policy expansion, and abuse-case fixture records. The expansion is conservative: it treats the broader project as a substrate architecture and does not claim production security readiness, runtime enforcement, network authority, root authority, kernel integration, SELinux integration, systemd enforcement, or Fedora approval.</w:t>
+        <w:t>This edition was derived from the uploaded Latticra Seal handbook and broadened with recent repository material containing Panel installer notes, dry-run and local-prefix install transcripts, receipt and component-marker evidence, Fedora validation snippets, the one-pass field-engine browser artifact, May 25 Lat/LIR no-effect implementation records, Latticra Console Stage-0 foundation records, Nucleus report-only task-boundary refinements, Nadia offline AI Stage-0 through Stage-27 contract records, defensive threat-model validation, runtime-boundary policy expansion, and abuse-case fixture records. The expansion is conservative: it treats the broader project as a substrate architecture and does not claim production security readiness, runtime enforcement, network authority, root authority, kernel integration, SELinux integration, systemd enforcement, Fedora approval, active AI inference, autonomous coding, or tool execution.</w:t>
       </w:r>
     </w:p>
     <w:tbl>
@@ -17586,6 +18024,70 @@
           </w:p>
         </w:tc>
       </w:tr>
+      <w:tr>
+        <w:tc>
+          <w:tcPr>
+            <w:tcW w:type="dxa" w:w="4997"/>
+          </w:tcPr>
+          <w:p>
+            <w:pPr/>
+            <w:r>
+              <w:rPr>
+                <w:rFonts w:ascii="Liberation Sans" w:hAnsi="Liberation Sans"/>
+                <w:sz w:val="16"/>
+              </w:rPr>
+              <w:t>Nucleus task boundary</w:t>
+            </w:r>
+          </w:p>
+        </w:tc>
+        <w:tc>
+          <w:tcPr>
+            <w:tcW w:type="dxa" w:w="4997"/>
+          </w:tcPr>
+          <w:p>
+            <w:pPr/>
+            <w:r>
+              <w:rPr>
+                <w:rFonts w:ascii="Liberation Sans" w:hAnsi="Liberation Sans"/>
+                <w:sz w:val="16"/>
+              </w:rPr>
+              <w:t>Report-only task classification, no-effect alignment, execution-status labels, and future-gated task vocabulary.</w:t>
+            </w:r>
+          </w:p>
+        </w:tc>
+      </w:tr>
+      <w:tr>
+        <w:tc>
+          <w:tcPr>
+            <w:tcW w:type="dxa" w:w="4997"/>
+          </w:tcPr>
+          <w:p>
+            <w:pPr/>
+            <w:r>
+              <w:rPr>
+                <w:rFonts w:ascii="Liberation Sans" w:hAnsi="Liberation Sans"/>
+                <w:sz w:val="16"/>
+              </w:rPr>
+              <w:t>Nadia offline AI contracts</w:t>
+            </w:r>
+          </w:p>
+        </w:tc>
+        <w:tc>
+          <w:tcPr>
+            <w:tcW w:type="dxa" w:w="4997"/>
+          </w:tcPr>
+          <w:p>
+            <w:pPr/>
+            <w:r>
+              <w:rPr>
+                <w:rFonts w:ascii="Liberation Sans" w:hAnsi="Liberation Sans"/>
+                <w:sz w:val="16"/>
+              </w:rPr>
+              <w:t>Stage-0 through Stage-27 metadata ladder for Panel/Console visibility, local context, model/prompt/tokenizer contracts, prompt-token-sequence and context-window boundaries, and denied AI/tool authority.</w:t>
+            </w:r>
+          </w:p>
+        </w:tc>
+      </w:tr>
     </w:tbl>
     <w:p>
       <w:pPr>
@@ -17600,7 +18102,7 @@
         <w:rPr>
           <w:rFonts w:ascii="Liberation Serif" w:hAnsi="Liberation Serif"/>
         </w:rPr>
-        <w:t>Future editions should replace inferred project-level connective tissue with canonical repository documents as they mature: a root architecture spec, Lat/LIR spec, Panel UX contract, Latticra Console host-embedding contract, installer readiness contract, report schema, receipt schema, and runtime-handoff specification.</w:t>
+        <w:t>Future editions should replace inferred project-level connective tissue with canonical repository documents as they mature: a root architecture spec, Lat/LIR spec, Panel UX contract, Latticra Console host-embedding contract, Nucleus task-record schema, Nadia offline-AI contract ladder, installer readiness contract, report schema, receipt schema, and runtime-handoff specification.</w:t>
       </w:r>
     </w:p>
     <w:p>
@@ -17684,6 +18186,14 @@
           <w:rFonts w:ascii="Liberation Serif" w:hAnsi="Liberation Serif"/>
         </w:rPr>
         <w:t>Treat future runtime-boundary work as metadata research until an enforcement path exists and is tested.</w:t>
+      </w:r>
+    </w:p>
+    <w:p>
+      <w:pPr>
+        <w:pStyle w:val="ListNumber"/>
+      </w:pPr>
+      <w:r>
+        <w:t>For AI-era surfaces, distinguish contract metadata from model loading, prompt tokenization, inference, dialogue generation, source mutation, and tool execution.</w:t>
       </w:r>
     </w:p>
     <w:p>

</xml_diff>

<commit_message>
Clarify installer reset handling for unmanaged wrappers
</commit_message>
<xml_diff>
--- a/docs/latticra-system-substrate/the-latticra-system-substrate.docx
+++ b/docs/latticra-system-substrate/the-latticra-system-substrate.docx
@@ -105,7 +105,7 @@
           <w:color w:val="475569"/>
           <w:sz w:val="20"/>
         </w:rPr>
-        <w:t>Working Draft 0.5 - 2026-05-25</w:t>
+        <w:t>Working Draft 0.6 - 2026-05-25</w:t>
       </w:r>
     </w:p>
     <w:p>
@@ -157,7 +157,7 @@
         <w:rPr>
           <w:rFonts w:ascii="Liberation Serif" w:hAnsi="Liberation Serif"/>
         </w:rPr>
-        <w:t>Source posture: the source material available for this edition included the uploaded Seal handbook and recent project evidence around the Latticra Panel installer, guarded user-local installation, receipts, component markers, Fedora validation traces, a one-pass field-engine browser artifact, Lat/LIR implementation records, Latticra Console Stage-0 foundation records, Nucleus report-only task-boundary records, Nadia offline AI staged contract records through Stage-27, defensive threat-model validation, runtime-boundary policy expansion, and abuse-case fixtures. Where the broader project is not fully specified by those materials, this book defines a conservative model rather than asserting unverified implementation details.</w:t>
+        <w:t>Source posture: this edition draws from the Seal handbook plus current Panel/installer receipts, Fedora and macOS platform-validation records, production-installer readiness gates, Lat/LIR, Latticra Console, Nucleus, Nadia Stage-27, threat-model, runtime-boundary, and abuse-case evidence. Where project documents are not yet canonical, this book uses conservative connective tissue rather than asserting implementation details.</w:t>
       </w:r>
     </w:p>
     <w:p>
@@ -4195,6 +4195,210 @@
           </w:p>
         </w:tc>
       </w:tr>
+      <w:tr>
+        <w:tc>
+          <w:tcPr>
+            <w:tcW w:type="dxa" w:w="2592"/>
+            <w:tcMar>
+              <w:top w:w="60" w:type="dxa"/>
+              <w:start w:w="70" w:type="dxa"/>
+              <w:bottom w:w="60" w:type="dxa"/>
+              <w:end w:w="70" w:type="dxa"/>
+            </w:tcMar>
+            <w:vAlign w:val="top"/>
+          </w:tcPr>
+          <w:p>
+            <w:pPr/>
+            <w:r>
+              <w:rPr>
+                <w:rFonts w:ascii="Liberation Sans" w:hAnsi="Liberation Sans"/>
+                <w:sz w:val="16"/>
+              </w:rPr>
+              <w:t>macOS app bundle lane</w:t>
+            </w:r>
+          </w:p>
+        </w:tc>
+        <w:tc>
+          <w:tcPr>
+            <w:tcW w:type="dxa" w:w="2952"/>
+            <w:tcMar>
+              <w:top w:w="60" w:type="dxa"/>
+              <w:start w:w="70" w:type="dxa"/>
+              <w:bottom w:w="60" w:type="dxa"/>
+              <w:end w:w="70" w:type="dxa"/>
+            </w:tcMar>
+            <w:vAlign w:val="top"/>
+          </w:tcPr>
+          <w:p>
+            <w:pPr/>
+            <w:r>
+              <w:rPr>
+                <w:rFonts w:ascii="Liberation Sans" w:hAnsi="Liberation Sans"/>
+                <w:sz w:val="16"/>
+              </w:rPr>
+              <w:t>No-effect user-local app-bundle writer dry-run, commit gate, reset/uninstall dry-run contract, and verification-transcript contract.</w:t>
+            </w:r>
+          </w:p>
+        </w:tc>
+        <w:tc>
+          <w:tcPr>
+            <w:tcW w:type="dxa" w:w="4176"/>
+            <w:tcMar>
+              <w:top w:w="60" w:type="dxa"/>
+              <w:start w:w="70" w:type="dxa"/>
+              <w:bottom w:w="60" w:type="dxa"/>
+              <w:end w:w="70" w:type="dxa"/>
+            </w:tcMar>
+            <w:vAlign w:val="top"/>
+          </w:tcPr>
+          <w:p>
+            <w:pPr/>
+            <w:r>
+              <w:rPr>
+                <w:rFonts w:ascii="Liberation Sans" w:hAnsi="Liberation Sans"/>
+                <w:sz w:val="16"/>
+              </w:rPr>
+              <w:t>Say macOS install evidence is being specified; do not say a macOS installer exists.</w:t>
+            </w:r>
+          </w:p>
+        </w:tc>
+      </w:tr>
+      <w:tr>
+        <w:tc>
+          <w:tcPr>
+            <w:tcW w:type="dxa" w:w="2592"/>
+            <w:tcMar>
+              <w:top w:w="60" w:type="dxa"/>
+              <w:start w:w="70" w:type="dxa"/>
+              <w:bottom w:w="60" w:type="dxa"/>
+              <w:end w:w="70" w:type="dxa"/>
+            </w:tcMar>
+            <w:vAlign w:val="top"/>
+          </w:tcPr>
+          <w:p>
+            <w:pPr/>
+            <w:r>
+              <w:rPr>
+                <w:rFonts w:ascii="Liberation Sans" w:hAnsi="Liberation Sans"/>
+                <w:sz w:val="16"/>
+              </w:rPr>
+              <w:t>Fedora RPM lifecycle lane</w:t>
+            </w:r>
+          </w:p>
+        </w:tc>
+        <w:tc>
+          <w:tcPr>
+            <w:tcW w:type="dxa" w:w="2952"/>
+            <w:tcMar>
+              <w:top w:w="60" w:type="dxa"/>
+              <w:start w:w="70" w:type="dxa"/>
+              <w:bottom w:w="60" w:type="dxa"/>
+              <w:end w:w="70" w:type="dxa"/>
+            </w:tcMar>
+            <w:vAlign w:val="top"/>
+          </w:tcPr>
+          <w:p>
+            <w:pPr/>
+            <w:r>
+              <w:rPr>
+                <w:rFonts w:ascii="Liberation Sans" w:hAnsi="Liberation Sans"/>
+                <w:sz w:val="16"/>
+              </w:rPr>
+              <w:t>Controlled installroot/disposable-VM RPM evidence and package validation records.</w:t>
+            </w:r>
+          </w:p>
+        </w:tc>
+        <w:tc>
+          <w:tcPr>
+            <w:tcW w:type="dxa" w:w="4176"/>
+            <w:tcMar>
+              <w:top w:w="60" w:type="dxa"/>
+              <w:start w:w="70" w:type="dxa"/>
+              <w:bottom w:w="60" w:type="dxa"/>
+              <w:end w:w="70" w:type="dxa"/>
+            </w:tcMar>
+            <w:vAlign w:val="top"/>
+          </w:tcPr>
+          <w:p>
+            <w:pPr/>
+            <w:r>
+              <w:rPr>
+                <w:rFonts w:ascii="Liberation Sans" w:hAnsi="Liberation Sans"/>
+                <w:sz w:val="16"/>
+              </w:rPr>
+              <w:t>Say bounded RPM lifecycle evidence exists; do not say Fedora approval or daily-driver readiness.</w:t>
+            </w:r>
+          </w:p>
+        </w:tc>
+      </w:tr>
+      <w:tr>
+        <w:tc>
+          <w:tcPr>
+            <w:tcW w:type="dxa" w:w="2592"/>
+            <w:tcMar>
+              <w:top w:w="60" w:type="dxa"/>
+              <w:start w:w="70" w:type="dxa"/>
+              <w:bottom w:w="60" w:type="dxa"/>
+              <w:end w:w="70" w:type="dxa"/>
+            </w:tcMar>
+            <w:vAlign w:val="top"/>
+          </w:tcPr>
+          <w:p>
+            <w:pPr/>
+            <w:r>
+              <w:rPr>
+                <w:rFonts w:ascii="Liberation Sans" w:hAnsi="Liberation Sans"/>
+                <w:sz w:val="16"/>
+              </w:rPr>
+              <w:t>Production installer readiness</w:t>
+            </w:r>
+          </w:p>
+        </w:tc>
+        <w:tc>
+          <w:tcPr>
+            <w:tcW w:type="dxa" w:w="2952"/>
+            <w:tcMar>
+              <w:top w:w="60" w:type="dxa"/>
+              <w:start w:w="70" w:type="dxa"/>
+              <w:bottom w:w="60" w:type="dxa"/>
+              <w:end w:w="70" w:type="dxa"/>
+            </w:tcMar>
+            <w:vAlign w:val="top"/>
+          </w:tcPr>
+          <w:p>
+            <w:pPr/>
+            <w:r>
+              <w:rPr>
+                <w:rFonts w:ascii="Liberation Sans" w:hAnsi="Liberation Sans"/>
+                <w:sz w:val="16"/>
+              </w:rPr>
+              <w:t>Contract-only readiness gate with required future artifacts, transcripts, signatures, rollback, and multi-VM evidence.</w:t>
+            </w:r>
+          </w:p>
+        </w:tc>
+        <w:tc>
+          <w:tcPr>
+            <w:tcW w:type="dxa" w:w="4176"/>
+            <w:tcMar>
+              <w:top w:w="60" w:type="dxa"/>
+              <w:start w:w="70" w:type="dxa"/>
+              <w:bottom w:w="60" w:type="dxa"/>
+              <w:end w:w="70" w:type="dxa"/>
+            </w:tcMar>
+            <w:vAlign w:val="top"/>
+          </w:tcPr>
+          <w:p>
+            <w:pPr/>
+            <w:r>
+              <w:rPr>
+                <w:rFonts w:ascii="Liberation Sans" w:hAnsi="Liberation Sans"/>
+                <w:sz w:val="16"/>
+              </w:rPr>
+              <w:t>Say readiness is gated and currently false; do not say Latticra is production installable.</w:t>
+            </w:r>
+          </w:p>
+        </w:tc>
+      </w:tr>
     </w:tbl>
     <w:p>
       <w:pPr>
@@ -5273,6 +5477,53 @@
           </w:p>
         </w:tc>
       </w:tr>
+      <w:tr>
+        <w:tc>
+          <w:tcPr>
+            <w:tcW w:type="dxa" w:w="3331"/>
+          </w:tcPr>
+          <w:p>
+            <w:pPr/>
+            <w:r>
+              <w:rPr>
+                <w:rFonts w:ascii="Liberation Sans" w:hAnsi="Liberation Sans"/>
+                <w:sz w:val="16"/>
+              </w:rPr>
+              <w:t>Platform install lanes</w:t>
+            </w:r>
+          </w:p>
+        </w:tc>
+        <w:tc>
+          <w:tcPr>
+            <w:tcW w:type="dxa" w:w="3331"/>
+          </w:tcPr>
+          <w:p>
+            <w:pPr/>
+            <w:r>
+              <w:rPr>
+                <w:rFonts w:ascii="Liberation Sans" w:hAnsi="Liberation Sans"/>
+                <w:sz w:val="16"/>
+              </w:rPr>
+              <w:t>macOS contracts, Fedora RPM lanes, production readiness gates</w:t>
+            </w:r>
+          </w:p>
+        </w:tc>
+        <w:tc>
+          <w:tcPr>
+            <w:tcW w:type="dxa" w:w="3331"/>
+          </w:tcPr>
+          <w:p>
+            <w:pPr/>
+            <w:r>
+              <w:rPr>
+                <w:rFonts w:ascii="Liberation Sans" w:hAnsi="Liberation Sans"/>
+                <w:sz w:val="16"/>
+              </w:rPr>
+              <w:t>Convert host-facing install claims into dry-run reports, bounded transcripts, and explicit non-readiness evidence.</w:t>
+            </w:r>
+          </w:p>
+        </w:tc>
+      </w:tr>
     </w:tbl>
     <w:p>
       <w:pPr>
@@ -7718,6 +7969,46 @@
     </w:p>
     <w:p>
       <w:pPr>
+        <w:pStyle w:val="Heading2"/>
+      </w:pPr>
+      <w:r>
+        <w:t>6.4 Platform install lanes</w:t>
+      </w:r>
+    </w:p>
+    <w:p>
+      <w:pPr>
+        <w:pStyle w:val="BodyTight"/>
+      </w:pPr>
+      <w:r>
+        <w:t>Platform install work belongs in the substrate only when the target, authority, transcript, and rollback story are named. Latticra now has enough macOS and Fedora evidence to describe platform lanes, but the lanes remain deliberately short of production installer readiness.</w:t>
+      </w:r>
+    </w:p>
+    <w:p>
+      <w:pPr>
+        <w:pStyle w:val="ListBullet"/>
+      </w:pPr>
+      <w:r>
+        <w:t>The macOS lane is user-local and no-effect today: app bundle writer dry-runs, local candidate probes, commit-gate reports, reset/uninstall dry-run contracts, and verification-transcript contracts define what a future managed writer must prove before any app bundle or Application Support file is written.</w:t>
+      </w:r>
+    </w:p>
+    <w:p>
+      <w:pPr>
+        <w:pStyle w:val="ListBullet"/>
+      </w:pPr>
+      <w:r>
+        <w:t>The Fedora lane distinguishes controlled installroot and disposable-VM RPM validation from live-host installation. It can build or inspect local RPM payloads under explicit gates, but Fedora approval, immutable-host support, daily-driver readiness, and production installer readiness stay false.</w:t>
+      </w:r>
+    </w:p>
+    <w:p>
+      <w:pPr>
+        <w:pStyle w:val="ListBullet"/>
+      </w:pPr>
+      <w:r>
+        <w:t>The production installer readiness contract is the promotion boundary. It requires reproducible artifacts, checksums, signatures, SBOM/license metadata, install/uninstall/rollback transcripts, unsupported-target blocking, multi-VM validation, and public non-claims before production_installer_ready can ever become 1.</w:t>
+      </w:r>
+    </w:p>
+    <w:p>
+      <w:pPr>
         <w:pStyle w:val="Heading1"/>
       </w:pPr>
       <w:r>
@@ -12064,6 +12355,46 @@
     </w:p>
     <w:p>
       <w:pPr>
+        <w:pStyle w:val="Heading2"/>
+      </w:pPr>
+      <w:r>
+        <w:t>12.6 Host-platform and installer non-goals</w:t>
+      </w:r>
+    </w:p>
+    <w:p>
+      <w:pPr>
+        <w:pStyle w:val="BodyTight"/>
+      </w:pPr>
+      <w:r>
+        <w:t>Host-platform evidence is especially easy to overread. A dry-run writer, package validation lane, or readiness contract is not the same thing as a supported installer. The handbook should keep those meanings separate.</w:t>
+      </w:r>
+    </w:p>
+    <w:p>
+      <w:pPr>
+        <w:pStyle w:val="ListBullet"/>
+      </w:pPr>
+      <w:r>
+        <w:t>A macOS user-local contract may name $HOME/Applications, Application Support, wrappers, receipts, managed markers, and verification transcript lines, but it must not imply notarization, signing, launchd authority, Keychain access, TCC approval, Endpoint Security, System Extensions, Network Extensions, privileged helpers, or Apple platform approval.</w:t>
+      </w:r>
+    </w:p>
+    <w:p>
+      <w:pPr>
+        <w:pStyle w:val="ListBullet"/>
+      </w:pPr>
+      <w:r>
+        <w:t>A Fedora RPM lifecycle lane may mutate a temporary installroot or disposable VM under explicit gates, but it must not imply live developer-host mutation, sudo readiness, Fedora distribution acceptance, immutable Fedora support, service activation, kernel modules, SELinux policy, boot changes, or daily-driver eligibility.</w:t>
+      </w:r>
+    </w:p>
+    <w:p>
+      <w:pPr>
+        <w:pStyle w:val="ListBullet"/>
+      </w:pPr>
+      <w:r>
+        <w:t>Installer language must preserve the evidence level: dry-run, contract, installroot, disposable VM, manual release-candidate checklist, and production installer readiness are different claims and should never collapse into one public sentence.</w:t>
+      </w:r>
+    </w:p>
+    <w:p>
+      <w:pPr>
         <w:pStyle w:val="Heading1"/>
         <w:jc w:val="center"/>
       </w:pPr>
@@ -15237,6 +15568,46 @@
     </w:p>
     <w:p>
       <w:pPr>
+        <w:pStyle w:val="Heading2"/>
+      </w:pPr>
+      <w:r>
+        <w:t>15.5 Platform validation lanes</w:t>
+      </w:r>
+    </w:p>
+    <w:p>
+      <w:pPr>
+        <w:pStyle w:val="BodyTight"/>
+      </w:pPr>
+      <w:r>
+        <w:t>Platform validation should be treated as evidence stratification. The question is not merely whether a command succeeded; it is where the effect occurred, what was allowed to mutate, and which larger readiness claim remained denied.</w:t>
+      </w:r>
+    </w:p>
+    <w:p>
+      <w:pPr>
+        <w:pStyle w:val="ListBullet"/>
+      </w:pPr>
+      <w:r>
+        <w:t>macOS tests should prove path guards, user-local target selection, managed-marker requirements, closed commit gates, verification-transcript contract fields, reset/uninstall dry-run ordering, and zero host mutation while no writer exists.</w:t>
+      </w:r>
+    </w:p>
+    <w:p>
+      <w:pPr>
+        <w:pStyle w:val="ListBullet"/>
+      </w:pPr>
+      <w:r>
+        <w:t>Fedora tests should distinguish static spec checks, installroot lifecycle evidence, disposable-VM local RPM validation, manual host release-candidate classification, and production-readiness blockers.</w:t>
+      </w:r>
+    </w:p>
+    <w:p>
+      <w:pPr>
+        <w:pStyle w:val="ListBullet"/>
+      </w:pPr>
+      <w:r>
+        <w:t>A platform validation report should always carry negative fields: root_authority=0, network_performed=0, production_installer_ready=0, platform_approval_claimed=0, and daily_driver_install_ready=0 unless a later evidence package proves otherwise.</w:t>
+      </w:r>
+    </w:p>
+    <w:p>
+      <w:pPr>
         <w:pStyle w:val="Heading1"/>
       </w:pPr>
       <w:r>
@@ -17656,7 +18027,7 @@
         <w:rPr>
           <w:rFonts w:ascii="Liberation Serif" w:hAnsi="Liberation Serif"/>
         </w:rPr>
-        <w:t>This edition was derived from the uploaded Latticra Seal handbook and broadened with recent repository material containing Panel installer notes, dry-run and local-prefix install transcripts, receipt and component-marker evidence, Fedora validation snippets, the one-pass field-engine browser artifact, May 25 Lat/LIR no-effect implementation records, Latticra Console Stage-0 foundation records, Nucleus report-only task-boundary refinements, Nadia offline AI Stage-0 through Stage-27 contract records, defensive threat-model validation, runtime-boundary policy expansion, and abuse-case fixture records. The expansion is conservative: it treats the broader project as a substrate architecture and does not claim production security readiness, runtime enforcement, network authority, root authority, kernel integration, SELinux integration, systemd enforcement, Fedora approval, active AI inference, autonomous coding, or tool execution.</w:t>
+        <w:t>This edition was derived from the uploaded Latticra Seal handbook and broadened with recent repository material containing Panel installer notes, dry-run and local-prefix install transcripts, receipt and component-marker evidence, Fedora validation snippets, Fedora installroot/disposable-VM RPM lifecycle records, macOS user-local app-bundle dry-run, commit-gate, reset/uninstall, and verification-transcript contracts, the production-installer readiness contract, the one-pass field-engine browser artifact, May 25 Lat/LIR no-effect implementation records, Latticra Console Stage-0 foundation records, Nucleus report-only task-boundary refinements, Nadia offline AI Stage-0 through Stage-27 contract records, defensive threat-model validation, runtime-boundary policy expansion, and abuse-case fixture records. The expansion is conservative: it treats the broader project as a substrate architecture and does not claim production security readiness, runtime enforcement, network authority, root authority, kernel integration, SELinux integration, systemd enforcement, Fedora approval, Apple platform approval, active AI inference, autonomous coding, tool execution, or production installer readiness.</w:t>
       </w:r>
     </w:p>
     <w:tbl>
@@ -18088,6 +18459,102 @@
           </w:p>
         </w:tc>
       </w:tr>
+      <w:tr>
+        <w:tc>
+          <w:tcPr>
+            <w:tcW w:type="dxa" w:w="4997"/>
+          </w:tcPr>
+          <w:p>
+            <w:pPr/>
+            <w:r>
+              <w:rPr>
+                <w:rFonts w:ascii="Liberation Sans" w:hAnsi="Liberation Sans"/>
+                <w:sz w:val="16"/>
+              </w:rPr>
+              <w:t>macOS user-local app bundle lane</w:t>
+            </w:r>
+          </w:p>
+        </w:tc>
+        <w:tc>
+          <w:tcPr>
+            <w:tcW w:type="dxa" w:w="4997"/>
+          </w:tcPr>
+          <w:p>
+            <w:pPr/>
+            <w:r>
+              <w:rPr>
+                <w:rFonts w:ascii="Liberation Sans" w:hAnsi="Liberation Sans"/>
+                <w:sz w:val="16"/>
+              </w:rPr>
+              <w:t>Dry-run writer posture, user-local app bundle contract, commit gate, reset/uninstall contract, and verification transcript requirements.</w:t>
+            </w:r>
+          </w:p>
+        </w:tc>
+      </w:tr>
+      <w:tr>
+        <w:tc>
+          <w:tcPr>
+            <w:tcW w:type="dxa" w:w="4997"/>
+          </w:tcPr>
+          <w:p>
+            <w:pPr/>
+            <w:r>
+              <w:rPr>
+                <w:rFonts w:ascii="Liberation Sans" w:hAnsi="Liberation Sans"/>
+                <w:sz w:val="16"/>
+              </w:rPr>
+              <w:t>Fedora RPM validation lanes</w:t>
+            </w:r>
+          </w:p>
+        </w:tc>
+        <w:tc>
+          <w:tcPr>
+            <w:tcW w:type="dxa" w:w="4997"/>
+          </w:tcPr>
+          <w:p>
+            <w:pPr/>
+            <w:r>
+              <w:rPr>
+                <w:rFonts w:ascii="Liberation Sans" w:hAnsi="Liberation Sans"/>
+                <w:sz w:val="16"/>
+              </w:rPr>
+              <w:t>Installroot and disposable-VM RPM lifecycle evidence, bounded host-facing validation vocabulary, and Fedora non-claims.</w:t>
+            </w:r>
+          </w:p>
+        </w:tc>
+      </w:tr>
+      <w:tr>
+        <w:tc>
+          <w:tcPr>
+            <w:tcW w:type="dxa" w:w="4997"/>
+          </w:tcPr>
+          <w:p>
+            <w:pPr/>
+            <w:r>
+              <w:rPr>
+                <w:rFonts w:ascii="Liberation Sans" w:hAnsi="Liberation Sans"/>
+                <w:sz w:val="16"/>
+              </w:rPr>
+              <w:t>Production installer readiness contract</w:t>
+            </w:r>
+          </w:p>
+        </w:tc>
+        <w:tc>
+          <w:tcPr>
+            <w:tcW w:type="dxa" w:w="4997"/>
+          </w:tcPr>
+          <w:p>
+            <w:pPr/>
+            <w:r>
+              <w:rPr>
+                <w:rFonts w:ascii="Liberation Sans" w:hAnsi="Liberation Sans"/>
+                <w:sz w:val="16"/>
+              </w:rPr>
+              <w:t>Promotion gates for future installer artifacts, signatures, SBOM, install/uninstall/rollback transcripts, multi-VM validation, and readiness non-claims.</w:t>
+            </w:r>
+          </w:p>
+        </w:tc>
+      </w:tr>
     </w:tbl>
     <w:p>
       <w:pPr>
@@ -18102,7 +18569,7 @@
         <w:rPr>
           <w:rFonts w:ascii="Liberation Serif" w:hAnsi="Liberation Serif"/>
         </w:rPr>
-        <w:t>Future editions should replace inferred project-level connective tissue with canonical repository documents as they mature: a root architecture spec, Lat/LIR spec, Panel UX contract, Latticra Console host-embedding contract, Nucleus task-record schema, Nadia offline-AI contract ladder, installer readiness contract, report schema, receipt schema, and runtime-handoff specification.</w:t>
+        <w:t>Future editions should replace inferred project-level connective tissue with canonical repository documents as they mature: a root architecture spec, Lat/LIR spec, Panel UX contract, Latticra Console host-embedding contract, Nucleus task-record schema, Nadia offline-AI contract ladder, installer readiness contract, macOS app-bundle writer contract, Fedora RPM validation contract, report schema, receipt schema, and runtime-handoff specification.</w:t>
       </w:r>
     </w:p>
     <w:p>
@@ -18194,6 +18661,14 @@
       </w:pPr>
       <w:r>
         <w:t>For AI-era surfaces, distinguish contract metadata from model loading, prompt tokenization, inference, dialogue generation, source mutation, and tool execution.</w:t>
+      </w:r>
+    </w:p>
+    <w:p>
+      <w:pPr>
+        <w:pStyle w:val="ListNumber"/>
+      </w:pPr>
+      <w:r>
+        <w:t>For platform work, distinguish dry-run, installroot, disposable-VM, manual-host, and production-installer evidence before making any readiness claim.</w:t>
       </w:r>
     </w:p>
     <w:p>

</xml_diff>

<commit_message>
Advance Nadia to Stage 28 prompt evaluation input
</commit_message>
<xml_diff>
--- a/docs/latticra-system-substrate/the-latticra-system-substrate.docx
+++ b/docs/latticra-system-substrate/the-latticra-system-substrate.docx
@@ -101,11 +101,10 @@
       </w:pPr>
       <w:r>
         <w:rPr>
-          <w:rFonts w:ascii="Liberation Sans" w:hAnsi="Liberation Sans"/>
-          <w:color w:val="475569"/>
+          <w:rFonts w:ascii="Liberation Sans" w:hAnsi="Liberation Sans" w:eastAsia="Liberation Sans"/>
           <w:sz w:val="20"/>
         </w:rPr>
-        <w:t>Working Draft 0.6 - 2026-05-25</w:t>
+        <w:t>Working Draft 0.7 - 2026-05-25</w:t>
       </w:r>
     </w:p>
     <w:p>
@@ -155,9 +154,9 @@
       </w:pPr>
       <w:r>
         <w:rPr>
-          <w:rFonts w:ascii="Liberation Serif" w:hAnsi="Liberation Serif"/>
+          <w:rFonts w:ascii="Liberation Serif" w:hAnsi="Liberation Serif" w:eastAsia="Liberation Serif"/>
         </w:rPr>
-        <w:t>Source posture: this edition draws from the Seal handbook plus current Panel/installer receipts, Fedora and macOS platform-validation records, production-installer readiness gates, Lat/LIR, Latticra Console, Nucleus, Nadia Stage-27, threat-model, runtime-boundary, and abuse-case evidence. Where project documents are not yet canonical, this book uses conservative connective tissue rather than asserting implementation details.</w:t>
+        <w:t>Source posture: this edition draws from the Seal handbook plus current Seal signed-request, request-freshness, verification-receipt, crypto-verify-backend, capability-gate, and effect-decision metadata records; Panel/installer receipts; Fedora and macOS platform-validation records; production-installer readiness gates; Lat/LIR; Latticra Console; Nucleus; Nadia Stage-27; threat-model, runtime-boundary, and abuse-case evidence. Where project documents are not yet canonical, this book uses conservative connective tissue rather than asserting implementation details.</w:t>
       </w:r>
     </w:p>
     <w:p>
@@ -3273,12 +3272,17 @@
           </w:tcPr>
           <w:p>
             <w:pPr>
-              <w:spacing w:after="0"/>
-            </w:pPr>
-            <w:r/>
-            <w:r>
-              <w:rPr>
-                <w:rFonts w:ascii="Liberation Sans" w:hAnsi="Liberation Sans"/>
+              <w:spacing w:after="0" w:before="0" w:line="240" w:lineRule="auto"/>
+            </w:pPr>
+            <w:r>
+              <w:rPr>
+                <w:rFonts w:ascii="Liberation Sans" w:hAnsi="Liberation Sans" w:eastAsia="Liberation Sans"/>
+                <w:sz w:val="16"/>
+              </w:rPr>
+            </w:r>
+            <w:r>
+              <w:rPr>
+                <w:rFonts w:ascii="Liberation Sans" w:hAnsi="Liberation Sans" w:eastAsia="Liberation Sans"/>
                 <w:color w:val="0F172A"/>
                 <w:sz w:val="16"/>
               </w:rPr>
@@ -3299,12 +3303,17 @@
           </w:tcPr>
           <w:p>
             <w:pPr>
-              <w:spacing w:after="0"/>
-            </w:pPr>
-            <w:r/>
-            <w:r>
-              <w:rPr>
-                <w:rFonts w:ascii="Liberation Sans" w:hAnsi="Liberation Sans"/>
+              <w:spacing w:after="0" w:before="0" w:line="240" w:lineRule="auto"/>
+            </w:pPr>
+            <w:r>
+              <w:rPr>
+                <w:rFonts w:ascii="Liberation Sans" w:hAnsi="Liberation Sans" w:eastAsia="Liberation Sans"/>
+                <w:sz w:val="16"/>
+              </w:rPr>
+            </w:r>
+            <w:r>
+              <w:rPr>
+                <w:rFonts w:ascii="Liberation Sans" w:hAnsi="Liberation Sans" w:eastAsia="Liberation Sans"/>
                 <w:color w:val="0F172A"/>
                 <w:sz w:val="16"/>
               </w:rPr>
@@ -3325,12 +3334,17 @@
           </w:tcPr>
           <w:p>
             <w:pPr>
-              <w:spacing w:after="0"/>
-            </w:pPr>
-            <w:r/>
-            <w:r>
-              <w:rPr>
-                <w:rFonts w:ascii="Liberation Sans" w:hAnsi="Liberation Sans"/>
+              <w:spacing w:after="0" w:before="0" w:line="240" w:lineRule="auto"/>
+            </w:pPr>
+            <w:r>
+              <w:rPr>
+                <w:rFonts w:ascii="Liberation Sans" w:hAnsi="Liberation Sans" w:eastAsia="Liberation Sans"/>
+                <w:sz w:val="16"/>
+              </w:rPr>
+            </w:r>
+            <w:r>
+              <w:rPr>
+                <w:rFonts w:ascii="Liberation Sans" w:hAnsi="Liberation Sans" w:eastAsia="Liberation Sans"/>
                 <w:color w:val="0F172A"/>
                 <w:sz w:val="16"/>
               </w:rPr>
@@ -3353,12 +3367,17 @@
           </w:tcPr>
           <w:p>
             <w:pPr>
-              <w:spacing w:after="0"/>
-            </w:pPr>
-            <w:r/>
-            <w:r>
-              <w:rPr>
-                <w:rFonts w:ascii="Liberation Sans" w:hAnsi="Liberation Sans"/>
+              <w:spacing w:after="0" w:before="0" w:line="240" w:lineRule="auto"/>
+            </w:pPr>
+            <w:r>
+              <w:rPr>
+                <w:rFonts w:ascii="Liberation Sans" w:hAnsi="Liberation Sans" w:eastAsia="Liberation Sans"/>
+                <w:sz w:val="16"/>
+              </w:rPr>
+            </w:r>
+            <w:r>
+              <w:rPr>
+                <w:rFonts w:ascii="Liberation Sans" w:hAnsi="Liberation Sans" w:eastAsia="Liberation Sans"/>
                 <w:color w:val="0F172A"/>
                 <w:sz w:val="16"/>
               </w:rPr>
@@ -3379,12 +3398,17 @@
           </w:tcPr>
           <w:p>
             <w:pPr>
-              <w:spacing w:after="0"/>
-            </w:pPr>
-            <w:r/>
-            <w:r>
-              <w:rPr>
-                <w:rFonts w:ascii="Liberation Sans" w:hAnsi="Liberation Sans"/>
+              <w:spacing w:after="0" w:before="0" w:line="240" w:lineRule="auto"/>
+            </w:pPr>
+            <w:r>
+              <w:rPr>
+                <w:rFonts w:ascii="Liberation Sans" w:hAnsi="Liberation Sans" w:eastAsia="Liberation Sans"/>
+                <w:sz w:val="16"/>
+              </w:rPr>
+            </w:r>
+            <w:r>
+              <w:rPr>
+                <w:rFonts w:ascii="Liberation Sans" w:hAnsi="Liberation Sans" w:eastAsia="Liberation Sans"/>
                 <w:color w:val="0F172A"/>
                 <w:sz w:val="16"/>
               </w:rPr>
@@ -3405,12 +3429,17 @@
           </w:tcPr>
           <w:p>
             <w:pPr>
-              <w:spacing w:after="0"/>
-            </w:pPr>
-            <w:r/>
-            <w:r>
-              <w:rPr>
-                <w:rFonts w:ascii="Liberation Sans" w:hAnsi="Liberation Sans"/>
+              <w:spacing w:after="0" w:before="0" w:line="240" w:lineRule="auto"/>
+            </w:pPr>
+            <w:r>
+              <w:rPr>
+                <w:rFonts w:ascii="Liberation Sans" w:hAnsi="Liberation Sans" w:eastAsia="Liberation Sans"/>
+                <w:sz w:val="16"/>
+              </w:rPr>
+            </w:r>
+            <w:r>
+              <w:rPr>
+                <w:rFonts w:ascii="Liberation Sans" w:hAnsi="Liberation Sans" w:eastAsia="Liberation Sans"/>
                 <w:color w:val="0F172A"/>
                 <w:sz w:val="16"/>
               </w:rPr>
@@ -3433,12 +3462,17 @@
           </w:tcPr>
           <w:p>
             <w:pPr>
-              <w:spacing w:after="0"/>
-            </w:pPr>
-            <w:r/>
-            <w:r>
-              <w:rPr>
-                <w:rFonts w:ascii="Liberation Sans" w:hAnsi="Liberation Sans"/>
+              <w:spacing w:after="0" w:before="0" w:line="240" w:lineRule="auto"/>
+            </w:pPr>
+            <w:r>
+              <w:rPr>
+                <w:rFonts w:ascii="Liberation Sans" w:hAnsi="Liberation Sans" w:eastAsia="Liberation Sans"/>
+                <w:sz w:val="16"/>
+              </w:rPr>
+            </w:r>
+            <w:r>
+              <w:rPr>
+                <w:rFonts w:ascii="Liberation Sans" w:hAnsi="Liberation Sans" w:eastAsia="Liberation Sans"/>
                 <w:color w:val="0F172A"/>
                 <w:sz w:val="16"/>
               </w:rPr>
@@ -3459,12 +3493,17 @@
           </w:tcPr>
           <w:p>
             <w:pPr>
-              <w:spacing w:after="0"/>
-            </w:pPr>
-            <w:r/>
-            <w:r>
-              <w:rPr>
-                <w:rFonts w:ascii="Liberation Sans" w:hAnsi="Liberation Sans"/>
+              <w:spacing w:after="0" w:before="0" w:line="240" w:lineRule="auto"/>
+            </w:pPr>
+            <w:r>
+              <w:rPr>
+                <w:rFonts w:ascii="Liberation Sans" w:hAnsi="Liberation Sans" w:eastAsia="Liberation Sans"/>
+                <w:sz w:val="16"/>
+              </w:rPr>
+            </w:r>
+            <w:r>
+              <w:rPr>
+                <w:rFonts w:ascii="Liberation Sans" w:hAnsi="Liberation Sans" w:eastAsia="Liberation Sans"/>
                 <w:color w:val="0F172A"/>
                 <w:sz w:val="16"/>
               </w:rPr>
@@ -3485,12 +3524,17 @@
           </w:tcPr>
           <w:p>
             <w:pPr>
-              <w:spacing w:after="0"/>
-            </w:pPr>
-            <w:r/>
-            <w:r>
-              <w:rPr>
-                <w:rFonts w:ascii="Liberation Sans" w:hAnsi="Liberation Sans"/>
+              <w:spacing w:after="0" w:before="0" w:line="240" w:lineRule="auto"/>
+            </w:pPr>
+            <w:r>
+              <w:rPr>
+                <w:rFonts w:ascii="Liberation Sans" w:hAnsi="Liberation Sans" w:eastAsia="Liberation Sans"/>
+                <w:sz w:val="16"/>
+              </w:rPr>
+            </w:r>
+            <w:r>
+              <w:rPr>
+                <w:rFonts w:ascii="Liberation Sans" w:hAnsi="Liberation Sans" w:eastAsia="Liberation Sans"/>
                 <w:color w:val="0F172A"/>
                 <w:sz w:val="16"/>
               </w:rPr>
@@ -3513,12 +3557,17 @@
           </w:tcPr>
           <w:p>
             <w:pPr>
-              <w:spacing w:after="0"/>
-            </w:pPr>
-            <w:r/>
-            <w:r>
-              <w:rPr>
-                <w:rFonts w:ascii="Liberation Sans" w:hAnsi="Liberation Sans"/>
+              <w:spacing w:after="0" w:before="0" w:line="240" w:lineRule="auto"/>
+            </w:pPr>
+            <w:r>
+              <w:rPr>
+                <w:rFonts w:ascii="Liberation Sans" w:hAnsi="Liberation Sans" w:eastAsia="Liberation Sans"/>
+                <w:sz w:val="16"/>
+              </w:rPr>
+            </w:r>
+            <w:r>
+              <w:rPr>
+                <w:rFonts w:ascii="Liberation Sans" w:hAnsi="Liberation Sans" w:eastAsia="Liberation Sans"/>
                 <w:color w:val="0F172A"/>
                 <w:sz w:val="16"/>
               </w:rPr>
@@ -3539,12 +3588,17 @@
           </w:tcPr>
           <w:p>
             <w:pPr>
-              <w:spacing w:after="0"/>
-            </w:pPr>
-            <w:r/>
-            <w:r>
-              <w:rPr>
-                <w:rFonts w:ascii="Liberation Sans" w:hAnsi="Liberation Sans"/>
+              <w:spacing w:after="0" w:before="0" w:line="240" w:lineRule="auto"/>
+            </w:pPr>
+            <w:r>
+              <w:rPr>
+                <w:rFonts w:ascii="Liberation Sans" w:hAnsi="Liberation Sans" w:eastAsia="Liberation Sans"/>
+                <w:sz w:val="16"/>
+              </w:rPr>
+            </w:r>
+            <w:r>
+              <w:rPr>
+                <w:rFonts w:ascii="Liberation Sans" w:hAnsi="Liberation Sans" w:eastAsia="Liberation Sans"/>
                 <w:color w:val="0F172A"/>
                 <w:sz w:val="16"/>
               </w:rPr>
@@ -3565,12 +3619,17 @@
           </w:tcPr>
           <w:p>
             <w:pPr>
-              <w:spacing w:after="0"/>
-            </w:pPr>
-            <w:r/>
-            <w:r>
-              <w:rPr>
-                <w:rFonts w:ascii="Liberation Sans" w:hAnsi="Liberation Sans"/>
+              <w:spacing w:after="0" w:before="0" w:line="240" w:lineRule="auto"/>
+            </w:pPr>
+            <w:r>
+              <w:rPr>
+                <w:rFonts w:ascii="Liberation Sans" w:hAnsi="Liberation Sans" w:eastAsia="Liberation Sans"/>
+                <w:sz w:val="16"/>
+              </w:rPr>
+            </w:r>
+            <w:r>
+              <w:rPr>
+                <w:rFonts w:ascii="Liberation Sans" w:hAnsi="Liberation Sans" w:eastAsia="Liberation Sans"/>
                 <w:color w:val="0F172A"/>
                 <w:sz w:val="16"/>
               </w:rPr>
@@ -3593,12 +3652,17 @@
           </w:tcPr>
           <w:p>
             <w:pPr>
-              <w:spacing w:after="0"/>
-            </w:pPr>
-            <w:r/>
-            <w:r>
-              <w:rPr>
-                <w:rFonts w:ascii="Liberation Sans" w:hAnsi="Liberation Sans"/>
+              <w:spacing w:after="0" w:before="0" w:line="240" w:lineRule="auto"/>
+            </w:pPr>
+            <w:r>
+              <w:rPr>
+                <w:rFonts w:ascii="Liberation Sans" w:hAnsi="Liberation Sans" w:eastAsia="Liberation Sans"/>
+                <w:sz w:val="16"/>
+              </w:rPr>
+            </w:r>
+            <w:r>
+              <w:rPr>
+                <w:rFonts w:ascii="Liberation Sans" w:hAnsi="Liberation Sans" w:eastAsia="Liberation Sans"/>
                 <w:color w:val="0F172A"/>
                 <w:sz w:val="16"/>
               </w:rPr>
@@ -3619,12 +3683,17 @@
           </w:tcPr>
           <w:p>
             <w:pPr>
-              <w:spacing w:after="0"/>
-            </w:pPr>
-            <w:r/>
-            <w:r>
-              <w:rPr>
-                <w:rFonts w:ascii="Liberation Sans" w:hAnsi="Liberation Sans"/>
+              <w:spacing w:after="0" w:before="0" w:line="240" w:lineRule="auto"/>
+            </w:pPr>
+            <w:r>
+              <w:rPr>
+                <w:rFonts w:ascii="Liberation Sans" w:hAnsi="Liberation Sans" w:eastAsia="Liberation Sans"/>
+                <w:sz w:val="16"/>
+              </w:rPr>
+            </w:r>
+            <w:r>
+              <w:rPr>
+                <w:rFonts w:ascii="Liberation Sans" w:hAnsi="Liberation Sans" w:eastAsia="Liberation Sans"/>
                 <w:color w:val="0F172A"/>
                 <w:sz w:val="16"/>
               </w:rPr>
@@ -3645,12 +3714,17 @@
           </w:tcPr>
           <w:p>
             <w:pPr>
-              <w:spacing w:after="0"/>
-            </w:pPr>
-            <w:r/>
-            <w:r>
-              <w:rPr>
-                <w:rFonts w:ascii="Liberation Sans" w:hAnsi="Liberation Sans"/>
+              <w:spacing w:after="0" w:before="0" w:line="240" w:lineRule="auto"/>
+            </w:pPr>
+            <w:r>
+              <w:rPr>
+                <w:rFonts w:ascii="Liberation Sans" w:hAnsi="Liberation Sans" w:eastAsia="Liberation Sans"/>
+                <w:sz w:val="16"/>
+              </w:rPr>
+            </w:r>
+            <w:r>
+              <w:rPr>
+                <w:rFonts w:ascii="Liberation Sans" w:hAnsi="Liberation Sans" w:eastAsia="Liberation Sans"/>
                 <w:color w:val="0F172A"/>
                 <w:sz w:val="16"/>
               </w:rPr>
@@ -3673,12 +3747,17 @@
           </w:tcPr>
           <w:p>
             <w:pPr>
-              <w:spacing w:after="0"/>
-            </w:pPr>
-            <w:r/>
-            <w:r>
-              <w:rPr>
-                <w:rFonts w:ascii="Liberation Sans" w:hAnsi="Liberation Sans"/>
+              <w:spacing w:after="0" w:before="0" w:line="240" w:lineRule="auto"/>
+            </w:pPr>
+            <w:r>
+              <w:rPr>
+                <w:rFonts w:ascii="Liberation Sans" w:hAnsi="Liberation Sans" w:eastAsia="Liberation Sans"/>
+                <w:sz w:val="16"/>
+              </w:rPr>
+            </w:r>
+            <w:r>
+              <w:rPr>
+                <w:rFonts w:ascii="Liberation Sans" w:hAnsi="Liberation Sans" w:eastAsia="Liberation Sans"/>
                 <w:color w:val="0F172A"/>
                 <w:sz w:val="16"/>
               </w:rPr>
@@ -3699,12 +3778,17 @@
           </w:tcPr>
           <w:p>
             <w:pPr>
-              <w:spacing w:after="0"/>
-            </w:pPr>
-            <w:r/>
-            <w:r>
-              <w:rPr>
-                <w:rFonts w:ascii="Liberation Sans" w:hAnsi="Liberation Sans"/>
+              <w:spacing w:after="0" w:before="0" w:line="240" w:lineRule="auto"/>
+            </w:pPr>
+            <w:r>
+              <w:rPr>
+                <w:rFonts w:ascii="Liberation Sans" w:hAnsi="Liberation Sans" w:eastAsia="Liberation Sans"/>
+                <w:sz w:val="16"/>
+              </w:rPr>
+            </w:r>
+            <w:r>
+              <w:rPr>
+                <w:rFonts w:ascii="Liberation Sans" w:hAnsi="Liberation Sans" w:eastAsia="Liberation Sans"/>
                 <w:color w:val="0F172A"/>
                 <w:sz w:val="16"/>
               </w:rPr>
@@ -3725,12 +3809,17 @@
           </w:tcPr>
           <w:p>
             <w:pPr>
-              <w:spacing w:after="0"/>
-            </w:pPr>
-            <w:r/>
-            <w:r>
-              <w:rPr>
-                <w:rFonts w:ascii="Liberation Sans" w:hAnsi="Liberation Sans"/>
+              <w:spacing w:after="0" w:before="0" w:line="240" w:lineRule="auto"/>
+            </w:pPr>
+            <w:r>
+              <w:rPr>
+                <w:rFonts w:ascii="Liberation Sans" w:hAnsi="Liberation Sans" w:eastAsia="Liberation Sans"/>
+                <w:sz w:val="16"/>
+              </w:rPr>
+            </w:r>
+            <w:r>
+              <w:rPr>
+                <w:rFonts w:ascii="Liberation Sans" w:hAnsi="Liberation Sans" w:eastAsia="Liberation Sans"/>
                 <w:color w:val="0F172A"/>
                 <w:sz w:val="16"/>
               </w:rPr>
@@ -3753,12 +3842,17 @@
           </w:tcPr>
           <w:p>
             <w:pPr>
-              <w:spacing w:after="0"/>
-            </w:pPr>
-            <w:r/>
-            <w:r>
-              <w:rPr>
-                <w:rFonts w:ascii="Liberation Sans" w:hAnsi="Liberation Sans"/>
+              <w:spacing w:after="0" w:before="0" w:line="240" w:lineRule="auto"/>
+            </w:pPr>
+            <w:r>
+              <w:rPr>
+                <w:rFonts w:ascii="Liberation Sans" w:hAnsi="Liberation Sans" w:eastAsia="Liberation Sans"/>
+                <w:sz w:val="16"/>
+              </w:rPr>
+            </w:r>
+            <w:r>
+              <w:rPr>
+                <w:rFonts w:ascii="Liberation Sans" w:hAnsi="Liberation Sans" w:eastAsia="Liberation Sans"/>
                 <w:color w:val="0F172A"/>
                 <w:sz w:val="16"/>
               </w:rPr>
@@ -3779,12 +3873,17 @@
           </w:tcPr>
           <w:p>
             <w:pPr>
-              <w:spacing w:after="0"/>
-            </w:pPr>
-            <w:r/>
-            <w:r>
-              <w:rPr>
-                <w:rFonts w:ascii="Liberation Sans" w:hAnsi="Liberation Sans"/>
+              <w:spacing w:after="0" w:before="0" w:line="240" w:lineRule="auto"/>
+            </w:pPr>
+            <w:r>
+              <w:rPr>
+                <w:rFonts w:ascii="Liberation Sans" w:hAnsi="Liberation Sans" w:eastAsia="Liberation Sans"/>
+                <w:sz w:val="16"/>
+              </w:rPr>
+            </w:r>
+            <w:r>
+              <w:rPr>
+                <w:rFonts w:ascii="Liberation Sans" w:hAnsi="Liberation Sans" w:eastAsia="Liberation Sans"/>
                 <w:color w:val="0F172A"/>
                 <w:sz w:val="16"/>
               </w:rPr>
@@ -3805,12 +3904,17 @@
           </w:tcPr>
           <w:p>
             <w:pPr>
-              <w:spacing w:after="0"/>
-            </w:pPr>
-            <w:r/>
-            <w:r>
-              <w:rPr>
-                <w:rFonts w:ascii="Liberation Sans" w:hAnsi="Liberation Sans"/>
+              <w:spacing w:after="0" w:before="0" w:line="240" w:lineRule="auto"/>
+            </w:pPr>
+            <w:r>
+              <w:rPr>
+                <w:rFonts w:ascii="Liberation Sans" w:hAnsi="Liberation Sans" w:eastAsia="Liberation Sans"/>
+                <w:sz w:val="16"/>
+              </w:rPr>
+            </w:r>
+            <w:r>
+              <w:rPr>
+                <w:rFonts w:ascii="Liberation Sans" w:hAnsi="Liberation Sans" w:eastAsia="Liberation Sans"/>
                 <w:color w:val="0F172A"/>
                 <w:sz w:val="16"/>
               </w:rPr>
@@ -3833,12 +3937,17 @@
           </w:tcPr>
           <w:p>
             <w:pPr>
-              <w:spacing w:after="0"/>
-            </w:pPr>
-            <w:r/>
-            <w:r>
-              <w:rPr>
-                <w:rFonts w:ascii="Liberation Sans" w:hAnsi="Liberation Sans"/>
+              <w:spacing w:after="0" w:before="0" w:line="240" w:lineRule="auto"/>
+            </w:pPr>
+            <w:r>
+              <w:rPr>
+                <w:rFonts w:ascii="Liberation Sans" w:hAnsi="Liberation Sans" w:eastAsia="Liberation Sans"/>
+                <w:sz w:val="16"/>
+              </w:rPr>
+            </w:r>
+            <w:r>
+              <w:rPr>
+                <w:rFonts w:ascii="Liberation Sans" w:hAnsi="Liberation Sans" w:eastAsia="Liberation Sans"/>
                 <w:color w:val="0F172A"/>
                 <w:sz w:val="16"/>
               </w:rPr>
@@ -3859,12 +3968,17 @@
           </w:tcPr>
           <w:p>
             <w:pPr>
-              <w:spacing w:after="0"/>
-            </w:pPr>
-            <w:r/>
-            <w:r>
-              <w:rPr>
-                <w:rFonts w:ascii="Liberation Sans" w:hAnsi="Liberation Sans"/>
+              <w:spacing w:after="0" w:before="0" w:line="240" w:lineRule="auto"/>
+            </w:pPr>
+            <w:r>
+              <w:rPr>
+                <w:rFonts w:ascii="Liberation Sans" w:hAnsi="Liberation Sans" w:eastAsia="Liberation Sans"/>
+                <w:sz w:val="16"/>
+              </w:rPr>
+            </w:r>
+            <w:r>
+              <w:rPr>
+                <w:rFonts w:ascii="Liberation Sans" w:hAnsi="Liberation Sans" w:eastAsia="Liberation Sans"/>
                 <w:color w:val="0F172A"/>
                 <w:sz w:val="16"/>
               </w:rPr>
@@ -3885,12 +3999,17 @@
           </w:tcPr>
           <w:p>
             <w:pPr>
-              <w:spacing w:after="0"/>
-            </w:pPr>
-            <w:r/>
-            <w:r>
-              <w:rPr>
-                <w:rFonts w:ascii="Liberation Sans" w:hAnsi="Liberation Sans"/>
+              <w:spacing w:after="0" w:before="0" w:line="240" w:lineRule="auto"/>
+            </w:pPr>
+            <w:r>
+              <w:rPr>
+                <w:rFonts w:ascii="Liberation Sans" w:hAnsi="Liberation Sans" w:eastAsia="Liberation Sans"/>
+                <w:sz w:val="16"/>
+              </w:rPr>
+            </w:r>
+            <w:r>
+              <w:rPr>
+                <w:rFonts w:ascii="Liberation Sans" w:hAnsi="Liberation Sans" w:eastAsia="Liberation Sans"/>
                 <w:color w:val="0F172A"/>
                 <w:sz w:val="16"/>
               </w:rPr>
@@ -3913,12 +4032,17 @@
           </w:tcPr>
           <w:p>
             <w:pPr>
-              <w:spacing w:after="0"/>
-            </w:pPr>
-            <w:r/>
-            <w:r>
-              <w:rPr>
-                <w:rFonts w:ascii="Liberation Sans" w:hAnsi="Liberation Sans"/>
+              <w:spacing w:after="0" w:before="0" w:line="240" w:lineRule="auto"/>
+            </w:pPr>
+            <w:r>
+              <w:rPr>
+                <w:rFonts w:ascii="Liberation Sans" w:hAnsi="Liberation Sans" w:eastAsia="Liberation Sans"/>
+                <w:sz w:val="16"/>
+              </w:rPr>
+            </w:r>
+            <w:r>
+              <w:rPr>
+                <w:rFonts w:ascii="Liberation Sans" w:hAnsi="Liberation Sans" w:eastAsia="Liberation Sans"/>
                 <w:color w:val="0F172A"/>
                 <w:sz w:val="16"/>
               </w:rPr>
@@ -3939,12 +4063,17 @@
           </w:tcPr>
           <w:p>
             <w:pPr>
-              <w:spacing w:after="0"/>
-            </w:pPr>
-            <w:r/>
-            <w:r>
-              <w:rPr>
-                <w:rFonts w:ascii="Liberation Sans" w:hAnsi="Liberation Sans"/>
+              <w:spacing w:after="0" w:before="0" w:line="240" w:lineRule="auto"/>
+            </w:pPr>
+            <w:r>
+              <w:rPr>
+                <w:rFonts w:ascii="Liberation Sans" w:hAnsi="Liberation Sans" w:eastAsia="Liberation Sans"/>
+                <w:sz w:val="16"/>
+              </w:rPr>
+            </w:r>
+            <w:r>
+              <w:rPr>
+                <w:rFonts w:ascii="Liberation Sans" w:hAnsi="Liberation Sans" w:eastAsia="Liberation Sans"/>
                 <w:color w:val="0F172A"/>
                 <w:sz w:val="16"/>
               </w:rPr>
@@ -3965,12 +4094,17 @@
           </w:tcPr>
           <w:p>
             <w:pPr>
-              <w:spacing w:after="0"/>
-            </w:pPr>
-            <w:r/>
-            <w:r>
-              <w:rPr>
-                <w:rFonts w:ascii="Liberation Sans" w:hAnsi="Liberation Sans"/>
+              <w:spacing w:after="0" w:before="0" w:line="240" w:lineRule="auto"/>
+            </w:pPr>
+            <w:r>
+              <w:rPr>
+                <w:rFonts w:ascii="Liberation Sans" w:hAnsi="Liberation Sans" w:eastAsia="Liberation Sans"/>
+                <w:sz w:val="16"/>
+              </w:rPr>
+            </w:r>
+            <w:r>
+              <w:rPr>
+                <w:rFonts w:ascii="Liberation Sans" w:hAnsi="Liberation Sans" w:eastAsia="Liberation Sans"/>
                 <w:color w:val="0F172A"/>
                 <w:sz w:val="16"/>
               </w:rPr>
@@ -3993,12 +4127,17 @@
           </w:tcPr>
           <w:p>
             <w:pPr>
-              <w:spacing w:after="0"/>
-            </w:pPr>
-            <w:r/>
-            <w:r>
-              <w:rPr>
-                <w:rFonts w:ascii="Liberation Sans" w:hAnsi="Liberation Sans"/>
+              <w:spacing w:after="0" w:before="0" w:line="240" w:lineRule="auto"/>
+            </w:pPr>
+            <w:r>
+              <w:rPr>
+                <w:rFonts w:ascii="Liberation Sans" w:hAnsi="Liberation Sans" w:eastAsia="Liberation Sans"/>
+                <w:sz w:val="16"/>
+              </w:rPr>
+            </w:r>
+            <w:r>
+              <w:rPr>
+                <w:rFonts w:ascii="Liberation Sans" w:hAnsi="Liberation Sans" w:eastAsia="Liberation Sans"/>
                 <w:color w:val="0F172A"/>
                 <w:sz w:val="16"/>
               </w:rPr>
@@ -4019,12 +4158,17 @@
           </w:tcPr>
           <w:p>
             <w:pPr>
-              <w:spacing w:after="0"/>
-            </w:pPr>
-            <w:r/>
-            <w:r>
-              <w:rPr>
-                <w:rFonts w:ascii="Liberation Sans" w:hAnsi="Liberation Sans"/>
+              <w:spacing w:after="0" w:before="0" w:line="240" w:lineRule="auto"/>
+            </w:pPr>
+            <w:r>
+              <w:rPr>
+                <w:rFonts w:ascii="Liberation Sans" w:hAnsi="Liberation Sans" w:eastAsia="Liberation Sans"/>
+                <w:sz w:val="16"/>
+              </w:rPr>
+            </w:r>
+            <w:r>
+              <w:rPr>
+                <w:rFonts w:ascii="Liberation Sans" w:hAnsi="Liberation Sans" w:eastAsia="Liberation Sans"/>
                 <w:color w:val="0F172A"/>
                 <w:sz w:val="16"/>
               </w:rPr>
@@ -4045,12 +4189,17 @@
           </w:tcPr>
           <w:p>
             <w:pPr>
-              <w:spacing w:after="0"/>
-            </w:pPr>
-            <w:r/>
-            <w:r>
-              <w:rPr>
-                <w:rFonts w:ascii="Liberation Sans" w:hAnsi="Liberation Sans"/>
+              <w:spacing w:after="0" w:before="0" w:line="240" w:lineRule="auto"/>
+            </w:pPr>
+            <w:r>
+              <w:rPr>
+                <w:rFonts w:ascii="Liberation Sans" w:hAnsi="Liberation Sans" w:eastAsia="Liberation Sans"/>
+                <w:sz w:val="16"/>
+              </w:rPr>
+            </w:r>
+            <w:r>
+              <w:rPr>
+                <w:rFonts w:ascii="Liberation Sans" w:hAnsi="Liberation Sans" w:eastAsia="Liberation Sans"/>
                 <w:color w:val="0F172A"/>
                 <w:sz w:val="16"/>
               </w:rPr>
@@ -4072,10 +4221,12 @@
             <w:vAlign w:val="top"/>
           </w:tcPr>
           <w:p>
-            <w:pPr/>
-            <w:r>
-              <w:rPr>
-                <w:rFonts w:ascii="Liberation Sans" w:hAnsi="Liberation Sans"/>
+            <w:pPr>
+              <w:spacing w:before="0" w:after="0" w:line="240" w:lineRule="auto"/>
+            </w:pPr>
+            <w:r>
+              <w:rPr>
+                <w:rFonts w:ascii="Liberation Sans" w:hAnsi="Liberation Sans" w:eastAsia="Liberation Sans"/>
                 <w:sz w:val="16"/>
               </w:rPr>
               <w:t>Nucleus task boundary</w:t>
@@ -4094,10 +4245,12 @@
             <w:vAlign w:val="top"/>
           </w:tcPr>
           <w:p>
-            <w:pPr/>
-            <w:r>
-              <w:rPr>
-                <w:rFonts w:ascii="Liberation Sans" w:hAnsi="Liberation Sans"/>
+            <w:pPr>
+              <w:spacing w:before="0" w:after="0" w:line="240" w:lineRule="auto"/>
+            </w:pPr>
+            <w:r>
+              <w:rPr>
+                <w:rFonts w:ascii="Liberation Sans" w:hAnsi="Liberation Sans" w:eastAsia="Liberation Sans"/>
                 <w:sz w:val="16"/>
               </w:rPr>
               <w:t>Report-only task records with no-effect alignment and execution/effect/runtime labels.</w:t>
@@ -4116,10 +4269,12 @@
             <w:vAlign w:val="top"/>
           </w:tcPr>
           <w:p>
-            <w:pPr/>
-            <w:r>
-              <w:rPr>
-                <w:rFonts w:ascii="Liberation Sans" w:hAnsi="Liberation Sans"/>
+            <w:pPr>
+              <w:spacing w:before="0" w:after="0" w:line="240" w:lineRule="auto"/>
+            </w:pPr>
+            <w:r>
+              <w:rPr>
+                <w:rFonts w:ascii="Liberation Sans" w:hAnsi="Liberation Sans" w:eastAsia="Liberation Sans"/>
                 <w:sz w:val="16"/>
               </w:rPr>
               <w:t>Say it classifies and reports task-shaped requests; do not say it executes tasks.</w:t>
@@ -4140,10 +4295,12 @@
             <w:vAlign w:val="top"/>
           </w:tcPr>
           <w:p>
-            <w:pPr/>
-            <w:r>
-              <w:rPr>
-                <w:rFonts w:ascii="Liberation Sans" w:hAnsi="Liberation Sans"/>
+            <w:pPr>
+              <w:spacing w:before="0" w:after="0" w:line="240" w:lineRule="auto"/>
+            </w:pPr>
+            <w:r>
+              <w:rPr>
+                <w:rFonts w:ascii="Liberation Sans" w:hAnsi="Liberation Sans" w:eastAsia="Liberation Sans"/>
                 <w:sz w:val="16"/>
               </w:rPr>
               <w:t>Nadia offline AI</w:t>
@@ -4162,10 +4319,12 @@
             <w:vAlign w:val="top"/>
           </w:tcPr>
           <w:p>
-            <w:pPr/>
-            <w:r>
-              <w:rPr>
-                <w:rFonts w:ascii="Liberation Sans" w:hAnsi="Liberation Sans"/>
+            <w:pPr>
+              <w:spacing w:before="0" w:after="0" w:line="240" w:lineRule="auto"/>
+            </w:pPr>
+            <w:r>
+              <w:rPr>
+                <w:rFonts w:ascii="Liberation Sans" w:hAnsi="Liberation Sans" w:eastAsia="Liberation Sans"/>
                 <w:sz w:val="16"/>
               </w:rPr>
               <w:t>Stage-0 through Stage-27 contract metadata; no model runtime, tokenization, context-window assembly, inference, dialogue, or tools.</w:t>
@@ -4184,10 +4343,12 @@
             <w:vAlign w:val="top"/>
           </w:tcPr>
           <w:p>
-            <w:pPr/>
-            <w:r>
-              <w:rPr>
-                <w:rFonts w:ascii="Liberation Sans" w:hAnsi="Liberation Sans"/>
+            <w:pPr>
+              <w:spacing w:before="0" w:after="0" w:line="240" w:lineRule="auto"/>
+            </w:pPr>
+            <w:r>
+              <w:rPr>
+                <w:rFonts w:ascii="Liberation Sans" w:hAnsi="Liberation Sans" w:eastAsia="Liberation Sans"/>
                 <w:sz w:val="16"/>
               </w:rPr>
               <w:t>Say it is an offline-AI contract ladder; do not say it is an active AI assistant.</w:t>
@@ -4208,10 +4369,12 @@
             <w:vAlign w:val="top"/>
           </w:tcPr>
           <w:p>
-            <w:pPr/>
-            <w:r>
-              <w:rPr>
-                <w:rFonts w:ascii="Liberation Sans" w:hAnsi="Liberation Sans"/>
+            <w:pPr>
+              <w:spacing w:before="0" w:after="0" w:line="240" w:lineRule="auto"/>
+            </w:pPr>
+            <w:r>
+              <w:rPr>
+                <w:rFonts w:ascii="Liberation Sans" w:hAnsi="Liberation Sans" w:eastAsia="Liberation Sans"/>
                 <w:sz w:val="16"/>
               </w:rPr>
               <w:t>macOS app bundle lane</w:t>
@@ -4230,10 +4393,12 @@
             <w:vAlign w:val="top"/>
           </w:tcPr>
           <w:p>
-            <w:pPr/>
-            <w:r>
-              <w:rPr>
-                <w:rFonts w:ascii="Liberation Sans" w:hAnsi="Liberation Sans"/>
+            <w:pPr>
+              <w:spacing w:before="0" w:after="0" w:line="240" w:lineRule="auto"/>
+            </w:pPr>
+            <w:r>
+              <w:rPr>
+                <w:rFonts w:ascii="Liberation Sans" w:hAnsi="Liberation Sans" w:eastAsia="Liberation Sans"/>
                 <w:sz w:val="16"/>
               </w:rPr>
               <w:t>No-effect user-local app-bundle writer dry-run, commit gate, reset/uninstall dry-run contract, and verification-transcript contract.</w:t>
@@ -4252,10 +4417,12 @@
             <w:vAlign w:val="top"/>
           </w:tcPr>
           <w:p>
-            <w:pPr/>
-            <w:r>
-              <w:rPr>
-                <w:rFonts w:ascii="Liberation Sans" w:hAnsi="Liberation Sans"/>
+            <w:pPr>
+              <w:spacing w:before="0" w:after="0" w:line="240" w:lineRule="auto"/>
+            </w:pPr>
+            <w:r>
+              <w:rPr>
+                <w:rFonts w:ascii="Liberation Sans" w:hAnsi="Liberation Sans" w:eastAsia="Liberation Sans"/>
                 <w:sz w:val="16"/>
               </w:rPr>
               <w:t>Say macOS install evidence is being specified; do not say a macOS installer exists.</w:t>
@@ -4276,10 +4443,12 @@
             <w:vAlign w:val="top"/>
           </w:tcPr>
           <w:p>
-            <w:pPr/>
-            <w:r>
-              <w:rPr>
-                <w:rFonts w:ascii="Liberation Sans" w:hAnsi="Liberation Sans"/>
+            <w:pPr>
+              <w:spacing w:before="0" w:after="0" w:line="240" w:lineRule="auto"/>
+            </w:pPr>
+            <w:r>
+              <w:rPr>
+                <w:rFonts w:ascii="Liberation Sans" w:hAnsi="Liberation Sans" w:eastAsia="Liberation Sans"/>
                 <w:sz w:val="16"/>
               </w:rPr>
               <w:t>Fedora RPM lifecycle lane</w:t>
@@ -4298,10 +4467,12 @@
             <w:vAlign w:val="top"/>
           </w:tcPr>
           <w:p>
-            <w:pPr/>
-            <w:r>
-              <w:rPr>
-                <w:rFonts w:ascii="Liberation Sans" w:hAnsi="Liberation Sans"/>
+            <w:pPr>
+              <w:spacing w:before="0" w:after="0" w:line="240" w:lineRule="auto"/>
+            </w:pPr>
+            <w:r>
+              <w:rPr>
+                <w:rFonts w:ascii="Liberation Sans" w:hAnsi="Liberation Sans" w:eastAsia="Liberation Sans"/>
                 <w:sz w:val="16"/>
               </w:rPr>
               <w:t>Controlled installroot/disposable-VM RPM evidence and package validation records.</w:t>
@@ -4320,10 +4491,12 @@
             <w:vAlign w:val="top"/>
           </w:tcPr>
           <w:p>
-            <w:pPr/>
-            <w:r>
-              <w:rPr>
-                <w:rFonts w:ascii="Liberation Sans" w:hAnsi="Liberation Sans"/>
+            <w:pPr>
+              <w:spacing w:before="0" w:after="0" w:line="240" w:lineRule="auto"/>
+            </w:pPr>
+            <w:r>
+              <w:rPr>
+                <w:rFonts w:ascii="Liberation Sans" w:hAnsi="Liberation Sans" w:eastAsia="Liberation Sans"/>
                 <w:sz w:val="16"/>
               </w:rPr>
               <w:t>Say bounded RPM lifecycle evidence exists; do not say Fedora approval or daily-driver readiness.</w:t>
@@ -4344,10 +4517,12 @@
             <w:vAlign w:val="top"/>
           </w:tcPr>
           <w:p>
-            <w:pPr/>
-            <w:r>
-              <w:rPr>
-                <w:rFonts w:ascii="Liberation Sans" w:hAnsi="Liberation Sans"/>
+            <w:pPr>
+              <w:spacing w:before="0" w:after="0" w:line="240" w:lineRule="auto"/>
+            </w:pPr>
+            <w:r>
+              <w:rPr>
+                <w:rFonts w:ascii="Liberation Sans" w:hAnsi="Liberation Sans" w:eastAsia="Liberation Sans"/>
                 <w:sz w:val="16"/>
               </w:rPr>
               <w:t>Production installer readiness</w:t>
@@ -4366,10 +4541,12 @@
             <w:vAlign w:val="top"/>
           </w:tcPr>
           <w:p>
-            <w:pPr/>
-            <w:r>
-              <w:rPr>
-                <w:rFonts w:ascii="Liberation Sans" w:hAnsi="Liberation Sans"/>
+            <w:pPr>
+              <w:spacing w:before="0" w:after="0" w:line="240" w:lineRule="auto"/>
+            </w:pPr>
+            <w:r>
+              <w:rPr>
+                <w:rFonts w:ascii="Liberation Sans" w:hAnsi="Liberation Sans" w:eastAsia="Liberation Sans"/>
                 <w:sz w:val="16"/>
               </w:rPr>
               <w:t>Contract-only readiness gate with required future artifacts, transcripts, signatures, rollback, and multi-VM evidence.</w:t>
@@ -4388,13 +4565,174 @@
             <w:vAlign w:val="top"/>
           </w:tcPr>
           <w:p>
-            <w:pPr/>
-            <w:r>
-              <w:rPr>
-                <w:rFonts w:ascii="Liberation Sans" w:hAnsi="Liberation Sans"/>
+            <w:pPr>
+              <w:spacing w:before="0" w:after="0" w:line="240" w:lineRule="auto"/>
+            </w:pPr>
+            <w:r>
+              <w:rPr>
+                <w:rFonts w:ascii="Liberation Sans" w:hAnsi="Liberation Sans" w:eastAsia="Liberation Sans"/>
                 <w:sz w:val="16"/>
               </w:rPr>
               <w:t>Say readiness is gated and currently false; do not say Latticra is production installable.</w:t>
+            </w:r>
+          </w:p>
+        </w:tc>
+      </w:tr>
+      <w:tr>
+        <w:tc>
+          <w:tcPr>
+            <w:tcW w:type="dxa" w:w="3331"/>
+          </w:tcPr>
+          <w:p>
+            <w:pPr>
+              <w:spacing w:before="0" w:after="0" w:line="240" w:lineRule="auto"/>
+            </w:pPr>
+            <w:r>
+              <w:rPr>
+                <w:rFonts w:ascii="Liberation Sans" w:hAnsi="Liberation Sans" w:eastAsia="Liberation Sans"/>
+                <w:sz w:val="16"/>
+              </w:rPr>
+              <w:t>Seal signed request metadata</w:t>
+            </w:r>
+          </w:p>
+        </w:tc>
+        <w:tc>
+          <w:tcPr>
+            <w:tcW w:type="dxa" w:w="3331"/>
+          </w:tcPr>
+          <w:p>
+            <w:pPr>
+              <w:spacing w:before="0" w:after="0" w:line="240" w:lineRule="auto"/>
+            </w:pPr>
+            <w:r>
+              <w:rPr>
+                <w:rFonts w:ascii="Liberation Sans" w:hAnsi="Liberation Sans" w:eastAsia="Liberation Sans"/>
+                <w:sz w:val="16"/>
+              </w:rPr>
+              <w:t>Report-only metadata; signing and verification unsupported.</w:t>
+            </w:r>
+          </w:p>
+        </w:tc>
+        <w:tc>
+          <w:tcPr>
+            <w:tcW w:type="dxa" w:w="3331"/>
+          </w:tcPr>
+          <w:p>
+            <w:pPr>
+              <w:spacing w:before="0" w:after="0" w:line="240" w:lineRule="auto"/>
+            </w:pPr>
+            <w:r>
+              <w:rPr>
+                <w:rFonts w:ascii="Liberation Sans" w:hAnsi="Liberation Sans" w:eastAsia="Liberation Sans"/>
+                <w:sz w:val="16"/>
+              </w:rPr>
+              <w:t>Say Seal records signed-request vocabulary; do not say it signs, verifies, enforces, or trusts requests.</w:t>
+            </w:r>
+          </w:p>
+        </w:tc>
+      </w:tr>
+      <w:tr>
+        <w:tc>
+          <w:tcPr>
+            <w:tcW w:type="dxa" w:w="3331"/>
+          </w:tcPr>
+          <w:p>
+            <w:pPr>
+              <w:spacing w:before="0" w:after="0" w:line="240" w:lineRule="auto"/>
+            </w:pPr>
+            <w:r>
+              <w:rPr>
+                <w:rFonts w:ascii="Liberation Sans" w:hAnsi="Liberation Sans" w:eastAsia="Liberation Sans"/>
+                <w:sz w:val="16"/>
+              </w:rPr>
+              <w:t>Seal verification receipt and crypto backend</w:t>
+            </w:r>
+          </w:p>
+        </w:tc>
+        <w:tc>
+          <w:tcPr>
+            <w:tcW w:type="dxa" w:w="3331"/>
+          </w:tcPr>
+          <w:p>
+            <w:pPr>
+              <w:spacing w:before="0" w:after="0" w:line="240" w:lineRule="auto"/>
+            </w:pPr>
+            <w:r>
+              <w:rPr>
+                <w:rFonts w:ascii="Liberation Sans" w:hAnsi="Liberation Sans" w:eastAsia="Liberation Sans"/>
+                <w:sz w:val="16"/>
+              </w:rPr>
+              <w:t>Metadata-only receipt/backend posture with verification_state=unsupported and crypto_verify_state=unsupported.</w:t>
+            </w:r>
+          </w:p>
+        </w:tc>
+        <w:tc>
+          <w:tcPr>
+            <w:tcW w:type="dxa" w:w="3331"/>
+          </w:tcPr>
+          <w:p>
+            <w:pPr>
+              <w:spacing w:before="0" w:after="0" w:line="240" w:lineRule="auto"/>
+            </w:pPr>
+            <w:r>
+              <w:rPr>
+                <w:rFonts w:ascii="Liberation Sans" w:hAnsi="Liberation Sans" w:eastAsia="Liberation Sans"/>
+                <w:sz w:val="16"/>
+              </w:rPr>
+              <w:t>Say the boundary is specified; do not claim active crypto verification, key handling, trust stores, or revocation checks.</w:t>
+            </w:r>
+          </w:p>
+        </w:tc>
+      </w:tr>
+      <w:tr>
+        <w:tc>
+          <w:tcPr>
+            <w:tcW w:type="dxa" w:w="3331"/>
+          </w:tcPr>
+          <w:p>
+            <w:pPr>
+              <w:spacing w:before="0" w:after="0" w:line="240" w:lineRule="auto"/>
+            </w:pPr>
+            <w:r>
+              <w:rPr>
+                <w:rFonts w:ascii="Liberation Sans" w:hAnsi="Liberation Sans" w:eastAsia="Liberation Sans"/>
+                <w:sz w:val="16"/>
+              </w:rPr>
+              <w:t>Seal capability and effect gates</w:t>
+            </w:r>
+          </w:p>
+        </w:tc>
+        <w:tc>
+          <w:tcPr>
+            <w:tcW w:type="dxa" w:w="3331"/>
+          </w:tcPr>
+          <w:p>
+            <w:pPr>
+              <w:spacing w:before="0" w:after="0" w:line="240" w:lineRule="auto"/>
+            </w:pPr>
+            <w:r>
+              <w:rPr>
+                <w:rFonts w:ascii="Liberation Sans" w:hAnsi="Liberation Sans" w:eastAsia="Liberation Sans"/>
+                <w:sz w:val="16"/>
+              </w:rPr>
+              <w:t>Denied-by-default metadata with gate_allowed=0, effect_allowed=0, and runtime_authority_granted=0.</w:t>
+            </w:r>
+          </w:p>
+        </w:tc>
+        <w:tc>
+          <w:tcPr>
+            <w:tcW w:type="dxa" w:w="3331"/>
+          </w:tcPr>
+          <w:p>
+            <w:pPr>
+              <w:spacing w:before="0" w:after="0" w:line="240" w:lineRule="auto"/>
+            </w:pPr>
+            <w:r>
+              <w:rPr>
+                <w:rFonts w:ascii="Liberation Sans" w:hAnsi="Liberation Sans" w:eastAsia="Liberation Sans"/>
+                <w:sz w:val="16"/>
+              </w:rPr>
+              <w:t>Say gates and decisions preserve non-effects; do not say they enforce capabilities or perform host effects.</w:t>
             </w:r>
           </w:p>
         </w:tc>
@@ -6685,6 +7023,72 @@
     </w:p>
     <w:p>
       <w:pPr>
+        <w:pStyle w:val="Heading2"/>
+      </w:pPr>
+      <w:r>
+        <w:rPr>
+          <w:rFonts w:ascii="Liberation Serif" w:hAnsi="Liberation Serif" w:eastAsia="Liberation Serif"/>
+        </w:rPr>
+        <w:t>5.6 Seal trust and crypto metadata ladder</w:t>
+      </w:r>
+    </w:p>
+    <w:p>
+      <w:pPr>
+        <w:pStyle w:val="BodyTight"/>
+      </w:pPr>
+      <w:r>
+        <w:rPr>
+          <w:rFonts w:ascii="Liberation Serif" w:hAnsi="Liberation Serif" w:eastAsia="Liberation Serif"/>
+        </w:rPr>
+        <w:t>Seal now has enough trust-adjacent contract surface to name a ladder without pretending the ladder already grants authority. The stages are signed request metadata, request freshness metadata, verification policy metadata, verification receipt metadata, crypto verify backend metadata, capability gate metadata, effect decision metadata, runtime handoff metadata, and report envelope metadata. Each stage records the next question before the project is allowed to answer it with effects.</w:t>
+      </w:r>
+    </w:p>
+    <w:p>
+      <w:pPr>
+        <w:pStyle w:val="BodyTight"/>
+      </w:pPr>
+      <w:r>
+        <w:rPr>
+          <w:rFonts w:ascii="Liberation Serif" w:hAnsi="Liberation Serif" w:eastAsia="Liberation Serif"/>
+        </w:rPr>
+        <w:t>Signed request records may describe identity, context, parameters, freshness, policy binding, algorithms, key identifiers, and signature hashes, but the current posture is report-only. Signature generation, signature verification, public-key parsing, trust-store loading, revocation lookup, signed-request enforcement, host effects, and runtime authority are all zero claims.</w:t>
+      </w:r>
+    </w:p>
+    <w:p>
+      <w:pPr>
+        <w:pStyle w:val="BodyTight"/>
+      </w:pPr>
+      <w:r>
+        <w:rPr>
+          <w:rFonts w:ascii="Liberation Serif" w:hAnsi="Liberation Serif" w:eastAsia="Liberation Serif"/>
+        </w:rPr>
+        <w:t>Verification receipts are intentionally weaker than authority. The current receipt profile is unverified metadata: verification_state=unsupported, receipt_state=unverified-metadata, cryptographic_verification_performed=0, verified=0, authority_usable=0, capability_gate_allowed=0, and runtime_authority_granted=0. That shape is useful because it prevents a future signed object from silently becoming a capability.</w:t>
+      </w:r>
+    </w:p>
+    <w:p>
+      <w:pPr>
+        <w:pStyle w:val="BodyTight"/>
+      </w:pPr>
+      <w:r>
+        <w:rPr>
+          <w:rFonts w:ascii="Liberation Serif" w:hAnsi="Liberation Serif" w:eastAsia="Liberation Serif"/>
+        </w:rPr>
+        <w:t>The crypto verify backend is also metadata-only. It can name a planned verify-only boundary and an Ed25519-development label, but it does not consume keys, perform real cryptographic verification, consult trust stores, check revocation, contact networks, or grant authority. Post-quantum algorithm labels such as ML-DSA-planned and SLH-DSA-planned are roadmap vocabulary, not current verification support.</w:t>
+      </w:r>
+    </w:p>
+    <w:p>
+      <w:pPr>
+        <w:pStyle w:val="BodyTight"/>
+      </w:pPr>
+      <w:r>
+        <w:rPr>
+          <w:rFonts w:ascii="Liberation Serif" w:hAnsi="Liberation Serif" w:eastAsia="Liberation Serif"/>
+        </w:rPr>
+        <w:t>Capability gates and effect decisions close the ladder. A denied or unverified receipt must keep gate_state=denied-unverified, gate_allowed=0, decision_state=denied-gate, effect_allowed=0, effect_performed=0, host_read_performed=0, host_write_performed=0, network_performed=0, and runtime_authority_granted=0. Future authority may only appear after cryptographic verification, receipt semantics, gate policy, effect decision, runtime handoff, and tests all agree.</w:t>
+      </w:r>
+    </w:p>
+    <w:p>
+      <w:pPr>
         <w:pStyle w:val="Heading1"/>
       </w:pPr>
       <w:r>
@@ -11467,6 +11871,50 @@
     </w:p>
     <w:p>
       <w:pPr>
+        <w:pStyle w:val="Heading2"/>
+      </w:pPr>
+      <w:r>
+        <w:rPr>
+          <w:rFonts w:ascii="Liberation Serif" w:hAnsi="Liberation Serif" w:eastAsia="Liberation Serif"/>
+        </w:rPr>
+        <w:t>11.4 Verification receipts and authority handoff</w:t>
+      </w:r>
+    </w:p>
+    <w:p>
+      <w:pPr>
+        <w:pStyle w:val="BodyTight"/>
+      </w:pPr>
+      <w:r>
+        <w:rPr>
+          <w:rFonts w:ascii="Liberation Serif" w:hAnsi="Liberation Serif" w:eastAsia="Liberation Serif"/>
+        </w:rPr>
+        <w:t>A verification receipt should be treated as a witness object in the graph, not as a permission slip. It records the relationship among artifact digest, signature profile, signer identity label, public-key identity label, verification policy profile, requested receipt mode, and verification state.</w:t>
+      </w:r>
+    </w:p>
+    <w:p>
+      <w:pPr>
+        <w:pStyle w:val="BodyTight"/>
+      </w:pPr>
+      <w:r>
+        <w:rPr>
+          <w:rFonts w:ascii="Liberation Serif" w:hAnsi="Liberation Serif" w:eastAsia="Liberation Serif"/>
+        </w:rPr>
+        <w:t>The handoff rule is deliberately segmented: signature metadata is not verification; verification is not a receipt; a receipt is not a capability gate; a capability gate is not an effect decision; an effect decision is not runtime handoff; and runtime handoff is not host enforcement. Keeping those nouns separate prevents one implemented layer from borrowing the authority of a future layer.</w:t>
+      </w:r>
+    </w:p>
+    <w:p>
+      <w:pPr>
+        <w:pStyle w:val="BodyTight"/>
+      </w:pPr>
+      <w:r>
+        <w:rPr>
+          <w:rFonts w:ascii="Liberation Serif" w:hAnsi="Liberation Serif" w:eastAsia="Liberation Serif"/>
+        </w:rPr>
+        <w:t>This also gives reviewers a concrete audit path. If a report claims authority, the witness graph should show a verified receipt, an allowed capability gate, an allowed effect decision, a performed runtime handoff, and explicit evidence for the effect. If any predecessor is missing or unsupported, public wording must fall back to metadata-only, report-only, or denied-by-default language.</w:t>
+      </w:r>
+    </w:p>
+    <w:p>
+      <w:pPr>
         <w:pStyle w:val="Heading1"/>
       </w:pPr>
       <w:r>
@@ -14677,6 +15125,61 @@
       </w:pPr>
       <w:r>
         <w:t>Prompt-tokenization and prompt-token-sequence records reserve the future shape of token count, token order, offsets, masks, and position IDs; Stage-27 context-window records then reserve future context-window layout, token budget, truncation, and prompt-evaluation-input requirements while explicitly recording that those values are not produced today.</w:t>
+      </w:r>
+    </w:p>
+    <w:p>
+      <w:pPr>
+        <w:pStyle w:val="Heading2"/>
+      </w:pPr>
+      <w:r>
+        <w:rPr>
+          <w:rFonts w:ascii="Liberation Serif" w:hAnsi="Liberation Serif" w:eastAsia="Liberation Serif"/>
+        </w:rPr>
+        <w:t>14.6 Seal trust metadata schemas</w:t>
+      </w:r>
+    </w:p>
+    <w:p>
+      <w:pPr>
+        <w:pStyle w:val="BodyTight"/>
+      </w:pPr>
+      <w:r>
+        <w:rPr>
+          <w:rFonts w:ascii="Liberation Serif" w:hAnsi="Liberation Serif" w:eastAsia="Liberation Serif"/>
+        </w:rPr>
+        <w:t>The trust ladder should use small, stable key/value schemas before it grows richer object formats. The current schema vocabulary already includes signed_request_profile, freshness_profile, receipt_profile, verification_policy_profile, backend_profile, gate_profile, decision_profile, signature_profile, manifest_profile, artifact_digest_algorithm, signer_identity_label, public_key_identity_label, trust_source, requested_capability, requested_effect, requested_scope, and status.</w:t>
+      </w:r>
+    </w:p>
+    <w:p>
+      <w:pPr>
+        <w:pStyle w:val="BodyTight"/>
+      </w:pPr>
+      <w:r>
+        <w:rPr>
+          <w:rFonts w:ascii="Liberation Serif" w:hAnsi="Liberation Serif" w:eastAsia="Liberation Serif"/>
+        </w:rPr>
+        <w:t>State fields should remain explicit even when the value is a denial. The important fields include signed_request_supported, signature_present, signature_valid, request_freshness_supported, replay_protection_supported, verification_state, receipt_state, crypto_verify_state, verified, invalid, authority_usable, capability_gate_allowed, gate_state, gate_allowed, decision_state, effect_allowed, effect_performed, and runtime_authority_granted.</w:t>
+      </w:r>
+    </w:p>
+    <w:p>
+      <w:pPr>
+        <w:pStyle w:val="BodyTight"/>
+      </w:pPr>
+      <w:r>
+        <w:rPr>
+          <w:rFonts w:ascii="Liberation Serif" w:hAnsi="Liberation Serif" w:eastAsia="Liberation Serif"/>
+        </w:rPr>
+        <w:t>Effect fields must not disappear when false. Report consumers should see host_read_performed=0, host_write_performed=0, network_performed=0, cryptographic_verification_performed=0, verification_performed=0, signature_performed=0, signer_invoked=0, trust_store_loaded=0, revocation_lookup_performed=0, key_material_loaded=0, private_key_handling=0, capability_enforcement_performed=0, and runtime_handoff_performed=0 where the corresponding layer is in scope.</w:t>
+      </w:r>
+    </w:p>
+    <w:p>
+      <w:pPr>
+        <w:pStyle w:val="BodyTight"/>
+      </w:pPr>
+      <w:r>
+        <w:rPr>
+          <w:rFonts w:ascii="Liberation Serif" w:hAnsi="Liberation Serif" w:eastAsia="Liberation Serif"/>
+        </w:rPr>
+        <w:t>The schema rule is simple: a future field may reserve vocabulary, but a current field must not imply capability. If the project adds real Ed25519 verification, a trust store, revocation checks, signed envelopes, or effect execution later, each transition should change only after a contract, implementation, invariant tests, status record, public wording update, and handbook update are in place.</w:t>
       </w:r>
     </w:p>
     <w:p>
@@ -15608,6 +16111,61 @@
     </w:p>
     <w:p>
       <w:pPr>
+        <w:pStyle w:val="Heading2"/>
+      </w:pPr>
+      <w:r>
+        <w:rPr>
+          <w:rFonts w:ascii="Liberation Serif" w:hAnsi="Liberation Serif" w:eastAsia="Liberation Serif"/>
+        </w:rPr>
+        <w:t>15.6 Seal trust-boundary validation lanes</w:t>
+      </w:r>
+    </w:p>
+    <w:p>
+      <w:pPr>
+        <w:pStyle w:val="BodyTight"/>
+      </w:pPr>
+      <w:r>
+        <w:rPr>
+          <w:rFonts w:ascii="Liberation Serif" w:hAnsi="Liberation Serif" w:eastAsia="Liberation Serif"/>
+        </w:rPr>
+        <w:t>Seal trust-boundary tests should prove the negative path as carefully as the happy path. The signed-request lane should assert that supported, generation, verification, signature-present, signature-valid, trust-store, revocation, network, host-effect, and runtime-authority fields remain zero until a real implementation exists.</w:t>
+      </w:r>
+    </w:p>
+    <w:p>
+      <w:pPr>
+        <w:pStyle w:val="BodyTight"/>
+      </w:pPr>
+      <w:r>
+        <w:rPr>
+          <w:rFonts w:ascii="Liberation Serif" w:hAnsi="Liberation Serif" w:eastAsia="Liberation Serif"/>
+        </w:rPr>
+        <w:t>The request-freshness lane should cover timestamp and nonce vocabulary without claiming trusted clocks, nonce storage, replay caches, freshness validation, replay protection, context hashing, parameter hashing, or enforcement. The report surface is valuable precisely because it makes the absence of those mechanisms reproducible.</w:t>
+      </w:r>
+    </w:p>
+    <w:p>
+      <w:pPr>
+        <w:pStyle w:val="BodyTight"/>
+      </w:pPr>
+      <w:r>
+        <w:rPr>
+          <w:rFonts w:ascii="Liberation Serif" w:hAnsi="Liberation Serif" w:eastAsia="Liberation Serif"/>
+        </w:rPr>
+        <w:t>The verification-receipt and crypto-backend lanes should assert that verification_state=unsupported, receipt_state=unverified-metadata, crypto_verify_state=unsupported, cryptographic_verification_performed=0, verified=0, authority_usable=0, and runtime_authority_granted=0 remain stable across refactors.</w:t>
+      </w:r>
+    </w:p>
+    <w:p>
+      <w:pPr>
+        <w:pStyle w:val="BodyTight"/>
+      </w:pPr>
+      <w:r>
+        <w:rPr>
+          <w:rFonts w:ascii="Liberation Serif" w:hAnsi="Liberation Serif" w:eastAsia="Liberation Serif"/>
+        </w:rPr>
+        <w:t>The capability-gate and effect-decision lanes should assert denied defaults: gate_state=denied-unverified, gate_allowed=0, decision_state=denied-gate, effect_allowed=0, effect_performed=0, host_read_performed=0, host_write_performed=0, network_performed=0, and runtime_authority_granted=0. When those tests fail, the default response should be to weaken or fix the claim, not to widen authority.</w:t>
+      </w:r>
+    </w:p>
+    <w:p>
+      <w:pPr>
         <w:pStyle w:val="Heading1"/>
       </w:pPr>
       <w:r>
@@ -16619,12 +17177,17 @@
           </w:tcPr>
           <w:p>
             <w:pPr>
-              <w:spacing w:after="0"/>
-            </w:pPr>
-            <w:r/>
-            <w:r>
-              <w:rPr>
-                <w:rFonts w:ascii="Liberation Sans" w:hAnsi="Liberation Sans"/>
+              <w:spacing w:after="0" w:before="0" w:line="240" w:lineRule="auto"/>
+            </w:pPr>
+            <w:r>
+              <w:rPr>
+                <w:rFonts w:ascii="Liberation Sans" w:hAnsi="Liberation Sans" w:eastAsia="Liberation Sans"/>
+                <w:sz w:val="16"/>
+              </w:rPr>
+            </w:r>
+            <w:r>
+              <w:rPr>
+                <w:rFonts w:ascii="Liberation Sans" w:hAnsi="Liberation Sans" w:eastAsia="Liberation Sans"/>
                 <w:color w:val="0F172A"/>
                 <w:sz w:val="16"/>
               </w:rPr>
@@ -16645,12 +17208,17 @@
           </w:tcPr>
           <w:p>
             <w:pPr>
-              <w:spacing w:after="0"/>
-            </w:pPr>
-            <w:r/>
-            <w:r>
-              <w:rPr>
-                <w:rFonts w:ascii="Liberation Sans" w:hAnsi="Liberation Sans"/>
+              <w:spacing w:after="0" w:before="0" w:line="240" w:lineRule="auto"/>
+            </w:pPr>
+            <w:r>
+              <w:rPr>
+                <w:rFonts w:ascii="Liberation Sans" w:hAnsi="Liberation Sans" w:eastAsia="Liberation Sans"/>
+                <w:sz w:val="16"/>
+              </w:rPr>
+            </w:r>
+            <w:r>
+              <w:rPr>
+                <w:rFonts w:ascii="Liberation Sans" w:hAnsi="Liberation Sans" w:eastAsia="Liberation Sans"/>
                 <w:color w:val="0F172A"/>
                 <w:sz w:val="16"/>
               </w:rPr>
@@ -16673,12 +17241,17 @@
           </w:tcPr>
           <w:p>
             <w:pPr>
-              <w:spacing w:after="0"/>
-            </w:pPr>
-            <w:r/>
-            <w:r>
-              <w:rPr>
-                <w:rFonts w:ascii="Liberation Sans" w:hAnsi="Liberation Sans"/>
+              <w:spacing w:after="0" w:before="0" w:line="240" w:lineRule="auto"/>
+            </w:pPr>
+            <w:r>
+              <w:rPr>
+                <w:rFonts w:ascii="Liberation Sans" w:hAnsi="Liberation Sans" w:eastAsia="Liberation Sans"/>
+                <w:sz w:val="16"/>
+              </w:rPr>
+            </w:r>
+            <w:r>
+              <w:rPr>
+                <w:rFonts w:ascii="Liberation Sans" w:hAnsi="Liberation Sans" w:eastAsia="Liberation Sans"/>
                 <w:color w:val="0F172A"/>
                 <w:sz w:val="16"/>
               </w:rPr>
@@ -16699,12 +17272,17 @@
           </w:tcPr>
           <w:p>
             <w:pPr>
-              <w:spacing w:after="0"/>
-            </w:pPr>
-            <w:r/>
-            <w:r>
-              <w:rPr>
-                <w:rFonts w:ascii="Liberation Sans" w:hAnsi="Liberation Sans"/>
+              <w:spacing w:after="0" w:before="0" w:line="240" w:lineRule="auto"/>
+            </w:pPr>
+            <w:r>
+              <w:rPr>
+                <w:rFonts w:ascii="Liberation Sans" w:hAnsi="Liberation Sans" w:eastAsia="Liberation Sans"/>
+                <w:sz w:val="16"/>
+              </w:rPr>
+            </w:r>
+            <w:r>
+              <w:rPr>
+                <w:rFonts w:ascii="Liberation Sans" w:hAnsi="Liberation Sans" w:eastAsia="Liberation Sans"/>
                 <w:color w:val="0F172A"/>
                 <w:sz w:val="16"/>
               </w:rPr>
@@ -16727,12 +17305,17 @@
           </w:tcPr>
           <w:p>
             <w:pPr>
-              <w:spacing w:after="0"/>
-            </w:pPr>
-            <w:r/>
-            <w:r>
-              <w:rPr>
-                <w:rFonts w:ascii="Liberation Sans" w:hAnsi="Liberation Sans"/>
+              <w:spacing w:after="0" w:before="0" w:line="240" w:lineRule="auto"/>
+            </w:pPr>
+            <w:r>
+              <w:rPr>
+                <w:rFonts w:ascii="Liberation Sans" w:hAnsi="Liberation Sans" w:eastAsia="Liberation Sans"/>
+                <w:sz w:val="16"/>
+              </w:rPr>
+            </w:r>
+            <w:r>
+              <w:rPr>
+                <w:rFonts w:ascii="Liberation Sans" w:hAnsi="Liberation Sans" w:eastAsia="Liberation Sans"/>
                 <w:color w:val="0F172A"/>
                 <w:sz w:val="16"/>
               </w:rPr>
@@ -16753,12 +17336,17 @@
           </w:tcPr>
           <w:p>
             <w:pPr>
-              <w:spacing w:after="0"/>
-            </w:pPr>
-            <w:r/>
-            <w:r>
-              <w:rPr>
-                <w:rFonts w:ascii="Liberation Sans" w:hAnsi="Liberation Sans"/>
+              <w:spacing w:after="0" w:before="0" w:line="240" w:lineRule="auto"/>
+            </w:pPr>
+            <w:r>
+              <w:rPr>
+                <w:rFonts w:ascii="Liberation Sans" w:hAnsi="Liberation Sans" w:eastAsia="Liberation Sans"/>
+                <w:sz w:val="16"/>
+              </w:rPr>
+            </w:r>
+            <w:r>
+              <w:rPr>
+                <w:rFonts w:ascii="Liberation Sans" w:hAnsi="Liberation Sans" w:eastAsia="Liberation Sans"/>
                 <w:color w:val="0F172A"/>
                 <w:sz w:val="16"/>
               </w:rPr>
@@ -16781,12 +17369,17 @@
           </w:tcPr>
           <w:p>
             <w:pPr>
-              <w:spacing w:after="0"/>
-            </w:pPr>
-            <w:r/>
-            <w:r>
-              <w:rPr>
-                <w:rFonts w:ascii="Liberation Sans" w:hAnsi="Liberation Sans"/>
+              <w:spacing w:after="0" w:before="0" w:line="240" w:lineRule="auto"/>
+            </w:pPr>
+            <w:r>
+              <w:rPr>
+                <w:rFonts w:ascii="Liberation Sans" w:hAnsi="Liberation Sans" w:eastAsia="Liberation Sans"/>
+                <w:sz w:val="16"/>
+              </w:rPr>
+            </w:r>
+            <w:r>
+              <w:rPr>
+                <w:rFonts w:ascii="Liberation Sans" w:hAnsi="Liberation Sans" w:eastAsia="Liberation Sans"/>
                 <w:color w:val="0F172A"/>
                 <w:sz w:val="16"/>
               </w:rPr>
@@ -16807,12 +17400,17 @@
           </w:tcPr>
           <w:p>
             <w:pPr>
-              <w:spacing w:after="0"/>
-            </w:pPr>
-            <w:r/>
-            <w:r>
-              <w:rPr>
-                <w:rFonts w:ascii="Liberation Sans" w:hAnsi="Liberation Sans"/>
+              <w:spacing w:after="0" w:before="0" w:line="240" w:lineRule="auto"/>
+            </w:pPr>
+            <w:r>
+              <w:rPr>
+                <w:rFonts w:ascii="Liberation Sans" w:hAnsi="Liberation Sans" w:eastAsia="Liberation Sans"/>
+                <w:sz w:val="16"/>
+              </w:rPr>
+            </w:r>
+            <w:r>
+              <w:rPr>
+                <w:rFonts w:ascii="Liberation Sans" w:hAnsi="Liberation Sans" w:eastAsia="Liberation Sans"/>
                 <w:color w:val="0F172A"/>
                 <w:sz w:val="16"/>
               </w:rPr>
@@ -16835,12 +17433,17 @@
           </w:tcPr>
           <w:p>
             <w:pPr>
-              <w:spacing w:after="0"/>
-            </w:pPr>
-            <w:r/>
-            <w:r>
-              <w:rPr>
-                <w:rFonts w:ascii="Liberation Sans" w:hAnsi="Liberation Sans"/>
+              <w:spacing w:after="0" w:before="0" w:line="240" w:lineRule="auto"/>
+            </w:pPr>
+            <w:r>
+              <w:rPr>
+                <w:rFonts w:ascii="Liberation Sans" w:hAnsi="Liberation Sans" w:eastAsia="Liberation Sans"/>
+                <w:sz w:val="16"/>
+              </w:rPr>
+            </w:r>
+            <w:r>
+              <w:rPr>
+                <w:rFonts w:ascii="Liberation Sans" w:hAnsi="Liberation Sans" w:eastAsia="Liberation Sans"/>
                 <w:color w:val="0F172A"/>
                 <w:sz w:val="16"/>
               </w:rPr>
@@ -16861,12 +17464,17 @@
           </w:tcPr>
           <w:p>
             <w:pPr>
-              <w:spacing w:after="0"/>
-            </w:pPr>
-            <w:r/>
-            <w:r>
-              <w:rPr>
-                <w:rFonts w:ascii="Liberation Sans" w:hAnsi="Liberation Sans"/>
+              <w:spacing w:after="0" w:before="0" w:line="240" w:lineRule="auto"/>
+            </w:pPr>
+            <w:r>
+              <w:rPr>
+                <w:rFonts w:ascii="Liberation Sans" w:hAnsi="Liberation Sans" w:eastAsia="Liberation Sans"/>
+                <w:sz w:val="16"/>
+              </w:rPr>
+            </w:r>
+            <w:r>
+              <w:rPr>
+                <w:rFonts w:ascii="Liberation Sans" w:hAnsi="Liberation Sans" w:eastAsia="Liberation Sans"/>
                 <w:color w:val="0F172A"/>
                 <w:sz w:val="16"/>
               </w:rPr>
@@ -16889,12 +17497,17 @@
           </w:tcPr>
           <w:p>
             <w:pPr>
-              <w:spacing w:after="0"/>
-            </w:pPr>
-            <w:r/>
-            <w:r>
-              <w:rPr>
-                <w:rFonts w:ascii="Liberation Sans" w:hAnsi="Liberation Sans"/>
+              <w:spacing w:after="0" w:before="0" w:line="240" w:lineRule="auto"/>
+            </w:pPr>
+            <w:r>
+              <w:rPr>
+                <w:rFonts w:ascii="Liberation Sans" w:hAnsi="Liberation Sans" w:eastAsia="Liberation Sans"/>
+                <w:sz w:val="16"/>
+              </w:rPr>
+            </w:r>
+            <w:r>
+              <w:rPr>
+                <w:rFonts w:ascii="Liberation Sans" w:hAnsi="Liberation Sans" w:eastAsia="Liberation Sans"/>
                 <w:color w:val="0F172A"/>
                 <w:sz w:val="16"/>
               </w:rPr>
@@ -16915,12 +17528,17 @@
           </w:tcPr>
           <w:p>
             <w:pPr>
-              <w:spacing w:after="0"/>
-            </w:pPr>
-            <w:r/>
-            <w:r>
-              <w:rPr>
-                <w:rFonts w:ascii="Liberation Sans" w:hAnsi="Liberation Sans"/>
+              <w:spacing w:after="0" w:before="0" w:line="240" w:lineRule="auto"/>
+            </w:pPr>
+            <w:r>
+              <w:rPr>
+                <w:rFonts w:ascii="Liberation Sans" w:hAnsi="Liberation Sans" w:eastAsia="Liberation Sans"/>
+                <w:sz w:val="16"/>
+              </w:rPr>
+            </w:r>
+            <w:r>
+              <w:rPr>
+                <w:rFonts w:ascii="Liberation Sans" w:hAnsi="Liberation Sans" w:eastAsia="Liberation Sans"/>
                 <w:color w:val="0F172A"/>
                 <w:sz w:val="16"/>
               </w:rPr>
@@ -16943,12 +17561,17 @@
           </w:tcPr>
           <w:p>
             <w:pPr>
-              <w:spacing w:after="0"/>
-            </w:pPr>
-            <w:r/>
-            <w:r>
-              <w:rPr>
-                <w:rFonts w:ascii="Liberation Sans" w:hAnsi="Liberation Sans"/>
+              <w:spacing w:after="0" w:before="0" w:line="240" w:lineRule="auto"/>
+            </w:pPr>
+            <w:r>
+              <w:rPr>
+                <w:rFonts w:ascii="Liberation Sans" w:hAnsi="Liberation Sans" w:eastAsia="Liberation Sans"/>
+                <w:sz w:val="16"/>
+              </w:rPr>
+            </w:r>
+            <w:r>
+              <w:rPr>
+                <w:rFonts w:ascii="Liberation Sans" w:hAnsi="Liberation Sans" w:eastAsia="Liberation Sans"/>
                 <w:color w:val="0F172A"/>
                 <w:sz w:val="16"/>
               </w:rPr>
@@ -16969,12 +17592,17 @@
           </w:tcPr>
           <w:p>
             <w:pPr>
-              <w:spacing w:after="0"/>
-            </w:pPr>
-            <w:r/>
-            <w:r>
-              <w:rPr>
-                <w:rFonts w:ascii="Liberation Sans" w:hAnsi="Liberation Sans"/>
+              <w:spacing w:after="0" w:before="0" w:line="240" w:lineRule="auto"/>
+            </w:pPr>
+            <w:r>
+              <w:rPr>
+                <w:rFonts w:ascii="Liberation Sans" w:hAnsi="Liberation Sans" w:eastAsia="Liberation Sans"/>
+                <w:sz w:val="16"/>
+              </w:rPr>
+            </w:r>
+            <w:r>
+              <w:rPr>
+                <w:rFonts w:ascii="Liberation Sans" w:hAnsi="Liberation Sans" w:eastAsia="Liberation Sans"/>
                 <w:color w:val="0F172A"/>
                 <w:sz w:val="16"/>
               </w:rPr>
@@ -16997,12 +17625,17 @@
           </w:tcPr>
           <w:p>
             <w:pPr>
-              <w:spacing w:after="0"/>
-            </w:pPr>
-            <w:r/>
-            <w:r>
-              <w:rPr>
-                <w:rFonts w:ascii="Liberation Sans" w:hAnsi="Liberation Sans"/>
+              <w:spacing w:after="0" w:before="0" w:line="240" w:lineRule="auto"/>
+            </w:pPr>
+            <w:r>
+              <w:rPr>
+                <w:rFonts w:ascii="Liberation Sans" w:hAnsi="Liberation Sans" w:eastAsia="Liberation Sans"/>
+                <w:sz w:val="16"/>
+              </w:rPr>
+            </w:r>
+            <w:r>
+              <w:rPr>
+                <w:rFonts w:ascii="Liberation Sans" w:hAnsi="Liberation Sans" w:eastAsia="Liberation Sans"/>
                 <w:color w:val="0F172A"/>
                 <w:sz w:val="16"/>
               </w:rPr>
@@ -17023,12 +17656,17 @@
           </w:tcPr>
           <w:p>
             <w:pPr>
-              <w:spacing w:after="0"/>
-            </w:pPr>
-            <w:r/>
-            <w:r>
-              <w:rPr>
-                <w:rFonts w:ascii="Liberation Sans" w:hAnsi="Liberation Sans"/>
+              <w:spacing w:after="0" w:before="0" w:line="240" w:lineRule="auto"/>
+            </w:pPr>
+            <w:r>
+              <w:rPr>
+                <w:rFonts w:ascii="Liberation Sans" w:hAnsi="Liberation Sans" w:eastAsia="Liberation Sans"/>
+                <w:sz w:val="16"/>
+              </w:rPr>
+            </w:r>
+            <w:r>
+              <w:rPr>
+                <w:rFonts w:ascii="Liberation Sans" w:hAnsi="Liberation Sans" w:eastAsia="Liberation Sans"/>
                 <w:color w:val="0F172A"/>
                 <w:sz w:val="16"/>
               </w:rPr>
@@ -17051,12 +17689,17 @@
           </w:tcPr>
           <w:p>
             <w:pPr>
-              <w:spacing w:after="0"/>
-            </w:pPr>
-            <w:r/>
-            <w:r>
-              <w:rPr>
-                <w:rFonts w:ascii="Liberation Sans" w:hAnsi="Liberation Sans"/>
+              <w:spacing w:after="0" w:before="0" w:line="240" w:lineRule="auto"/>
+            </w:pPr>
+            <w:r>
+              <w:rPr>
+                <w:rFonts w:ascii="Liberation Sans" w:hAnsi="Liberation Sans" w:eastAsia="Liberation Sans"/>
+                <w:sz w:val="16"/>
+              </w:rPr>
+            </w:r>
+            <w:r>
+              <w:rPr>
+                <w:rFonts w:ascii="Liberation Sans" w:hAnsi="Liberation Sans" w:eastAsia="Liberation Sans"/>
                 <w:color w:val="0F172A"/>
                 <w:sz w:val="16"/>
               </w:rPr>
@@ -17077,12 +17720,17 @@
           </w:tcPr>
           <w:p>
             <w:pPr>
-              <w:spacing w:after="0"/>
-            </w:pPr>
-            <w:r/>
-            <w:r>
-              <w:rPr>
-                <w:rFonts w:ascii="Liberation Sans" w:hAnsi="Liberation Sans"/>
+              <w:spacing w:after="0" w:before="0" w:line="240" w:lineRule="auto"/>
+            </w:pPr>
+            <w:r>
+              <w:rPr>
+                <w:rFonts w:ascii="Liberation Sans" w:hAnsi="Liberation Sans" w:eastAsia="Liberation Sans"/>
+                <w:sz w:val="16"/>
+              </w:rPr>
+            </w:r>
+            <w:r>
+              <w:rPr>
+                <w:rFonts w:ascii="Liberation Sans" w:hAnsi="Liberation Sans" w:eastAsia="Liberation Sans"/>
                 <w:color w:val="0F172A"/>
                 <w:sz w:val="16"/>
               </w:rPr>
@@ -17105,12 +17753,17 @@
           </w:tcPr>
           <w:p>
             <w:pPr>
-              <w:spacing w:after="0"/>
-            </w:pPr>
-            <w:r/>
-            <w:r>
-              <w:rPr>
-                <w:rFonts w:ascii="Liberation Sans" w:hAnsi="Liberation Sans"/>
+              <w:spacing w:after="0" w:before="0" w:line="240" w:lineRule="auto"/>
+            </w:pPr>
+            <w:r>
+              <w:rPr>
+                <w:rFonts w:ascii="Liberation Sans" w:hAnsi="Liberation Sans" w:eastAsia="Liberation Sans"/>
+                <w:sz w:val="16"/>
+              </w:rPr>
+            </w:r>
+            <w:r>
+              <w:rPr>
+                <w:rFonts w:ascii="Liberation Sans" w:hAnsi="Liberation Sans" w:eastAsia="Liberation Sans"/>
                 <w:color w:val="0F172A"/>
                 <w:sz w:val="16"/>
               </w:rPr>
@@ -17131,12 +17784,17 @@
           </w:tcPr>
           <w:p>
             <w:pPr>
-              <w:spacing w:after="0"/>
-            </w:pPr>
-            <w:r/>
-            <w:r>
-              <w:rPr>
-                <w:rFonts w:ascii="Liberation Sans" w:hAnsi="Liberation Sans"/>
+              <w:spacing w:after="0" w:before="0" w:line="240" w:lineRule="auto"/>
+            </w:pPr>
+            <w:r>
+              <w:rPr>
+                <w:rFonts w:ascii="Liberation Sans" w:hAnsi="Liberation Sans" w:eastAsia="Liberation Sans"/>
+                <w:sz w:val="16"/>
+              </w:rPr>
+            </w:r>
+            <w:r>
+              <w:rPr>
+                <w:rFonts w:ascii="Liberation Sans" w:hAnsi="Liberation Sans" w:eastAsia="Liberation Sans"/>
                 <w:color w:val="0F172A"/>
                 <w:sz w:val="16"/>
               </w:rPr>
@@ -17159,12 +17817,17 @@
           </w:tcPr>
           <w:p>
             <w:pPr>
-              <w:spacing w:after="0"/>
-            </w:pPr>
-            <w:r/>
-            <w:r>
-              <w:rPr>
-                <w:rFonts w:ascii="Liberation Sans" w:hAnsi="Liberation Sans"/>
+              <w:spacing w:after="0" w:before="0" w:line="240" w:lineRule="auto"/>
+            </w:pPr>
+            <w:r>
+              <w:rPr>
+                <w:rFonts w:ascii="Liberation Sans" w:hAnsi="Liberation Sans" w:eastAsia="Liberation Sans"/>
+                <w:sz w:val="16"/>
+              </w:rPr>
+            </w:r>
+            <w:r>
+              <w:rPr>
+                <w:rFonts w:ascii="Liberation Sans" w:hAnsi="Liberation Sans" w:eastAsia="Liberation Sans"/>
                 <w:color w:val="0F172A"/>
                 <w:sz w:val="16"/>
               </w:rPr>
@@ -17185,12 +17848,17 @@
           </w:tcPr>
           <w:p>
             <w:pPr>
-              <w:spacing w:after="0"/>
-            </w:pPr>
-            <w:r/>
-            <w:r>
-              <w:rPr>
-                <w:rFonts w:ascii="Liberation Sans" w:hAnsi="Liberation Sans"/>
+              <w:spacing w:after="0" w:before="0" w:line="240" w:lineRule="auto"/>
+            </w:pPr>
+            <w:r>
+              <w:rPr>
+                <w:rFonts w:ascii="Liberation Sans" w:hAnsi="Liberation Sans" w:eastAsia="Liberation Sans"/>
+                <w:sz w:val="16"/>
+              </w:rPr>
+            </w:r>
+            <w:r>
+              <w:rPr>
+                <w:rFonts w:ascii="Liberation Sans" w:hAnsi="Liberation Sans" w:eastAsia="Liberation Sans"/>
                 <w:color w:val="0F172A"/>
                 <w:sz w:val="16"/>
               </w:rPr>
@@ -17213,12 +17881,17 @@
           </w:tcPr>
           <w:p>
             <w:pPr>
-              <w:spacing w:after="0"/>
-            </w:pPr>
-            <w:r/>
-            <w:r>
-              <w:rPr>
-                <w:rFonts w:ascii="Liberation Sans" w:hAnsi="Liberation Sans"/>
+              <w:spacing w:after="0" w:before="0" w:line="240" w:lineRule="auto"/>
+            </w:pPr>
+            <w:r>
+              <w:rPr>
+                <w:rFonts w:ascii="Liberation Sans" w:hAnsi="Liberation Sans" w:eastAsia="Liberation Sans"/>
+                <w:sz w:val="16"/>
+              </w:rPr>
+            </w:r>
+            <w:r>
+              <w:rPr>
+                <w:rFonts w:ascii="Liberation Sans" w:hAnsi="Liberation Sans" w:eastAsia="Liberation Sans"/>
                 <w:color w:val="0F172A"/>
                 <w:sz w:val="16"/>
               </w:rPr>
@@ -17239,16 +17912,129 @@
           </w:tcPr>
           <w:p>
             <w:pPr>
-              <w:spacing w:after="0"/>
-            </w:pPr>
-            <w:r/>
-            <w:r>
-              <w:rPr>
-                <w:rFonts w:ascii="Liberation Sans" w:hAnsi="Liberation Sans"/>
+              <w:spacing w:after="0" w:before="0" w:line="240" w:lineRule="auto"/>
+            </w:pPr>
+            <w:r>
+              <w:rPr>
+                <w:rFonts w:ascii="Liberation Sans" w:hAnsi="Liberation Sans" w:eastAsia="Liberation Sans"/>
+                <w:sz w:val="16"/>
+              </w:rPr>
+            </w:r>
+            <w:r>
+              <w:rPr>
+                <w:rFonts w:ascii="Liberation Sans" w:hAnsi="Liberation Sans" w:eastAsia="Liberation Sans"/>
                 <w:color w:val="0F172A"/>
                 <w:sz w:val="16"/>
               </w:rPr>
               <w:t>A foundational layer of state, policy, evidence, and authority relations.</w:t>
+            </w:r>
+          </w:p>
+        </w:tc>
+      </w:tr>
+      <w:tr>
+        <w:tc>
+          <w:tcPr>
+            <w:tcW w:type="dxa" w:w="4997"/>
+          </w:tcPr>
+          <w:p>
+            <w:pPr>
+              <w:spacing w:before="0" w:after="0" w:line="240" w:lineRule="auto"/>
+            </w:pPr>
+            <w:r>
+              <w:rPr>
+                <w:rFonts w:ascii="Liberation Sans" w:hAnsi="Liberation Sans" w:eastAsia="Liberation Sans"/>
+                <w:sz w:val="16"/>
+              </w:rPr>
+              <w:t>Verification receipt</w:t>
+            </w:r>
+          </w:p>
+        </w:tc>
+        <w:tc>
+          <w:tcPr>
+            <w:tcW w:type="dxa" w:w="4997"/>
+          </w:tcPr>
+          <w:p>
+            <w:pPr>
+              <w:spacing w:before="0" w:after="0" w:line="240" w:lineRule="auto"/>
+            </w:pPr>
+            <w:r>
+              <w:rPr>
+                <w:rFonts w:ascii="Liberation Sans" w:hAnsi="Liberation Sans" w:eastAsia="Liberation Sans"/>
+                <w:sz w:val="16"/>
+              </w:rPr>
+              <w:t>A witness record for verification metadata; not authority unless later cryptographic verification and gate policy are implemented and tested.</w:t>
+            </w:r>
+          </w:p>
+        </w:tc>
+      </w:tr>
+      <w:tr>
+        <w:tc>
+          <w:tcPr>
+            <w:tcW w:type="dxa" w:w="4997"/>
+          </w:tcPr>
+          <w:p>
+            <w:pPr>
+              <w:spacing w:before="0" w:after="0" w:line="240" w:lineRule="auto"/>
+            </w:pPr>
+            <w:r>
+              <w:rPr>
+                <w:rFonts w:ascii="Liberation Sans" w:hAnsi="Liberation Sans" w:eastAsia="Liberation Sans"/>
+                <w:sz w:val="16"/>
+              </w:rPr>
+              <w:t>Capability gate</w:t>
+            </w:r>
+          </w:p>
+        </w:tc>
+        <w:tc>
+          <w:tcPr>
+            <w:tcW w:type="dxa" w:w="4997"/>
+          </w:tcPr>
+          <w:p>
+            <w:pPr>
+              <w:spacing w:before="0" w:after="0" w:line="240" w:lineRule="auto"/>
+            </w:pPr>
+            <w:r>
+              <w:rPr>
+                <w:rFonts w:ascii="Liberation Sans" w:hAnsi="Liberation Sans" w:eastAsia="Liberation Sans"/>
+                <w:sz w:val="16"/>
+              </w:rPr>
+              <w:t>A boundary record that may later decide whether a verified receipt can request a capability; currently denied for unverified metadata.</w:t>
+            </w:r>
+          </w:p>
+        </w:tc>
+      </w:tr>
+      <w:tr>
+        <w:tc>
+          <w:tcPr>
+            <w:tcW w:type="dxa" w:w="4997"/>
+          </w:tcPr>
+          <w:p>
+            <w:pPr>
+              <w:spacing w:before="0" w:after="0" w:line="240" w:lineRule="auto"/>
+            </w:pPr>
+            <w:r>
+              <w:rPr>
+                <w:rFonts w:ascii="Liberation Sans" w:hAnsi="Liberation Sans" w:eastAsia="Liberation Sans"/>
+                <w:sz w:val="16"/>
+              </w:rPr>
+              <w:t>Effect decision</w:t>
+            </w:r>
+          </w:p>
+        </w:tc>
+        <w:tc>
+          <w:tcPr>
+            <w:tcW w:type="dxa" w:w="4997"/>
+          </w:tcPr>
+          <w:p>
+            <w:pPr>
+              <w:spacing w:before="0" w:after="0" w:line="240" w:lineRule="auto"/>
+            </w:pPr>
+            <w:r>
+              <w:rPr>
+                <w:rFonts w:ascii="Liberation Sans" w:hAnsi="Liberation Sans" w:eastAsia="Liberation Sans"/>
+                <w:sz w:val="16"/>
+              </w:rPr>
+              <w:t>A record that separates an allowed gate from any actual host, network, runtime, or tool effect.</w:t>
             </w:r>
           </w:p>
         </w:tc>
@@ -17981,9 +18767,9 @@
       </w:pPr>
       <w:r>
         <w:rPr>
-          <w:rFonts w:ascii="Liberation Serif" w:hAnsi="Liberation Serif"/>
+          <w:rFonts w:ascii="Liberation Serif" w:hAnsi="Liberation Serif" w:eastAsia="Liberation Serif"/>
         </w:rPr>
-        <w:t>A strong public sentence: "Latticra is an early, local, evidence-bound substrate for report-only verification, policy regression, manifest/hash baselines, guarded user-local installation, and future runtime-boundary research."</w:t>
+        <w:t>A strong public sentence: "Latticra is an early, local, evidence-bound substrate for report-only verification, policy regression, manifest/hash baselines, Seal trust-boundary metadata, guarded user-local installation, and future runtime-boundary research."</w:t>
       </w:r>
     </w:p>
     <w:p>
@@ -18025,9 +18811,9 @@
       </w:pPr>
       <w:r>
         <w:rPr>
-          <w:rFonts w:ascii="Liberation Serif" w:hAnsi="Liberation Serif"/>
+          <w:rFonts w:ascii="Liberation Serif" w:hAnsi="Liberation Serif" w:eastAsia="Liberation Serif"/>
         </w:rPr>
-        <w:t>This edition was derived from the uploaded Latticra Seal handbook and broadened with recent repository material containing Panel installer notes, dry-run and local-prefix install transcripts, receipt and component-marker evidence, Fedora validation snippets, Fedora installroot/disposable-VM RPM lifecycle records, macOS user-local app-bundle dry-run, commit-gate, reset/uninstall, and verification-transcript contracts, the production-installer readiness contract, the one-pass field-engine browser artifact, May 25 Lat/LIR no-effect implementation records, Latticra Console Stage-0 foundation records, Nucleus report-only task-boundary refinements, Nadia offline AI Stage-0 through Stage-27 contract records, defensive threat-model validation, runtime-boundary policy expansion, and abuse-case fixture records. The expansion is conservative: it treats the broader project as a substrate architecture and does not claim production security readiness, runtime enforcement, network authority, root authority, kernel integration, SELinux integration, systemd enforcement, Fedora approval, Apple platform approval, active AI inference, autonomous coding, tool execution, or production installer readiness.</w:t>
+        <w:t>This edition was derived from the uploaded Latticra Seal handbook and broadened with recent repository material containing Seal signed-request, request-freshness, verification-receipt, crypto-verify-backend, capability-gate, and effect-decision metadata records; Panel installer notes; dry-run and local-prefix install transcripts; receipt and component-marker evidence; Fedora validation snippets; Fedora installroot/disposable-VM RPM lifecycle records; macOS user-local app-bundle dry-run, commit-gate, reset/uninstall, and verification-transcript contracts; the production-installer readiness contract; the one-pass field-engine browser artifact; May 25 Lat/LIR no-effect implementation records; Latticra Console Stage-0 foundation records; Nucleus report-only task-boundary refinements; Nadia offline AI Stage-0 through Stage-27 contract records; defensive threat-model validation; runtime-boundary policy expansion; and abuse-case fixture records. The expansion is conservative: it treats the broader project as a substrate architecture and does not claim production security readiness, cryptographic verification, signed-request enforcement, trust-store behavior, revocation checking, runtime enforcement, network authority, root authority, kernel integration, SELinux integration, systemd enforcement, Fedora approval, Apple platform approval, active AI inference, autonomous coding, tool execution, host effect execution, capability enforcement, or production installer readiness.</w:t>
       </w:r>
     </w:p>
     <w:tbl>
@@ -18107,12 +18893,17 @@
           </w:tcPr>
           <w:p>
             <w:pPr>
-              <w:spacing w:after="0"/>
-            </w:pPr>
-            <w:r/>
-            <w:r>
-              <w:rPr>
-                <w:rFonts w:ascii="Liberation Sans" w:hAnsi="Liberation Sans"/>
+              <w:spacing w:after="0" w:before="0" w:line="240" w:lineRule="auto"/>
+            </w:pPr>
+            <w:r>
+              <w:rPr>
+                <w:rFonts w:ascii="Liberation Sans" w:hAnsi="Liberation Sans" w:eastAsia="Liberation Sans"/>
+                <w:sz w:val="16"/>
+              </w:rPr>
+            </w:r>
+            <w:r>
+              <w:rPr>
+                <w:rFonts w:ascii="Liberation Sans" w:hAnsi="Liberation Sans" w:eastAsia="Liberation Sans"/>
                 <w:color w:val="0F172A"/>
                 <w:sz w:val="16"/>
               </w:rPr>
@@ -18133,12 +18924,17 @@
           </w:tcPr>
           <w:p>
             <w:pPr>
-              <w:spacing w:after="0"/>
-            </w:pPr>
-            <w:r/>
-            <w:r>
-              <w:rPr>
-                <w:rFonts w:ascii="Liberation Sans" w:hAnsi="Liberation Sans"/>
+              <w:spacing w:after="0" w:before="0" w:line="240" w:lineRule="auto"/>
+            </w:pPr>
+            <w:r>
+              <w:rPr>
+                <w:rFonts w:ascii="Liberation Sans" w:hAnsi="Liberation Sans" w:eastAsia="Liberation Sans"/>
+                <w:sz w:val="16"/>
+              </w:rPr>
+            </w:r>
+            <w:r>
+              <w:rPr>
+                <w:rFonts w:ascii="Liberation Sans" w:hAnsi="Liberation Sans" w:eastAsia="Liberation Sans"/>
                 <w:color w:val="0F172A"/>
                 <w:sz w:val="16"/>
               </w:rPr>
@@ -18161,12 +18957,17 @@
           </w:tcPr>
           <w:p>
             <w:pPr>
-              <w:spacing w:after="0"/>
-            </w:pPr>
-            <w:r/>
-            <w:r>
-              <w:rPr>
-                <w:rFonts w:ascii="Liberation Sans" w:hAnsi="Liberation Sans"/>
+              <w:spacing w:after="0" w:before="0" w:line="240" w:lineRule="auto"/>
+            </w:pPr>
+            <w:r>
+              <w:rPr>
+                <w:rFonts w:ascii="Liberation Sans" w:hAnsi="Liberation Sans" w:eastAsia="Liberation Sans"/>
+                <w:sz w:val="16"/>
+              </w:rPr>
+            </w:r>
+            <w:r>
+              <w:rPr>
+                <w:rFonts w:ascii="Liberation Sans" w:hAnsi="Liberation Sans" w:eastAsia="Liberation Sans"/>
                 <w:color w:val="0F172A"/>
                 <w:sz w:val="16"/>
               </w:rPr>
@@ -18187,12 +18988,17 @@
           </w:tcPr>
           <w:p>
             <w:pPr>
-              <w:spacing w:after="0"/>
-            </w:pPr>
-            <w:r/>
-            <w:r>
-              <w:rPr>
-                <w:rFonts w:ascii="Liberation Sans" w:hAnsi="Liberation Sans"/>
+              <w:spacing w:after="0" w:before="0" w:line="240" w:lineRule="auto"/>
+            </w:pPr>
+            <w:r>
+              <w:rPr>
+                <w:rFonts w:ascii="Liberation Sans" w:hAnsi="Liberation Sans" w:eastAsia="Liberation Sans"/>
+                <w:sz w:val="16"/>
+              </w:rPr>
+            </w:r>
+            <w:r>
+              <w:rPr>
+                <w:rFonts w:ascii="Liberation Sans" w:hAnsi="Liberation Sans" w:eastAsia="Liberation Sans"/>
                 <w:color w:val="0F172A"/>
                 <w:sz w:val="16"/>
               </w:rPr>
@@ -18215,12 +19021,17 @@
           </w:tcPr>
           <w:p>
             <w:pPr>
-              <w:spacing w:after="0"/>
-            </w:pPr>
-            <w:r/>
-            <w:r>
-              <w:rPr>
-                <w:rFonts w:ascii="Liberation Sans" w:hAnsi="Liberation Sans"/>
+              <w:spacing w:after="0" w:before="0" w:line="240" w:lineRule="auto"/>
+            </w:pPr>
+            <w:r>
+              <w:rPr>
+                <w:rFonts w:ascii="Liberation Sans" w:hAnsi="Liberation Sans" w:eastAsia="Liberation Sans"/>
+                <w:sz w:val="16"/>
+              </w:rPr>
+            </w:r>
+            <w:r>
+              <w:rPr>
+                <w:rFonts w:ascii="Liberation Sans" w:hAnsi="Liberation Sans" w:eastAsia="Liberation Sans"/>
                 <w:color w:val="0F172A"/>
                 <w:sz w:val="16"/>
               </w:rPr>
@@ -18241,12 +19052,17 @@
           </w:tcPr>
           <w:p>
             <w:pPr>
-              <w:spacing w:after="0"/>
-            </w:pPr>
-            <w:r/>
-            <w:r>
-              <w:rPr>
-                <w:rFonts w:ascii="Liberation Sans" w:hAnsi="Liberation Sans"/>
+              <w:spacing w:after="0" w:before="0" w:line="240" w:lineRule="auto"/>
+            </w:pPr>
+            <w:r>
+              <w:rPr>
+                <w:rFonts w:ascii="Liberation Sans" w:hAnsi="Liberation Sans" w:eastAsia="Liberation Sans"/>
+                <w:sz w:val="16"/>
+              </w:rPr>
+            </w:r>
+            <w:r>
+              <w:rPr>
+                <w:rFonts w:ascii="Liberation Sans" w:hAnsi="Liberation Sans" w:eastAsia="Liberation Sans"/>
                 <w:color w:val="0F172A"/>
                 <w:sz w:val="16"/>
               </w:rPr>
@@ -18269,12 +19085,17 @@
           </w:tcPr>
           <w:p>
             <w:pPr>
-              <w:spacing w:after="0"/>
-            </w:pPr>
-            <w:r/>
-            <w:r>
-              <w:rPr>
-                <w:rFonts w:ascii="Liberation Sans" w:hAnsi="Liberation Sans"/>
+              <w:spacing w:after="0" w:before="0" w:line="240" w:lineRule="auto"/>
+            </w:pPr>
+            <w:r>
+              <w:rPr>
+                <w:rFonts w:ascii="Liberation Sans" w:hAnsi="Liberation Sans" w:eastAsia="Liberation Sans"/>
+                <w:sz w:val="16"/>
+              </w:rPr>
+            </w:r>
+            <w:r>
+              <w:rPr>
+                <w:rFonts w:ascii="Liberation Sans" w:hAnsi="Liberation Sans" w:eastAsia="Liberation Sans"/>
                 <w:color w:val="0F172A"/>
                 <w:sz w:val="16"/>
               </w:rPr>
@@ -18295,12 +19116,17 @@
           </w:tcPr>
           <w:p>
             <w:pPr>
-              <w:spacing w:after="0"/>
-            </w:pPr>
-            <w:r/>
-            <w:r>
-              <w:rPr>
-                <w:rFonts w:ascii="Liberation Sans" w:hAnsi="Liberation Sans"/>
+              <w:spacing w:after="0" w:before="0" w:line="240" w:lineRule="auto"/>
+            </w:pPr>
+            <w:r>
+              <w:rPr>
+                <w:rFonts w:ascii="Liberation Sans" w:hAnsi="Liberation Sans" w:eastAsia="Liberation Sans"/>
+                <w:sz w:val="16"/>
+              </w:rPr>
+            </w:r>
+            <w:r>
+              <w:rPr>
+                <w:rFonts w:ascii="Liberation Sans" w:hAnsi="Liberation Sans" w:eastAsia="Liberation Sans"/>
                 <w:color w:val="0F172A"/>
                 <w:sz w:val="16"/>
               </w:rPr>
@@ -18323,12 +19149,17 @@
           </w:tcPr>
           <w:p>
             <w:pPr>
-              <w:spacing w:after="0"/>
-            </w:pPr>
-            <w:r/>
-            <w:r>
-              <w:rPr>
-                <w:rFonts w:ascii="Liberation Sans" w:hAnsi="Liberation Sans"/>
+              <w:spacing w:after="0" w:before="0" w:line="240" w:lineRule="auto"/>
+            </w:pPr>
+            <w:r>
+              <w:rPr>
+                <w:rFonts w:ascii="Liberation Sans" w:hAnsi="Liberation Sans" w:eastAsia="Liberation Sans"/>
+                <w:sz w:val="16"/>
+              </w:rPr>
+            </w:r>
+            <w:r>
+              <w:rPr>
+                <w:rFonts w:ascii="Liberation Sans" w:hAnsi="Liberation Sans" w:eastAsia="Liberation Sans"/>
                 <w:color w:val="0F172A"/>
                 <w:sz w:val="16"/>
               </w:rPr>
@@ -18349,12 +19180,17 @@
           </w:tcPr>
           <w:p>
             <w:pPr>
-              <w:spacing w:after="0"/>
-            </w:pPr>
-            <w:r/>
-            <w:r>
-              <w:rPr>
-                <w:rFonts w:ascii="Liberation Sans" w:hAnsi="Liberation Sans"/>
+              <w:spacing w:after="0" w:before="0" w:line="240" w:lineRule="auto"/>
+            </w:pPr>
+            <w:r>
+              <w:rPr>
+                <w:rFonts w:ascii="Liberation Sans" w:hAnsi="Liberation Sans" w:eastAsia="Liberation Sans"/>
+                <w:sz w:val="16"/>
+              </w:rPr>
+            </w:r>
+            <w:r>
+              <w:rPr>
+                <w:rFonts w:ascii="Liberation Sans" w:hAnsi="Liberation Sans" w:eastAsia="Liberation Sans"/>
                 <w:color w:val="0F172A"/>
                 <w:sz w:val="16"/>
               </w:rPr>
@@ -18369,10 +19205,12 @@
             <w:tcW w:type="dxa" w:w="4997"/>
           </w:tcPr>
           <w:p>
-            <w:pPr/>
-            <w:r>
-              <w:rPr>
-                <w:rFonts w:ascii="Liberation Sans" w:hAnsi="Liberation Sans"/>
+            <w:pPr>
+              <w:spacing w:before="0" w:after="0" w:line="240" w:lineRule="auto"/>
+            </w:pPr>
+            <w:r>
+              <w:rPr>
+                <w:rFonts w:ascii="Liberation Sans" w:hAnsi="Liberation Sans" w:eastAsia="Liberation Sans"/>
                 <w:sz w:val="16"/>
               </w:rPr>
               <w:t>Latticra Console foundation</w:t>
@@ -18384,10 +19222,12 @@
             <w:tcW w:type="dxa" w:w="4997"/>
           </w:tcPr>
           <w:p>
-            <w:pPr/>
-            <w:r>
-              <w:rPr>
-                <w:rFonts w:ascii="Liberation Sans" w:hAnsi="Liberation Sans"/>
+            <w:pPr>
+              <w:spacing w:before="0" w:after="0" w:line="240" w:lineRule="auto"/>
+            </w:pPr>
+            <w:r>
+              <w:rPr>
+                <w:rFonts w:ascii="Liberation Sans" w:hAnsi="Liberation Sans" w:eastAsia="Liberation Sans"/>
                 <w:sz w:val="16"/>
               </w:rPr>
               <w:t>Stage-0 command registry, Panel installability, runtime-boundary binding, and no-effect operator-surface posture.</w:t>
@@ -18401,10 +19241,12 @@
             <w:tcW w:type="dxa" w:w="4997"/>
           </w:tcPr>
           <w:p>
-            <w:pPr/>
-            <w:r>
-              <w:rPr>
-                <w:rFonts w:ascii="Liberation Sans" w:hAnsi="Liberation Sans"/>
+            <w:pPr>
+              <w:spacing w:before="0" w:after="0" w:line="240" w:lineRule="auto"/>
+            </w:pPr>
+            <w:r>
+              <w:rPr>
+                <w:rFonts w:ascii="Liberation Sans" w:hAnsi="Liberation Sans" w:eastAsia="Liberation Sans"/>
                 <w:sz w:val="16"/>
               </w:rPr>
               <w:t>Nucleus task boundary</w:t>
@@ -18416,10 +19258,12 @@
             <w:tcW w:type="dxa" w:w="4997"/>
           </w:tcPr>
           <w:p>
-            <w:pPr/>
-            <w:r>
-              <w:rPr>
-                <w:rFonts w:ascii="Liberation Sans" w:hAnsi="Liberation Sans"/>
+            <w:pPr>
+              <w:spacing w:before="0" w:after="0" w:line="240" w:lineRule="auto"/>
+            </w:pPr>
+            <w:r>
+              <w:rPr>
+                <w:rFonts w:ascii="Liberation Sans" w:hAnsi="Liberation Sans" w:eastAsia="Liberation Sans"/>
                 <w:sz w:val="16"/>
               </w:rPr>
               <w:t>Report-only task classification, no-effect alignment, execution-status labels, and future-gated task vocabulary.</w:t>
@@ -18433,10 +19277,12 @@
             <w:tcW w:type="dxa" w:w="4997"/>
           </w:tcPr>
           <w:p>
-            <w:pPr/>
-            <w:r>
-              <w:rPr>
-                <w:rFonts w:ascii="Liberation Sans" w:hAnsi="Liberation Sans"/>
+            <w:pPr>
+              <w:spacing w:before="0" w:after="0" w:line="240" w:lineRule="auto"/>
+            </w:pPr>
+            <w:r>
+              <w:rPr>
+                <w:rFonts w:ascii="Liberation Sans" w:hAnsi="Liberation Sans" w:eastAsia="Liberation Sans"/>
                 <w:sz w:val="16"/>
               </w:rPr>
               <w:t>Nadia offline AI contracts</w:t>
@@ -18448,10 +19294,12 @@
             <w:tcW w:type="dxa" w:w="4997"/>
           </w:tcPr>
           <w:p>
-            <w:pPr/>
-            <w:r>
-              <w:rPr>
-                <w:rFonts w:ascii="Liberation Sans" w:hAnsi="Liberation Sans"/>
+            <w:pPr>
+              <w:spacing w:before="0" w:after="0" w:line="240" w:lineRule="auto"/>
+            </w:pPr>
+            <w:r>
+              <w:rPr>
+                <w:rFonts w:ascii="Liberation Sans" w:hAnsi="Liberation Sans" w:eastAsia="Liberation Sans"/>
                 <w:sz w:val="16"/>
               </w:rPr>
               <w:t>Stage-0 through Stage-27 metadata ladder for Panel/Console visibility, local context, model/prompt/tokenizer contracts, prompt-token-sequence and context-window boundaries, and denied AI/tool authority.</w:t>
@@ -18465,10 +19313,12 @@
             <w:tcW w:type="dxa" w:w="4997"/>
           </w:tcPr>
           <w:p>
-            <w:pPr/>
-            <w:r>
-              <w:rPr>
-                <w:rFonts w:ascii="Liberation Sans" w:hAnsi="Liberation Sans"/>
+            <w:pPr>
+              <w:spacing w:before="0" w:after="0" w:line="240" w:lineRule="auto"/>
+            </w:pPr>
+            <w:r>
+              <w:rPr>
+                <w:rFonts w:ascii="Liberation Sans" w:hAnsi="Liberation Sans" w:eastAsia="Liberation Sans"/>
                 <w:sz w:val="16"/>
               </w:rPr>
               <w:t>macOS user-local app bundle lane</w:t>
@@ -18480,10 +19330,12 @@
             <w:tcW w:type="dxa" w:w="4997"/>
           </w:tcPr>
           <w:p>
-            <w:pPr/>
-            <w:r>
-              <w:rPr>
-                <w:rFonts w:ascii="Liberation Sans" w:hAnsi="Liberation Sans"/>
+            <w:pPr>
+              <w:spacing w:before="0" w:after="0" w:line="240" w:lineRule="auto"/>
+            </w:pPr>
+            <w:r>
+              <w:rPr>
+                <w:rFonts w:ascii="Liberation Sans" w:hAnsi="Liberation Sans" w:eastAsia="Liberation Sans"/>
                 <w:sz w:val="16"/>
               </w:rPr>
               <w:t>Dry-run writer posture, user-local app bundle contract, commit gate, reset/uninstall contract, and verification transcript requirements.</w:t>
@@ -18497,10 +19349,12 @@
             <w:tcW w:type="dxa" w:w="4997"/>
           </w:tcPr>
           <w:p>
-            <w:pPr/>
-            <w:r>
-              <w:rPr>
-                <w:rFonts w:ascii="Liberation Sans" w:hAnsi="Liberation Sans"/>
+            <w:pPr>
+              <w:spacing w:before="0" w:after="0" w:line="240" w:lineRule="auto"/>
+            </w:pPr>
+            <w:r>
+              <w:rPr>
+                <w:rFonts w:ascii="Liberation Sans" w:hAnsi="Liberation Sans" w:eastAsia="Liberation Sans"/>
                 <w:sz w:val="16"/>
               </w:rPr>
               <w:t>Fedora RPM validation lanes</w:t>
@@ -18512,10 +19366,12 @@
             <w:tcW w:type="dxa" w:w="4997"/>
           </w:tcPr>
           <w:p>
-            <w:pPr/>
-            <w:r>
-              <w:rPr>
-                <w:rFonts w:ascii="Liberation Sans" w:hAnsi="Liberation Sans"/>
+            <w:pPr>
+              <w:spacing w:before="0" w:after="0" w:line="240" w:lineRule="auto"/>
+            </w:pPr>
+            <w:r>
+              <w:rPr>
+                <w:rFonts w:ascii="Liberation Sans" w:hAnsi="Liberation Sans" w:eastAsia="Liberation Sans"/>
                 <w:sz w:val="16"/>
               </w:rPr>
               <w:t>Installroot and disposable-VM RPM lifecycle evidence, bounded host-facing validation vocabulary, and Fedora non-claims.</w:t>
@@ -18529,10 +19385,12 @@
             <w:tcW w:type="dxa" w:w="4997"/>
           </w:tcPr>
           <w:p>
-            <w:pPr/>
-            <w:r>
-              <w:rPr>
-                <w:rFonts w:ascii="Liberation Sans" w:hAnsi="Liberation Sans"/>
+            <w:pPr>
+              <w:spacing w:before="0" w:after="0" w:line="240" w:lineRule="auto"/>
+            </w:pPr>
+            <w:r>
+              <w:rPr>
+                <w:rFonts w:ascii="Liberation Sans" w:hAnsi="Liberation Sans" w:eastAsia="Liberation Sans"/>
                 <w:sz w:val="16"/>
               </w:rPr>
               <w:t>Production installer readiness contract</w:t>
@@ -18544,13 +19402,51 @@
             <w:tcW w:type="dxa" w:w="4997"/>
           </w:tcPr>
           <w:p>
-            <w:pPr/>
-            <w:r>
-              <w:rPr>
-                <w:rFonts w:ascii="Liberation Sans" w:hAnsi="Liberation Sans"/>
+            <w:pPr>
+              <w:spacing w:before="0" w:after="0" w:line="240" w:lineRule="auto"/>
+            </w:pPr>
+            <w:r>
+              <w:rPr>
+                <w:rFonts w:ascii="Liberation Sans" w:hAnsi="Liberation Sans" w:eastAsia="Liberation Sans"/>
                 <w:sz w:val="16"/>
               </w:rPr>
               <w:t>Promotion gates for future installer artifacts, signatures, SBOM, install/uninstall/rollback transcripts, multi-VM validation, and readiness non-claims.</w:t>
+            </w:r>
+          </w:p>
+        </w:tc>
+      </w:tr>
+      <w:tr>
+        <w:tc>
+          <w:tcPr>
+            <w:tcW w:type="dxa" w:w="4997"/>
+          </w:tcPr>
+          <w:p>
+            <w:pPr>
+              <w:spacing w:before="0" w:after="0" w:line="240" w:lineRule="auto"/>
+            </w:pPr>
+            <w:r>
+              <w:rPr>
+                <w:rFonts w:ascii="Liberation Sans" w:hAnsi="Liberation Sans" w:eastAsia="Liberation Sans"/>
+                <w:sz w:val="16"/>
+              </w:rPr>
+              <w:t>Seal trust and crypto metadata ladder</w:t>
+            </w:r>
+          </w:p>
+        </w:tc>
+        <w:tc>
+          <w:tcPr>
+            <w:tcW w:type="dxa" w:w="4997"/>
+          </w:tcPr>
+          <w:p>
+            <w:pPr>
+              <w:spacing w:before="0" w:after="0" w:line="240" w:lineRule="auto"/>
+            </w:pPr>
+            <w:r>
+              <w:rPr>
+                <w:rFonts w:ascii="Liberation Sans" w:hAnsi="Liberation Sans" w:eastAsia="Liberation Sans"/>
+                <w:sz w:val="16"/>
+              </w:rPr>
+              <w:t>Signed request, request freshness, verification receipt, crypto verify backend, capability gate, effect decision, and denied authority boundaries.</w:t>
             </w:r>
           </w:p>
         </w:tc>
@@ -18567,9 +19463,9 @@
       </w:pPr>
       <w:r>
         <w:rPr>
-          <w:rFonts w:ascii="Liberation Serif" w:hAnsi="Liberation Serif"/>
+          <w:rFonts w:ascii="Liberation Serif" w:hAnsi="Liberation Serif" w:eastAsia="Liberation Serif"/>
         </w:rPr>
-        <w:t>Future editions should replace inferred project-level connective tissue with canonical repository documents as they mature: a root architecture spec, Lat/LIR spec, Panel UX contract, Latticra Console host-embedding contract, Nucleus task-record schema, Nadia offline-AI contract ladder, installer readiness contract, macOS app-bundle writer contract, Fedora RPM validation contract, report schema, receipt schema, and runtime-handoff specification.</w:t>
+        <w:t>Future editions should replace inferred project-level connective tissue with canonical repository documents as they mature: a root architecture spec, Lat/LIR spec, Panel UX contract, Latticra Console host-embedding contract, Nucleus task-record schema, Nadia offline-AI contract ladder, Seal trust/crypto evidence schema, installer readiness contract, macOS app-bundle writer contract, Fedora RPM validation contract, report schema, receipt schema, and runtime-handoff specification.</w:t>
       </w:r>
     </w:p>
     <w:p>
@@ -18669,6 +19565,17 @@
       </w:pPr>
       <w:r>
         <w:t>For platform work, distinguish dry-run, installroot, disposable-VM, manual-host, and production-installer evidence before making any readiness claim.</w:t>
+      </w:r>
+    </w:p>
+    <w:p>
+      <w:pPr>
+        <w:pStyle w:val="BodyTight"/>
+      </w:pPr>
+      <w:r>
+        <w:rPr>
+          <w:rFonts w:ascii="Liberation Serif" w:hAnsi="Liberation Serif" w:eastAsia="Liberation Serif"/>
+        </w:rPr>
+        <w:t>For trust-adjacent Seal work, follow the ladder: signed request metadata, freshness metadata, verification receipt, crypto backend, capability gate, effect decision, runtime handoff, and report envelope. Do not skip from metadata to authority.</w:t>
       </w:r>
     </w:p>
     <w:p>

</xml_diff>

<commit_message>
Add updater workspace to Latticra Panel
</commit_message>
<xml_diff>
--- a/docs/latticra-system-substrate/the-latticra-system-substrate.docx
+++ b/docs/latticra-system-substrate/the-latticra-system-substrate.docx
@@ -104,7 +104,7 @@
           <w:rFonts w:ascii="Liberation Sans" w:hAnsi="Liberation Sans" w:eastAsia="Liberation Sans"/>
           <w:sz w:val="20"/>
         </w:rPr>
-        <w:t>Working Draft 0.7 - 2026-05-25</w:t>
+        <w:t>Working Draft 0.8 - 2026-05-25</w:t>
       </w:r>
     </w:p>
     <w:p>
@@ -156,7 +156,7 @@
         <w:rPr>
           <w:rFonts w:ascii="Liberation Serif" w:hAnsi="Liberation Serif" w:eastAsia="Liberation Serif"/>
         </w:rPr>
-        <w:t>Source posture: this edition draws from the Seal handbook plus current Seal signed-request, request-freshness, verification-receipt, crypto-verify-backend, capability-gate, and effect-decision metadata records; Panel/installer receipts; Fedora and macOS platform-validation records; production-installer readiness gates; Lat/LIR; Latticra Console; Nucleus; Nadia Stage-27; threat-model, runtime-boundary, and abuse-case evidence. Where project documents are not yet canonical, this book uses conservative connective tissue rather than asserting implementation details.</w:t>
+        <w:t>Source posture: this edition draws from the Seal handbook plus current Seal signed-request, request-freshness, verification-receipt, crypto-verify-backend, Ed25519 verify-only, verified-receipt-promotion, verified-capability-gate, capability-gate, and effect-decision records; Panel/installer receipts; Fedora and macOS platform-validation records; production-installer readiness gates; Lat/LIR; Latticra Console; Nucleus; Nadia Stage-27; threat-model, runtime-boundary, and abuse-case evidence. Where project documents are not yet canonical, this book uses conservative connective tissue rather than asserting implementation details.</w:t>
       </w:r>
     </w:p>
     <w:p>
@@ -4645,7 +4645,7 @@
                 <w:rFonts w:ascii="Liberation Sans" w:hAnsi="Liberation Sans" w:eastAsia="Liberation Sans"/>
                 <w:sz w:val="16"/>
               </w:rPr>
-              <w:t>Seal verification receipt and crypto backend</w:t>
+              <w:t>Seal verification receipt and crypto backend metadata</w:t>
             </w:r>
           </w:p>
         </w:tc>
@@ -4662,7 +4662,7 @@
                 <w:rFonts w:ascii="Liberation Sans" w:hAnsi="Liberation Sans" w:eastAsia="Liberation Sans"/>
                 <w:sz w:val="16"/>
               </w:rPr>
-              <w:t>Metadata-only receipt/backend posture with verification_state=unsupported and crypto_verify_state=unsupported.</w:t>
+              <w:t>Baseline receipt/backend metadata remains unverified or unsupported until a later verify-only result is introduced.</w:t>
             </w:r>
           </w:p>
         </w:tc>
@@ -4679,7 +4679,7 @@
                 <w:rFonts w:ascii="Liberation Sans" w:hAnsi="Liberation Sans" w:eastAsia="Liberation Sans"/>
                 <w:sz w:val="16"/>
               </w:rPr>
-              <w:t>Say the boundary is specified; do not claim active crypto verification, key handling, trust stores, or revocation checks.</w:t>
+              <w:t>Say the predecessor boundary is specified; do not treat backend metadata alone as cryptographic verification.</w:t>
             </w:r>
           </w:p>
         </w:tc>
@@ -4733,6 +4733,165 @@
                 <w:sz w:val="16"/>
               </w:rPr>
               <w:t>Say gates and decisions preserve non-effects; do not say they enforce capabilities or perform host effects.</w:t>
+            </w:r>
+          </w:p>
+        </w:tc>
+      </w:tr>
+      <w:tr>
+        <w:tc>
+          <w:tcPr>
+            <w:tcW w:type="dxa" w:w="3331"/>
+          </w:tcPr>
+          <w:p>
+            <w:pPr>
+              <w:spacing w:before="0" w:after="0" w:line="240" w:lineRule="auto"/>
+            </w:pPr>
+            <w:r>
+              <w:rPr>
+                <w:rFonts w:ascii="Liberation Sans" w:hAnsi="Liberation Sans" w:eastAsia="Liberation Sans"/>
+                <w:sz w:val="16"/>
+              </w:rPr>
+              <w:t>Seal Ed25519 verify-only result</w:t>
+            </w:r>
+          </w:p>
+        </w:tc>
+        <w:tc>
+          <w:tcPr>
+            <w:tcW w:type="dxa" w:w="3331"/>
+          </w:tcPr>
+          <w:p>
+            <w:pPr>
+              <w:spacing w:before="0" w:after="0" w:line="240" w:lineRule="auto"/>
+            </w:pPr>
+            <w:r>
+              <w:rPr>
+                <w:rFonts w:ascii="Liberation Sans" w:hAnsi="Liberation Sans" w:eastAsia="Liberation Sans"/>
+                <w:sz w:val="16"/>
+              </w:rPr>
+              <w:t>Local provider-backed verification of caller-supplied message, public key, and signature bytes; authority-neutral.</w:t>
+            </w:r>
+          </w:p>
+        </w:tc>
+        <w:tc>
+          <w:tcPr>
+            <w:tcW w:type="dxa" w:w="3331"/>
+          </w:tcPr>
+          <w:p>
+            <w:pPr>
+              <w:spacing w:before="0" w:after="0" w:line="240" w:lineRule="auto"/>
+            </w:pPr>
+            <w:r>
+              <w:rPr>
+                <w:rFonts w:ascii="Liberation Sans" w:hAnsi="Liberation Sans" w:eastAsia="Liberation Sans"/>
+                <w:sz w:val="16"/>
+              </w:rPr>
+              <w:t>Say local Ed25519 verify-only evidence exists; do not claim signing, trust stores, revocation, production crypto, or authority.</w:t>
+            </w:r>
+          </w:p>
+        </w:tc>
+      </w:tr>
+      <w:tr>
+        <w:tc>
+          <w:tcPr>
+            <w:tcW w:type="dxa" w:w="3331"/>
+          </w:tcPr>
+          <w:p>
+            <w:pPr>
+              <w:spacing w:before="0" w:after="0" w:line="240" w:lineRule="auto"/>
+            </w:pPr>
+            <w:r>
+              <w:rPr>
+                <w:rFonts w:ascii="Liberation Sans" w:hAnsi="Liberation Sans" w:eastAsia="Liberation Sans"/>
+                <w:sz w:val="16"/>
+              </w:rPr>
+              <w:t>Seal verified receipt promotion</w:t>
+            </w:r>
+          </w:p>
+        </w:tc>
+        <w:tc>
+          <w:tcPr>
+            <w:tcW w:type="dxa" w:w="3331"/>
+          </w:tcPr>
+          <w:p>
+            <w:pPr>
+              <w:spacing w:before="0" w:after="0" w:line="240" w:lineRule="auto"/>
+            </w:pPr>
+            <w:r>
+              <w:rPr>
+                <w:rFonts w:ascii="Liberation Sans" w:hAnsi="Liberation Sans" w:eastAsia="Liberation Sans"/>
+                <w:sz w:val="16"/>
+              </w:rPr>
+              <w:t>Successful verify-only results can be promoted into verified receipt metadata with authority still zero.</w:t>
+            </w:r>
+          </w:p>
+        </w:tc>
+        <w:tc>
+          <w:tcPr>
+            <w:tcW w:type="dxa" w:w="3331"/>
+          </w:tcPr>
+          <w:p>
+            <w:pPr>
+              <w:spacing w:before="0" w:after="0" w:line="240" w:lineRule="auto"/>
+            </w:pPr>
+            <w:r>
+              <w:rPr>
+                <w:rFonts w:ascii="Liberation Sans" w:hAnsi="Liberation Sans" w:eastAsia="Liberation Sans"/>
+                <w:sz w:val="16"/>
+              </w:rPr>
+              <w:t>Say evidence promotion; do not say permission promotion, capability authorization, effects, or runtime handoff.</w:t>
+            </w:r>
+          </w:p>
+        </w:tc>
+      </w:tr>
+      <w:tr>
+        <w:tc>
+          <w:tcPr>
+            <w:tcW w:type="dxa" w:w="3331"/>
+          </w:tcPr>
+          <w:p>
+            <w:pPr>
+              <w:spacing w:before="0" w:after="0" w:line="240" w:lineRule="auto"/>
+            </w:pPr>
+            <w:r>
+              <w:rPr>
+                <w:rFonts w:ascii="Liberation Sans" w:hAnsi="Liberation Sans" w:eastAsia="Liberation Sans"/>
+                <w:sz w:val="16"/>
+              </w:rPr>
+              <w:t>Seal verified capability gate</w:t>
+            </w:r>
+          </w:p>
+        </w:tc>
+        <w:tc>
+          <w:tcPr>
+            <w:tcW w:type="dxa" w:w="3331"/>
+          </w:tcPr>
+          <w:p>
+            <w:pPr>
+              <w:spacing w:before="0" w:after="0" w:line="240" w:lineRule="auto"/>
+            </w:pPr>
+            <w:r>
+              <w:rPr>
+                <w:rFonts w:ascii="Liberation Sans" w:hAnsi="Liberation Sans" w:eastAsia="Liberation Sans"/>
+                <w:sz w:val="16"/>
+              </w:rPr>
+              <w:t>Verified receipt metadata can pass a narrow report/evaluate metadata gate with gate_allowed=1 and no effects.</w:t>
+            </w:r>
+          </w:p>
+        </w:tc>
+        <w:tc>
+          <w:tcPr>
+            <w:tcW w:type="dxa" w:w="3331"/>
+          </w:tcPr>
+          <w:p>
+            <w:pPr>
+              <w:spacing w:before="0" w:after="0" w:line="240" w:lineRule="auto"/>
+            </w:pPr>
+            <w:r>
+              <w:rPr>
+                <w:rFonts w:ascii="Liberation Sans" w:hAnsi="Liberation Sans" w:eastAsia="Liberation Sans"/>
+                <w:sz w:val="16"/>
+              </w:rPr>
+              <w:t>Say metadata-only gate evaluation; do not say capability enforcement, effect execution, or runtime permission.</w:t>
             </w:r>
           </w:p>
         </w:tc>
@@ -7040,7 +7199,7 @@
         <w:rPr>
           <w:rFonts w:ascii="Liberation Serif" w:hAnsi="Liberation Serif" w:eastAsia="Liberation Serif"/>
         </w:rPr>
-        <w:t>Seal now has enough trust-adjacent contract surface to name a ladder without pretending the ladder already grants authority. The stages are signed request metadata, request freshness metadata, verification policy metadata, verification receipt metadata, crypto verify backend metadata, capability gate metadata, effect decision metadata, runtime handoff metadata, and report envelope metadata. Each stage records the next question before the project is allowed to answer it with effects.</w:t>
+        <w:t>Seal now has enough trust-adjacent contract surface to name a ladder without pretending the ladder already grants authority. The stages are signed request metadata, request freshness metadata, verification policy metadata, verification receipt metadata, crypto verify backend metadata, Ed25519 verify-only result metadata, verified receipt promotion metadata, verified capability gate metadata, effect decision metadata, runtime handoff metadata, and report envelope metadata. Each stage records the next question before the project is allowed to answer it with effects.</w:t>
       </w:r>
     </w:p>
     <w:p>
@@ -7051,7 +7210,7 @@
         <w:rPr>
           <w:rFonts w:ascii="Liberation Serif" w:hAnsi="Liberation Serif" w:eastAsia="Liberation Serif"/>
         </w:rPr>
-        <w:t>Signed request records may describe identity, context, parameters, freshness, policy binding, algorithms, key identifiers, and signature hashes, but the current posture is report-only. Signature generation, signature verification, public-key parsing, trust-store loading, revocation lookup, signed-request enforcement, host effects, and runtime authority are all zero claims.</w:t>
+        <w:t>Signed request records may describe identity, context, parameters, freshness, policy binding, algorithms, key identifiers, and signature hashes, but the signed-request posture is still report-only. Signature generation, signed-request verification, public trust lookup, revocation lookup, signed-request enforcement, host effects, and runtime authority remain zero claims even though a separate local verify-only primitive now exists.</w:t>
       </w:r>
     </w:p>
     <w:p>
@@ -7062,7 +7221,7 @@
         <w:rPr>
           <w:rFonts w:ascii="Liberation Serif" w:hAnsi="Liberation Serif" w:eastAsia="Liberation Serif"/>
         </w:rPr>
-        <w:t>Verification receipts are intentionally weaker than authority. The current receipt profile is unverified metadata: verification_state=unsupported, receipt_state=unverified-metadata, cryptographic_verification_performed=0, verified=0, authority_usable=0, capability_gate_allowed=0, and runtime_authority_granted=0. That shape is useful because it prevents a future signed object from silently becoming a capability.</w:t>
+        <w:t>Verification receipts are intentionally weaker than authority. The baseline receipt profile records unverified metadata: verification_state=unsupported, receipt_state=unverified-metadata, cryptographic_verification_performed=0, verified=0, authority_usable=0, capability_gate_allowed=0, and runtime_authority_granted=0. A later verified receipt promotion may change the evidence state to verified, but not the permission state.</w:t>
       </w:r>
     </w:p>
     <w:p>
@@ -7073,7 +7232,7 @@
         <w:rPr>
           <w:rFonts w:ascii="Liberation Serif" w:hAnsi="Liberation Serif" w:eastAsia="Liberation Serif"/>
         </w:rPr>
-        <w:t>The crypto verify backend is also metadata-only. It can name a planned verify-only boundary and an Ed25519-development label, but it does not consume keys, perform real cryptographic verification, consult trust stores, check revocation, contact networks, or grant authority. Post-quantum algorithm labels such as ML-DSA-planned and SLH-DSA-planned are roadmap vocabulary, not current verification support.</w:t>
+        <w:t>The crypto verify backend remains the metadata boundary that names the provider path. The later Ed25519 verify-only result surface is separate: it can perform a local provider-backed verification over caller-supplied bytes, while the backend contract still carries no trust store, revocation lookup, network behavior, capability authorization, or runtime authority. Post-quantum algorithm labels such as ML-DSA-planned and SLH-DSA-planned remain roadmap vocabulary, not current verification support.</w:t>
       </w:r>
     </w:p>
     <w:p>
@@ -7084,7 +7243,106 @@
         <w:rPr>
           <w:rFonts w:ascii="Liberation Serif" w:hAnsi="Liberation Serif" w:eastAsia="Liberation Serif"/>
         </w:rPr>
-        <w:t>Capability gates and effect decisions close the ladder. A denied or unverified receipt must keep gate_state=denied-unverified, gate_allowed=0, decision_state=denied-gate, effect_allowed=0, effect_performed=0, host_read_performed=0, host_write_performed=0, network_performed=0, and runtime_authority_granted=0. Future authority may only appear after cryptographic verification, receipt semantics, gate policy, effect decision, runtime handoff, and tests all agree.</w:t>
+        <w:t>Capability gates and effect decisions close the ladder. A verified capability gate may now set gate_allowed=1 for a narrow metadata-only report/evaluate request, but effect_allowed, effect_performed, host_read_performed, host_write_performed, network_performed, and runtime_authority_granted must remain zero unless a later effect-decision contract, implementation, and tests explicitly widen that boundary.</w:t>
+      </w:r>
+    </w:p>
+    <w:p>
+      <w:pPr>
+        <w:pStyle w:val="Heading2"/>
+      </w:pPr>
+      <w:r>
+        <w:rPr>
+          <w:rFonts w:ascii="Liberation Serif" w:hAnsi="Liberation Serif" w:eastAsia="Liberation Serif"/>
+        </w:rPr>
+        <w:t>5.7 Ed25519 verify-only and verified receipt promotion</w:t>
+      </w:r>
+    </w:p>
+    <w:p>
+      <w:pPr>
+        <w:pStyle w:val="BodyTight"/>
+      </w:pPr>
+      <w:r>
+        <w:rPr>
+          <w:rFonts w:ascii="Liberation Serif" w:hAnsi="Liberation Serif" w:eastAsia="Liberation Serif"/>
+        </w:rPr>
+        <w:t>The first real cryptographic operation in the current Seal lane is local Ed25519 verify-only. It accepts caller-supplied message bytes, caller-supplied 32-byte Ed25519 public-key bytes, caller-supplied 64-byte signature bytes, and an existing crypto verify backend metadata record. It uses OpenSSL EVP rather than handwritten curve arithmetic, computes a SHA-256 message digest for reporting, and renders deterministic result metadata.</w:t>
+      </w:r>
+    </w:p>
+    <w:p>
+      <w:pPr>
+        <w:pStyle w:val="BodyTight"/>
+      </w:pPr>
+      <w:r>
+        <w:rPr>
+          <w:rFonts w:ascii="Liberation Serif" w:hAnsi="Liberation Serif" w:eastAsia="Liberation Serif"/>
+        </w:rPr>
+        <w:t>A successful verify-only result may set crypto_verify_state=verified, cryptographic_verification_supported=1, cryptographic_verification_performed=1, verified=1, invalid=0, and status=ed25519-verified. That is a meaningful evidence upgrade, but it is not a trust-store result, not revocation checking, not signing, not private-key handling, not production cryptography certification, and not authority.</w:t>
+      </w:r>
+    </w:p>
+    <w:p>
+      <w:pPr>
+        <w:pStyle w:val="BodyTight"/>
+      </w:pPr>
+      <w:r>
+        <w:rPr>
+          <w:rFonts w:ascii="Liberation Serif" w:hAnsi="Liberation Serif" w:eastAsia="Liberation Serif"/>
+        </w:rPr>
+        <w:t>Verified receipt promotion consumes only a successful Ed25519 verify-only result and turns it into deterministic verified receipt metadata: verification_state=verified, receipt_state=verified, cryptographic_verification_performed=1, and verified=1. The promotion is evidence promotion, not permission promotion. It must preserve authority_usable=0, capability_gate_allowed=0, runtime_authority_granted=0, capability_authorization_added=0, effect_execution_added=0, host behavior unchanged, and network behavior unchanged.</w:t>
+      </w:r>
+    </w:p>
+    <w:p>
+      <w:pPr>
+        <w:pStyle w:val="BodyTight"/>
+      </w:pPr>
+      <w:r>
+        <w:rPr>
+          <w:rFonts w:ascii="Liberation Serif" w:hAnsi="Liberation Serif" w:eastAsia="Liberation Serif"/>
+        </w:rPr>
+        <w:t>This distinction is now central to the Seal story. Latticra can say that local verify-only evidence and authority-neutral verified receipt metadata exist. It still must not say that verified receipts authorize capabilities, execute effects, contact trust infrastructure, enforce runtime behavior, or make production security claims.</w:t>
+      </w:r>
+    </w:p>
+    <w:p>
+      <w:pPr>
+        <w:pStyle w:val="Heading2"/>
+      </w:pPr>
+      <w:r>
+        <w:rPr>
+          <w:rFonts w:ascii="Liberation Serif" w:hAnsi="Liberation Serif" w:eastAsia="Liberation Serif"/>
+        </w:rPr>
+        <w:t>5.8 Verified capability gate metadata</w:t>
+      </w:r>
+    </w:p>
+    <w:p>
+      <w:pPr>
+        <w:pStyle w:val="BodyTight"/>
+      </w:pPr>
+      <w:r>
+        <w:rPr>
+          <w:rFonts w:ascii="Liberation Serif" w:hAnsi="Liberation Serif" w:eastAsia="Liberation Serif"/>
+        </w:rPr>
+        <w:t>The verified capability gate consumes verified receipt promotion metadata plus requested capability, effect, and scope labels. Its initial allowlist is intentionally narrow: verified-receipt-inspection and verified-receipt-report as capability labels, and report-only or evaluate-only as effect labels.</w:t>
+      </w:r>
+    </w:p>
+    <w:p>
+      <w:pPr>
+        <w:pStyle w:val="BodyTight"/>
+      </w:pPr>
+      <w:r>
+        <w:rPr>
+          <w:rFonts w:ascii="Liberation Serif" w:hAnsi="Liberation Serif" w:eastAsia="Liberation Serif"/>
+        </w:rPr>
+        <w:t>A successful metadata-only gate may set gate_allowed=1 and gate_state=allowed-metadata-only. That phrase must be read literally. It means the gate evaluation accepted a local metadata request; it does not mean capability enforcement, effect execution, host reads, host writes, network access, tool execution, shell execution, policy persistence, or runtime authority.</w:t>
+      </w:r>
+    </w:p>
+    <w:p>
+      <w:pPr>
+        <w:pStyle w:val="BodyTight"/>
+      </w:pPr>
+      <w:r>
+        <w:rPr>
+          <w:rFonts w:ascii="Liberation Serif" w:hAnsi="Liberation Serif" w:eastAsia="Liberation Serif"/>
+        </w:rPr>
+        <w:t>The current status shape is therefore subtle and useful: receipt_state=verified, verification_state=verified, verified=1, gate_allowed=1, gate_state=allowed-metadata-only, authority_usable=0, receipt_capability_gate_allowed=0, runtime_authority_granted=0, effect_performed=0, host_read_performed=0, host_write_performed=0, and network_performed=0. The next valid rung is effect-decision evaluation from an allowed metadata-only gate.</w:t>
       </w:r>
     </w:p>
     <w:p>
@@ -11915,6 +12173,83 @@
     </w:p>
     <w:p>
       <w:pPr>
+        <w:pStyle w:val="Heading2"/>
+      </w:pPr>
+      <w:r>
+        <w:rPr>
+          <w:rFonts w:ascii="Liberation Serif" w:hAnsi="Liberation Serif" w:eastAsia="Liberation Serif"/>
+        </w:rPr>
+        <w:t>11.5 Verified evidence is not permission</w:t>
+      </w:r>
+    </w:p>
+    <w:p>
+      <w:pPr>
+        <w:pStyle w:val="BodyTight"/>
+      </w:pPr>
+      <w:r>
+        <w:rPr>
+          <w:rFonts w:ascii="Liberation Serif" w:hAnsi="Liberation Serif" w:eastAsia="Liberation Serif"/>
+        </w:rPr>
+        <w:t>The Ed25519 verify-only result changes the witness graph because a report can now contain a real local cryptographic verification result. That result should still be read narrowly: it says the supplied signature matched the supplied message and public key under the local provider boundary.</w:t>
+      </w:r>
+    </w:p>
+    <w:p>
+      <w:pPr>
+        <w:pStyle w:val="BodyTight"/>
+      </w:pPr>
+      <w:r>
+        <w:rPr>
+          <w:rFonts w:ascii="Liberation Serif" w:hAnsi="Liberation Serif" w:eastAsia="Liberation Serif"/>
+        </w:rPr>
+        <w:t>It does not say the public key is trusted, current, non-revoked, authorized for a capability, or allowed to drive a host effect. Those are different witness edges. A future trust-store edge, revocation edge, capability-gate edge, effect-decision edge, and runtime-handoff edge would each need its own schema, implementation, tests, and public wording.</w:t>
+      </w:r>
+    </w:p>
+    <w:p>
+      <w:pPr>
+        <w:pStyle w:val="BodyTight"/>
+      </w:pPr>
+      <w:r>
+        <w:rPr>
+          <w:rFonts w:ascii="Liberation Serif" w:hAnsi="Liberation Serif" w:eastAsia="Liberation Serif"/>
+        </w:rPr>
+        <w:t>Verified receipt promotion is therefore useful precisely because it gives the graph a named middle state. A promoted receipt is stronger than unverified metadata, but weaker than authority. Reviewers should treat authority_usable=0 and capability_gate_allowed=0 as part of the receipt meaning, not as incidental implementation details.</w:t>
+      </w:r>
+    </w:p>
+    <w:p>
+      <w:pPr>
+        <w:pStyle w:val="Heading2"/>
+      </w:pPr>
+      <w:r>
+        <w:rPr>
+          <w:rFonts w:ascii="Liberation Serif" w:hAnsi="Liberation Serif" w:eastAsia="Liberation Serif"/>
+        </w:rPr>
+        <w:t>11.6 Metadata gates before effects</w:t>
+      </w:r>
+    </w:p>
+    <w:p>
+      <w:pPr>
+        <w:pStyle w:val="BodyTight"/>
+      </w:pPr>
+      <w:r>
+        <w:rPr>
+          <w:rFonts w:ascii="Liberation Serif" w:hAnsi="Liberation Serif" w:eastAsia="Liberation Serif"/>
+        </w:rPr>
+        <w:t>The verified capability gate adds another witness edge between a promoted receipt and an effect decision. Its allowed state is still metadata-only: gate_allowed=1 is not the same as an effect being allowed, performed, or handed to a runtime.</w:t>
+      </w:r>
+    </w:p>
+    <w:p>
+      <w:pPr>
+        <w:pStyle w:val="BodyTight"/>
+      </w:pPr>
+      <w:r>
+        <w:rPr>
+          <w:rFonts w:ascii="Liberation Serif" w:hAnsi="Liberation Serif" w:eastAsia="Liberation Serif"/>
+        </w:rPr>
+        <w:t>This gives reviewers a sharper audit rule. A record may show verified receipt evidence and an allowed metadata gate while still proving that no host read, host write, network access, tool execution, shell execution, capability enforcement, or runtime authority occurred. That is not contradiction; it is the point of the staged witness graph.</w:t>
+      </w:r>
+    </w:p>
+    <w:p>
+      <w:pPr>
         <w:pStyle w:val="Heading1"/>
       </w:pPr>
       <w:r>
@@ -15146,7 +15481,7 @@
         <w:rPr>
           <w:rFonts w:ascii="Liberation Serif" w:hAnsi="Liberation Serif" w:eastAsia="Liberation Serif"/>
         </w:rPr>
-        <w:t>The trust ladder should use small, stable key/value schemas before it grows richer object formats. The current schema vocabulary already includes signed_request_profile, freshness_profile, receipt_profile, verification_policy_profile, backend_profile, gate_profile, decision_profile, signature_profile, manifest_profile, artifact_digest_algorithm, signer_identity_label, public_key_identity_label, trust_source, requested_capability, requested_effect, requested_scope, and status.</w:t>
+        <w:t>The trust ladder should use small, stable key/value schemas before it grows richer object formats. The current schema vocabulary includes signed_request_profile, freshness_profile, receipt_profile, verify_profile, ed25519_verify_profile, verification_policy_profile, backend_profile, gate_profile, decision_profile, signature_profile, manifest_profile, artifact_digest_algorithm, message_digest_algorithm, signer_identity_label, public_key_identity_label, trust_source, requested_capability, requested_effect, requested_scope, and status.</w:t>
       </w:r>
     </w:p>
     <w:p>
@@ -15179,7 +15514,84 @@
         <w:rPr>
           <w:rFonts w:ascii="Liberation Serif" w:hAnsi="Liberation Serif" w:eastAsia="Liberation Serif"/>
         </w:rPr>
-        <w:t>The schema rule is simple: a future field may reserve vocabulary, but a current field must not imply capability. If the project adds real Ed25519 verification, a trust store, revocation checks, signed envelopes, or effect execution later, each transition should change only after a contract, implementation, invariant tests, status record, public wording update, and handbook update are in place.</w:t>
+        <w:t>The schema rule is simple: a future field may reserve vocabulary, but a current field must not imply capability. If the project adds trust stores, revocation checks, signed envelopes, capability authorization, effect execution, or production cryptography claims later, each transition should change only after a contract, implementation, invariant tests, status record, public wording update, and handbook update are in place.</w:t>
+      </w:r>
+    </w:p>
+    <w:p>
+      <w:pPr>
+        <w:pStyle w:val="Heading2"/>
+      </w:pPr>
+      <w:r>
+        <w:rPr>
+          <w:rFonts w:ascii="Liberation Serif" w:hAnsi="Liberation Serif" w:eastAsia="Liberation Serif"/>
+        </w:rPr>
+        <w:t>14.7 Verify-only result and promoted receipt schemas</w:t>
+      </w:r>
+    </w:p>
+    <w:p>
+      <w:pPr>
+        <w:pStyle w:val="BodyTight"/>
+      </w:pPr>
+      <w:r>
+        <w:rPr>
+          <w:rFonts w:ascii="Liberation Serif" w:hAnsi="Liberation Serif" w:eastAsia="Liberation Serif"/>
+        </w:rPr>
+        <w:t>The Ed25519 verify-only result schema is the first place where cryptographic verification fields can legitimately become one. Its key fields are ed25519_verify_profile, backend_profile, verification_policy_profile, message_label, message_size_bytes, message_digest_algorithm, message_digest_hex, public_key_identity_label, public_key_size_bytes, signature_algorithm, signature_size_bytes, trust_source, crypto_verify_state, cryptographic_verification_supported, cryptographic_verification_performed, verified, invalid, authority_usable, capability_gate_allowed, runtime_authority_granted, and status.</w:t>
+      </w:r>
+    </w:p>
+    <w:p>
+      <w:pPr>
+        <w:pStyle w:val="BodyTight"/>
+      </w:pPr>
+      <w:r>
+        <w:rPr>
+          <w:rFonts w:ascii="Liberation Serif" w:hAnsi="Liberation Serif" w:eastAsia="Liberation Serif"/>
+        </w:rPr>
+        <w:t>The promoted receipt schema copies the evidence-bearing fields into receipt form and changes the receipt state, not the authority state. Its important fields include receipt_profile, verify_profile, backend_profile, verification_policy_profile, message_label, message_digest_algorithm, message_digest_hex, public_key_identity_label, signature_algorithm, trust_source, verification_state=verified, receipt_state=verified, verified=1, authority_usable=0, capability_gate_allowed=0, runtime_authority_granted=0, mode=verified-receipt-authority-neutral, and status=verified-receipt-metadata.</w:t>
+      </w:r>
+    </w:p>
+    <w:p>
+      <w:pPr>
+        <w:pStyle w:val="BodyTight"/>
+      </w:pPr>
+      <w:r>
+        <w:rPr>
+          <w:rFonts w:ascii="Liberation Serif" w:hAnsi="Liberation Serif" w:eastAsia="Liberation Serif"/>
+        </w:rPr>
+        <w:t>Schema consumers should distinguish mathematical verification from trust. The current trust_source=local-test-vector label is evidence about the fixture boundary, not a trust root, revocation service, certificate chain, or production identity system.</w:t>
+      </w:r>
+    </w:p>
+    <w:p>
+      <w:pPr>
+        <w:pStyle w:val="Heading2"/>
+      </w:pPr>
+      <w:r>
+        <w:rPr>
+          <w:rFonts w:ascii="Liberation Serif" w:hAnsi="Liberation Serif" w:eastAsia="Liberation Serif"/>
+        </w:rPr>
+        <w:t>14.8 Verified capability gate schema</w:t>
+      </w:r>
+    </w:p>
+    <w:p>
+      <w:pPr>
+        <w:pStyle w:val="BodyTight"/>
+      </w:pPr>
+      <w:r>
+        <w:rPr>
+          <w:rFonts w:ascii="Liberation Serif" w:hAnsi="Liberation Serif" w:eastAsia="Liberation Serif"/>
+        </w:rPr>
+        <w:t>The verified capability gate schema binds a verified receipt to a requested metadata capability without crossing into enforcement. Core fields include gate_profile, receipt_profile, verify_profile, message_digest_algorithm, message_digest_hex, public_key_identity_label, receipt_state, verification_state, requested_capability, requested_effect, requested_scope, verified, authority_usable, receipt_capability_gate_allowed, gate_allowed, gate_state, runtime_authority_granted, effect_performed, host_read_performed, host_write_performed, network_performed, and status.</w:t>
+      </w:r>
+    </w:p>
+    <w:p>
+      <w:pPr>
+        <w:pStyle w:val="BodyTight"/>
+      </w:pPr>
+      <w:r>
+        <w:rPr>
+          <w:rFonts w:ascii="Liberation Serif" w:hAnsi="Liberation Serif" w:eastAsia="Liberation Serif"/>
+        </w:rPr>
+        <w:t>The important distinction is that gate_allowed=1 and gate_state=allowed-metadata-only may coexist with authority_usable=0, receipt_capability_gate_allowed=0, runtime_authority_granted=0, and effect_performed=0. Schema consumers must not collapse metadata permission into runtime permission.</w:t>
       </w:r>
     </w:p>
     <w:p>
@@ -16128,7 +16540,7 @@
         <w:rPr>
           <w:rFonts w:ascii="Liberation Serif" w:hAnsi="Liberation Serif" w:eastAsia="Liberation Serif"/>
         </w:rPr>
-        <w:t>Seal trust-boundary tests should prove the negative path as carefully as the happy path. The signed-request lane should assert that supported, generation, verification, signature-present, signature-valid, trust-store, revocation, network, host-effect, and runtime-authority fields remain zero until a real implementation exists.</w:t>
+        <w:t>Seal trust-boundary tests should prove the negative path as carefully as the happy path. The signed-request lane should still assert that signed-request support, generation, signed-request verification, signature-present, signature-valid, trust-store, revocation, network, host-effect, and runtime-authority fields remain zero until those specific layers exist.</w:t>
       </w:r>
     </w:p>
     <w:p>
@@ -16150,7 +16562,7 @@
         <w:rPr>
           <w:rFonts w:ascii="Liberation Serif" w:hAnsi="Liberation Serif" w:eastAsia="Liberation Serif"/>
         </w:rPr>
-        <w:t>The verification-receipt and crypto-backend lanes should assert that verification_state=unsupported, receipt_state=unverified-metadata, crypto_verify_state=unsupported, cryptographic_verification_performed=0, verified=0, authority_usable=0, and runtime_authority_granted=0 remain stable across refactors.</w:t>
+        <w:t>The baseline verification-receipt and crypto-backend lanes should keep unverified and unsupported predecessor states stable: verification_state=unsupported, receipt_state=unverified-metadata, crypto_verify_state=unsupported, cryptographic_verification_performed=0, verified=0, authority_usable=0, and runtime_authority_granted=0. The Ed25519 and promotion lanes then prove the later, narrower evidence upgrade separately.</w:t>
       </w:r>
     </w:p>
     <w:p>
@@ -16162,6 +16574,83 @@
           <w:rFonts w:ascii="Liberation Serif" w:hAnsi="Liberation Serif" w:eastAsia="Liberation Serif"/>
         </w:rPr>
         <w:t>The capability-gate and effect-decision lanes should assert denied defaults: gate_state=denied-unverified, gate_allowed=0, decision_state=denied-gate, effect_allowed=0, effect_performed=0, host_read_performed=0, host_write_performed=0, network_performed=0, and runtime_authority_granted=0. When those tests fail, the default response should be to weaken or fix the claim, not to widen authority.</w:t>
+      </w:r>
+    </w:p>
+    <w:p>
+      <w:pPr>
+        <w:pStyle w:val="Heading2"/>
+      </w:pPr>
+      <w:r>
+        <w:rPr>
+          <w:rFonts w:ascii="Liberation Serif" w:hAnsi="Liberation Serif" w:eastAsia="Liberation Serif"/>
+        </w:rPr>
+        <w:t>15.7 Ed25519 and promotion validation lanes</w:t>
+      </w:r>
+    </w:p>
+    <w:p>
+      <w:pPr>
+        <w:pStyle w:val="BodyTight"/>
+      </w:pPr>
+      <w:r>
+        <w:rPr>
+          <w:rFonts w:ascii="Liberation Serif" w:hAnsi="Liberation Serif" w:eastAsia="Liberation Serif"/>
+        </w:rPr>
+        <w:t>The Ed25519 verify-only lane should prove both the real positive and the safe negative cases. The positive case verifies the RFC8032-style test vector and renders crypto_verify_state=verified, cryptographic_verification_performed=1, verified=1, authority_usable=0, capability_gate_allowed=0, and runtime_authority_granted=0.</w:t>
+      </w:r>
+    </w:p>
+    <w:p>
+      <w:pPr>
+        <w:pStyle w:val="BodyTight"/>
+      </w:pPr>
+      <w:r>
+        <w:rPr>
+          <w:rFonts w:ascii="Liberation Serif" w:hAnsi="Liberation Serif" w:eastAsia="Liberation Serif"/>
+        </w:rPr>
+        <w:t>The negative cases are just as important: tampered signature, unsupported algorithm, missing message, oversized message, missing public key, wrong public-key size, missing signature, wrong signature size, provider failure, null output, null report buffers, and tiny report buffers must fail closed without key generation, signing, trust-store access, revocation lookup, host reads, host writes, network access, capability enforcement, or runtime authority.</w:t>
+      </w:r>
+    </w:p>
+    <w:p>
+      <w:pPr>
+        <w:pStyle w:val="BodyTight"/>
+      </w:pPr>
+      <w:r>
+        <w:rPr>
+          <w:rFonts w:ascii="Liberation Serif" w:hAnsi="Liberation Serif" w:eastAsia="Liberation Serif"/>
+        </w:rPr>
+        <w:t>The verified receipt promotion lane should accept only a successful Ed25519 verify-only result. It should reject unsupported verification, verification-not-performed, verified=0, invalid=1, wrong crypto state, missing digest, and missing public-key identity. Its success case must keep authority_usable=0, capability_gate_allowed=0, and runtime_authority_granted=0 visible in both the record and report.</w:t>
+      </w:r>
+    </w:p>
+    <w:p>
+      <w:pPr>
+        <w:pStyle w:val="Heading2"/>
+      </w:pPr>
+      <w:r>
+        <w:rPr>
+          <w:rFonts w:ascii="Liberation Serif" w:hAnsi="Liberation Serif" w:eastAsia="Liberation Serif"/>
+        </w:rPr>
+        <w:t>15.8 Verified capability gate validation lane</w:t>
+      </w:r>
+    </w:p>
+    <w:p>
+      <w:pPr>
+        <w:pStyle w:val="BodyTight"/>
+      </w:pPr>
+      <w:r>
+        <w:rPr>
+          <w:rFonts w:ascii="Liberation Serif" w:hAnsi="Liberation Serif" w:eastAsia="Liberation Serif"/>
+        </w:rPr>
+        <w:t>The verified capability gate lane should prove that the narrow allowlist works and that the boundaries remain visible. Valid report/evaluate requests may set gate_allowed=1 and gate_state=allowed-metadata-only while preserving runtime_authority_granted=0, effect_performed=0, host_read_performed=0, host_write_performed=0, and network_performed=0.</w:t>
+      </w:r>
+    </w:p>
+    <w:p>
+      <w:pPr>
+        <w:pStyle w:val="BodyTight"/>
+      </w:pPr>
+      <w:r>
+        <w:rPr>
+          <w:rFonts w:ascii="Liberation Serif" w:hAnsi="Liberation Serif" w:eastAsia="Liberation Serif"/>
+        </w:rPr>
+        <w:t>The failure lane should reject null receipts, invalid receipts, unverified receipts, invalid receipt flags, missing digest metadata, missing public-key identity, missing requested capability, unknown capability, missing requested effect, unknown effect, null output, null reports, and tiny report buffers. None of those failures may execute effects, persist policy, contact networks, read or write host files, execute tools, execute shells, enforce capabilities, or grant runtime authority.</w:t>
       </w:r>
     </w:p>
     <w:p>
@@ -18039,6 +18528,114 @@
           </w:p>
         </w:tc>
       </w:tr>
+      <w:tr>
+        <w:tc>
+          <w:tcPr>
+            <w:tcW w:type="dxa" w:w="4997"/>
+          </w:tcPr>
+          <w:p>
+            <w:pPr>
+              <w:spacing w:before="0" w:after="0" w:line="240" w:lineRule="auto"/>
+            </w:pPr>
+            <w:r>
+              <w:rPr>
+                <w:rFonts w:ascii="Liberation Sans" w:hAnsi="Liberation Sans" w:eastAsia="Liberation Sans"/>
+                <w:sz w:val="16"/>
+              </w:rPr>
+              <w:t>Verify-only result</w:t>
+            </w:r>
+          </w:p>
+        </w:tc>
+        <w:tc>
+          <w:tcPr>
+            <w:tcW w:type="dxa" w:w="4997"/>
+          </w:tcPr>
+          <w:p>
+            <w:pPr>
+              <w:spacing w:before="0" w:after="0" w:line="240" w:lineRule="auto"/>
+            </w:pPr>
+            <w:r>
+              <w:rPr>
+                <w:rFonts w:ascii="Liberation Sans" w:hAnsi="Liberation Sans" w:eastAsia="Liberation Sans"/>
+                <w:sz w:val="16"/>
+              </w:rPr>
+              <w:t>A local cryptographic verification result for caller-supplied bytes that remains separate from signing, trust, capability, and effects.</w:t>
+            </w:r>
+          </w:p>
+        </w:tc>
+      </w:tr>
+      <w:tr>
+        <w:tc>
+          <w:tcPr>
+            <w:tcW w:type="dxa" w:w="4997"/>
+          </w:tcPr>
+          <w:p>
+            <w:pPr>
+              <w:spacing w:before="0" w:after="0" w:line="240" w:lineRule="auto"/>
+            </w:pPr>
+            <w:r>
+              <w:rPr>
+                <w:rFonts w:ascii="Liberation Sans" w:hAnsi="Liberation Sans" w:eastAsia="Liberation Sans"/>
+                <w:sz w:val="16"/>
+              </w:rPr>
+              <w:t>Evidence promotion</w:t>
+            </w:r>
+          </w:p>
+        </w:tc>
+        <w:tc>
+          <w:tcPr>
+            <w:tcW w:type="dxa" w:w="4997"/>
+          </w:tcPr>
+          <w:p>
+            <w:pPr>
+              <w:spacing w:before="0" w:after="0" w:line="240" w:lineRule="auto"/>
+            </w:pPr>
+            <w:r>
+              <w:rPr>
+                <w:rFonts w:ascii="Liberation Sans" w:hAnsi="Liberation Sans" w:eastAsia="Liberation Sans"/>
+                <w:sz w:val="16"/>
+              </w:rPr>
+              <w:t>A transition that strengthens a witness record, such as from a verified result to a verified receipt, without granting authority.</w:t>
+            </w:r>
+          </w:p>
+        </w:tc>
+      </w:tr>
+      <w:tr>
+        <w:tc>
+          <w:tcPr>
+            <w:tcW w:type="dxa" w:w="4997"/>
+          </w:tcPr>
+          <w:p>
+            <w:pPr>
+              <w:spacing w:before="0" w:after="0" w:line="240" w:lineRule="auto"/>
+            </w:pPr>
+            <w:r>
+              <w:rPr>
+                <w:rFonts w:ascii="Liberation Sans" w:hAnsi="Liberation Sans" w:eastAsia="Liberation Sans"/>
+                <w:sz w:val="16"/>
+              </w:rPr>
+              <w:t>Metadata gate</w:t>
+            </w:r>
+          </w:p>
+        </w:tc>
+        <w:tc>
+          <w:tcPr>
+            <w:tcW w:type="dxa" w:w="4997"/>
+          </w:tcPr>
+          <w:p>
+            <w:pPr>
+              <w:spacing w:before="0" w:after="0" w:line="240" w:lineRule="auto"/>
+            </w:pPr>
+            <w:r>
+              <w:rPr>
+                <w:rFonts w:ascii="Liberation Sans" w:hAnsi="Liberation Sans" w:eastAsia="Liberation Sans"/>
+                <w:sz w:val="16"/>
+              </w:rPr>
+              <w:t>A policy evaluation record that can allow metadata-only inspection or reporting without performing an effect.</w:t>
+            </w:r>
+          </w:p>
+        </w:tc>
+      </w:tr>
     </w:tbl>
     <w:p>
       <w:pPr>
@@ -18769,7 +19366,7 @@
         <w:rPr>
           <w:rFonts w:ascii="Liberation Serif" w:hAnsi="Liberation Serif" w:eastAsia="Liberation Serif"/>
         </w:rPr>
-        <w:t>A strong public sentence: "Latticra is an early, local, evidence-bound substrate for report-only verification, policy regression, manifest/hash baselines, Seal trust-boundary metadata, guarded user-local installation, and future runtime-boundary research."</w:t>
+        <w:t>A strong public sentence: "Latticra is an early, local, evidence-bound substrate for report-only verification, policy regression, manifest/hash baselines, authority-neutral Ed25519 verification evidence, metadata-only capability gating, guarded user-local installation, and future runtime-boundary research."</w:t>
       </w:r>
     </w:p>
     <w:p>
@@ -18810,10 +19407,7 @@
         <w:pStyle w:val="BodyTight"/>
       </w:pPr>
       <w:r>
-        <w:rPr>
-          <w:rFonts w:ascii="Liberation Serif" w:hAnsi="Liberation Serif" w:eastAsia="Liberation Serif"/>
-        </w:rPr>
-        <w:t>This edition was derived from the uploaded Latticra Seal handbook and broadened with recent repository material containing Seal signed-request, request-freshness, verification-receipt, crypto-verify-backend, capability-gate, and effect-decision metadata records; Panel installer notes; dry-run and local-prefix install transcripts; receipt and component-marker evidence; Fedora validation snippets; Fedora installroot/disposable-VM RPM lifecycle records; macOS user-local app-bundle dry-run, commit-gate, reset/uninstall, and verification-transcript contracts; the production-installer readiness contract; the one-pass field-engine browser artifact; May 25 Lat/LIR no-effect implementation records; Latticra Console Stage-0 foundation records; Nucleus report-only task-boundary refinements; Nadia offline AI Stage-0 through Stage-27 contract records; defensive threat-model validation; runtime-boundary policy expansion; and abuse-case fixture records. The expansion is conservative: it treats the broader project as a substrate architecture and does not claim production security readiness, cryptographic verification, signed-request enforcement, trust-store behavior, revocation checking, runtime enforcement, network authority, root authority, kernel integration, SELinux integration, systemd enforcement, Fedora approval, Apple platform approval, active AI inference, autonomous coding, tool execution, host effect execution, capability enforcement, or production installer readiness.</w:t>
+        <w:t>This edition was derived from the Latticra Seal handbook and recent repository material covering signed-request, freshness, verification-receipt, crypto-backend, Ed25519 verify-only, verified receipt promotion, verified capability gate, capability-gate/effect-decision records, installer, Console, Panel, Nucleus, Nadia, macOS app-bundle, Fedora/RPM, Lat/LIR, and one-pass field-engine evidence. It distinguishes implemented facts from inferred substrate architecture and preserves the project non-claims.</w:t>
       </w:r>
     </w:p>
     <w:tbl>
@@ -19451,6 +20045,78 @@
           </w:p>
         </w:tc>
       </w:tr>
+      <w:tr>
+        <w:tc>
+          <w:tcPr>
+            <w:tcW w:type="dxa" w:w="4997"/>
+          </w:tcPr>
+          <w:p>
+            <w:pPr>
+              <w:spacing w:before="0" w:after="0" w:line="240" w:lineRule="auto"/>
+            </w:pPr>
+            <w:r>
+              <w:rPr>
+                <w:rFonts w:ascii="Liberation Sans" w:hAnsi="Liberation Sans" w:eastAsia="Liberation Sans"/>
+                <w:sz w:val="16"/>
+              </w:rPr>
+              <w:t>Seal Ed25519 verify-only and receipt promotion</w:t>
+            </w:r>
+          </w:p>
+        </w:tc>
+        <w:tc>
+          <w:tcPr>
+            <w:tcW w:type="dxa" w:w="4997"/>
+          </w:tcPr>
+          <w:p>
+            <w:pPr>
+              <w:spacing w:before="0" w:after="0" w:line="240" w:lineRule="auto"/>
+            </w:pPr>
+            <w:r>
+              <w:rPr>
+                <w:rFonts w:ascii="Liberation Sans" w:hAnsi="Liberation Sans" w:eastAsia="Liberation Sans"/>
+                <w:sz w:val="16"/>
+              </w:rPr>
+              <w:t>Provider-backed local verification result evidence, authority-neutral verified receipt promotion, and non-claims around trust stores, revocation, signing, capabilities, effects, and runtime authority.</w:t>
+            </w:r>
+          </w:p>
+        </w:tc>
+      </w:tr>
+      <w:tr>
+        <w:tc>
+          <w:tcPr>
+            <w:tcW w:type="dxa" w:w="4997"/>
+          </w:tcPr>
+          <w:p>
+            <w:pPr>
+              <w:spacing w:before="0" w:after="0" w:line="240" w:lineRule="auto"/>
+            </w:pPr>
+            <w:r>
+              <w:rPr>
+                <w:rFonts w:ascii="Liberation Sans" w:hAnsi="Liberation Sans" w:eastAsia="Liberation Sans"/>
+                <w:sz w:val="16"/>
+              </w:rPr>
+              <w:t>Seal verified capability gate</w:t>
+            </w:r>
+          </w:p>
+        </w:tc>
+        <w:tc>
+          <w:tcPr>
+            <w:tcW w:type="dxa" w:w="4997"/>
+          </w:tcPr>
+          <w:p>
+            <w:pPr>
+              <w:spacing w:before="0" w:after="0" w:line="240" w:lineRule="auto"/>
+            </w:pPr>
+            <w:r>
+              <w:rPr>
+                <w:rFonts w:ascii="Liberation Sans" w:hAnsi="Liberation Sans" w:eastAsia="Liberation Sans"/>
+                <w:sz w:val="16"/>
+              </w:rPr>
+              <w:t>Metadata-only capability/effect allowlist for verified receipts, with gate_allowed=1 separated from enforcement, effects, host behavior, and runtime authority.</w:t>
+            </w:r>
+          </w:p>
+        </w:tc>
+      </w:tr>
     </w:tbl>
     <w:p>
       <w:pPr>
@@ -19462,10 +20128,7 @@
         <w:pStyle w:val="BodyTight"/>
       </w:pPr>
       <w:r>
-        <w:rPr>
-          <w:rFonts w:ascii="Liberation Serif" w:hAnsi="Liberation Serif" w:eastAsia="Liberation Serif"/>
-        </w:rPr>
-        <w:t>Future editions should replace inferred project-level connective tissue with canonical repository documents as they mature: a root architecture spec, Lat/LIR spec, Panel UX contract, Latticra Console host-embedding contract, Nucleus task-record schema, Nadia offline-AI contract ladder, Seal trust/crypto evidence schema, installer readiness contract, macOS app-bundle writer contract, Fedora RPM validation contract, report schema, receipt schema, and runtime-handoff specification.</w:t>
+        <w:t>Future editions should replace inferred connective tissue with canonical specs for root architecture, Lat/LIR, Panel, Console, Nucleus, Nadia, Seal, installers, platform validation, reports, receipts, and runtime handoff.</w:t>
       </w:r>
     </w:p>
     <w:p>
@@ -19569,24 +20232,10 @@
     </w:p>
     <w:p>
       <w:pPr>
-        <w:pStyle w:val="BodyTight"/>
+        <w:pStyle w:val="ListNumber"/>
       </w:pPr>
       <w:r>
-        <w:rPr>
-          <w:rFonts w:ascii="Liberation Serif" w:hAnsi="Liberation Serif" w:eastAsia="Liberation Serif"/>
-        </w:rPr>
-        <w:t>For trust-adjacent Seal work, follow the ladder: signed request metadata, freshness metadata, verification receipt, crypto backend, capability gate, effect decision, runtime handoff, and report envelope. Do not skip from metadata to authority.</w:t>
-      </w:r>
-    </w:p>
-    <w:p>
-      <w:pPr>
-        <w:pStyle w:val="BodyTight"/>
-      </w:pPr>
-      <w:r>
-        <w:rPr>
-          <w:rFonts w:ascii="Liberation Serif" w:hAnsi="Liberation Serif"/>
-        </w:rPr>
-        <w:t>The result is a project that can mature without pretending. That is the Latticra contribution: not a premature claim of security, but a substrate where the effects of modern security work become explicit enough to verify.</w:t>
+        <w:t>For Seal work, follow the ladder through verified receipt promotion and verified capability gate metadata; never skip from verification evidence to authority.</w:t>
       </w:r>
     </w:p>
     <w:sectPr>

</xml_diff>

<commit_message>
Prepare public readiness checkpoint
</commit_message>
<xml_diff>
--- a/docs/latticra-system-substrate/the-latticra-system-substrate.docx
+++ b/docs/latticra-system-substrate/the-latticra-system-substrate.docx
@@ -100,11 +100,7 @@
         <w:jc w:val="center"/>
       </w:pPr>
       <w:r>
-        <w:rPr>
-          <w:rFonts w:ascii="Liberation Sans" w:hAnsi="Liberation Sans" w:eastAsia="Liberation Sans"/>
-          <w:sz w:val="20"/>
-        </w:rPr>
-        <w:t>Working Draft 0.8 - 2026-05-25</w:t>
+        <w:t>Working Draft 0.9 - 2026-05-25</w:t>
       </w:r>
     </w:p>
     <w:p>
@@ -153,10 +149,7 @@
         <w:pStyle w:val="BodyTight"/>
       </w:pPr>
       <w:r>
-        <w:rPr>
-          <w:rFonts w:ascii="Liberation Serif" w:hAnsi="Liberation Serif" w:eastAsia="Liberation Serif"/>
-        </w:rPr>
-        <w:t>Source posture: this edition draws from the Seal handbook plus current Seal signed-request, request-freshness, verification-receipt, crypto-verify-backend, Ed25519 verify-only, verified-receipt-promotion, verified-capability-gate, capability-gate, and effect-decision records; Panel/installer receipts; Fedora and macOS platform-validation records; production-installer readiness gates; Lat/LIR; Latticra Console; Nucleus; Nadia Stage-27; threat-model, runtime-boundary, and abuse-case evidence. Where project documents are not yet canonical, this book uses conservative connective tissue rather than asserting implementation details.</w:t>
+        <w:t>Source posture: this edition draws from the Seal handbook plus current Seal signed-request, request-freshness, verification-receipt, crypto-verify-backend, Ed25519 verify-only, verified-receipt-promotion, verified-capability-gate, verified-effect-decision, runtime-handoff-evaluation, runtime-handoff-report, capability-gate, and effect-decision records; Panel/installer receipts; Fedora and macOS validation material; Lat/LIR, Latticra Console, Nucleus, Nadia, runtime-boundary, kernel-lifecycle, and defensive threat-model notes; and the one-pass field engine research artifact.</w:t>
       </w:r>
     </w:p>
     <w:p>
@@ -4896,6 +4889,138 @@
           </w:p>
         </w:tc>
       </w:tr>
+      <w:tr>
+        <w:tc>
+          <w:tcPr>
+            <w:tcW w:type="dxa" w:w="3331"/>
+          </w:tcPr>
+          <w:p>
+            <w:r>
+              <w:rPr>
+                <w:rFonts w:ascii="Liberation Sans" w:hAnsi="Liberation Sans"/>
+                <w:sz w:val="16"/>
+              </w:rPr>
+              <w:t>Seal verified effect decision</w:t>
+            </w:r>
+          </w:p>
+        </w:tc>
+        <w:tc>
+          <w:tcPr>
+            <w:tcW w:type="dxa" w:w="3331"/>
+          </w:tcPr>
+          <w:p>
+            <w:r>
+              <w:rPr>
+                <w:rFonts w:ascii="Liberation Sans" w:hAnsi="Liberation Sans"/>
+                <w:sz w:val="16"/>
+              </w:rPr>
+              <w:t>Allowed verified gate metadata can classify report/evaluate requests with effect_allowed=1 while no effect is performed.</w:t>
+            </w:r>
+          </w:p>
+        </w:tc>
+        <w:tc>
+          <w:tcPr>
+            <w:tcW w:type="dxa" w:w="3331"/>
+          </w:tcPr>
+          <w:p>
+            <w:r>
+              <w:rPr>
+                <w:rFonts w:ascii="Liberation Sans" w:hAnsi="Liberation Sans"/>
+                <w:sz w:val="16"/>
+              </w:rPr>
+              <w:t>Say effect classification metadata; do not say effect execution, host effects, capability enforcement, or runtime permission.</w:t>
+            </w:r>
+          </w:p>
+        </w:tc>
+      </w:tr>
+      <w:tr>
+        <w:tc>
+          <w:tcPr>
+            <w:tcW w:type="dxa" w:w="3331"/>
+          </w:tcPr>
+          <w:p>
+            <w:r>
+              <w:rPr>
+                <w:rFonts w:ascii="Liberation Sans" w:hAnsi="Liberation Sans"/>
+                <w:sz w:val="16"/>
+              </w:rPr>
+              <w:t>Seal runtime handoff evaluation</w:t>
+            </w:r>
+          </w:p>
+        </w:tc>
+        <w:tc>
+          <w:tcPr>
+            <w:tcW w:type="dxa" w:w="3331"/>
+          </w:tcPr>
+          <w:p>
+            <w:r>
+              <w:rPr>
+                <w:rFonts w:ascii="Liberation Sans" w:hAnsi="Liberation Sans"/>
+                <w:sz w:val="16"/>
+              </w:rPr>
+              <w:t>Allowed metadata-only effect decisions can become handoff_eligible=1 with no handoff performed.</w:t>
+            </w:r>
+          </w:p>
+        </w:tc>
+        <w:tc>
+          <w:tcPr>
+            <w:tcW w:type="dxa" w:w="3331"/>
+          </w:tcPr>
+          <w:p>
+            <w:r>
+              <w:rPr>
+                <w:rFonts w:ascii="Liberation Sans" w:hAnsi="Liberation Sans"/>
+                <w:sz w:val="16"/>
+              </w:rPr>
+              <w:t>Say handoff eligibility classification; do not say runtime handoff execution or runtime authority.</w:t>
+            </w:r>
+          </w:p>
+        </w:tc>
+      </w:tr>
+      <w:tr>
+        <w:tc>
+          <w:tcPr>
+            <w:tcW w:type="dxa" w:w="3331"/>
+          </w:tcPr>
+          <w:p>
+            <w:r>
+              <w:rPr>
+                <w:rFonts w:ascii="Liberation Sans" w:hAnsi="Liberation Sans"/>
+                <w:sz w:val="16"/>
+              </w:rPr>
+              <w:t>Seal runtime handoff report</w:t>
+            </w:r>
+          </w:p>
+        </w:tc>
+        <w:tc>
+          <w:tcPr>
+            <w:tcW w:type="dxa" w:w="3331"/>
+          </w:tcPr>
+          <w:p>
+            <w:r>
+              <w:rPr>
+                <w:rFonts w:ascii="Liberation Sans" w:hAnsi="Liberation Sans"/>
+                <w:sz w:val="16"/>
+              </w:rPr>
+              <w:t>Eligible handoff metadata can become report_ready=1 with no runtime handoff or effect execution.</w:t>
+            </w:r>
+          </w:p>
+        </w:tc>
+        <w:tc>
+          <w:tcPr>
+            <w:tcW w:type="dxa" w:w="3331"/>
+          </w:tcPr>
+          <w:p>
+            <w:r>
+              <w:rPr>
+                <w:rFonts w:ascii="Liberation Sans" w:hAnsi="Liberation Sans"/>
+                <w:sz w:val="16"/>
+              </w:rPr>
+              <w:t>Say report-readiness metadata; do not say runtime bridge, enforcement, or host/network behavior.</w:t>
+            </w:r>
+          </w:p>
+        </w:tc>
+      </w:tr>
     </w:tbl>
     <w:p>
       <w:pPr>
@@ -7196,10 +7321,7 @@
         <w:pStyle w:val="BodyTight"/>
       </w:pPr>
       <w:r>
-        <w:rPr>
-          <w:rFonts w:ascii="Liberation Serif" w:hAnsi="Liberation Serif" w:eastAsia="Liberation Serif"/>
-        </w:rPr>
-        <w:t>Seal now has enough trust-adjacent contract surface to name a ladder without pretending the ladder already grants authority. The stages are signed request metadata, request freshness metadata, verification policy metadata, verification receipt metadata, crypto verify backend metadata, Ed25519 verify-only result metadata, verified receipt promotion metadata, verified capability gate metadata, effect decision metadata, runtime handoff metadata, and report envelope metadata. Each stage records the next question before the project is allowed to answer it with effects.</w:t>
+        <w:t>Seal now has enough trust-adjacent contract surface to name a ladder without pretending the ladder already grants authority. The stages are signed request metadata, request freshness metadata, verification policy metadata, verification receipt metadata, crypto verify backend metadata, Ed25519 verify-only result metadata, verified receipt promotion metadata, verified capability gate metadata, verified effect decision metadata, runtime handoff evaluation metadata, runtime handoff report metadata, effect decision metadata, runtime handoff metadata, and report envelope metadata. Each stage records the next question before the project is allowed to answer it with effects.</w:t>
       </w:r>
     </w:p>
     <w:p>
@@ -7240,10 +7362,7 @@
         <w:pStyle w:val="BodyTight"/>
       </w:pPr>
       <w:r>
-        <w:rPr>
-          <w:rFonts w:ascii="Liberation Serif" w:hAnsi="Liberation Serif" w:eastAsia="Liberation Serif"/>
-        </w:rPr>
-        <w:t>Capability gates and effect decisions close the ladder. A verified capability gate may now set gate_allowed=1 for a narrow metadata-only report/evaluate request, but effect_allowed, effect_performed, host_read_performed, host_write_performed, network_performed, and runtime_authority_granted must remain zero unless a later effect-decision contract, implementation, and tests explicitly widen that boundary.</w:t>
+        <w:t>Capability gates, verified effect decisions, and runtime handoff reports close the current ladder. A verified capability gate may set gate_allowed=1 for a narrow metadata-only report/evaluate request; a verified effect decision may set effect_allowed=1; a runtime handoff evaluation may set handoff_eligible=1; and a runtime handoff report may set report_ready=1. None of those flags means an effect ran, a handoff happened, or authority was granted.</w:t>
       </w:r>
     </w:p>
     <w:p>
@@ -7339,10 +7458,55 @@
         <w:pStyle w:val="BodyTight"/>
       </w:pPr>
       <w:r>
-        <w:rPr>
-          <w:rFonts w:ascii="Liberation Serif" w:hAnsi="Liberation Serif" w:eastAsia="Liberation Serif"/>
-        </w:rPr>
-        <w:t>The current status shape is therefore subtle and useful: receipt_state=verified, verification_state=verified, verified=1, gate_allowed=1, gate_state=allowed-metadata-only, authority_usable=0, receipt_capability_gate_allowed=0, runtime_authority_granted=0, effect_performed=0, host_read_performed=0, host_write_performed=0, and network_performed=0. The next valid rung is effect-decision evaluation from an allowed metadata-only gate.</w:t>
+        <w:t>The current status shape is therefore subtle and useful: receipt_state=verified, verification_state=verified, verified=1, gate_allowed=1, gate_state=allowed-metadata-only, authority_usable=0, receipt_capability_gate_allowed=0, runtime_authority_granted=0, effect_performed=0, host_read_performed=0, host_write_performed=0, and network_performed=0. The next valid rung is verified effect decision evaluation from an allowed metadata-only gate.</w:t>
+      </w:r>
+    </w:p>
+    <w:p>
+      <w:pPr>
+        <w:pStyle w:val="Heading2"/>
+      </w:pPr>
+      <w:r>
+        <w:t>5.9 Verified effect decision metadata</w:t>
+      </w:r>
+    </w:p>
+    <w:p>
+      <w:pPr>
+        <w:pStyle w:val="BodyTight"/>
+      </w:pPr>
+      <w:r>
+        <w:t>The verified effect decision consumes an allowed verified capability gate and a requested effect label. Its narrow policy accepts only report-only and evaluate-only requests from gate_state=allowed-metadata-only, with gate_allowed=1 and all performed/authority fields still zero.</w:t>
+      </w:r>
+    </w:p>
+    <w:p>
+      <w:pPr>
+        <w:pStyle w:val="BodyTight"/>
+      </w:pPr>
+      <w:r>
+        <w:t>A successful decision may set effect_allowed=1 and decision_state=allowed-report-only or decision_state=allowed-evaluate-only. That is effect classification metadata, not effect execution. It must preserve effect_performed=0, runtime_authority_granted=0, host_read_performed=0, host_write_performed=0, and network_performed=0.</w:t>
+      </w:r>
+    </w:p>
+    <w:p>
+      <w:pPr>
+        <w:pStyle w:val="Heading2"/>
+      </w:pPr>
+      <w:r>
+        <w:t>5.10 Runtime handoff evaluation and report metadata</w:t>
+      </w:r>
+    </w:p>
+    <w:p>
+      <w:pPr>
+        <w:pStyle w:val="BodyTight"/>
+      </w:pPr>
+      <w:r>
+        <w:t>Runtime handoff evaluation consumes a metadata-only verified effect decision and asks whether it is eligible to be described as a future handoff candidate. A successful evaluation may set handoff_eligible=1 and handoff_state=eligible-report-only or eligible-evaluate-only while still preserving handoff_performed=0 and runtime_authority_granted=0.</w:t>
+      </w:r>
+    </w:p>
+    <w:p>
+      <w:pPr>
+        <w:pStyle w:val="BodyTight"/>
+      </w:pPr>
+      <w:r>
+        <w:t>The runtime handoff report layer consumes eligible handoff evaluation metadata and produces report-readiness metadata. It may set report_ready=1 and report_state=ready-report-only or ready-evaluate-only, but it still does not perform a runtime handoff, execute an effect, enforce a capability, read or write host state, contact a network, or grant authority.</w:t>
       </w:r>
     </w:p>
     <w:p>
@@ -12231,9 +12395,6 @@
         <w:pStyle w:val="BodyTight"/>
       </w:pPr>
       <w:r>
-        <w:rPr>
-          <w:rFonts w:ascii="Liberation Serif" w:hAnsi="Liberation Serif" w:eastAsia="Liberation Serif"/>
-        </w:rPr>
         <w:t>The verified capability gate adds another witness edge between a promoted receipt and an effect decision. Its allowed state is still metadata-only: gate_allowed=1 is not the same as an effect being allowed, performed, or handed to a runtime.</w:t>
       </w:r>
     </w:p>
@@ -12242,10 +12403,31 @@
         <w:pStyle w:val="BodyTight"/>
       </w:pPr>
       <w:r>
-        <w:rPr>
-          <w:rFonts w:ascii="Liberation Serif" w:hAnsi="Liberation Serif" w:eastAsia="Liberation Serif"/>
-        </w:rPr>
-        <w:t>This gives reviewers a sharper audit rule. A record may show verified receipt evidence and an allowed metadata gate while still proving that no host read, host write, network access, tool execution, shell execution, capability enforcement, or runtime authority occurred. That is not contradiction; it is the point of the staged witness graph.</w:t>
+        <w:t>This gives reviewers a sharper audit rule. A record may show verified receipt evidence, an allowed metadata gate, an allowed metadata-only effect decision, eligible runtime-handoff metadata, and report-ready metadata while still proving that no host read, host write, network access, tool execution, shell execution, capability enforcement, runtime handoff, or runtime authority occurred. That is not contradiction; it is the point of the ladder.</w:t>
+      </w:r>
+    </w:p>
+    <w:p>
+      <w:pPr>
+        <w:pStyle w:val="Heading2"/>
+      </w:pPr>
+      <w:r>
+        <w:t>11.7 Allowed, eligible, and ready are not performed</w:t>
+      </w:r>
+    </w:p>
+    <w:p>
+      <w:pPr>
+        <w:pStyle w:val="BodyTight"/>
+      </w:pPr>
+      <w:r>
+        <w:t>The new Seal ladder deliberately uses different verbs for different evidence states. gate_allowed=1 means a metadata gate accepted the request. effect_allowed=1 means a metadata-only effect classification accepted the request. handoff_eligible=1 means a future handoff candidate is describable. report_ready=1 means a report record can be emitted.</w:t>
+      </w:r>
+    </w:p>
+    <w:p>
+      <w:pPr>
+        <w:pStyle w:val="BodyTight"/>
+      </w:pPr>
+      <w:r>
+        <w:t>None of those states means effect_performed=1, handoff_performed=1, runtime_authority_granted=1, or host/network behavior. Reviewers should read these flags as named non-effect checkpoints, not as disguised permission grants.</w:t>
       </w:r>
     </w:p>
     <w:p>
@@ -15592,6 +15774,30 @@
           <w:rFonts w:ascii="Liberation Serif" w:hAnsi="Liberation Serif" w:eastAsia="Liberation Serif"/>
         </w:rPr>
         <w:t>The important distinction is that gate_allowed=1 and gate_state=allowed-metadata-only may coexist with authority_usable=0, receipt_capability_gate_allowed=0, runtime_authority_granted=0, and effect_performed=0. Schema consumers must not collapse metadata permission into runtime permission.</w:t>
+      </w:r>
+    </w:p>
+    <w:p>
+      <w:pPr>
+        <w:pStyle w:val="Heading2"/>
+      </w:pPr>
+      <w:r>
+        <w:t>14.9 Verified effect, handoff evaluation, and handoff report schemas</w:t>
+      </w:r>
+    </w:p>
+    <w:p>
+      <w:pPr>
+        <w:pStyle w:val="BodyTight"/>
+      </w:pPr>
+      <w:r>
+        <w:t>The verified effect decision schema carries decision_profile, gate_profile, receipt_profile, requested_capability, requested_effect, requested_scope, gate_allowed, gate_state, decision_state, effect_allowed, effect_performed, runtime_authority_granted, host_read_performed, host_write_performed, network_performed, error, and status. The central invariant is that effect_allowed=1 may coexist with effect_performed=0 and runtime_authority_granted=0.</w:t>
+      </w:r>
+    </w:p>
+    <w:p>
+      <w:pPr>
+        <w:pStyle w:val="BodyTight"/>
+      </w:pPr>
+      <w:r>
+        <w:t>The runtime handoff evaluation schema adds handoff_profile, requested_handoff, handoff_state, and handoff_eligible while preserving handoff_performed=0. The runtime handoff report schema adds report_profile, requested_report, report_state, and report_ready. Schema consumers must not collapse handoff_eligible=1 or report_ready=1 into runtime handoff execution.</w:t>
       </w:r>
     </w:p>
     <w:p>
@@ -16655,6 +16861,30 @@
     </w:p>
     <w:p>
       <w:pPr>
+        <w:pStyle w:val="Heading2"/>
+      </w:pPr>
+      <w:r>
+        <w:t>15.9 Effect decision and handoff validation lanes</w:t>
+      </w:r>
+    </w:p>
+    <w:p>
+      <w:pPr>
+        <w:pStyle w:val="BodyTight"/>
+      </w:pPr>
+      <w:r>
+        <w:t>The verified effect decision lane should accept only allowed metadata gates and report/evaluate effects. It should prove effect_allowed=1 only when the gate is valid, gate_state=allowed-metadata-only, runtime authority is zero, and no host, network, handoff, or effect has already occurred.</w:t>
+      </w:r>
+    </w:p>
+    <w:p>
+      <w:pPr>
+        <w:pStyle w:val="BodyTight"/>
+      </w:pPr>
+      <w:r>
+        <w:t>The runtime handoff evaluation and report lanes should accept only metadata-only allowed decisions, then prove handoff_eligible=1 and report_ready=1 without performing handoff or granting authority. Negative cases should cover null inputs, invalid predecessors, unsupported labels, mismatched report requests, prior performed effects, host read/write flags, network flags, tiny report buffers, and runtime_authority_granted=1.</w:t>
+      </w:r>
+    </w:p>
+    <w:p>
+      <w:pPr>
         <w:pStyle w:val="Heading1"/>
       </w:pPr>
       <w:r>
@@ -17320,17 +17550,8 @@
             <w:vAlign w:val="top"/>
           </w:tcPr>
           <w:p>
-            <w:pPr>
-              <w:spacing w:after="0"/>
-            </w:pPr>
-            <w:r/>
-            <w:r>
-              <w:rPr>
-                <w:rFonts w:ascii="Liberation Sans" w:hAnsi="Liberation Sans"/>
-                <w:color w:val="0F172A"/>
-                <w:sz w:val="16"/>
-              </w:rPr>
-              <w:t>No-effect dry-run handoff, capability gate, denial tests.</w:t>
+            <w:r>
+              <w:t>No-effect dry-run handoff, verified capability gate, verified effect decision, handoff eligibility, report readiness, and denial tests.</w:t>
             </w:r>
           </w:p>
         </w:tc>
@@ -18636,6 +18857,96 @@
           </w:p>
         </w:tc>
       </w:tr>
+      <w:tr>
+        <w:tc>
+          <w:tcPr>
+            <w:tcW w:type="dxa" w:w="4997"/>
+          </w:tcPr>
+          <w:p>
+            <w:r>
+              <w:rPr>
+                <w:rFonts w:ascii="Liberation Sans" w:hAnsi="Liberation Sans"/>
+                <w:sz w:val="16"/>
+              </w:rPr>
+              <w:t>Verified effect decision</w:t>
+            </w:r>
+          </w:p>
+        </w:tc>
+        <w:tc>
+          <w:tcPr>
+            <w:tcW w:type="dxa" w:w="4997"/>
+          </w:tcPr>
+          <w:p>
+            <w:r>
+              <w:rPr>
+                <w:rFonts w:ascii="Liberation Sans" w:hAnsi="Liberation Sans"/>
+                <w:sz w:val="16"/>
+              </w:rPr>
+              <w:t>A metadata-only classification that may set effect_allowed=1 for report/evaluate requests while keeping effect_performed=0.</w:t>
+            </w:r>
+          </w:p>
+        </w:tc>
+      </w:tr>
+      <w:tr>
+        <w:tc>
+          <w:tcPr>
+            <w:tcW w:type="dxa" w:w="4997"/>
+          </w:tcPr>
+          <w:p>
+            <w:r>
+              <w:rPr>
+                <w:rFonts w:ascii="Liberation Sans" w:hAnsi="Liberation Sans"/>
+                <w:sz w:val="16"/>
+              </w:rPr>
+              <w:t>Handoff eligibility</w:t>
+            </w:r>
+          </w:p>
+        </w:tc>
+        <w:tc>
+          <w:tcPr>
+            <w:tcW w:type="dxa" w:w="4997"/>
+          </w:tcPr>
+          <w:p>
+            <w:r>
+              <w:rPr>
+                <w:rFonts w:ascii="Liberation Sans" w:hAnsi="Liberation Sans"/>
+                <w:sz w:val="16"/>
+              </w:rPr>
+              <w:t>A metadata-only runtime-boundary classification that may set handoff_eligible=1 without performing a handoff.</w:t>
+            </w:r>
+          </w:p>
+        </w:tc>
+      </w:tr>
+      <w:tr>
+        <w:tc>
+          <w:tcPr>
+            <w:tcW w:type="dxa" w:w="4997"/>
+          </w:tcPr>
+          <w:p>
+            <w:r>
+              <w:rPr>
+                <w:rFonts w:ascii="Liberation Sans" w:hAnsi="Liberation Sans"/>
+                <w:sz w:val="16"/>
+              </w:rPr>
+              <w:t>Report readiness</w:t>
+            </w:r>
+          </w:p>
+        </w:tc>
+        <w:tc>
+          <w:tcPr>
+            <w:tcW w:type="dxa" w:w="4997"/>
+          </w:tcPr>
+          <w:p>
+            <w:r>
+              <w:rPr>
+                <w:rFonts w:ascii="Liberation Sans" w:hAnsi="Liberation Sans"/>
+                <w:sz w:val="16"/>
+              </w:rPr>
+              <w:t>A metadata-only report classification that may set report_ready=1 without runtime authority or host/network behavior.</w:t>
+            </w:r>
+          </w:p>
+        </w:tc>
+      </w:tr>
     </w:tbl>
     <w:p>
       <w:pPr>
@@ -19363,10 +19674,7 @@
         <w:pStyle w:val="BodyTight"/>
       </w:pPr>
       <w:r>
-        <w:rPr>
-          <w:rFonts w:ascii="Liberation Serif" w:hAnsi="Liberation Serif" w:eastAsia="Liberation Serif"/>
-        </w:rPr>
-        <w:t>A strong public sentence: "Latticra is an early, local, evidence-bound substrate for report-only verification, policy regression, manifest/hash baselines, authority-neutral Ed25519 verification evidence, metadata-only capability gating, guarded user-local installation, and future runtime-boundary research."</w:t>
+        <w:t>A strong public sentence: "Latticra is an early, local, evidence-bound substrate for report-only verification, policy regression, manifest/hash baselines, authority-neutral Ed25519 verification evidence, metadata-only Seal gate/effect/handoff/report classification, guarded user-local installation, and future runtime-boundary research."</w:t>
       </w:r>
     </w:p>
     <w:p>
@@ -19407,7 +19715,7 @@
         <w:pStyle w:val="BodyTight"/>
       </w:pPr>
       <w:r>
-        <w:t>This edition was derived from the Latticra Seal handbook and recent repository material covering signed-request, freshness, verification-receipt, crypto-backend, Ed25519 verify-only, verified receipt promotion, verified capability gate, capability-gate/effect-decision records, installer, Console, Panel, Nucleus, Nadia, macOS app-bundle, Fedora/RPM, Lat/LIR, and one-pass field-engine evidence. It distinguishes implemented facts from inferred substrate architecture and preserves the project non-claims.</w:t>
+        <w:t>This edition was derived from the Latticra Seal handbook and recent repository material covering signed-request, freshness, verification-receipt, crypto-backend, Ed25519 verify-only, verified receipt promotion, verified capability gate, verified effect decision, runtime handoff evaluation, runtime handoff report, capability-gate/effect-decision records, installer, Console, Panel, Nucleus, Nadia, macOS app-bundle, Fedora/RPM, Lat/LIR, and one-pass field-engine evidence. It distinguishes implemented facts from inferred substrate architecture and preserves the project non-claims.</w:t>
       </w:r>
     </w:p>
     <w:tbl>
@@ -20117,6 +20425,66 @@
           </w:p>
         </w:tc>
       </w:tr>
+      <w:tr>
+        <w:tc>
+          <w:tcPr>
+            <w:tcW w:type="dxa" w:w="4997"/>
+          </w:tcPr>
+          <w:p>
+            <w:r>
+              <w:rPr>
+                <w:rFonts w:ascii="Liberation Sans" w:hAnsi="Liberation Sans"/>
+                <w:sz w:val="16"/>
+              </w:rPr>
+              <w:t>Seal verified effect decision</w:t>
+            </w:r>
+          </w:p>
+        </w:tc>
+        <w:tc>
+          <w:tcPr>
+            <w:tcW w:type="dxa" w:w="4997"/>
+          </w:tcPr>
+          <w:p>
+            <w:r>
+              <w:rPr>
+                <w:rFonts w:ascii="Liberation Sans" w:hAnsi="Liberation Sans"/>
+                <w:sz w:val="16"/>
+              </w:rPr>
+              <w:t>Metadata-only effect classification from allowed verified gates, with effect_allowed=1 separated from effect execution and runtime authority.</w:t>
+            </w:r>
+          </w:p>
+        </w:tc>
+      </w:tr>
+      <w:tr>
+        <w:tc>
+          <w:tcPr>
+            <w:tcW w:type="dxa" w:w="4997"/>
+          </w:tcPr>
+          <w:p>
+            <w:r>
+              <w:rPr>
+                <w:rFonts w:ascii="Liberation Sans" w:hAnsi="Liberation Sans"/>
+                <w:sz w:val="16"/>
+              </w:rPr>
+              <w:t>Seal runtime handoff evaluation/report</w:t>
+            </w:r>
+          </w:p>
+        </w:tc>
+        <w:tc>
+          <w:tcPr>
+            <w:tcW w:type="dxa" w:w="4997"/>
+          </w:tcPr>
+          <w:p>
+            <w:r>
+              <w:rPr>
+                <w:rFonts w:ascii="Liberation Sans" w:hAnsi="Liberation Sans"/>
+                <w:sz w:val="16"/>
+              </w:rPr>
+              <w:t>Metadata-only handoff eligibility and report-readiness classification, with handoff_eligible=1 and report_ready=1 separated from handoff execution, host behavior, network behavior, and authority.</w:t>
+            </w:r>
+          </w:p>
+        </w:tc>
+      </w:tr>
     </w:tbl>
     <w:p>
       <w:pPr>
@@ -20235,7 +20603,7 @@
         <w:pStyle w:val="ListNumber"/>
       </w:pPr>
       <w:r>
-        <w:t>For Seal work, follow the ladder through verified receipt promotion and verified capability gate metadata; never skip from verification evidence to authority.</w:t>
+        <w:t>For Seal work, follow the ladder through verified receipt promotion, verified capability gate, verified effect decision, handoff eligibility, and report readiness metadata; never skip from verification evidence to authority.</w:t>
       </w:r>
     </w:p>
     <w:sectPr>

</xml_diff>

<commit_message>
Validate clean operating checkpoint
</commit_message>
<xml_diff>
--- a/docs/latticra-system-substrate/the-latticra-system-substrate.docx
+++ b/docs/latticra-system-substrate/the-latticra-system-substrate.docx
@@ -100,7 +100,7 @@
         <w:jc w:val="center"/>
       </w:pPr>
       <w:r>
-        <w:t>Working Draft 0.9 - 2026-05-25</w:t>
+        <w:t>Working Draft 0.11 - 2026-05-26</w:t>
       </w:r>
     </w:p>
     <w:p>
@@ -149,7 +149,7 @@
         <w:pStyle w:val="BodyTight"/>
       </w:pPr>
       <w:r>
-        <w:t>Source posture: this edition draws from the Seal handbook plus current Seal signed-request, request-freshness, verification-receipt, crypto-verify-backend, Ed25519 verify-only, verified-receipt-promotion, verified-capability-gate, verified-effect-decision, runtime-handoff-evaluation, runtime-handoff-report, capability-gate, and effect-decision records; Panel/installer receipts; Fedora and macOS validation material; Lat/LIR, Latticra Console, Nucleus, Nadia, runtime-boundary, kernel-lifecycle, and defensive threat-model notes; and the one-pass field engine research artifact.</w:t>
+        <w:t>Source posture: this edition draws from the Seal handbook plus current Seal signed-request, request-freshness, verification-receipt, crypto-verify-backend, Ed25519 verify-only, verified-receipt-promotion, verified-capability-gate, verified-effect-decision, runtime-handoff-evaluation, runtime-handoff-report, report-envelope, signature-request, capability-gate, and effect-decision records; Latticra Console Stage-0 host-adapter, receipt-request, receipt-payload, signature-request-binding, OS-base, and VM-evidence contract surfaces; Panel/installer receipts; Fedora and macOS validation material; Lat/LIR, Nucleus, Nadia, runtime-boundary, kernel-lifecycle, and defensive threat-model notes; and the one-pass field engine research artifact.</w:t>
       </w:r>
     </w:p>
     <w:p>
@@ -5021,6 +5021,190 @@
           </w:p>
         </w:tc>
       </w:tr>
+      <w:tr>
+        <w:tc>
+          <w:tcPr>
+            <w:tcW w:type="dxa" w:w="3331"/>
+          </w:tcPr>
+          <w:p>
+            <w:r>
+              <w:rPr>
+                <w:rFonts w:ascii="Liberation Sans" w:hAnsi="Liberation Sans"/>
+                <w:sz w:val="16"/>
+              </w:rPr>
+              <w:t>Seal report envelope</w:t>
+            </w:r>
+          </w:p>
+        </w:tc>
+        <w:tc>
+          <w:tcPr>
+            <w:tcW w:type="dxa" w:w="3331"/>
+          </w:tcPr>
+          <w:p>
+            <w:r>
+              <w:rPr>
+                <w:rFonts w:ascii="Liberation Sans" w:hAnsi="Liberation Sans"/>
+                <w:sz w:val="16"/>
+              </w:rPr>
+              <w:t>Ready runtime-handoff report metadata can become envelope_ready=1 while unsigned and object-unsealed.</w:t>
+            </w:r>
+          </w:p>
+        </w:tc>
+        <w:tc>
+          <w:tcPr>
+            <w:tcW w:type="dxa" w:w="3331"/>
+          </w:tcPr>
+          <w:p>
+            <w:r>
+              <w:rPr>
+                <w:rFonts w:ascii="Liberation Sans" w:hAnsi="Liberation Sans"/>
+                <w:sz w:val="16"/>
+              </w:rPr>
+              <w:t>Say envelope classification metadata; do not say signing, object sealing, runtime handoff, or authority.</w:t>
+            </w:r>
+          </w:p>
+        </w:tc>
+      </w:tr>
+      <w:tr>
+        <w:tc>
+          <w:tcPr>
+            <w:tcW w:type="dxa" w:w="3331"/>
+          </w:tcPr>
+          <w:p>
+            <w:r>
+              <w:rPr>
+                <w:rFonts w:ascii="Liberation Sans" w:hAnsi="Liberation Sans"/>
+                <w:sz w:val="16"/>
+              </w:rPr>
+              <w:t>Seal signature request</w:t>
+            </w:r>
+          </w:p>
+        </w:tc>
+        <w:tc>
+          <w:tcPr>
+            <w:tcW w:type="dxa" w:w="3331"/>
+          </w:tcPr>
+          <w:p>
+            <w:r>
+              <w:rPr>
+                <w:rFonts w:ascii="Liberation Sans" w:hAnsi="Liberation Sans"/>
+                <w:sz w:val="16"/>
+              </w:rPr>
+              <w:t>Ready report-envelope metadata can request Ed25519-development signing as metadata with signature_request_ready=1 and no signing.</w:t>
+            </w:r>
+          </w:p>
+        </w:tc>
+        <w:tc>
+          <w:tcPr>
+            <w:tcW w:type="dxa" w:w="3331"/>
+          </w:tcPr>
+          <w:p>
+            <w:r>
+              <w:rPr>
+                <w:rFonts w:ascii="Liberation Sans" w:hAnsi="Liberation Sans"/>
+                <w:sz w:val="16"/>
+              </w:rPr>
+              <w:t>Say signature-request classification; do not say Ed25519 signing, verification, private-key handling, or trust establishment.</w:t>
+            </w:r>
+          </w:p>
+        </w:tc>
+      </w:tr>
+      <w:tr>
+        <w:tc>
+          <w:tcPr>
+            <w:tcW w:type="dxa" w:w="3331"/>
+          </w:tcPr>
+          <w:p>
+            <w:r>
+              <w:t>LC host-adapter contract</w:t>
+            </w:r>
+          </w:p>
+        </w:tc>
+        <w:tc>
+          <w:tcPr>
+            <w:tcW w:type="dxa" w:w="3331"/>
+          </w:tcPr>
+          <w:p>
+            <w:r>
+              <w:t>Metadata-only contract; host_adapter_present=0, host process/file/network/runtime/boot authority denied.</w:t>
+            </w:r>
+          </w:p>
+        </w:tc>
+        <w:tc>
+          <w:tcPr>
+            <w:tcW w:type="dxa" w:w="3331"/>
+          </w:tcPr>
+          <w:p>
+            <w:r>
+              <w:t>Say LC exposes the adapter boundary for review; do not say a host adapter exists, probes the host, or embeds into the host.</w:t>
+            </w:r>
+          </w:p>
+        </w:tc>
+      </w:tr>
+      <w:tr>
+        <w:tc>
+          <w:tcPr>
+            <w:tcW w:type="dxa" w:w="3331"/>
+          </w:tcPr>
+          <w:p>
+            <w:r>
+              <w:t>LC receipt and signature bridge</w:t>
+            </w:r>
+          </w:p>
+        </w:tc>
+        <w:tc>
+          <w:tcPr>
+            <w:tcW w:type="dxa" w:w="3331"/>
+          </w:tcPr>
+          <w:p>
+            <w:r>
+              <w:t>Metadata-only receipt request, payload schema, artifact draft, and signature-request binding; payload_artifact_present=0, seal_signature_request_present=0, receipt_write_allowed=0.</w:t>
+            </w:r>
+          </w:p>
+        </w:tc>
+        <w:tc>
+          <w:tcPr>
+            <w:tcW w:type="dxa" w:w="3331"/>
+          </w:tcPr>
+          <w:p>
+            <w:r>
+              <w:t>Say LC reserves the Seal receipt path; do not say it materializes payloads, writes receipts, signs, verifies, or hands off to a signer.</w:t>
+            </w:r>
+          </w:p>
+        </w:tc>
+      </w:tr>
+      <w:tr>
+        <w:tc>
+          <w:tcPr>
+            <w:tcW w:type="dxa" w:w="3331"/>
+          </w:tcPr>
+          <w:p>
+            <w:r>
+              <w:t>LC OS-base and VM evidence contracts</w:t>
+            </w:r>
+          </w:p>
+        </w:tc>
+        <w:tc>
+          <w:tcPr>
+            <w:tcW w:type="dxa" w:w="3331"/>
+          </w:tcPr>
+          <w:p>
+            <w:r>
+              <w:t>Metadata-only planning/evidence contracts; os_base_enabled=0, vm_evidence_capture_enabled=0, boot_authority=0, production_os_claim=0.</w:t>
+            </w:r>
+          </w:p>
+        </w:tc>
+        <w:tc>
+          <w:tcPr>
+            <w:tcW w:type="dxa" w:w="3331"/>
+          </w:tcPr>
+          <w:p>
+            <w:r>
+              <w:t>Say LC records OS/VM promotion gates; do not say it boots, launches VMs, touches hypervisors, writes disk images, or replaces an OS.</w:t>
+            </w:r>
+          </w:p>
+        </w:tc>
+      </w:tr>
     </w:tbl>
     <w:p>
       <w:pPr>
@@ -5979,13 +6163,8 @@
             <w:tcW w:type="dxa" w:w="3331"/>
           </w:tcPr>
           <w:p>
-            <w:pPr/>
-            <w:r>
-              <w:rPr>
-                <w:rFonts w:ascii="Liberation Sans" w:hAnsi="Liberation Sans"/>
-                <w:sz w:val="16"/>
-              </w:rPr>
-              <w:t>latticra-lc, command registry, profiles</w:t>
+            <w:r>
+              <w:t>latticra-lc, command registry, profiles, host/receipt/OS contract reports</w:t>
             </w:r>
           </w:p>
         </w:tc>
@@ -5994,13 +6173,8 @@
             <w:tcW w:type="dxa" w:w="3331"/>
           </w:tcPr>
           <w:p>
-            <w:pPr/>
-            <w:r>
-              <w:rPr>
-                <w:rFonts w:ascii="Liberation Sans" w:hAnsi="Liberation Sans"/>
-                <w:sz w:val="16"/>
-              </w:rPr>
-              <w:t>Operator command surface with no-effect metadata and future gates.</w:t>
+            <w:r>
+              <w:t>Operator command surface with no-effect metadata, host-adapter and receipt-request contracts, OS/VM evidence planning, and future gates.</w:t>
             </w:r>
           </w:p>
         </w:tc>
@@ -6447,7 +6621,7 @@
         <w:pStyle w:val="BodyTight"/>
       </w:pPr>
       <w:r>
-        <w:t>Latticra Console, or LC, is the planned operator base for the substrate. Stage 0 makes LC visible without granting host authority: it is panel-installable, configurable, backed by a seed command registry, and bound to Runtime Boundary classification plus Seal capability labels.</w:t>
+        <w:t>Latticra Console, or LC, is the planned operator base for the substrate. Stage 0 makes LC visible without granting host authority: it is panel-installable, configurable, backed by a seed command registry, bound to Runtime Boundary classification plus Seal capability labels, and now extended with inspectable host, receipt, OS-base, and VM-evidence contract surfaces.</w:t>
       </w:r>
     </w:p>
     <w:p>
@@ -6472,6 +6646,22 @@
       </w:pPr>
       <w:r>
         <w:t>Future host embedding and OS-base directions are planning profiles only; they do not replace a host OS, launch shell commands, or create boot/runtime authority.</w:t>
+      </w:r>
+    </w:p>
+    <w:p>
+      <w:pPr>
+        <w:pStyle w:val="ListBullet"/>
+      </w:pPr>
+      <w:r>
+        <w:t>LC contract commands now include lc host-adapter, lc receipt-request, lc receipt-payload, lc receipt-artifact, lc signature-request, lc os-contract, and lc vm-evidence. They are review surfaces, not effect surfaces.</w:t>
+      </w:r>
+    </w:p>
+    <w:p>
+      <w:pPr>
+        <w:pStyle w:val="ListBullet"/>
+      </w:pPr>
+      <w:r>
+        <w:t>The important zeroes are part of the operator contract: host_adapter_present=0, payload_artifact_present=0, seal_signature_request_present=0, receipt_write_allowed=0, vm_evidence_artifact_present=0, boot_authority=0, and production_os_claim=0.</w:t>
       </w:r>
     </w:p>
     <w:p>
@@ -7321,7 +7511,7 @@
         <w:pStyle w:val="BodyTight"/>
       </w:pPr>
       <w:r>
-        <w:t>Seal now has enough trust-adjacent contract surface to name a ladder without pretending the ladder already grants authority. The stages are signed request metadata, request freshness metadata, verification policy metadata, verification receipt metadata, crypto verify backend metadata, Ed25519 verify-only result metadata, verified receipt promotion metadata, verified capability gate metadata, verified effect decision metadata, runtime handoff evaluation metadata, runtime handoff report metadata, effect decision metadata, runtime handoff metadata, and report envelope metadata. Each stage records the next question before the project is allowed to answer it with effects.</w:t>
+        <w:t>Seal now has enough trust-adjacent contract surface to name a ladder without pretending the ladder already grants authority. The stages are signed request metadata, request freshness metadata, verification policy metadata, verification receipt metadata, crypto verify backend metadata, Ed25519 verify-only result metadata, verified receipt promotion metadata, verified capability gate metadata, verified effect decision metadata, runtime handoff evaluation metadata, runtime handoff report metadata, report envelope metadata, and signature request metadata. Each stage records the next question before the project is allowed to answer it with effects.</w:t>
       </w:r>
     </w:p>
     <w:p>
@@ -7362,7 +7552,7 @@
         <w:pStyle w:val="BodyTight"/>
       </w:pPr>
       <w:r>
-        <w:t>Capability gates, verified effect decisions, and runtime handoff reports close the current ladder. A verified capability gate may set gate_allowed=1 for a narrow metadata-only report/evaluate request; a verified effect decision may set effect_allowed=1; a runtime handoff evaluation may set handoff_eligible=1; and a runtime handoff report may set report_ready=1. None of those flags means an effect ran, a handoff happened, or authority was granted.</w:t>
+        <w:t>Capability gates, verified effect decisions, runtime handoff reports, report envelopes, and signature requests close the current ladder. A verified capability gate may set gate_allowed=1; a verified effect decision may set effect_allowed=1; a runtime handoff evaluation may set handoff_eligible=1; a runtime handoff report may set report_ready=1; a report envelope may set envelope_ready=1; and a signature request may set signature_request_ready=1. None of those flags means an effect ran, a handoff happened, an object was sealed, a signature was produced, or authority was granted.</w:t>
       </w:r>
     </w:p>
     <w:p>
@@ -7507,6 +7697,30 @@
       </w:pPr>
       <w:r>
         <w:t>The runtime handoff report layer consumes eligible handoff evaluation metadata and produces report-readiness metadata. It may set report_ready=1 and report_state=ready-report-only or ready-evaluate-only, but it still does not perform a runtime handoff, execute an effect, enforce a capability, read or write host state, contact a network, or grant authority.</w:t>
+      </w:r>
+    </w:p>
+    <w:p>
+      <w:pPr>
+        <w:pStyle w:val="Heading2"/>
+      </w:pPr>
+      <w:r>
+        <w:t>5.11 Report envelope and signature request metadata</w:t>
+      </w:r>
+    </w:p>
+    <w:p>
+      <w:pPr>
+        <w:pStyle w:val="BodyTight"/>
+      </w:pPr>
+      <w:r>
+        <w:t>The report envelope layer consumes ready runtime handoff report metadata and classifies whether a report/evaluate record may be wrapped into deterministic envelope metadata. A successful envelope may set envelope_ready=1 and envelope_state=sealed-report-only or sealed-evaluate-only, but the name is deliberately narrow: it is metadata-only, unsigned, object-unsealed, and authority-neutral.</w:t>
+      </w:r>
+    </w:p>
+    <w:p>
+      <w:pPr>
+        <w:pStyle w:val="BodyTight"/>
+      </w:pPr>
+      <w:r>
+        <w:t>The signature request layer consumes ready report-envelope metadata and classifies an Ed25519-development request label as signature_request_state=requested-metadata-only with signature_request_ready=1. It is request classification, not signing or verification. It must preserve signature_performed=0, verification_performed=0, private_key_handling=0, handoff_performed=0, effect_performed=0, runtime_authority_granted=0, host_read_performed=0, host_write_performed=0, and network_performed=0.</w:t>
       </w:r>
     </w:p>
     <w:p>
@@ -8835,6 +9049,38 @@
     </w:p>
     <w:p>
       <w:pPr>
+        <w:pStyle w:val="Heading2"/>
+      </w:pPr>
+      <w:r>
+        <w:t>6.5 Latticra Console receipt and host contract bridge</w:t>
+      </w:r>
+    </w:p>
+    <w:p>
+      <w:pPr>
+        <w:pStyle w:val="BodyTight"/>
+      </w:pPr>
+      <w:r>
+        <w:t>LC extends the Panel/install story by installing metadata-only contract files and reports for host embedding, host inventory, host adapter, receipts, receipt requests, payload schema, payload artifact draft, signature-request binding, OS-base planning, and VM evidence. These records make the future promotion path visible before any host adapter, payload artifact, signature request, receipt writer, VM launcher, or OS-base behavior exists.</w:t>
+      </w:r>
+    </w:p>
+    <w:p>
+      <w:pPr>
+        <w:pStyle w:val="BodyTight"/>
+      </w:pPr>
+      <w:r>
+        <w:t>The bridge is deliberately inert. The installed surfaces can say request_contract_present=1, schema_present=1, draft_contract_present=1, binding_contract_present=1, os_base_contract_present=1, and vm_evidence_contract_present=1, while also preserving host_adapter_present=0, payload_materialized=0, signature_request_binding_allowed=0, seal_signature_request_present=0, receipt_write_allowed=0, vm_launch_allowed=0, and boot_allowed=0.</w:t>
+      </w:r>
+    </w:p>
+    <w:p>
+      <w:pPr>
+        <w:pStyle w:val="BodyTight"/>
+      </w:pPr>
+      <w:r>
+        <w:t>A reviewer should treat these Console records as preconditions for later work: they name the receipts, operator consent, runtime-boundary binding, and Seal capability labels that must exist before host embedding, signing, OS-base, or VM-adjacent behavior can be promoted.</w:t>
+      </w:r>
+    </w:p>
+    <w:p>
+      <w:pPr>
         <w:pStyle w:val="Heading1"/>
       </w:pPr>
       <w:r>
@@ -12403,7 +12649,7 @@
         <w:pStyle w:val="BodyTight"/>
       </w:pPr>
       <w:r>
-        <w:t>This gives reviewers a sharper audit rule. A record may show verified receipt evidence, an allowed metadata gate, an allowed metadata-only effect decision, eligible runtime-handoff metadata, and report-ready metadata while still proving that no host read, host write, network access, tool execution, shell execution, capability enforcement, runtime handoff, or runtime authority occurred. That is not contradiction; it is the point of the ladder.</w:t>
+        <w:t>This gives reviewers a sharper audit rule. A record may show verified receipt evidence, an allowed metadata gate, an allowed metadata-only effect decision, eligible runtime-handoff metadata, report-ready metadata, envelope-ready metadata, and signature-request-ready metadata while still proving that no host read, host write, network access, tool execution, shell execution, capability enforcement, runtime handoff, signing, object sealing, or runtime authority occurred. That is not contradiction; it is the point of the ladder.</w:t>
       </w:r>
     </w:p>
     <w:p>
@@ -12419,7 +12665,7 @@
         <w:pStyle w:val="BodyTight"/>
       </w:pPr>
       <w:r>
-        <w:t>The new Seal ladder deliberately uses different verbs for different evidence states. gate_allowed=1 means a metadata gate accepted the request. effect_allowed=1 means a metadata-only effect classification accepted the request. handoff_eligible=1 means a future handoff candidate is describable. report_ready=1 means a report record can be emitted.</w:t>
+        <w:t>The new Seal ladder deliberately uses different verbs for different evidence states. gate_allowed=1 means a metadata gate accepted the request. effect_allowed=1 means a metadata-only effect classification accepted the request. handoff_eligible=1 means a future handoff candidate is describable. report_ready=1 means a report record can be emitted. envelope_ready=1 means a deterministic envelope record can be emitted. signature_request_ready=1 means a future signing path was requested as metadata.</w:t>
       </w:r>
     </w:p>
     <w:p>
@@ -12427,7 +12673,55 @@
         <w:pStyle w:val="BodyTight"/>
       </w:pPr>
       <w:r>
-        <w:t>None of those states means effect_performed=1, handoff_performed=1, runtime_authority_granted=1, or host/network behavior. Reviewers should read these flags as named non-effect checkpoints, not as disguised permission grants.</w:t>
+        <w:t>None of those states means effect_performed=1, handoff_performed=1, signature_performed=1, verification_performed=1, private_key_handling=1, runtime_authority_granted=1, object sealing, or host/network behavior. Reviewers should read these flags as named non-effect checkpoints, not as disguised permission grants.</w:t>
+      </w:r>
+    </w:p>
+    <w:p>
+      <w:pPr>
+        <w:pStyle w:val="Heading2"/>
+      </w:pPr>
+      <w:r>
+        <w:t>11.8 Envelope and signature request do not sign</w:t>
+      </w:r>
+    </w:p>
+    <w:p>
+      <w:pPr>
+        <w:pStyle w:val="BodyTight"/>
+      </w:pPr>
+      <w:r>
+        <w:t>Envelope language is risky because ordinary readers may hear "sealed" as cryptographic or object-sealing behavior. In this edition it means only deterministic report-envelope metadata. Signature request language is equally narrow: Ed25519-development is a requested signature label, not a signing operation, private-key action, trust-store decision, or signature verification result.</w:t>
+      </w:r>
+    </w:p>
+    <w:p>
+      <w:pPr>
+        <w:pStyle w:val="BodyTight"/>
+      </w:pPr>
+      <w:r>
+        <w:t>A reviewer should reject any claim that jumps from envelope_ready=1 or signature_request_ready=1 to signing, object sealing, production cryptography, runtime handoff, host mutation, network behavior, or authority. Those transitions require separate contracts, implementations, and denial tests.</w:t>
+      </w:r>
+    </w:p>
+    <w:p>
+      <w:pPr>
+        <w:pStyle w:val="Heading2"/>
+      </w:pPr>
+      <w:r>
+        <w:t>11.9 Console receipt requests are not receipts</w:t>
+      </w:r>
+    </w:p>
+    <w:p>
+      <w:pPr>
+        <w:pStyle w:val="BodyTight"/>
+      </w:pPr>
+      <w:r>
+        <w:t>LC adds a second, component-specific example of the same rule. Its receipt-request, payload-schema, payload-artifact-draft, and signature-request-binding records describe what a future Seal-signed Console receipt would need to contain, but they do not materialize a payload, compute or record a payload hash, create a signature-request artifact, write a receipt, invoke a signer, or verify anything.</w:t>
+      </w:r>
+    </w:p>
+    <w:p>
+      <w:pPr>
+        <w:pStyle w:val="BodyTight"/>
+      </w:pPr>
+      <w:r>
+        <w:t>The Console witness edge is therefore a request edge, not an evidence edge. The current evidence is the presence of metadata-only contracts and the persistence of denial fields such as payload_artifact_present=0, signature_request_binding_allowed=0, seal_signature_request_ready=0, receipt_write_allowed=0, receipt_signed=0, file_write_allowed=0, and runtime_authority_granted=0.</w:t>
       </w:r>
     </w:p>
     <w:p>
@@ -14741,6 +15035,22 @@
         <w:pStyle w:val="ListBullet"/>
       </w:pPr>
       <w:r>
+        <w:t>Contract commands such as lc host-adapter, lc receipt-request, lc receipt-payload, lc receipt-artifact, lc signature-request, lc os-contract, and lc vm-evidence expose promotion gates and denial fields as command output.</w:t>
+      </w:r>
+    </w:p>
+    <w:p>
+      <w:pPr>
+        <w:pStyle w:val="ListBullet"/>
+      </w:pPr>
+      <w:r>
+        <w:t>Their source and installed report surfaces must remain paired: latticra_console_report &lt;surface&gt; and latticra-lc &lt;surface&gt; should tell the same no-effect story for host, receipt, signature, OS, and VM planning metadata.</w:t>
+      </w:r>
+    </w:p>
+    <w:p>
+      <w:pPr>
+        <w:pStyle w:val="ListBullet"/>
+      </w:pPr>
+      <w:r>
         <w:t>The review rule is simple: adding a command means adding its effect label, capability label, no-effect flag, future-gate status, report surface, and denial behavior before widening authority.</w:t>
       </w:r>
     </w:p>
@@ -15798,6 +16108,62 @@
       </w:pPr>
       <w:r>
         <w:t>The runtime handoff evaluation schema adds handoff_profile, requested_handoff, handoff_state, and handoff_eligible while preserving handoff_performed=0. The runtime handoff report schema adds report_profile, requested_report, report_state, and report_ready. Schema consumers must not collapse handoff_eligible=1 or report_ready=1 into runtime handoff execution.</w:t>
+      </w:r>
+    </w:p>
+    <w:p>
+      <w:pPr>
+        <w:pStyle w:val="Heading2"/>
+      </w:pPr>
+      <w:r>
+        <w:t>14.10 Report envelope and signature request schemas</w:t>
+      </w:r>
+    </w:p>
+    <w:p>
+      <w:pPr>
+        <w:pStyle w:val="BodyTight"/>
+      </w:pPr>
+      <w:r>
+        <w:t>The report envelope schema adds envelope_profile, requested_envelope, envelope_state, envelope_ready, and signature_performed to the runtime handoff report lineage. Its central invariant is that envelope_ready=1 may coexist with signature_performed=0, handoff_performed=0, effect_performed=0, runtime_authority_granted=0, and no host or network behavior.</w:t>
+      </w:r>
+    </w:p>
+    <w:p>
+      <w:pPr>
+        <w:pStyle w:val="BodyTight"/>
+      </w:pPr>
+      <w:r>
+        <w:t>The signature request schema adds signature_request_profile, requested_signature, signature_request_state, signature_request_ready, verification_performed, and private_key_handling. The current allowed request label is Ed25519-development, but that label is metadata-only. Schema consumers must not interpret signature_request_ready=1 as Ed25519 signing, key generation, private-key handling, trust establishment, or signature verification.</w:t>
+      </w:r>
+    </w:p>
+    <w:p>
+      <w:pPr>
+        <w:pStyle w:val="Heading2"/>
+      </w:pPr>
+      <w:r>
+        <w:t>14.11 Latticra Console contract schemas</w:t>
+      </w:r>
+    </w:p>
+    <w:p>
+      <w:pPr>
+        <w:pStyle w:val="BodyTight"/>
+      </w:pPr>
+      <w:r>
+        <w:t>LC contract schemas should stay small and auditable. The host-adapter contract centers fields such as contract_profile=lc-host-adapter-v0, host_adapter_enabled, host_adapter_present, host_embedding_contract_receipt_required, host_inventory_contract_receipt_required, operator_consent_required, runtime_boundary_required, seal_capability_labels_required, and promotion_gate.</w:t>
+      </w:r>
+    </w:p>
+    <w:p>
+      <w:pPr>
+        <w:pStyle w:val="BodyTight"/>
+      </w:pPr>
+      <w:r>
+        <w:t>The receipt path centers request_profile=lc-receipt-request-v0, schema_profile=lc-receipt-payload-schema-v0, draft_profile=lc-receipt-payload-artifact-draft-v0, binding_profile=lc-signature-request-binding-v0, requested_receipt_profile, requested_capability, requested_surfaces, payload_fields, required_authority_fields, required_prior_contracts, and signing_authorization_profile. Schema consumers must preserve payload_artifact_present=0, payload_materialized=0, payload_hash_computed=0, seal_signature_request_present=0, receipt_write_allowed=0, and receipt_signed=0 until later artifacts exist.</w:t>
+      </w:r>
+    </w:p>
+    <w:p>
+      <w:pPr>
+        <w:pStyle w:val="BodyTight"/>
+      </w:pPr>
+      <w:r>
+        <w:t>The OS and VM planning contracts center contract_profile=lc-os-base-v0, contract_profile=lc-vm-evidence-v0, vm_evidence_required, vm_evidence_capture_enabled, vm_evidence_artifact_present, os_base_enabled, production_os_claim, read_only_host_inventory_receipt_required, receipt_required_before_os_base, receipt_required_before_vm_evidence, and promotion_gate. These fields reserve evidence obligations; they do not grant boot, hypervisor, disk-image, guest, host, network, or runtime authority.</w:t>
       </w:r>
     </w:p>
     <w:p>
@@ -16482,6 +16848,38 @@
           </w:p>
         </w:tc>
       </w:tr>
+      <w:tr>
+        <w:tc>
+          <w:tcPr>
+            <w:tcW w:type="dxa" w:w="3331"/>
+          </w:tcPr>
+          <w:p>
+            <w:r>
+              <w:t>make latticra-console</w:t>
+            </w:r>
+          </w:p>
+        </w:tc>
+        <w:tc>
+          <w:tcPr>
+            <w:tcW w:type="dxa" w:w="3331"/>
+          </w:tcPr>
+          <w:p>
+            <w:r>
+              <w:t>Validate LC registry, Panel installability, host/receipt/signature/OS/VM contract reports, and boundary metadata.</w:t>
+            </w:r>
+          </w:p>
+        </w:tc>
+        <w:tc>
+          <w:tcPr>
+            <w:tcW w:type="dxa" w:w="3331"/>
+          </w:tcPr>
+          <w:p>
+            <w:r>
+              <w:t>Console report transcript with required contract-present fields and no-effect denial fields.</w:t>
+            </w:r>
+          </w:p>
+        </w:tc>
+      </w:tr>
     </w:tbl>
     <w:p>
       <w:pPr>
@@ -16881,6 +17279,54 @@
       </w:pPr>
       <w:r>
         <w:t>The runtime handoff evaluation and report lanes should accept only metadata-only allowed decisions, then prove handoff_eligible=1 and report_ready=1 without performing handoff or granting authority. Negative cases should cover null inputs, invalid predecessors, unsupported labels, mismatched report requests, prior performed effects, host read/write flags, network flags, tiny report buffers, and runtime_authority_granted=1.</w:t>
+      </w:r>
+    </w:p>
+    <w:p>
+      <w:pPr>
+        <w:pStyle w:val="Heading2"/>
+      </w:pPr>
+      <w:r>
+        <w:t>15.10 Envelope and signature request validation lanes</w:t>
+      </w:r>
+    </w:p>
+    <w:p>
+      <w:pPr>
+        <w:pStyle w:val="BodyTight"/>
+      </w:pPr>
+      <w:r>
+        <w:t>The report envelope lane should accept only ready runtime handoff reports and report/evaluate envelope labels, then prove envelope_ready=1 without signing, object sealing, performing handoff, performing effects, reading host state, writing host state, contacting networks, or granting runtime authority.</w:t>
+      </w:r>
+    </w:p>
+    <w:p>
+      <w:pPr>
+        <w:pStyle w:val="BodyTight"/>
+      </w:pPr>
+      <w:r>
+        <w:t>The signature request lane should accept only ready sealed-report or sealed-evaluate envelope metadata and the Ed25519-development request label, then prove signature_request_ready=1 while signature_performed=0, verification_performed=0, private_key_handling=0, handoff_performed=0, effect_performed=0, runtime_authority_granted=0, and host/network flags remain zero. Negative cases should cover invalid envelopes, missing or unknown signature labels, prior signature/effect/handoff flags, tiny report buffers, and runtime_authority_granted=1.</w:t>
+      </w:r>
+    </w:p>
+    <w:p>
+      <w:pPr>
+        <w:pStyle w:val="Heading2"/>
+      </w:pPr>
+      <w:r>
+        <w:t>15.11 Latticra Console contract validation lane</w:t>
+      </w:r>
+    </w:p>
+    <w:p>
+      <w:pPr>
+        <w:pStyle w:val="BodyTight"/>
+      </w:pPr>
+      <w:r>
+        <w:t>The Console validation lane should prove both halves of the contract bundle: the positive presence of reportable metadata and the negative absence of authority. The current evidence target is make latticra-console plus focused checks for host-adapter, receipt-request, payload schema, payload artifact draft, signature-request binding, OS-base, VM-evidence, boundary, help, manpage, installed wrapper, and Panel component metadata.</w:t>
+      </w:r>
+    </w:p>
+    <w:p>
+      <w:pPr>
+        <w:pStyle w:val="BodyTight"/>
+      </w:pPr>
+      <w:r>
+        <w:t>The no-effect assertions are the important part: command_registry_no_effect=1, host_process_launch_allowed=0, host_adapter_present=0, payload_artifact_present=0, seal_signature_request_present=0, receipt_write_allowed=0, vm_evidence_artifact_present=0, vm_launch_allowed=0, boot_allowed=0, production_os_claim=0, network_authority=0, and runtime_enforcement_authority=0.</w:t>
       </w:r>
     </w:p>
     <w:p>
@@ -17501,7 +17947,12 @@
             <w:pPr>
               <w:spacing w:after="0"/>
             </w:pPr>
-            <w:r/>
+            <w:r>
+              <w:rPr>
+                <w:rFonts w:ascii="Liberation Sans" w:hAnsi="Liberation Sans"/>
+                <w:sz w:val="16"/>
+              </w:rPr>
+            </w:r>
             <w:r>
               <w:rPr>
                 <w:rFonts w:ascii="Liberation Sans" w:hAnsi="Liberation Sans"/>
@@ -17527,7 +17978,12 @@
             <w:pPr>
               <w:spacing w:after="0"/>
             </w:pPr>
-            <w:r/>
+            <w:r>
+              <w:rPr>
+                <w:rFonts w:ascii="Liberation Sans" w:hAnsi="Liberation Sans"/>
+                <w:sz w:val="16"/>
+              </w:rPr>
+            </w:r>
             <w:r>
               <w:rPr>
                 <w:rFonts w:ascii="Liberation Sans" w:hAnsi="Liberation Sans"/>
@@ -17551,7 +18007,11 @@
           </w:tcPr>
           <w:p>
             <w:r>
-              <w:t>No-effect dry-run handoff, verified capability gate, verified effect decision, handoff eligibility, report readiness, and denial tests.</w:t>
+              <w:rPr>
+                <w:rFonts w:ascii="Liberation Sans" w:hAnsi="Liberation Sans"/>
+                <w:sz w:val="16"/>
+              </w:rPr>
+              <w:t>No-effect dry-run handoff, verified capability gate, verified effect decision, handoff/report/envelope/signature-request readiness, and denial tests.</w:t>
             </w:r>
           </w:p>
         </w:tc>
@@ -17632,6 +18092,38 @@
                 <w:sz w:val="16"/>
               </w:rPr>
               <w:t>User-local evidence, no-root assumptions, RPM boundaries, SELinux/systemd non-claims.</w:t>
+            </w:r>
+          </w:p>
+        </w:tc>
+      </w:tr>
+      <w:tr>
+        <w:tc>
+          <w:tcPr>
+            <w:tcW w:type="dxa" w:w="3331"/>
+          </w:tcPr>
+          <w:p>
+            <w:r>
+              <w:t>9. LC host/receipt/OS promotion gates</w:t>
+            </w:r>
+          </w:p>
+        </w:tc>
+        <w:tc>
+          <w:tcPr>
+            <w:tcW w:type="dxa" w:w="3331"/>
+          </w:tcPr>
+          <w:p>
+            <w:r>
+              <w:t>Promote Console planning surfaces only after receipted evidence exists.</w:t>
+            </w:r>
+          </w:p>
+        </w:tc>
+        <w:tc>
+          <w:tcPr>
+            <w:tcW w:type="dxa" w:w="3331"/>
+          </w:tcPr>
+          <w:p>
+            <w:r>
+              <w:t>Host adapter, receipt payload, signature request, OS-base, and VM-evidence artifacts each have schemas, tests, receipts, and non-claims before authority widens.</w:t>
             </w:r>
           </w:p>
         </w:tc>
@@ -18947,6 +19439,154 @@
           </w:p>
         </w:tc>
       </w:tr>
+      <w:tr>
+        <w:tc>
+          <w:tcPr>
+            <w:tcW w:type="dxa" w:w="4997"/>
+          </w:tcPr>
+          <w:p>
+            <w:r>
+              <w:rPr>
+                <w:rFonts w:ascii="Liberation Sans" w:hAnsi="Liberation Sans"/>
+                <w:sz w:val="16"/>
+              </w:rPr>
+              <w:t>Report envelope</w:t>
+            </w:r>
+          </w:p>
+        </w:tc>
+        <w:tc>
+          <w:tcPr>
+            <w:tcW w:type="dxa" w:w="4997"/>
+          </w:tcPr>
+          <w:p>
+            <w:r>
+              <w:rPr>
+                <w:rFonts w:ascii="Liberation Sans" w:hAnsi="Liberation Sans"/>
+                <w:sz w:val="16"/>
+              </w:rPr>
+              <w:t>A deterministic metadata envelope around ready report metadata; currently unsigned and object-unsealed.</w:t>
+            </w:r>
+          </w:p>
+        </w:tc>
+      </w:tr>
+      <w:tr>
+        <w:tc>
+          <w:tcPr>
+            <w:tcW w:type="dxa" w:w="4997"/>
+          </w:tcPr>
+          <w:p>
+            <w:r>
+              <w:rPr>
+                <w:rFonts w:ascii="Liberation Sans" w:hAnsi="Liberation Sans"/>
+                <w:sz w:val="16"/>
+              </w:rPr>
+              <w:t>Signature request</w:t>
+            </w:r>
+          </w:p>
+        </w:tc>
+        <w:tc>
+          <w:tcPr>
+            <w:tcW w:type="dxa" w:w="4997"/>
+          </w:tcPr>
+          <w:p>
+            <w:r>
+              <w:rPr>
+                <w:rFonts w:ascii="Liberation Sans" w:hAnsi="Liberation Sans"/>
+                <w:sz w:val="16"/>
+              </w:rPr>
+              <w:t>A metadata-only request for a future signing path that does not sign, verify, handle keys, or grant authority.</w:t>
+            </w:r>
+          </w:p>
+        </w:tc>
+      </w:tr>
+      <w:tr>
+        <w:tc>
+          <w:tcPr>
+            <w:tcW w:type="dxa" w:w="4997"/>
+          </w:tcPr>
+          <w:p>
+            <w:r>
+              <w:t>Host-adapter contract</w:t>
+            </w:r>
+          </w:p>
+        </w:tc>
+        <w:tc>
+          <w:tcPr>
+            <w:tcW w:type="dxa" w:w="4997"/>
+          </w:tcPr>
+          <w:p>
+            <w:r>
+              <w:t>A metadata-only LC record naming the future host embedding adapter preconditions while preserving host_adapter_present=0 and denying host authority.</w:t>
+            </w:r>
+          </w:p>
+        </w:tc>
+      </w:tr>
+      <w:tr>
+        <w:tc>
+          <w:tcPr>
+            <w:tcW w:type="dxa" w:w="4997"/>
+          </w:tcPr>
+          <w:p>
+            <w:r>
+              <w:t>Receipt request contract</w:t>
+            </w:r>
+          </w:p>
+        </w:tc>
+        <w:tc>
+          <w:tcPr>
+            <w:tcW w:type="dxa" w:w="4997"/>
+          </w:tcPr>
+          <w:p>
+            <w:r>
+              <w:t>A metadata-only LC record that asks for a future Seal receipt path without materializing a payload, writing a receipt, signing, or verifying.</w:t>
+            </w:r>
+          </w:p>
+        </w:tc>
+      </w:tr>
+      <w:tr>
+        <w:tc>
+          <w:tcPr>
+            <w:tcW w:type="dxa" w:w="4997"/>
+          </w:tcPr>
+          <w:p>
+            <w:r>
+              <w:t>OS-base planning contract</w:t>
+            </w:r>
+          </w:p>
+        </w:tc>
+        <w:tc>
+          <w:tcPr>
+            <w:tcW w:type="dxa" w:w="4997"/>
+          </w:tcPr>
+          <w:p>
+            <w:r>
+              <w:t>A metadata-only LC record naming future OS-base evidence obligations while denying boot, kernel, hardware, host, network, and runtime authority.</w:t>
+            </w:r>
+          </w:p>
+        </w:tc>
+      </w:tr>
+      <w:tr>
+        <w:tc>
+          <w:tcPr>
+            <w:tcW w:type="dxa" w:w="4997"/>
+          </w:tcPr>
+          <w:p>
+            <w:r>
+              <w:t>VM evidence contract</w:t>
+            </w:r>
+          </w:p>
+        </w:tc>
+        <w:tc>
+          <w:tcPr>
+            <w:tcW w:type="dxa" w:w="4997"/>
+          </w:tcPr>
+          <w:p>
+            <w:r>
+              <w:t>A metadata-only LC record naming future VM evidence obligations while denying VM launch, hypervisor access, disk-image mutation, guest networking, host mutation, and boot authority.</w:t>
+            </w:r>
+          </w:p>
+        </w:tc>
+      </w:tr>
     </w:tbl>
     <w:p>
       <w:pPr>
@@ -19674,7 +20314,7 @@
         <w:pStyle w:val="BodyTight"/>
       </w:pPr>
       <w:r>
-        <w:t>A strong public sentence: "Latticra is an early, local, evidence-bound substrate for report-only verification, policy regression, manifest/hash baselines, authority-neutral Ed25519 verification evidence, metadata-only Seal gate/effect/handoff/report classification, guarded user-local installation, and future runtime-boundary research."</w:t>
+        <w:t>A strong public sentence: "Latticra is an early, local, evidence-bound substrate for report-only verification, policy regression, manifest/hash baselines, authority-neutral Ed25519 verification evidence, metadata-only Seal gate/effect/handoff/report/envelope/signature-request classification, metadata-only Console host/receipt/OS/VM contract surfaces, guarded user-local installation, and future runtime-boundary research."</w:t>
       </w:r>
     </w:p>
     <w:p>
@@ -19715,7 +20355,7 @@
         <w:pStyle w:val="BodyTight"/>
       </w:pPr>
       <w:r>
-        <w:t>This edition was derived from the Latticra Seal handbook and recent repository material covering signed-request, freshness, verification-receipt, crypto-backend, Ed25519 verify-only, verified receipt promotion, verified capability gate, verified effect decision, runtime handoff evaluation, runtime handoff report, capability-gate/effect-decision records, installer, Console, Panel, Nucleus, Nadia, macOS app-bundle, Fedora/RPM, Lat/LIR, and one-pass field-engine evidence. It distinguishes implemented facts from inferred substrate architecture and preserves the project non-claims.</w:t>
+        <w:t>This edition was derived from the Latticra Seal handbook and recent repository material covering signed-request, freshness, verification, Seal metadata ladder extensions through signature request, Console host-adapter/receipt-request/payload/signature/OS/VM contract surfaces, installer, Panel, Nucleus, Nadia, macOS, Fedora/RPM, Lat/LIR, and one-pass field-engine evidence. It distinguishes implemented facts from inferred substrate architecture and preserves project non-claims.</w:t>
       </w:r>
     </w:p>
     <w:tbl>
@@ -20124,15 +20764,8 @@
             <w:tcW w:type="dxa" w:w="4997"/>
           </w:tcPr>
           <w:p>
-            <w:pPr>
-              <w:spacing w:before="0" w:after="0" w:line="240" w:lineRule="auto"/>
-            </w:pPr>
-            <w:r>
-              <w:rPr>
-                <w:rFonts w:ascii="Liberation Sans" w:hAnsi="Liberation Sans" w:eastAsia="Liberation Sans"/>
-                <w:sz w:val="16"/>
-              </w:rPr>
-              <w:t>Stage-0 command registry, Panel installability, runtime-boundary binding, and no-effect operator-surface posture.</w:t>
+            <w:r>
+              <w:t>Stage-0 command registry, Panel installability, runtime-boundary binding, host-adapter contract, receipt-request/payload/signature-request-binding contracts, OS-base planning, VM-evidence contract, and no-effect operator-surface posture.</w:t>
             </w:r>
           </w:p>
         </w:tc>
@@ -20323,12 +20956,9 @@
             <w:tcW w:type="dxa" w:w="4997"/>
           </w:tcPr>
           <w:p>
-            <w:pPr>
-              <w:spacing w:before="0" w:after="0" w:line="240" w:lineRule="auto"/>
-            </w:pPr>
-            <w:r>
-              <w:rPr>
-                <w:rFonts w:ascii="Liberation Sans" w:hAnsi="Liberation Sans" w:eastAsia="Liberation Sans"/>
+            <w:r>
+              <w:rPr>
+                <w:rFonts w:ascii="Liberation Sans" w:hAnsi="Liberation Sans"/>
                 <w:sz w:val="16"/>
               </w:rPr>
               <w:t>Seal trust and crypto metadata ladder</w:t>
@@ -20340,15 +20970,12 @@
             <w:tcW w:type="dxa" w:w="4997"/>
           </w:tcPr>
           <w:p>
-            <w:pPr>
-              <w:spacing w:before="0" w:after="0" w:line="240" w:lineRule="auto"/>
-            </w:pPr>
-            <w:r>
-              <w:rPr>
-                <w:rFonts w:ascii="Liberation Sans" w:hAnsi="Liberation Sans" w:eastAsia="Liberation Sans"/>
-                <w:sz w:val="16"/>
-              </w:rPr>
-              <w:t>Signed request, request freshness, verification receipt, crypto verify backend, capability gate, effect decision, and denied authority boundaries.</w:t>
+            <w:r>
+              <w:rPr>
+                <w:rFonts w:ascii="Liberation Sans" w:hAnsi="Liberation Sans"/>
+                <w:sz w:val="16"/>
+              </w:rPr>
+              <w:t>Signed request, freshness, receipt/backend, Ed25519 verify-only, verified receipt, gate, effect, handoff, report, envelope, and signature-request metadata boundaries.</w:t>
             </w:r>
           </w:p>
         </w:tc>
@@ -20359,15 +20986,12 @@
             <w:tcW w:type="dxa" w:w="4997"/>
           </w:tcPr>
           <w:p>
-            <w:pPr>
-              <w:spacing w:before="0" w:after="0" w:line="240" w:lineRule="auto"/>
-            </w:pPr>
-            <w:r>
-              <w:rPr>
-                <w:rFonts w:ascii="Liberation Sans" w:hAnsi="Liberation Sans" w:eastAsia="Liberation Sans"/>
-                <w:sz w:val="16"/>
-              </w:rPr>
-              <w:t>Seal Ed25519 verify-only and receipt promotion</w:t>
+            <w:r>
+              <w:rPr>
+                <w:rFonts w:ascii="Liberation Sans" w:hAnsi="Liberation Sans"/>
+                <w:sz w:val="16"/>
+              </w:rPr>
+              <w:t>Seal authority non-claims</w:t>
             </w:r>
           </w:p>
         </w:tc>
@@ -20376,111 +21000,12 @@
             <w:tcW w:type="dxa" w:w="4997"/>
           </w:tcPr>
           <w:p>
-            <w:pPr>
-              <w:spacing w:before="0" w:after="0" w:line="240" w:lineRule="auto"/>
-            </w:pPr>
-            <w:r>
-              <w:rPr>
-                <w:rFonts w:ascii="Liberation Sans" w:hAnsi="Liberation Sans" w:eastAsia="Liberation Sans"/>
-                <w:sz w:val="16"/>
-              </w:rPr>
-              <w:t>Provider-backed local verification result evidence, authority-neutral verified receipt promotion, and non-claims around trust stores, revocation, signing, capabilities, effects, and runtime authority.</w:t>
-            </w:r>
-          </w:p>
-        </w:tc>
-      </w:tr>
-      <w:tr>
-        <w:tc>
-          <w:tcPr>
-            <w:tcW w:type="dxa" w:w="4997"/>
-          </w:tcPr>
-          <w:p>
-            <w:pPr>
-              <w:spacing w:before="0" w:after="0" w:line="240" w:lineRule="auto"/>
-            </w:pPr>
-            <w:r>
-              <w:rPr>
-                <w:rFonts w:ascii="Liberation Sans" w:hAnsi="Liberation Sans" w:eastAsia="Liberation Sans"/>
-                <w:sz w:val="16"/>
-              </w:rPr>
-              <w:t>Seal verified capability gate</w:t>
-            </w:r>
-          </w:p>
-        </w:tc>
-        <w:tc>
-          <w:tcPr>
-            <w:tcW w:type="dxa" w:w="4997"/>
-          </w:tcPr>
-          <w:p>
-            <w:pPr>
-              <w:spacing w:before="0" w:after="0" w:line="240" w:lineRule="auto"/>
-            </w:pPr>
-            <w:r>
-              <w:rPr>
-                <w:rFonts w:ascii="Liberation Sans" w:hAnsi="Liberation Sans" w:eastAsia="Liberation Sans"/>
-                <w:sz w:val="16"/>
-              </w:rPr>
-              <w:t>Metadata-only capability/effect allowlist for verified receipts, with gate_allowed=1 separated from enforcement, effects, host behavior, and runtime authority.</w:t>
-            </w:r>
-          </w:p>
-        </w:tc>
-      </w:tr>
-      <w:tr>
-        <w:tc>
-          <w:tcPr>
-            <w:tcW w:type="dxa" w:w="4997"/>
-          </w:tcPr>
-          <w:p>
             <w:r>
               <w:rPr>
                 <w:rFonts w:ascii="Liberation Sans" w:hAnsi="Liberation Sans"/>
                 <w:sz w:val="16"/>
               </w:rPr>
-              <w:t>Seal verified effect decision</w:t>
-            </w:r>
-          </w:p>
-        </w:tc>
-        <w:tc>
-          <w:tcPr>
-            <w:tcW w:type="dxa" w:w="4997"/>
-          </w:tcPr>
-          <w:p>
-            <w:r>
-              <w:rPr>
-                <w:rFonts w:ascii="Liberation Sans" w:hAnsi="Liberation Sans"/>
-                <w:sz w:val="16"/>
-              </w:rPr>
-              <w:t>Metadata-only effect classification from allowed verified gates, with effect_allowed=1 separated from effect execution and runtime authority.</w:t>
-            </w:r>
-          </w:p>
-        </w:tc>
-      </w:tr>
-      <w:tr>
-        <w:tc>
-          <w:tcPr>
-            <w:tcW w:type="dxa" w:w="4997"/>
-          </w:tcPr>
-          <w:p>
-            <w:r>
-              <w:rPr>
-                <w:rFonts w:ascii="Liberation Sans" w:hAnsi="Liberation Sans"/>
-                <w:sz w:val="16"/>
-              </w:rPr>
-              <w:t>Seal runtime handoff evaluation/report</w:t>
-            </w:r>
-          </w:p>
-        </w:tc>
-        <w:tc>
-          <w:tcPr>
-            <w:tcW w:type="dxa" w:w="4997"/>
-          </w:tcPr>
-          <w:p>
-            <w:r>
-              <w:rPr>
-                <w:rFonts w:ascii="Liberation Sans" w:hAnsi="Liberation Sans"/>
-                <w:sz w:val="16"/>
-              </w:rPr>
-              <w:t>Metadata-only handoff eligibility and report-readiness classification, with handoff_eligible=1 and report_ready=1 separated from handoff execution, host behavior, network behavior, and authority.</w:t>
+              <w:t>Readiness flags remain separated from signing, object sealing, effect execution, host/network behavior, and runtime authority.</w:t>
             </w:r>
           </w:p>
         </w:tc>
@@ -20595,7 +21120,7 @@
         <w:pStyle w:val="ListNumber"/>
       </w:pPr>
       <w:r>
-        <w:t>For platform work, distinguish dry-run, installroot, disposable-VM, manual-host, and production-installer evidence before making any readiness claim.</w:t>
+        <w:t>For platform work, distinguish dry-run, installroot, disposable-VM, manual-host, and production-installer evidence.</w:t>
       </w:r>
     </w:p>
     <w:p>
@@ -20603,7 +21128,15 @@
         <w:pStyle w:val="ListNumber"/>
       </w:pPr>
       <w:r>
-        <w:t>For Seal work, follow the ladder through verified receipt promotion, verified capability gate, verified effect decision, handoff eligibility, and report readiness metadata; never skip from verification evidence to authority.</w:t>
+        <w:t>For Seal work, follow the ladder through verified receipt, gate, effect, handoff, report, envelope, and signature-request metadata; never skip from evidence to authority.</w:t>
+      </w:r>
+    </w:p>
+    <w:p>
+      <w:pPr>
+        <w:pStyle w:val="ListNumber"/>
+      </w:pPr>
+      <w:r>
+        <w:t>For Console work, distinguish contract-present metadata from adapter presence, payload materialization, signature requests, receipt writing, VM launch, OS-base behavior, and boot authority.</w:t>
       </w:r>
     </w:p>
     <w:sectPr>

</xml_diff>

<commit_message>
Advance Nadia disposition contract and readiness surfaces (#368)
* Validate clean operating checkpoint

* Advance Nadia to Stage 33 disposition contract

* Fix Ubuntu lintian availability contract
</commit_message>
<xml_diff>
--- a/docs/latticra-system-substrate/the-latticra-system-substrate.docx
+++ b/docs/latticra-system-substrate/the-latticra-system-substrate.docx
@@ -100,7 +100,7 @@
         <w:jc w:val="center"/>
       </w:pPr>
       <w:r>
-        <w:t>Working Draft 0.9 - 2026-05-25</w:t>
+        <w:t>Working Draft 0.11 - 2026-05-26</w:t>
       </w:r>
     </w:p>
     <w:p>
@@ -149,7 +149,7 @@
         <w:pStyle w:val="BodyTight"/>
       </w:pPr>
       <w:r>
-        <w:t>Source posture: this edition draws from the Seal handbook plus current Seal signed-request, request-freshness, verification-receipt, crypto-verify-backend, Ed25519 verify-only, verified-receipt-promotion, verified-capability-gate, verified-effect-decision, runtime-handoff-evaluation, runtime-handoff-report, capability-gate, and effect-decision records; Panel/installer receipts; Fedora and macOS validation material; Lat/LIR, Latticra Console, Nucleus, Nadia, runtime-boundary, kernel-lifecycle, and defensive threat-model notes; and the one-pass field engine research artifact.</w:t>
+        <w:t>Source posture: this edition draws from the Seal handbook plus current Seal signed-request, request-freshness, verification-receipt, crypto-verify-backend, Ed25519 verify-only, verified-receipt-promotion, verified-capability-gate, verified-effect-decision, runtime-handoff-evaluation, runtime-handoff-report, report-envelope, signature-request, capability-gate, and effect-decision records; Latticra Console Stage-0 host-adapter, receipt-request, receipt-payload, signature-request-binding, OS-base, and VM-evidence contract surfaces; Panel/installer receipts; Fedora and macOS validation material; Lat/LIR, Nucleus, Nadia, runtime-boundary, kernel-lifecycle, and defensive threat-model notes; and the one-pass field engine research artifact.</w:t>
       </w:r>
     </w:p>
     <w:p>
@@ -5021,6 +5021,190 @@
           </w:p>
         </w:tc>
       </w:tr>
+      <w:tr>
+        <w:tc>
+          <w:tcPr>
+            <w:tcW w:type="dxa" w:w="3331"/>
+          </w:tcPr>
+          <w:p>
+            <w:r>
+              <w:rPr>
+                <w:rFonts w:ascii="Liberation Sans" w:hAnsi="Liberation Sans"/>
+                <w:sz w:val="16"/>
+              </w:rPr>
+              <w:t>Seal report envelope</w:t>
+            </w:r>
+          </w:p>
+        </w:tc>
+        <w:tc>
+          <w:tcPr>
+            <w:tcW w:type="dxa" w:w="3331"/>
+          </w:tcPr>
+          <w:p>
+            <w:r>
+              <w:rPr>
+                <w:rFonts w:ascii="Liberation Sans" w:hAnsi="Liberation Sans"/>
+                <w:sz w:val="16"/>
+              </w:rPr>
+              <w:t>Ready runtime-handoff report metadata can become envelope_ready=1 while unsigned and object-unsealed.</w:t>
+            </w:r>
+          </w:p>
+        </w:tc>
+        <w:tc>
+          <w:tcPr>
+            <w:tcW w:type="dxa" w:w="3331"/>
+          </w:tcPr>
+          <w:p>
+            <w:r>
+              <w:rPr>
+                <w:rFonts w:ascii="Liberation Sans" w:hAnsi="Liberation Sans"/>
+                <w:sz w:val="16"/>
+              </w:rPr>
+              <w:t>Say envelope classification metadata; do not say signing, object sealing, runtime handoff, or authority.</w:t>
+            </w:r>
+          </w:p>
+        </w:tc>
+      </w:tr>
+      <w:tr>
+        <w:tc>
+          <w:tcPr>
+            <w:tcW w:type="dxa" w:w="3331"/>
+          </w:tcPr>
+          <w:p>
+            <w:r>
+              <w:rPr>
+                <w:rFonts w:ascii="Liberation Sans" w:hAnsi="Liberation Sans"/>
+                <w:sz w:val="16"/>
+              </w:rPr>
+              <w:t>Seal signature request</w:t>
+            </w:r>
+          </w:p>
+        </w:tc>
+        <w:tc>
+          <w:tcPr>
+            <w:tcW w:type="dxa" w:w="3331"/>
+          </w:tcPr>
+          <w:p>
+            <w:r>
+              <w:rPr>
+                <w:rFonts w:ascii="Liberation Sans" w:hAnsi="Liberation Sans"/>
+                <w:sz w:val="16"/>
+              </w:rPr>
+              <w:t>Ready report-envelope metadata can request Ed25519-development signing as metadata with signature_request_ready=1 and no signing.</w:t>
+            </w:r>
+          </w:p>
+        </w:tc>
+        <w:tc>
+          <w:tcPr>
+            <w:tcW w:type="dxa" w:w="3331"/>
+          </w:tcPr>
+          <w:p>
+            <w:r>
+              <w:rPr>
+                <w:rFonts w:ascii="Liberation Sans" w:hAnsi="Liberation Sans"/>
+                <w:sz w:val="16"/>
+              </w:rPr>
+              <w:t>Say signature-request classification; do not say Ed25519 signing, verification, private-key handling, or trust establishment.</w:t>
+            </w:r>
+          </w:p>
+        </w:tc>
+      </w:tr>
+      <w:tr>
+        <w:tc>
+          <w:tcPr>
+            <w:tcW w:type="dxa" w:w="3331"/>
+          </w:tcPr>
+          <w:p>
+            <w:r>
+              <w:t>LC host-adapter contract</w:t>
+            </w:r>
+          </w:p>
+        </w:tc>
+        <w:tc>
+          <w:tcPr>
+            <w:tcW w:type="dxa" w:w="3331"/>
+          </w:tcPr>
+          <w:p>
+            <w:r>
+              <w:t>Metadata-only contract; host_adapter_present=0, host process/file/network/runtime/boot authority denied.</w:t>
+            </w:r>
+          </w:p>
+        </w:tc>
+        <w:tc>
+          <w:tcPr>
+            <w:tcW w:type="dxa" w:w="3331"/>
+          </w:tcPr>
+          <w:p>
+            <w:r>
+              <w:t>Say LC exposes the adapter boundary for review; do not say a host adapter exists, probes the host, or embeds into the host.</w:t>
+            </w:r>
+          </w:p>
+        </w:tc>
+      </w:tr>
+      <w:tr>
+        <w:tc>
+          <w:tcPr>
+            <w:tcW w:type="dxa" w:w="3331"/>
+          </w:tcPr>
+          <w:p>
+            <w:r>
+              <w:t>LC receipt and signature bridge</w:t>
+            </w:r>
+          </w:p>
+        </w:tc>
+        <w:tc>
+          <w:tcPr>
+            <w:tcW w:type="dxa" w:w="3331"/>
+          </w:tcPr>
+          <w:p>
+            <w:r>
+              <w:t>Metadata-only receipt request, payload schema, artifact draft, and signature-request binding; payload_artifact_present=0, seal_signature_request_present=0, receipt_write_allowed=0.</w:t>
+            </w:r>
+          </w:p>
+        </w:tc>
+        <w:tc>
+          <w:tcPr>
+            <w:tcW w:type="dxa" w:w="3331"/>
+          </w:tcPr>
+          <w:p>
+            <w:r>
+              <w:t>Say LC reserves the Seal receipt path; do not say it materializes payloads, writes receipts, signs, verifies, or hands off to a signer.</w:t>
+            </w:r>
+          </w:p>
+        </w:tc>
+      </w:tr>
+      <w:tr>
+        <w:tc>
+          <w:tcPr>
+            <w:tcW w:type="dxa" w:w="3331"/>
+          </w:tcPr>
+          <w:p>
+            <w:r>
+              <w:t>LC OS-base and VM evidence contracts</w:t>
+            </w:r>
+          </w:p>
+        </w:tc>
+        <w:tc>
+          <w:tcPr>
+            <w:tcW w:type="dxa" w:w="3331"/>
+          </w:tcPr>
+          <w:p>
+            <w:r>
+              <w:t>Metadata-only planning/evidence contracts; os_base_enabled=0, vm_evidence_capture_enabled=0, boot_authority=0, production_os_claim=0.</w:t>
+            </w:r>
+          </w:p>
+        </w:tc>
+        <w:tc>
+          <w:tcPr>
+            <w:tcW w:type="dxa" w:w="3331"/>
+          </w:tcPr>
+          <w:p>
+            <w:r>
+              <w:t>Say LC records OS/VM promotion gates; do not say it boots, launches VMs, touches hypervisors, writes disk images, or replaces an OS.</w:t>
+            </w:r>
+          </w:p>
+        </w:tc>
+      </w:tr>
     </w:tbl>
     <w:p>
       <w:pPr>
@@ -5979,13 +6163,8 @@
             <w:tcW w:type="dxa" w:w="3331"/>
           </w:tcPr>
           <w:p>
-            <w:pPr/>
-            <w:r>
-              <w:rPr>
-                <w:rFonts w:ascii="Liberation Sans" w:hAnsi="Liberation Sans"/>
-                <w:sz w:val="16"/>
-              </w:rPr>
-              <w:t>latticra-lc, command registry, profiles</w:t>
+            <w:r>
+              <w:t>latticra-lc, command registry, profiles, host/receipt/OS contract reports</w:t>
             </w:r>
           </w:p>
         </w:tc>
@@ -5994,13 +6173,8 @@
             <w:tcW w:type="dxa" w:w="3331"/>
           </w:tcPr>
           <w:p>
-            <w:pPr/>
-            <w:r>
-              <w:rPr>
-                <w:rFonts w:ascii="Liberation Sans" w:hAnsi="Liberation Sans"/>
-                <w:sz w:val="16"/>
-              </w:rPr>
-              <w:t>Operator command surface with no-effect metadata and future gates.</w:t>
+            <w:r>
+              <w:t>Operator command surface with no-effect metadata, host-adapter and receipt-request contracts, OS/VM evidence planning, and future gates.</w:t>
             </w:r>
           </w:p>
         </w:tc>
@@ -6447,7 +6621,7 @@
         <w:pStyle w:val="BodyTight"/>
       </w:pPr>
       <w:r>
-        <w:t>Latticra Console, or LC, is the planned operator base for the substrate. Stage 0 makes LC visible without granting host authority: it is panel-installable, configurable, backed by a seed command registry, and bound to Runtime Boundary classification plus Seal capability labels.</w:t>
+        <w:t>Latticra Console, or LC, is the planned operator base for the substrate. Stage 0 makes LC visible without granting host authority: it is panel-installable, configurable, backed by a seed command registry, bound to Runtime Boundary classification plus Seal capability labels, and now extended with inspectable host, receipt, OS-base, and VM-evidence contract surfaces.</w:t>
       </w:r>
     </w:p>
     <w:p>
@@ -6472,6 +6646,22 @@
       </w:pPr>
       <w:r>
         <w:t>Future host embedding and OS-base directions are planning profiles only; they do not replace a host OS, launch shell commands, or create boot/runtime authority.</w:t>
+      </w:r>
+    </w:p>
+    <w:p>
+      <w:pPr>
+        <w:pStyle w:val="ListBullet"/>
+      </w:pPr>
+      <w:r>
+        <w:t>LC contract commands now include lc host-adapter, lc receipt-request, lc receipt-payload, lc receipt-artifact, lc signature-request, lc os-contract, and lc vm-evidence. They are review surfaces, not effect surfaces.</w:t>
+      </w:r>
+    </w:p>
+    <w:p>
+      <w:pPr>
+        <w:pStyle w:val="ListBullet"/>
+      </w:pPr>
+      <w:r>
+        <w:t>The important zeroes are part of the operator contract: host_adapter_present=0, payload_artifact_present=0, seal_signature_request_present=0, receipt_write_allowed=0, vm_evidence_artifact_present=0, boot_authority=0, and production_os_claim=0.</w:t>
       </w:r>
     </w:p>
     <w:p>
@@ -7321,7 +7511,7 @@
         <w:pStyle w:val="BodyTight"/>
       </w:pPr>
       <w:r>
-        <w:t>Seal now has enough trust-adjacent contract surface to name a ladder without pretending the ladder already grants authority. The stages are signed request metadata, request freshness metadata, verification policy metadata, verification receipt metadata, crypto verify backend metadata, Ed25519 verify-only result metadata, verified receipt promotion metadata, verified capability gate metadata, verified effect decision metadata, runtime handoff evaluation metadata, runtime handoff report metadata, effect decision metadata, runtime handoff metadata, and report envelope metadata. Each stage records the next question before the project is allowed to answer it with effects.</w:t>
+        <w:t>Seal now has enough trust-adjacent contract surface to name a ladder without pretending the ladder already grants authority. The stages are signed request metadata, request freshness metadata, verification policy metadata, verification receipt metadata, crypto verify backend metadata, Ed25519 verify-only result metadata, verified receipt promotion metadata, verified capability gate metadata, verified effect decision metadata, runtime handoff evaluation metadata, runtime handoff report metadata, report envelope metadata, and signature request metadata. Each stage records the next question before the project is allowed to answer it with effects.</w:t>
       </w:r>
     </w:p>
     <w:p>
@@ -7362,7 +7552,7 @@
         <w:pStyle w:val="BodyTight"/>
       </w:pPr>
       <w:r>
-        <w:t>Capability gates, verified effect decisions, and runtime handoff reports close the current ladder. A verified capability gate may set gate_allowed=1 for a narrow metadata-only report/evaluate request; a verified effect decision may set effect_allowed=1; a runtime handoff evaluation may set handoff_eligible=1; and a runtime handoff report may set report_ready=1. None of those flags means an effect ran, a handoff happened, or authority was granted.</w:t>
+        <w:t>Capability gates, verified effect decisions, runtime handoff reports, report envelopes, and signature requests close the current ladder. A verified capability gate may set gate_allowed=1; a verified effect decision may set effect_allowed=1; a runtime handoff evaluation may set handoff_eligible=1; a runtime handoff report may set report_ready=1; a report envelope may set envelope_ready=1; and a signature request may set signature_request_ready=1. None of those flags means an effect ran, a handoff happened, an object was sealed, a signature was produced, or authority was granted.</w:t>
       </w:r>
     </w:p>
     <w:p>
@@ -7507,6 +7697,30 @@
       </w:pPr>
       <w:r>
         <w:t>The runtime handoff report layer consumes eligible handoff evaluation metadata and produces report-readiness metadata. It may set report_ready=1 and report_state=ready-report-only or ready-evaluate-only, but it still does not perform a runtime handoff, execute an effect, enforce a capability, read or write host state, contact a network, or grant authority.</w:t>
+      </w:r>
+    </w:p>
+    <w:p>
+      <w:pPr>
+        <w:pStyle w:val="Heading2"/>
+      </w:pPr>
+      <w:r>
+        <w:t>5.11 Report envelope and signature request metadata</w:t>
+      </w:r>
+    </w:p>
+    <w:p>
+      <w:pPr>
+        <w:pStyle w:val="BodyTight"/>
+      </w:pPr>
+      <w:r>
+        <w:t>The report envelope layer consumes ready runtime handoff report metadata and classifies whether a report/evaluate record may be wrapped into deterministic envelope metadata. A successful envelope may set envelope_ready=1 and envelope_state=sealed-report-only or sealed-evaluate-only, but the name is deliberately narrow: it is metadata-only, unsigned, object-unsealed, and authority-neutral.</w:t>
+      </w:r>
+    </w:p>
+    <w:p>
+      <w:pPr>
+        <w:pStyle w:val="BodyTight"/>
+      </w:pPr>
+      <w:r>
+        <w:t>The signature request layer consumes ready report-envelope metadata and classifies an Ed25519-development request label as signature_request_state=requested-metadata-only with signature_request_ready=1. It is request classification, not signing or verification. It must preserve signature_performed=0, verification_performed=0, private_key_handling=0, handoff_performed=0, effect_performed=0, runtime_authority_granted=0, host_read_performed=0, host_write_performed=0, and network_performed=0.</w:t>
       </w:r>
     </w:p>
     <w:p>
@@ -8835,6 +9049,38 @@
     </w:p>
     <w:p>
       <w:pPr>
+        <w:pStyle w:val="Heading2"/>
+      </w:pPr>
+      <w:r>
+        <w:t>6.5 Latticra Console receipt and host contract bridge</w:t>
+      </w:r>
+    </w:p>
+    <w:p>
+      <w:pPr>
+        <w:pStyle w:val="BodyTight"/>
+      </w:pPr>
+      <w:r>
+        <w:t>LC extends the Panel/install story by installing metadata-only contract files and reports for host embedding, host inventory, host adapter, receipts, receipt requests, payload schema, payload artifact draft, signature-request binding, OS-base planning, and VM evidence. These records make the future promotion path visible before any host adapter, payload artifact, signature request, receipt writer, VM launcher, or OS-base behavior exists.</w:t>
+      </w:r>
+    </w:p>
+    <w:p>
+      <w:pPr>
+        <w:pStyle w:val="BodyTight"/>
+      </w:pPr>
+      <w:r>
+        <w:t>The bridge is deliberately inert. The installed surfaces can say request_contract_present=1, schema_present=1, draft_contract_present=1, binding_contract_present=1, os_base_contract_present=1, and vm_evidence_contract_present=1, while also preserving host_adapter_present=0, payload_materialized=0, signature_request_binding_allowed=0, seal_signature_request_present=0, receipt_write_allowed=0, vm_launch_allowed=0, and boot_allowed=0.</w:t>
+      </w:r>
+    </w:p>
+    <w:p>
+      <w:pPr>
+        <w:pStyle w:val="BodyTight"/>
+      </w:pPr>
+      <w:r>
+        <w:t>A reviewer should treat these Console records as preconditions for later work: they name the receipts, operator consent, runtime-boundary binding, and Seal capability labels that must exist before host embedding, signing, OS-base, or VM-adjacent behavior can be promoted.</w:t>
+      </w:r>
+    </w:p>
+    <w:p>
+      <w:pPr>
         <w:pStyle w:val="Heading1"/>
       </w:pPr>
       <w:r>
@@ -12403,7 +12649,7 @@
         <w:pStyle w:val="BodyTight"/>
       </w:pPr>
       <w:r>
-        <w:t>This gives reviewers a sharper audit rule. A record may show verified receipt evidence, an allowed metadata gate, an allowed metadata-only effect decision, eligible runtime-handoff metadata, and report-ready metadata while still proving that no host read, host write, network access, tool execution, shell execution, capability enforcement, runtime handoff, or runtime authority occurred. That is not contradiction; it is the point of the ladder.</w:t>
+        <w:t>This gives reviewers a sharper audit rule. A record may show verified receipt evidence, an allowed metadata gate, an allowed metadata-only effect decision, eligible runtime-handoff metadata, report-ready metadata, envelope-ready metadata, and signature-request-ready metadata while still proving that no host read, host write, network access, tool execution, shell execution, capability enforcement, runtime handoff, signing, object sealing, or runtime authority occurred. That is not contradiction; it is the point of the ladder.</w:t>
       </w:r>
     </w:p>
     <w:p>
@@ -12419,7 +12665,7 @@
         <w:pStyle w:val="BodyTight"/>
       </w:pPr>
       <w:r>
-        <w:t>The new Seal ladder deliberately uses different verbs for different evidence states. gate_allowed=1 means a metadata gate accepted the request. effect_allowed=1 means a metadata-only effect classification accepted the request. handoff_eligible=1 means a future handoff candidate is describable. report_ready=1 means a report record can be emitted.</w:t>
+        <w:t>The new Seal ladder deliberately uses different verbs for different evidence states. gate_allowed=1 means a metadata gate accepted the request. effect_allowed=1 means a metadata-only effect classification accepted the request. handoff_eligible=1 means a future handoff candidate is describable. report_ready=1 means a report record can be emitted. envelope_ready=1 means a deterministic envelope record can be emitted. signature_request_ready=1 means a future signing path was requested as metadata.</w:t>
       </w:r>
     </w:p>
     <w:p>
@@ -12427,7 +12673,55 @@
         <w:pStyle w:val="BodyTight"/>
       </w:pPr>
       <w:r>
-        <w:t>None of those states means effect_performed=1, handoff_performed=1, runtime_authority_granted=1, or host/network behavior. Reviewers should read these flags as named non-effect checkpoints, not as disguised permission grants.</w:t>
+        <w:t>None of those states means effect_performed=1, handoff_performed=1, signature_performed=1, verification_performed=1, private_key_handling=1, runtime_authority_granted=1, object sealing, or host/network behavior. Reviewers should read these flags as named non-effect checkpoints, not as disguised permission grants.</w:t>
+      </w:r>
+    </w:p>
+    <w:p>
+      <w:pPr>
+        <w:pStyle w:val="Heading2"/>
+      </w:pPr>
+      <w:r>
+        <w:t>11.8 Envelope and signature request do not sign</w:t>
+      </w:r>
+    </w:p>
+    <w:p>
+      <w:pPr>
+        <w:pStyle w:val="BodyTight"/>
+      </w:pPr>
+      <w:r>
+        <w:t>Envelope language is risky because ordinary readers may hear "sealed" as cryptographic or object-sealing behavior. In this edition it means only deterministic report-envelope metadata. Signature request language is equally narrow: Ed25519-development is a requested signature label, not a signing operation, private-key action, trust-store decision, or signature verification result.</w:t>
+      </w:r>
+    </w:p>
+    <w:p>
+      <w:pPr>
+        <w:pStyle w:val="BodyTight"/>
+      </w:pPr>
+      <w:r>
+        <w:t>A reviewer should reject any claim that jumps from envelope_ready=1 or signature_request_ready=1 to signing, object sealing, production cryptography, runtime handoff, host mutation, network behavior, or authority. Those transitions require separate contracts, implementations, and denial tests.</w:t>
+      </w:r>
+    </w:p>
+    <w:p>
+      <w:pPr>
+        <w:pStyle w:val="Heading2"/>
+      </w:pPr>
+      <w:r>
+        <w:t>11.9 Console receipt requests are not receipts</w:t>
+      </w:r>
+    </w:p>
+    <w:p>
+      <w:pPr>
+        <w:pStyle w:val="BodyTight"/>
+      </w:pPr>
+      <w:r>
+        <w:t>LC adds a second, component-specific example of the same rule. Its receipt-request, payload-schema, payload-artifact-draft, and signature-request-binding records describe what a future Seal-signed Console receipt would need to contain, but they do not materialize a payload, compute or record a payload hash, create a signature-request artifact, write a receipt, invoke a signer, or verify anything.</w:t>
+      </w:r>
+    </w:p>
+    <w:p>
+      <w:pPr>
+        <w:pStyle w:val="BodyTight"/>
+      </w:pPr>
+      <w:r>
+        <w:t>The Console witness edge is therefore a request edge, not an evidence edge. The current evidence is the presence of metadata-only contracts and the persistence of denial fields such as payload_artifact_present=0, signature_request_binding_allowed=0, seal_signature_request_ready=0, receipt_write_allowed=0, receipt_signed=0, file_write_allowed=0, and runtime_authority_granted=0.</w:t>
       </w:r>
     </w:p>
     <w:p>
@@ -14741,6 +15035,22 @@
         <w:pStyle w:val="ListBullet"/>
       </w:pPr>
       <w:r>
+        <w:t>Contract commands such as lc host-adapter, lc receipt-request, lc receipt-payload, lc receipt-artifact, lc signature-request, lc os-contract, and lc vm-evidence expose promotion gates and denial fields as command output.</w:t>
+      </w:r>
+    </w:p>
+    <w:p>
+      <w:pPr>
+        <w:pStyle w:val="ListBullet"/>
+      </w:pPr>
+      <w:r>
+        <w:t>Their source and installed report surfaces must remain paired: latticra_console_report &lt;surface&gt; and latticra-lc &lt;surface&gt; should tell the same no-effect story for host, receipt, signature, OS, and VM planning metadata.</w:t>
+      </w:r>
+    </w:p>
+    <w:p>
+      <w:pPr>
+        <w:pStyle w:val="ListBullet"/>
+      </w:pPr>
+      <w:r>
         <w:t>The review rule is simple: adding a command means adding its effect label, capability label, no-effect flag, future-gate status, report surface, and denial behavior before widening authority.</w:t>
       </w:r>
     </w:p>
@@ -15798,6 +16108,62 @@
       </w:pPr>
       <w:r>
         <w:t>The runtime handoff evaluation schema adds handoff_profile, requested_handoff, handoff_state, and handoff_eligible while preserving handoff_performed=0. The runtime handoff report schema adds report_profile, requested_report, report_state, and report_ready. Schema consumers must not collapse handoff_eligible=1 or report_ready=1 into runtime handoff execution.</w:t>
+      </w:r>
+    </w:p>
+    <w:p>
+      <w:pPr>
+        <w:pStyle w:val="Heading2"/>
+      </w:pPr>
+      <w:r>
+        <w:t>14.10 Report envelope and signature request schemas</w:t>
+      </w:r>
+    </w:p>
+    <w:p>
+      <w:pPr>
+        <w:pStyle w:val="BodyTight"/>
+      </w:pPr>
+      <w:r>
+        <w:t>The report envelope schema adds envelope_profile, requested_envelope, envelope_state, envelope_ready, and signature_performed to the runtime handoff report lineage. Its central invariant is that envelope_ready=1 may coexist with signature_performed=0, handoff_performed=0, effect_performed=0, runtime_authority_granted=0, and no host or network behavior.</w:t>
+      </w:r>
+    </w:p>
+    <w:p>
+      <w:pPr>
+        <w:pStyle w:val="BodyTight"/>
+      </w:pPr>
+      <w:r>
+        <w:t>The signature request schema adds signature_request_profile, requested_signature, signature_request_state, signature_request_ready, verification_performed, and private_key_handling. The current allowed request label is Ed25519-development, but that label is metadata-only. Schema consumers must not interpret signature_request_ready=1 as Ed25519 signing, key generation, private-key handling, trust establishment, or signature verification.</w:t>
+      </w:r>
+    </w:p>
+    <w:p>
+      <w:pPr>
+        <w:pStyle w:val="Heading2"/>
+      </w:pPr>
+      <w:r>
+        <w:t>14.11 Latticra Console contract schemas</w:t>
+      </w:r>
+    </w:p>
+    <w:p>
+      <w:pPr>
+        <w:pStyle w:val="BodyTight"/>
+      </w:pPr>
+      <w:r>
+        <w:t>LC contract schemas should stay small and auditable. The host-adapter contract centers fields such as contract_profile=lc-host-adapter-v0, host_adapter_enabled, host_adapter_present, host_embedding_contract_receipt_required, host_inventory_contract_receipt_required, operator_consent_required, runtime_boundary_required, seal_capability_labels_required, and promotion_gate.</w:t>
+      </w:r>
+    </w:p>
+    <w:p>
+      <w:pPr>
+        <w:pStyle w:val="BodyTight"/>
+      </w:pPr>
+      <w:r>
+        <w:t>The receipt path centers request_profile=lc-receipt-request-v0, schema_profile=lc-receipt-payload-schema-v0, draft_profile=lc-receipt-payload-artifact-draft-v0, binding_profile=lc-signature-request-binding-v0, requested_receipt_profile, requested_capability, requested_surfaces, payload_fields, required_authority_fields, required_prior_contracts, and signing_authorization_profile. Schema consumers must preserve payload_artifact_present=0, payload_materialized=0, payload_hash_computed=0, seal_signature_request_present=0, receipt_write_allowed=0, and receipt_signed=0 until later artifacts exist.</w:t>
+      </w:r>
+    </w:p>
+    <w:p>
+      <w:pPr>
+        <w:pStyle w:val="BodyTight"/>
+      </w:pPr>
+      <w:r>
+        <w:t>The OS and VM planning contracts center contract_profile=lc-os-base-v0, contract_profile=lc-vm-evidence-v0, vm_evidence_required, vm_evidence_capture_enabled, vm_evidence_artifact_present, os_base_enabled, production_os_claim, read_only_host_inventory_receipt_required, receipt_required_before_os_base, receipt_required_before_vm_evidence, and promotion_gate. These fields reserve evidence obligations; they do not grant boot, hypervisor, disk-image, guest, host, network, or runtime authority.</w:t>
       </w:r>
     </w:p>
     <w:p>
@@ -16482,6 +16848,38 @@
           </w:p>
         </w:tc>
       </w:tr>
+      <w:tr>
+        <w:tc>
+          <w:tcPr>
+            <w:tcW w:type="dxa" w:w="3331"/>
+          </w:tcPr>
+          <w:p>
+            <w:r>
+              <w:t>make latticra-console</w:t>
+            </w:r>
+          </w:p>
+        </w:tc>
+        <w:tc>
+          <w:tcPr>
+            <w:tcW w:type="dxa" w:w="3331"/>
+          </w:tcPr>
+          <w:p>
+            <w:r>
+              <w:t>Validate LC registry, Panel installability, host/receipt/signature/OS/VM contract reports, and boundary metadata.</w:t>
+            </w:r>
+          </w:p>
+        </w:tc>
+        <w:tc>
+          <w:tcPr>
+            <w:tcW w:type="dxa" w:w="3331"/>
+          </w:tcPr>
+          <w:p>
+            <w:r>
+              <w:t>Console report transcript with required contract-present fields and no-effect denial fields.</w:t>
+            </w:r>
+          </w:p>
+        </w:tc>
+      </w:tr>
     </w:tbl>
     <w:p>
       <w:pPr>
@@ -16881,6 +17279,54 @@
       </w:pPr>
       <w:r>
         <w:t>The runtime handoff evaluation and report lanes should accept only metadata-only allowed decisions, then prove handoff_eligible=1 and report_ready=1 without performing handoff or granting authority. Negative cases should cover null inputs, invalid predecessors, unsupported labels, mismatched report requests, prior performed effects, host read/write flags, network flags, tiny report buffers, and runtime_authority_granted=1.</w:t>
+      </w:r>
+    </w:p>
+    <w:p>
+      <w:pPr>
+        <w:pStyle w:val="Heading2"/>
+      </w:pPr>
+      <w:r>
+        <w:t>15.10 Envelope and signature request validation lanes</w:t>
+      </w:r>
+    </w:p>
+    <w:p>
+      <w:pPr>
+        <w:pStyle w:val="BodyTight"/>
+      </w:pPr>
+      <w:r>
+        <w:t>The report envelope lane should accept only ready runtime handoff reports and report/evaluate envelope labels, then prove envelope_ready=1 without signing, object sealing, performing handoff, performing effects, reading host state, writing host state, contacting networks, or granting runtime authority.</w:t>
+      </w:r>
+    </w:p>
+    <w:p>
+      <w:pPr>
+        <w:pStyle w:val="BodyTight"/>
+      </w:pPr>
+      <w:r>
+        <w:t>The signature request lane should accept only ready sealed-report or sealed-evaluate envelope metadata and the Ed25519-development request label, then prove signature_request_ready=1 while signature_performed=0, verification_performed=0, private_key_handling=0, handoff_performed=0, effect_performed=0, runtime_authority_granted=0, and host/network flags remain zero. Negative cases should cover invalid envelopes, missing or unknown signature labels, prior signature/effect/handoff flags, tiny report buffers, and runtime_authority_granted=1.</w:t>
+      </w:r>
+    </w:p>
+    <w:p>
+      <w:pPr>
+        <w:pStyle w:val="Heading2"/>
+      </w:pPr>
+      <w:r>
+        <w:t>15.11 Latticra Console contract validation lane</w:t>
+      </w:r>
+    </w:p>
+    <w:p>
+      <w:pPr>
+        <w:pStyle w:val="BodyTight"/>
+      </w:pPr>
+      <w:r>
+        <w:t>The Console validation lane should prove both halves of the contract bundle: the positive presence of reportable metadata and the negative absence of authority. The current evidence target is make latticra-console plus focused checks for host-adapter, receipt-request, payload schema, payload artifact draft, signature-request binding, OS-base, VM-evidence, boundary, help, manpage, installed wrapper, and Panel component metadata.</w:t>
+      </w:r>
+    </w:p>
+    <w:p>
+      <w:pPr>
+        <w:pStyle w:val="BodyTight"/>
+      </w:pPr>
+      <w:r>
+        <w:t>The no-effect assertions are the important part: command_registry_no_effect=1, host_process_launch_allowed=0, host_adapter_present=0, payload_artifact_present=0, seal_signature_request_present=0, receipt_write_allowed=0, vm_evidence_artifact_present=0, vm_launch_allowed=0, boot_allowed=0, production_os_claim=0, network_authority=0, and runtime_enforcement_authority=0.</w:t>
       </w:r>
     </w:p>
     <w:p>
@@ -17501,7 +17947,12 @@
             <w:pPr>
               <w:spacing w:after="0"/>
             </w:pPr>
-            <w:r/>
+            <w:r>
+              <w:rPr>
+                <w:rFonts w:ascii="Liberation Sans" w:hAnsi="Liberation Sans"/>
+                <w:sz w:val="16"/>
+              </w:rPr>
+            </w:r>
             <w:r>
               <w:rPr>
                 <w:rFonts w:ascii="Liberation Sans" w:hAnsi="Liberation Sans"/>
@@ -17527,7 +17978,12 @@
             <w:pPr>
               <w:spacing w:after="0"/>
             </w:pPr>
-            <w:r/>
+            <w:r>
+              <w:rPr>
+                <w:rFonts w:ascii="Liberation Sans" w:hAnsi="Liberation Sans"/>
+                <w:sz w:val="16"/>
+              </w:rPr>
+            </w:r>
             <w:r>
               <w:rPr>
                 <w:rFonts w:ascii="Liberation Sans" w:hAnsi="Liberation Sans"/>
@@ -17551,7 +18007,11 @@
           </w:tcPr>
           <w:p>
             <w:r>
-              <w:t>No-effect dry-run handoff, verified capability gate, verified effect decision, handoff eligibility, report readiness, and denial tests.</w:t>
+              <w:rPr>
+                <w:rFonts w:ascii="Liberation Sans" w:hAnsi="Liberation Sans"/>
+                <w:sz w:val="16"/>
+              </w:rPr>
+              <w:t>No-effect dry-run handoff, verified capability gate, verified effect decision, handoff/report/envelope/signature-request readiness, and denial tests.</w:t>
             </w:r>
           </w:p>
         </w:tc>
@@ -17632,6 +18092,38 @@
                 <w:sz w:val="16"/>
               </w:rPr>
               <w:t>User-local evidence, no-root assumptions, RPM boundaries, SELinux/systemd non-claims.</w:t>
+            </w:r>
+          </w:p>
+        </w:tc>
+      </w:tr>
+      <w:tr>
+        <w:tc>
+          <w:tcPr>
+            <w:tcW w:type="dxa" w:w="3331"/>
+          </w:tcPr>
+          <w:p>
+            <w:r>
+              <w:t>9. LC host/receipt/OS promotion gates</w:t>
+            </w:r>
+          </w:p>
+        </w:tc>
+        <w:tc>
+          <w:tcPr>
+            <w:tcW w:type="dxa" w:w="3331"/>
+          </w:tcPr>
+          <w:p>
+            <w:r>
+              <w:t>Promote Console planning surfaces only after receipted evidence exists.</w:t>
+            </w:r>
+          </w:p>
+        </w:tc>
+        <w:tc>
+          <w:tcPr>
+            <w:tcW w:type="dxa" w:w="3331"/>
+          </w:tcPr>
+          <w:p>
+            <w:r>
+              <w:t>Host adapter, receipt payload, signature request, OS-base, and VM-evidence artifacts each have schemas, tests, receipts, and non-claims before authority widens.</w:t>
             </w:r>
           </w:p>
         </w:tc>
@@ -18947,6 +19439,154 @@
           </w:p>
         </w:tc>
       </w:tr>
+      <w:tr>
+        <w:tc>
+          <w:tcPr>
+            <w:tcW w:type="dxa" w:w="4997"/>
+          </w:tcPr>
+          <w:p>
+            <w:r>
+              <w:rPr>
+                <w:rFonts w:ascii="Liberation Sans" w:hAnsi="Liberation Sans"/>
+                <w:sz w:val="16"/>
+              </w:rPr>
+              <w:t>Report envelope</w:t>
+            </w:r>
+          </w:p>
+        </w:tc>
+        <w:tc>
+          <w:tcPr>
+            <w:tcW w:type="dxa" w:w="4997"/>
+          </w:tcPr>
+          <w:p>
+            <w:r>
+              <w:rPr>
+                <w:rFonts w:ascii="Liberation Sans" w:hAnsi="Liberation Sans"/>
+                <w:sz w:val="16"/>
+              </w:rPr>
+              <w:t>A deterministic metadata envelope around ready report metadata; currently unsigned and object-unsealed.</w:t>
+            </w:r>
+          </w:p>
+        </w:tc>
+      </w:tr>
+      <w:tr>
+        <w:tc>
+          <w:tcPr>
+            <w:tcW w:type="dxa" w:w="4997"/>
+          </w:tcPr>
+          <w:p>
+            <w:r>
+              <w:rPr>
+                <w:rFonts w:ascii="Liberation Sans" w:hAnsi="Liberation Sans"/>
+                <w:sz w:val="16"/>
+              </w:rPr>
+              <w:t>Signature request</w:t>
+            </w:r>
+          </w:p>
+        </w:tc>
+        <w:tc>
+          <w:tcPr>
+            <w:tcW w:type="dxa" w:w="4997"/>
+          </w:tcPr>
+          <w:p>
+            <w:r>
+              <w:rPr>
+                <w:rFonts w:ascii="Liberation Sans" w:hAnsi="Liberation Sans"/>
+                <w:sz w:val="16"/>
+              </w:rPr>
+              <w:t>A metadata-only request for a future signing path that does not sign, verify, handle keys, or grant authority.</w:t>
+            </w:r>
+          </w:p>
+        </w:tc>
+      </w:tr>
+      <w:tr>
+        <w:tc>
+          <w:tcPr>
+            <w:tcW w:type="dxa" w:w="4997"/>
+          </w:tcPr>
+          <w:p>
+            <w:r>
+              <w:t>Host-adapter contract</w:t>
+            </w:r>
+          </w:p>
+        </w:tc>
+        <w:tc>
+          <w:tcPr>
+            <w:tcW w:type="dxa" w:w="4997"/>
+          </w:tcPr>
+          <w:p>
+            <w:r>
+              <w:t>A metadata-only LC record naming the future host embedding adapter preconditions while preserving host_adapter_present=0 and denying host authority.</w:t>
+            </w:r>
+          </w:p>
+        </w:tc>
+      </w:tr>
+      <w:tr>
+        <w:tc>
+          <w:tcPr>
+            <w:tcW w:type="dxa" w:w="4997"/>
+          </w:tcPr>
+          <w:p>
+            <w:r>
+              <w:t>Receipt request contract</w:t>
+            </w:r>
+          </w:p>
+        </w:tc>
+        <w:tc>
+          <w:tcPr>
+            <w:tcW w:type="dxa" w:w="4997"/>
+          </w:tcPr>
+          <w:p>
+            <w:r>
+              <w:t>A metadata-only LC record that asks for a future Seal receipt path without materializing a payload, writing a receipt, signing, or verifying.</w:t>
+            </w:r>
+          </w:p>
+        </w:tc>
+      </w:tr>
+      <w:tr>
+        <w:tc>
+          <w:tcPr>
+            <w:tcW w:type="dxa" w:w="4997"/>
+          </w:tcPr>
+          <w:p>
+            <w:r>
+              <w:t>OS-base planning contract</w:t>
+            </w:r>
+          </w:p>
+        </w:tc>
+        <w:tc>
+          <w:tcPr>
+            <w:tcW w:type="dxa" w:w="4997"/>
+          </w:tcPr>
+          <w:p>
+            <w:r>
+              <w:t>A metadata-only LC record naming future OS-base evidence obligations while denying boot, kernel, hardware, host, network, and runtime authority.</w:t>
+            </w:r>
+          </w:p>
+        </w:tc>
+      </w:tr>
+      <w:tr>
+        <w:tc>
+          <w:tcPr>
+            <w:tcW w:type="dxa" w:w="4997"/>
+          </w:tcPr>
+          <w:p>
+            <w:r>
+              <w:t>VM evidence contract</w:t>
+            </w:r>
+          </w:p>
+        </w:tc>
+        <w:tc>
+          <w:tcPr>
+            <w:tcW w:type="dxa" w:w="4997"/>
+          </w:tcPr>
+          <w:p>
+            <w:r>
+              <w:t>A metadata-only LC record naming future VM evidence obligations while denying VM launch, hypervisor access, disk-image mutation, guest networking, host mutation, and boot authority.</w:t>
+            </w:r>
+          </w:p>
+        </w:tc>
+      </w:tr>
     </w:tbl>
     <w:p>
       <w:pPr>
@@ -19674,7 +20314,7 @@
         <w:pStyle w:val="BodyTight"/>
       </w:pPr>
       <w:r>
-        <w:t>A strong public sentence: "Latticra is an early, local, evidence-bound substrate for report-only verification, policy regression, manifest/hash baselines, authority-neutral Ed25519 verification evidence, metadata-only Seal gate/effect/handoff/report classification, guarded user-local installation, and future runtime-boundary research."</w:t>
+        <w:t>A strong public sentence: "Latticra is an early, local, evidence-bound substrate for report-only verification, policy regression, manifest/hash baselines, authority-neutral Ed25519 verification evidence, metadata-only Seal gate/effect/handoff/report/envelope/signature-request classification, metadata-only Console host/receipt/OS/VM contract surfaces, guarded user-local installation, and future runtime-boundary research."</w:t>
       </w:r>
     </w:p>
     <w:p>
@@ -19715,7 +20355,7 @@
         <w:pStyle w:val="BodyTight"/>
       </w:pPr>
       <w:r>
-        <w:t>This edition was derived from the Latticra Seal handbook and recent repository material covering signed-request, freshness, verification-receipt, crypto-backend, Ed25519 verify-only, verified receipt promotion, verified capability gate, verified effect decision, runtime handoff evaluation, runtime handoff report, capability-gate/effect-decision records, installer, Console, Panel, Nucleus, Nadia, macOS app-bundle, Fedora/RPM, Lat/LIR, and one-pass field-engine evidence. It distinguishes implemented facts from inferred substrate architecture and preserves the project non-claims.</w:t>
+        <w:t>This edition was derived from the Latticra Seal handbook and recent repository material covering signed-request, freshness, verification, Seal metadata ladder extensions through signature request, Console host-adapter/receipt-request/payload/signature/OS/VM contract surfaces, installer, Panel, Nucleus, Nadia, macOS, Fedora/RPM, Lat/LIR, and one-pass field-engine evidence. It distinguishes implemented facts from inferred substrate architecture and preserves project non-claims.</w:t>
       </w:r>
     </w:p>
     <w:tbl>
@@ -20124,15 +20764,8 @@
             <w:tcW w:type="dxa" w:w="4997"/>
           </w:tcPr>
           <w:p>
-            <w:pPr>
-              <w:spacing w:before="0" w:after="0" w:line="240" w:lineRule="auto"/>
-            </w:pPr>
-            <w:r>
-              <w:rPr>
-                <w:rFonts w:ascii="Liberation Sans" w:hAnsi="Liberation Sans" w:eastAsia="Liberation Sans"/>
-                <w:sz w:val="16"/>
-              </w:rPr>
-              <w:t>Stage-0 command registry, Panel installability, runtime-boundary binding, and no-effect operator-surface posture.</w:t>
+            <w:r>
+              <w:t>Stage-0 command registry, Panel installability, runtime-boundary binding, host-adapter contract, receipt-request/payload/signature-request-binding contracts, OS-base planning, VM-evidence contract, and no-effect operator-surface posture.</w:t>
             </w:r>
           </w:p>
         </w:tc>
@@ -20323,12 +20956,9 @@
             <w:tcW w:type="dxa" w:w="4997"/>
           </w:tcPr>
           <w:p>
-            <w:pPr>
-              <w:spacing w:before="0" w:after="0" w:line="240" w:lineRule="auto"/>
-            </w:pPr>
-            <w:r>
-              <w:rPr>
-                <w:rFonts w:ascii="Liberation Sans" w:hAnsi="Liberation Sans" w:eastAsia="Liberation Sans"/>
+            <w:r>
+              <w:rPr>
+                <w:rFonts w:ascii="Liberation Sans" w:hAnsi="Liberation Sans"/>
                 <w:sz w:val="16"/>
               </w:rPr>
               <w:t>Seal trust and crypto metadata ladder</w:t>
@@ -20340,15 +20970,12 @@
             <w:tcW w:type="dxa" w:w="4997"/>
           </w:tcPr>
           <w:p>
-            <w:pPr>
-              <w:spacing w:before="0" w:after="0" w:line="240" w:lineRule="auto"/>
-            </w:pPr>
-            <w:r>
-              <w:rPr>
-                <w:rFonts w:ascii="Liberation Sans" w:hAnsi="Liberation Sans" w:eastAsia="Liberation Sans"/>
-                <w:sz w:val="16"/>
-              </w:rPr>
-              <w:t>Signed request, request freshness, verification receipt, crypto verify backend, capability gate, effect decision, and denied authority boundaries.</w:t>
+            <w:r>
+              <w:rPr>
+                <w:rFonts w:ascii="Liberation Sans" w:hAnsi="Liberation Sans"/>
+                <w:sz w:val="16"/>
+              </w:rPr>
+              <w:t>Signed request, freshness, receipt/backend, Ed25519 verify-only, verified receipt, gate, effect, handoff, report, envelope, and signature-request metadata boundaries.</w:t>
             </w:r>
           </w:p>
         </w:tc>
@@ -20359,15 +20986,12 @@
             <w:tcW w:type="dxa" w:w="4997"/>
           </w:tcPr>
           <w:p>
-            <w:pPr>
-              <w:spacing w:before="0" w:after="0" w:line="240" w:lineRule="auto"/>
-            </w:pPr>
-            <w:r>
-              <w:rPr>
-                <w:rFonts w:ascii="Liberation Sans" w:hAnsi="Liberation Sans" w:eastAsia="Liberation Sans"/>
-                <w:sz w:val="16"/>
-              </w:rPr>
-              <w:t>Seal Ed25519 verify-only and receipt promotion</w:t>
+            <w:r>
+              <w:rPr>
+                <w:rFonts w:ascii="Liberation Sans" w:hAnsi="Liberation Sans"/>
+                <w:sz w:val="16"/>
+              </w:rPr>
+              <w:t>Seal authority non-claims</w:t>
             </w:r>
           </w:p>
         </w:tc>
@@ -20376,111 +21000,12 @@
             <w:tcW w:type="dxa" w:w="4997"/>
           </w:tcPr>
           <w:p>
-            <w:pPr>
-              <w:spacing w:before="0" w:after="0" w:line="240" w:lineRule="auto"/>
-            </w:pPr>
-            <w:r>
-              <w:rPr>
-                <w:rFonts w:ascii="Liberation Sans" w:hAnsi="Liberation Sans" w:eastAsia="Liberation Sans"/>
-                <w:sz w:val="16"/>
-              </w:rPr>
-              <w:t>Provider-backed local verification result evidence, authority-neutral verified receipt promotion, and non-claims around trust stores, revocation, signing, capabilities, effects, and runtime authority.</w:t>
-            </w:r>
-          </w:p>
-        </w:tc>
-      </w:tr>
-      <w:tr>
-        <w:tc>
-          <w:tcPr>
-            <w:tcW w:type="dxa" w:w="4997"/>
-          </w:tcPr>
-          <w:p>
-            <w:pPr>
-              <w:spacing w:before="0" w:after="0" w:line="240" w:lineRule="auto"/>
-            </w:pPr>
-            <w:r>
-              <w:rPr>
-                <w:rFonts w:ascii="Liberation Sans" w:hAnsi="Liberation Sans" w:eastAsia="Liberation Sans"/>
-                <w:sz w:val="16"/>
-              </w:rPr>
-              <w:t>Seal verified capability gate</w:t>
-            </w:r>
-          </w:p>
-        </w:tc>
-        <w:tc>
-          <w:tcPr>
-            <w:tcW w:type="dxa" w:w="4997"/>
-          </w:tcPr>
-          <w:p>
-            <w:pPr>
-              <w:spacing w:before="0" w:after="0" w:line="240" w:lineRule="auto"/>
-            </w:pPr>
-            <w:r>
-              <w:rPr>
-                <w:rFonts w:ascii="Liberation Sans" w:hAnsi="Liberation Sans" w:eastAsia="Liberation Sans"/>
-                <w:sz w:val="16"/>
-              </w:rPr>
-              <w:t>Metadata-only capability/effect allowlist for verified receipts, with gate_allowed=1 separated from enforcement, effects, host behavior, and runtime authority.</w:t>
-            </w:r>
-          </w:p>
-        </w:tc>
-      </w:tr>
-      <w:tr>
-        <w:tc>
-          <w:tcPr>
-            <w:tcW w:type="dxa" w:w="4997"/>
-          </w:tcPr>
-          <w:p>
             <w:r>
               <w:rPr>
                 <w:rFonts w:ascii="Liberation Sans" w:hAnsi="Liberation Sans"/>
                 <w:sz w:val="16"/>
               </w:rPr>
-              <w:t>Seal verified effect decision</w:t>
-            </w:r>
-          </w:p>
-        </w:tc>
-        <w:tc>
-          <w:tcPr>
-            <w:tcW w:type="dxa" w:w="4997"/>
-          </w:tcPr>
-          <w:p>
-            <w:r>
-              <w:rPr>
-                <w:rFonts w:ascii="Liberation Sans" w:hAnsi="Liberation Sans"/>
-                <w:sz w:val="16"/>
-              </w:rPr>
-              <w:t>Metadata-only effect classification from allowed verified gates, with effect_allowed=1 separated from effect execution and runtime authority.</w:t>
-            </w:r>
-          </w:p>
-        </w:tc>
-      </w:tr>
-      <w:tr>
-        <w:tc>
-          <w:tcPr>
-            <w:tcW w:type="dxa" w:w="4997"/>
-          </w:tcPr>
-          <w:p>
-            <w:r>
-              <w:rPr>
-                <w:rFonts w:ascii="Liberation Sans" w:hAnsi="Liberation Sans"/>
-                <w:sz w:val="16"/>
-              </w:rPr>
-              <w:t>Seal runtime handoff evaluation/report</w:t>
-            </w:r>
-          </w:p>
-        </w:tc>
-        <w:tc>
-          <w:tcPr>
-            <w:tcW w:type="dxa" w:w="4997"/>
-          </w:tcPr>
-          <w:p>
-            <w:r>
-              <w:rPr>
-                <w:rFonts w:ascii="Liberation Sans" w:hAnsi="Liberation Sans"/>
-                <w:sz w:val="16"/>
-              </w:rPr>
-              <w:t>Metadata-only handoff eligibility and report-readiness classification, with handoff_eligible=1 and report_ready=1 separated from handoff execution, host behavior, network behavior, and authority.</w:t>
+              <w:t>Readiness flags remain separated from signing, object sealing, effect execution, host/network behavior, and runtime authority.</w:t>
             </w:r>
           </w:p>
         </w:tc>
@@ -20595,7 +21120,7 @@
         <w:pStyle w:val="ListNumber"/>
       </w:pPr>
       <w:r>
-        <w:t>For platform work, distinguish dry-run, installroot, disposable-VM, manual-host, and production-installer evidence before making any readiness claim.</w:t>
+        <w:t>For platform work, distinguish dry-run, installroot, disposable-VM, manual-host, and production-installer evidence.</w:t>
       </w:r>
     </w:p>
     <w:p>
@@ -20603,7 +21128,15 @@
         <w:pStyle w:val="ListNumber"/>
       </w:pPr>
       <w:r>
-        <w:t>For Seal work, follow the ladder through verified receipt promotion, verified capability gate, verified effect decision, handoff eligibility, and report readiness metadata; never skip from verification evidence to authority.</w:t>
+        <w:t>For Seal work, follow the ladder through verified receipt, gate, effect, handoff, report, envelope, and signature-request metadata; never skip from evidence to authority.</w:t>
+      </w:r>
+    </w:p>
+    <w:p>
+      <w:pPr>
+        <w:pStyle w:val="ListNumber"/>
+      </w:pPr>
+      <w:r>
+        <w:t>For Console work, distinguish contract-present metadata from adapter presence, payload materialization, signature requests, receipt writing, VM launch, OS-base behavior, and boot authority.</w:t>
       </w:r>
     </w:p>
     <w:sectPr>

</xml_diff>

<commit_message>
Add Nadia Stage-34 prompt evaluation result release contract
</commit_message>
<xml_diff>
--- a/docs/latticra-system-substrate/the-latticra-system-substrate.docx
+++ b/docs/latticra-system-substrate/the-latticra-system-substrate.docx
@@ -100,7 +100,7 @@
         <w:jc w:val="center"/>
       </w:pPr>
       <w:r>
-        <w:t>Working Draft 0.11 - 2026-05-26</w:t>
+        <w:t>Working Draft 0.12 - 2026-05-26</w:t>
       </w:r>
     </w:p>
     <w:p>
@@ -149,7 +149,7 @@
         <w:pStyle w:val="BodyTight"/>
       </w:pPr>
       <w:r>
-        <w:t>Source posture: this edition draws from the Seal handbook plus current Seal signed-request, request-freshness, verification-receipt, crypto-verify-backend, Ed25519 verify-only, verified-receipt-promotion, verified-capability-gate, verified-effect-decision, runtime-handoff-evaluation, runtime-handoff-report, report-envelope, signature-request, capability-gate, and effect-decision records; Latticra Console Stage-0 host-adapter, receipt-request, receipt-payload, signature-request-binding, OS-base, and VM-evidence contract surfaces; Panel/installer receipts; Fedora and macOS validation material; Lat/LIR, Nucleus, Nadia, runtime-boundary, kernel-lifecycle, and defensive threat-model notes; and the one-pass field engine research artifact.</w:t>
+        <w:t>Source posture: this edition draws from the Seal handbook plus current Seal signed-request, request-freshness, verification-receipt, crypto-verify-backend, Ed25519 verify-only, verified-receipt-promotion, verified-capability-gate, verified-effect-decision, runtime-handoff-evaluation, runtime-handoff-report, report-envelope, signature-request, capability-gate, and effect-decision records; Latticra Console Stage-0 host-adapter, receipt-request, receipt-payload, signature-request-binding, OS-base, and VM-evidence contract surfaces; Runtime Boundary Lat pipeline first-clause evidence propagation; Panel/installer receipts; Fedora and macOS validation material; Lat/LIR, Nucleus, Nadia, runtime-boundary, kernel-lifecycle, and defensive threat-model notes; and the one-pass field engine research artifact.</w:t>
       </w:r>
     </w:p>
     <w:p>
@@ -5205,6 +5205,38 @@
           </w:p>
         </w:tc>
       </w:tr>
+      <w:tr>
+        <w:tc>
+          <w:tcPr>
+            <w:tcW w:type="dxa" w:w="3331"/>
+          </w:tcPr>
+          <w:p>
+            <w:r>
+              <w:t>Runtime Boundary Lat clause evidence</w:t>
+            </w:r>
+          </w:p>
+        </w:tc>
+        <w:tc>
+          <w:tcPr>
+            <w:tcW w:type="dxa" w:w="3331"/>
+          </w:tcPr>
+          <w:p>
+            <w:r>
+              <w:t>Record-level propagation of the first lowered Lat clause node index, role, effect, name, operator, and value from pipeline evidence; no operator evaluation or runtime authority.</w:t>
+            </w:r>
+          </w:p>
+        </w:tc>
+        <w:tc>
+          <w:tcPr>
+            <w:tcW w:type="dxa" w:w="3331"/>
+          </w:tcPr>
+          <w:p>
+            <w:r>
+              <w:t>Say Runtime Boundary preserves clause provenance for review; do not say it evaluates Lat clauses, executes Lat/LIR, enforces policy, permits effects, or grants authority.</w:t>
+            </w:r>
+          </w:p>
+        </w:tc>
+      </w:tr>
     </w:tbl>
     <w:p>
       <w:pPr>
@@ -5727,6 +5759,25 @@
             <w:vAlign w:val="top"/>
           </w:tcPr>
           <w:p>
+            <w:r>
+              <w:t>Project tooling lane with grammar, semantic, model, lowering, pipeline, diagnostic, and clause-provenance evidence surfaces.</w:t>
+            </w:r>
+          </w:p>
+        </w:tc>
+      </w:tr>
+      <w:tr>
+        <w:tc>
+          <w:tcPr>
+            <w:tcW w:type="dxa" w:w="2088"/>
+            <w:tcMar>
+              <w:top w:w="60" w:type="dxa"/>
+              <w:start w:w="70" w:type="dxa"/>
+              <w:bottom w:w="60" w:type="dxa"/>
+              <w:end w:w="70" w:type="dxa"/>
+            </w:tcMar>
+            <w:vAlign w:val="top"/>
+          </w:tcPr>
+          <w:p>
             <w:pPr>
               <w:spacing w:after="0"/>
             </w:pPr>
@@ -5737,15 +5788,13 @@
                 <w:color w:val="0F172A"/>
                 <w:sz w:val="16"/>
               </w:rPr>
-              <w:t>Project tooling lane; details should be specified by contracts.</w:t>
-            </w:r>
-          </w:p>
-        </w:tc>
-      </w:tr>
-      <w:tr>
-        <w:tc>
-          <w:tcPr>
-            <w:tcW w:type="dxa" w:w="2088"/>
+              <w:t>LIR contracts</w:t>
+            </w:r>
+          </w:p>
+        </w:tc>
+        <w:tc>
+          <w:tcPr>
+            <w:tcW w:type="dxa" w:w="3240"/>
             <w:tcMar>
               <w:top w:w="60" w:type="dxa"/>
               <w:start w:w="70" w:type="dxa"/>
@@ -5765,13 +5814,13 @@
                 <w:color w:val="0F172A"/>
                 <w:sz w:val="16"/>
               </w:rPr>
-              <w:t>LIR contracts</w:t>
-            </w:r>
-          </w:p>
-        </w:tc>
-        <w:tc>
-          <w:tcPr>
-            <w:tcW w:type="dxa" w:w="3240"/>
+              <w:t>Installed contract docs and validation lanes</w:t>
+            </w:r>
+          </w:p>
+        </w:tc>
+        <w:tc>
+          <w:tcPr>
+            <w:tcW w:type="dxa" w:w="4536"/>
             <w:tcMar>
               <w:top w:w="60" w:type="dxa"/>
               <w:start w:w="70" w:type="dxa"/>
@@ -5781,43 +5830,8 @@
             <w:vAlign w:val="top"/>
           </w:tcPr>
           <w:p>
-            <w:pPr>
-              <w:spacing w:after="0"/>
-            </w:pPr>
-            <w:r/>
-            <w:r>
-              <w:rPr>
-                <w:rFonts w:ascii="Liberation Sans" w:hAnsi="Liberation Sans"/>
-                <w:color w:val="0F172A"/>
-                <w:sz w:val="16"/>
-              </w:rPr>
-              <w:t>Installed contract docs and validation lanes</w:t>
-            </w:r>
-          </w:p>
-        </w:tc>
-        <w:tc>
-          <w:tcPr>
-            <w:tcW w:type="dxa" w:w="4536"/>
-            <w:tcMar>
-              <w:top w:w="60" w:type="dxa"/>
-              <w:start w:w="70" w:type="dxa"/>
-              <w:bottom w:w="60" w:type="dxa"/>
-              <w:end w:w="70" w:type="dxa"/>
-            </w:tcMar>
-            <w:vAlign w:val="top"/>
-          </w:tcPr>
-          <w:p>
-            <w:pPr>
-              <w:spacing w:after="0"/>
-            </w:pPr>
-            <w:r/>
-            <w:r>
-              <w:rPr>
-                <w:rFonts w:ascii="Liberation Sans" w:hAnsi="Liberation Sans"/>
-                <w:color w:val="0F172A"/>
-                <w:sz w:val="16"/>
-              </w:rPr>
-              <w:t>Intermediate representation or contract surface; should remain test-driven.</w:t>
+            <w:r>
+              <w:t>Intermediate representation and lowering evidence surface; preserves clause metadata without execution.</w:t>
             </w:r>
           </w:p>
         </w:tc>
@@ -9147,7 +9161,7 @@
         <w:pStyle w:val="BodyTight"/>
       </w:pPr>
       <w:r>
-        <w:t>As of the May 25 notes, the Lat path is parser -&gt; semantic validation -&gt; normalized model -&gt; model-aware Lat-to-LIR lowering -&gt; pipeline and diagnostic reports. This gives the project a stronger internal story than a raw parser: declarations, clauses, transition sources, operators, and first-item report metadata can be inspected without evaluating the language.</w:t>
+        <w:t>As of the May 26 notes, the Lat path is parser -&gt; semantic validation -&gt; normalized model -&gt; model-aware Lat-to-LIR lowering -&gt; pipeline and diagnostic reports -&gt; Runtime Boundary evidence records. This gives the project a stronger internal story than a raw parser: declarations, clauses, transition sources, operators, first-item report metadata, and first-clause provenance can be inspected without evaluating the language.</w:t>
       </w:r>
     </w:p>
     <w:p>
@@ -9180,6 +9194,22 @@
       </w:pPr>
       <w:r>
         <w:t>Pipeline and diagnostic reports copy first declaration, first clause, lowering, and error-class metadata for deterministic audit visibility.</w:t>
+      </w:r>
+    </w:p>
+    <w:p>
+      <w:pPr>
+        <w:pStyle w:val="ListBullet"/>
+      </w:pPr>
+      <w:r>
+        <w:t>Runtime Boundary now carries the same first-clause provenance at record level: lat_pipeline_first_clause_node_index, role, effect, name, operator, and value. That is evidence propagation, not clause interpretation.</w:t>
+      </w:r>
+    </w:p>
+    <w:p>
+      <w:pPr>
+        <w:pStyle w:val="ListBullet"/>
+      </w:pPr>
+      <w:r>
+        <w:t>The first-clause effect label is an observed metadata label from the Lat pipeline, not permission to perform that effect.</w:t>
       </w:r>
     </w:p>
     <w:p>
@@ -13553,6 +13583,14 @@
         <w:pStyle w:val="ListBullet"/>
       </w:pPr>
       <w:r>
+        <w:t>Lat pipeline prerequisites now include richer provenance: module/count/stage evidence, first-declaration evidence, comment evidence, and record-level first-clause evidence can travel with Runtime Boundary classifications while the request remains denied or no-effect.</w:t>
+      </w:r>
+    </w:p>
+    <w:p>
+      <w:pPr>
+        <w:pStyle w:val="ListBullet"/>
+      </w:pPr>
+      <w:r>
         <w:t>Abuse-case fixtures now cover unknown requests, unknown effects, future-gated execution, operator-confirmation non-override, denial-reason reporting, authority failure, invalid LIR prerequisites, and blocked effects.</w:t>
       </w:r>
     </w:p>
@@ -16164,6 +16202,30 @@
       </w:pPr>
       <w:r>
         <w:t>The OS and VM planning contracts center contract_profile=lc-os-base-v0, contract_profile=lc-vm-evidence-v0, vm_evidence_required, vm_evidence_capture_enabled, vm_evidence_artifact_present, os_base_enabled, production_os_claim, read_only_host_inventory_receipt_required, receipt_required_before_os_base, receipt_required_before_vm_evidence, and promotion_gate. These fields reserve evidence obligations; they do not grant boot, hypervisor, disk-image, guest, host, network, or runtime authority.</w:t>
+      </w:r>
+    </w:p>
+    <w:p>
+      <w:pPr>
+        <w:pStyle w:val="Heading2"/>
+      </w:pPr>
+      <w:r>
+        <w:t>14.12 Lat clause evidence in Runtime Boundary records</w:t>
+      </w:r>
+    </w:p>
+    <w:p>
+      <w:pPr>
+        <w:pStyle w:val="BodyTight"/>
+      </w:pPr>
+      <w:r>
+        <w:t>Runtime Boundary Lat pipeline records should keep provenance fields separate from authority fields. The current first-clause record shape includes lat_pipeline_first_clause_node_index, lat_pipeline_first_clause_role, lat_pipeline_first_clause_effect, lat_pipeline_first_clause_name, lat_pipeline_first_clause_operator, and lat_pipeline_first_clause_value.</w:t>
+      </w:r>
+    </w:p>
+    <w:p>
+      <w:pPr>
+        <w:pStyle w:val="BodyTight"/>
+      </w:pPr>
+      <w:r>
+        <w:t>The schema rule is that role, effect, operator, and value are copied evidence. They do not mean the operator was evaluated, the clause was enforced, the effect was performed, LIR executed, file/network I/O occurred, or runtime_authority_granted changed from zero.</w:t>
       </w:r>
     </w:p>
     <w:p>
@@ -16880,6 +16942,38 @@
           </w:p>
         </w:tc>
       </w:tr>
+      <w:tr>
+        <w:tc>
+          <w:tcPr>
+            <w:tcW w:type="dxa" w:w="3331"/>
+          </w:tcPr>
+          <w:p>
+            <w:r>
+              <w:t>Lat pipeline and Runtime Boundary evidence</w:t>
+            </w:r>
+          </w:p>
+        </w:tc>
+        <w:tc>
+          <w:tcPr>
+            <w:tcW w:type="dxa" w:w="3331"/>
+          </w:tcPr>
+          <w:p>
+            <w:r>
+              <w:t>Validate Lat first-clause provenance through pipeline reports and Runtime Boundary records without changing authority.</w:t>
+            </w:r>
+          </w:p>
+        </w:tc>
+        <w:tc>
+          <w:tcPr>
+            <w:tcW w:type="dxa" w:w="3331"/>
+          </w:tcPr>
+          <w:p>
+            <w:r>
+              <w:t>Lat pipeline and Runtime Boundary transcripts with stable clause metadata and no-effect denial fields.</w:t>
+            </w:r>
+          </w:p>
+        </w:tc>
+      </w:tr>
     </w:tbl>
     <w:p>
       <w:pPr>
@@ -17327,6 +17421,30 @@
       </w:pPr>
       <w:r>
         <w:t>The no-effect assertions are the important part: command_registry_no_effect=1, host_process_launch_allowed=0, host_adapter_present=0, payload_artifact_present=0, seal_signature_request_present=0, receipt_write_allowed=0, vm_evidence_artifact_present=0, vm_launch_allowed=0, boot_allowed=0, production_os_claim=0, network_authority=0, and runtime_enforcement_authority=0.</w:t>
+      </w:r>
+    </w:p>
+    <w:p>
+      <w:pPr>
+        <w:pStyle w:val="Heading2"/>
+      </w:pPr>
+      <w:r>
+        <w:t>15.12 Lat pipeline and Runtime Boundary evidence validation</w:t>
+      </w:r>
+    </w:p>
+    <w:p>
+      <w:pPr>
+        <w:pStyle w:val="BodyTight"/>
+      </w:pPr>
+      <w:r>
+        <w:t>The Lat and Runtime Boundary validation lanes should prove that provenance survives without changing authority. Current evidence targets include sh scripts/test-lat-pipeline-report-refinement.sh, sh scripts/test-lat-pipeline.sh, and sh scripts/test-runtime-boundary.sh.</w:t>
+      </w:r>
+    </w:p>
+    <w:p>
+      <w:pPr>
+        <w:pStyle w:val="BodyTight"/>
+      </w:pPr>
+      <w:r>
+        <w:t>The important checks are field stability and non-effect preservation: first-clause role/effect/name/operator/value metadata may be copied, while operator evaluation, Lat execution, LIR execution, file I/O, network I/O, host mutation, hardware behavior, boot behavior, and runtime authority stay denied.</w:t>
       </w:r>
     </w:p>
     <w:p>
@@ -18128,6 +18246,38 @@
           </w:p>
         </w:tc>
       </w:tr>
+      <w:tr>
+        <w:tc>
+          <w:tcPr>
+            <w:tcW w:type="dxa" w:w="3331"/>
+          </w:tcPr>
+          <w:p>
+            <w:r>
+              <w:t>10. Lat provenance to runtime-boundary records</w:t>
+            </w:r>
+          </w:p>
+        </w:tc>
+        <w:tc>
+          <w:tcPr>
+            <w:tcW w:type="dxa" w:w="3331"/>
+          </w:tcPr>
+          <w:p>
+            <w:r>
+              <w:t>Keep language evidence inspectable before any runtime promotion.</w:t>
+            </w:r>
+          </w:p>
+        </w:tc>
+        <w:tc>
+          <w:tcPr>
+            <w:tcW w:type="dxa" w:w="3331"/>
+          </w:tcPr>
+          <w:p>
+            <w:r>
+              <w:t>First-clause, first-declaration, comment, stage, module, and count evidence remain stable across Lat pipeline and Runtime Boundary tests with no execution authority.</w:t>
+            </w:r>
+          </w:p>
+        </w:tc>
+      </w:tr>
     </w:tbl>
     <w:p>
       <w:pPr>
@@ -19587,6 +19737,50 @@
           </w:p>
         </w:tc>
       </w:tr>
+      <w:tr>
+        <w:tc>
+          <w:tcPr>
+            <w:tcW w:type="dxa" w:w="4997"/>
+          </w:tcPr>
+          <w:p>
+            <w:r>
+              <w:t>Clause evidence</w:t>
+            </w:r>
+          </w:p>
+        </w:tc>
+        <w:tc>
+          <w:tcPr>
+            <w:tcW w:type="dxa" w:w="4997"/>
+          </w:tcPr>
+          <w:p>
+            <w:r>
+              <w:t>Copied Lat clause metadata such as role, effect label, name, operator, value, and node index; useful for audit but not operator evaluation or authority.</w:t>
+            </w:r>
+          </w:p>
+        </w:tc>
+      </w:tr>
+      <w:tr>
+        <w:tc>
+          <w:tcPr>
+            <w:tcW w:type="dxa" w:w="4997"/>
+          </w:tcPr>
+          <w:p>
+            <w:r>
+              <w:t>Provenance field</w:t>
+            </w:r>
+          </w:p>
+        </w:tc>
+        <w:tc>
+          <w:tcPr>
+            <w:tcW w:type="dxa" w:w="4997"/>
+          </w:tcPr>
+          <w:p>
+            <w:r>
+              <w:t>A schema field that records where evidence came from or how it was classified without changing the allowed effect state.</w:t>
+            </w:r>
+          </w:p>
+        </w:tc>
+      </w:tr>
     </w:tbl>
     <w:p>
       <w:pPr>
@@ -20314,7 +20508,7 @@
         <w:pStyle w:val="BodyTight"/>
       </w:pPr>
       <w:r>
-        <w:t>A strong public sentence: "Latticra is an early, local, evidence-bound substrate for report-only verification, policy regression, manifest/hash baselines, authority-neutral Ed25519 verification evidence, metadata-only Seal gate/effect/handoff/report/envelope/signature-request classification, metadata-only Console host/receipt/OS/VM contract surfaces, guarded user-local installation, and future runtime-boundary research."</w:t>
+        <w:t>A strong public sentence: "Latticra is an early, local, evidence-bound substrate for report-only verification, policy regression, manifest/hash baselines, authority-neutral Ed25519 verification evidence, metadata-only Seal gate/effect/handoff/report/envelope/signature-request classification, metadata-only Console host/receipt/OS/VM contract surfaces, Lat/LIR provenance records, guarded user-local installation, and future runtime-boundary research."</w:t>
       </w:r>
     </w:p>
     <w:p>
@@ -20355,7 +20549,7 @@
         <w:pStyle w:val="BodyTight"/>
       </w:pPr>
       <w:r>
-        <w:t>This edition was derived from the Latticra Seal handbook and recent repository material covering signed-request, freshness, verification, Seal metadata ladder extensions through signature request, Console host-adapter/receipt-request/payload/signature/OS/VM contract surfaces, installer, Panel, Nucleus, Nadia, macOS, Fedora/RPM, Lat/LIR, and one-pass field-engine evidence. It distinguishes implemented facts from inferred substrate architecture and preserves project non-claims.</w:t>
+        <w:t>This edition was derived from the Latticra Seal handbook and recent repository material covering signed-request, freshness, verification, Seal metadata ladder extensions through signature request, Console host-adapter/receipt-request/payload/signature/OS/VM contract surfaces, Runtime Boundary Lat pipeline first-clause evidence propagation, installer, Panel, Nucleus, Nadia, macOS, Fedora/RPM, Lat/LIR, and one-pass field-engine evidence. It distinguishes implemented facts from inferred substrate architecture and preserves project non-claims.</w:t>
       </w:r>
     </w:p>
     <w:tbl>
@@ -21010,6 +21204,28 @@
           </w:p>
         </w:tc>
       </w:tr>
+      <w:tr>
+        <w:tc>
+          <w:tcPr>
+            <w:tcW w:type="dxa" w:w="4997"/>
+          </w:tcPr>
+          <w:p>
+            <w:r>
+              <w:t>Runtime Boundary Lat clause evidence</w:t>
+            </w:r>
+          </w:p>
+        </w:tc>
+        <w:tc>
+          <w:tcPr>
+            <w:tcW w:type="dxa" w:w="4997"/>
+          </w:tcPr>
+          <w:p>
+            <w:r>
+              <w:t>Record-level propagation of first lowered clause node, role, effect, name, operator, and value while preserving no-effect runtime posture.</w:t>
+            </w:r>
+          </w:p>
+        </w:tc>
+      </w:tr>
     </w:tbl>
     <w:p>
       <w:pPr>
@@ -21137,6 +21353,14 @@
       </w:pPr>
       <w:r>
         <w:t>For Console work, distinguish contract-present metadata from adapter presence, payload materialization, signature requests, receipt writing, VM launch, OS-base behavior, and boot authority.</w:t>
+      </w:r>
+    </w:p>
+    <w:p>
+      <w:pPr>
+        <w:pStyle w:val="ListNumber"/>
+      </w:pPr>
+      <w:r>
+        <w:t>For Lat/LIR work, distinguish provenance fields from language execution: copied clause operators and effect labels are evidence, not evaluated predicates or permissions.</w:t>
       </w:r>
     </w:p>
     <w:sectPr>

</xml_diff>

<commit_message>
Add openSUSE integration and maintenance lane
</commit_message>
<xml_diff>
--- a/docs/latticra-system-substrate/the-latticra-system-substrate.docx
+++ b/docs/latticra-system-substrate/the-latticra-system-substrate.docx
@@ -67,6 +67,10 @@
         <w:gridCol w:w="9994"/>
       </w:tblGrid>
       <w:tr>
+        <w:trPr>
+          <w:tblHeader/>
+          <w:cantSplit/>
+        </w:trPr>
         <w:tc>
           <w:tcPr>
             <w:tcW w:type="dxa" w:w="9994"/>
@@ -100,7 +104,7 @@
         <w:jc w:val="center"/>
       </w:pPr>
       <w:r>
-        <w:t>Working Draft 0.12 - 2026-05-26</w:t>
+        <w:t>Working Draft 0.13 - 2026-05-26</w:t>
       </w:r>
     </w:p>
     <w:p>
@@ -149,7 +153,7 @@
         <w:pStyle w:val="BodyTight"/>
       </w:pPr>
       <w:r>
-        <w:t>Source posture: this edition draws from the Seal handbook plus current Seal signed-request, request-freshness, verification-receipt, crypto-verify-backend, Ed25519 verify-only, verified-receipt-promotion, verified-capability-gate, verified-effect-decision, runtime-handoff-evaluation, runtime-handoff-report, report-envelope, signature-request, capability-gate, and effect-decision records; Latticra Console Stage-0 host-adapter, receipt-request, receipt-payload, signature-request-binding, OS-base, and VM-evidence contract surfaces; Runtime Boundary Lat pipeline first-clause evidence propagation; Panel/installer receipts; Fedora and macOS validation material; Lat/LIR, Nucleus, Nadia, runtime-boundary, kernel-lifecycle, and defensive threat-model notes; and the one-pass field engine research artifact.</w:t>
+        <w:t>Source posture: this edition draws from the Seal handbook plus current Seal signed-request, request-freshness, verification-receipt, crypto-verify-backend, Ed25519 verify-only, verified-receipt-promotion, verified-capability-gate, verified-effect-decision, runtime-handoff-evaluation, runtime-handoff-report, report-envelope, signature-request, signing-authorization, signer-handoff, signer-invocation, signing-operation, capability-gate, and effect-decision records; Latticra Console Stage-0 host-adapter, receipt-request, receipt-payload, signature-request-binding, OS-base, and VM-evidence contract surfaces; Runtime Boundary Lat pipeline first-clause evidence propagation; Panel/installer receipts; Fedora and macOS validation material; Lat/LIR, Nucleus, Nadia, runtime-boundary, kernel-lifecycle, and defensive threat-model notes; and the one-pass field engine research artifact.</w:t>
       </w:r>
     </w:p>
     <w:p>
@@ -199,6 +203,10 @@
         <w:gridCol w:w="4997"/>
       </w:tblGrid>
       <w:tr>
+        <w:trPr>
+          <w:tblHeader/>
+          <w:cantSplit/>
+        </w:trPr>
         <w:tc>
           <w:tcPr>
             <w:tcW w:type="dxa" w:w="1728"/>
@@ -251,6 +259,9 @@
         </w:tc>
       </w:tr>
       <w:tr>
+        <w:trPr>
+          <w:cantSplit/>
+        </w:trPr>
         <w:tc>
           <w:tcPr>
             <w:tcW w:type="dxa" w:w="1728"/>
@@ -305,6 +316,9 @@
         </w:tc>
       </w:tr>
       <w:tr>
+        <w:trPr>
+          <w:cantSplit/>
+        </w:trPr>
         <w:tc>
           <w:tcPr>
             <w:tcW w:type="dxa" w:w="1728"/>
@@ -359,6 +373,9 @@
         </w:tc>
       </w:tr>
       <w:tr>
+        <w:trPr>
+          <w:cantSplit/>
+        </w:trPr>
         <w:tc>
           <w:tcPr>
             <w:tcW w:type="dxa" w:w="1728"/>
@@ -413,6 +430,9 @@
         </w:tc>
       </w:tr>
       <w:tr>
+        <w:trPr>
+          <w:cantSplit/>
+        </w:trPr>
         <w:tc>
           <w:tcPr>
             <w:tcW w:type="dxa" w:w="1728"/>
@@ -467,6 +487,9 @@
         </w:tc>
       </w:tr>
       <w:tr>
+        <w:trPr>
+          <w:cantSplit/>
+        </w:trPr>
         <w:tc>
           <w:tcPr>
             <w:tcW w:type="dxa" w:w="1728"/>
@@ -521,6 +544,9 @@
         </w:tc>
       </w:tr>
       <w:tr>
+        <w:trPr>
+          <w:cantSplit/>
+        </w:trPr>
         <w:tc>
           <w:tcPr>
             <w:tcW w:type="dxa" w:w="1728"/>
@@ -575,6 +601,9 @@
         </w:tc>
       </w:tr>
       <w:tr>
+        <w:trPr>
+          <w:cantSplit/>
+        </w:trPr>
         <w:tc>
           <w:tcPr>
             <w:tcW w:type="dxa" w:w="1728"/>
@@ -629,6 +658,9 @@
         </w:tc>
       </w:tr>
       <w:tr>
+        <w:trPr>
+          <w:cantSplit/>
+        </w:trPr>
         <w:tc>
           <w:tcPr>
             <w:tcW w:type="dxa" w:w="1728"/>
@@ -683,6 +715,9 @@
         </w:tc>
       </w:tr>
       <w:tr>
+        <w:trPr>
+          <w:cantSplit/>
+        </w:trPr>
         <w:tc>
           <w:tcPr>
             <w:tcW w:type="dxa" w:w="1728"/>
@@ -737,6 +772,9 @@
         </w:tc>
       </w:tr>
       <w:tr>
+        <w:trPr>
+          <w:cantSplit/>
+        </w:trPr>
         <w:tc>
           <w:tcPr>
             <w:tcW w:type="dxa" w:w="1728"/>
@@ -791,6 +829,9 @@
         </w:tc>
       </w:tr>
       <w:tr>
+        <w:trPr>
+          <w:cantSplit/>
+        </w:trPr>
         <w:tc>
           <w:tcPr>
             <w:tcW w:type="dxa" w:w="1728"/>
@@ -845,6 +886,9 @@
         </w:tc>
       </w:tr>
       <w:tr>
+        <w:trPr>
+          <w:cantSplit/>
+        </w:trPr>
         <w:tc>
           <w:tcPr>
             <w:tcW w:type="dxa" w:w="1728"/>
@@ -899,6 +943,9 @@
         </w:tc>
       </w:tr>
       <w:tr>
+        <w:trPr>
+          <w:cantSplit/>
+        </w:trPr>
         <w:tc>
           <w:tcPr>
             <w:tcW w:type="dxa" w:w="1728"/>
@@ -953,6 +1000,9 @@
         </w:tc>
       </w:tr>
       <w:tr>
+        <w:trPr>
+          <w:cantSplit/>
+        </w:trPr>
         <w:tc>
           <w:tcPr>
             <w:tcW w:type="dxa" w:w="1728"/>
@@ -1007,6 +1057,9 @@
         </w:tc>
       </w:tr>
       <w:tr>
+        <w:trPr>
+          <w:cantSplit/>
+        </w:trPr>
         <w:tc>
           <w:tcPr>
             <w:tcW w:type="dxa" w:w="1728"/>
@@ -1061,6 +1114,9 @@
         </w:tc>
       </w:tr>
       <w:tr>
+        <w:trPr>
+          <w:cantSplit/>
+        </w:trPr>
         <w:tc>
           <w:tcPr>
             <w:tcW w:type="dxa" w:w="1728"/>
@@ -1115,6 +1171,9 @@
         </w:tc>
       </w:tr>
       <w:tr>
+        <w:trPr>
+          <w:cantSplit/>
+        </w:trPr>
         <w:tc>
           <w:tcPr>
             <w:tcW w:type="dxa" w:w="1728"/>
@@ -1169,6 +1228,9 @@
         </w:tc>
       </w:tr>
       <w:tr>
+        <w:trPr>
+          <w:cantSplit/>
+        </w:trPr>
         <w:tc>
           <w:tcPr>
             <w:tcW w:type="dxa" w:w="1728"/>
@@ -1223,6 +1285,9 @@
         </w:tc>
       </w:tr>
       <w:tr>
+        <w:trPr>
+          <w:cantSplit/>
+        </w:trPr>
         <w:tc>
           <w:tcPr>
             <w:tcW w:type="dxa" w:w="1728"/>
@@ -1277,6 +1342,9 @@
         </w:tc>
       </w:tr>
       <w:tr>
+        <w:trPr>
+          <w:cantSplit/>
+        </w:trPr>
         <w:tc>
           <w:tcPr>
             <w:tcW w:type="dxa" w:w="1728"/>
@@ -1331,6 +1399,9 @@
         </w:tc>
       </w:tr>
       <w:tr>
+        <w:trPr>
+          <w:cantSplit/>
+        </w:trPr>
         <w:tc>
           <w:tcPr>
             <w:tcW w:type="dxa" w:w="1728"/>
@@ -1608,6 +1679,10 @@
         <w:gridCol w:w="9994"/>
       </w:tblGrid>
       <w:tr>
+        <w:trPr>
+          <w:tblHeader/>
+          <w:cantSplit/>
+        </w:trPr>
         <w:tc>
           <w:tcPr>
             <w:tcW w:type="dxa" w:w="9994"/>
@@ -1777,6 +1852,10 @@
         <w:gridCol w:w="3331"/>
       </w:tblGrid>
       <w:tr>
+        <w:trPr>
+          <w:tblHeader/>
+          <w:cantSplit/>
+        </w:trPr>
         <w:tc>
           <w:tcPr>
             <w:tcW w:type="dxa" w:w="1872"/>
@@ -1854,6 +1933,9 @@
         </w:tc>
       </w:tr>
       <w:tr>
+        <w:trPr>
+          <w:cantSplit/>
+        </w:trPr>
         <w:tc>
           <w:tcPr>
             <w:tcW w:type="dxa" w:w="1872"/>
@@ -1934,6 +2016,9 @@
         </w:tc>
       </w:tr>
       <w:tr>
+        <w:trPr>
+          <w:cantSplit/>
+        </w:trPr>
         <w:tc>
           <w:tcPr>
             <w:tcW w:type="dxa" w:w="1872"/>
@@ -2014,6 +2099,9 @@
         </w:tc>
       </w:tr>
       <w:tr>
+        <w:trPr>
+          <w:cantSplit/>
+        </w:trPr>
         <w:tc>
           <w:tcPr>
             <w:tcW w:type="dxa" w:w="1872"/>
@@ -2094,6 +2182,9 @@
         </w:tc>
       </w:tr>
       <w:tr>
+        <w:trPr>
+          <w:cantSplit/>
+        </w:trPr>
         <w:tc>
           <w:tcPr>
             <w:tcW w:type="dxa" w:w="1872"/>
@@ -2174,6 +2265,9 @@
         </w:tc>
       </w:tr>
       <w:tr>
+        <w:trPr>
+          <w:cantSplit/>
+        </w:trPr>
         <w:tc>
           <w:tcPr>
             <w:tcW w:type="dxa" w:w="1872"/>
@@ -2254,6 +2348,9 @@
         </w:tc>
       </w:tr>
       <w:tr>
+        <w:trPr>
+          <w:cantSplit/>
+        </w:trPr>
         <w:tc>
           <w:tcPr>
             <w:tcW w:type="dxa" w:w="1872"/>
@@ -2334,6 +2431,9 @@
         </w:tc>
       </w:tr>
       <w:tr>
+        <w:trPr>
+          <w:cantSplit/>
+        </w:trPr>
         <w:tc>
           <w:tcPr>
             <w:tcW w:type="dxa" w:w="1872"/>
@@ -2465,6 +2565,10 @@
         <w:gridCol w:w="3331"/>
       </w:tblGrid>
       <w:tr>
+        <w:trPr>
+          <w:tblHeader/>
+          <w:cantSplit/>
+        </w:trPr>
         <w:tc>
           <w:tcPr>
             <w:tcW w:type="dxa" w:w="2088"/>
@@ -2542,6 +2646,9 @@
         </w:tc>
       </w:tr>
       <w:tr>
+        <w:trPr>
+          <w:cantSplit/>
+        </w:trPr>
         <w:tc>
           <w:tcPr>
             <w:tcW w:type="dxa" w:w="2088"/>
@@ -2622,6 +2729,9 @@
         </w:tc>
       </w:tr>
       <w:tr>
+        <w:trPr>
+          <w:cantSplit/>
+        </w:trPr>
         <w:tc>
           <w:tcPr>
             <w:tcW w:type="dxa" w:w="2088"/>
@@ -2702,6 +2812,9 @@
         </w:tc>
       </w:tr>
       <w:tr>
+        <w:trPr>
+          <w:cantSplit/>
+        </w:trPr>
         <w:tc>
           <w:tcPr>
             <w:tcW w:type="dxa" w:w="2088"/>
@@ -2782,6 +2895,9 @@
         </w:tc>
       </w:tr>
       <w:tr>
+        <w:trPr>
+          <w:cantSplit/>
+        </w:trPr>
         <w:tc>
           <w:tcPr>
             <w:tcW w:type="dxa" w:w="2088"/>
@@ -2862,6 +2978,9 @@
         </w:tc>
       </w:tr>
       <w:tr>
+        <w:trPr>
+          <w:cantSplit/>
+        </w:trPr>
         <w:tc>
           <w:tcPr>
             <w:tcW w:type="dxa" w:w="2088"/>
@@ -2942,6 +3061,9 @@
         </w:tc>
       </w:tr>
       <w:tr>
+        <w:trPr>
+          <w:cantSplit/>
+        </w:trPr>
         <w:tc>
           <w:tcPr>
             <w:tcW w:type="dxa" w:w="2088"/>
@@ -3022,6 +3144,9 @@
         </w:tc>
       </w:tr>
       <w:tr>
+        <w:trPr>
+          <w:cantSplit/>
+        </w:trPr>
         <w:tc>
           <w:tcPr>
             <w:tcW w:type="dxa" w:w="2088"/>
@@ -3175,6 +3300,10 @@
         <w:gridCol w:w="3331"/>
       </w:tblGrid>
       <w:tr>
+        <w:trPr>
+          <w:tblHeader/>
+          <w:cantSplit/>
+        </w:trPr>
         <w:tc>
           <w:tcPr>
             <w:tcW w:type="dxa" w:w="2592"/>
@@ -3252,6 +3381,9 @@
         </w:tc>
       </w:tr>
       <w:tr>
+        <w:trPr>
+          <w:cantSplit/>
+        </w:trPr>
         <w:tc>
           <w:tcPr>
             <w:tcW w:type="dxa" w:w="2592"/>
@@ -3347,6 +3479,9 @@
         </w:tc>
       </w:tr>
       <w:tr>
+        <w:trPr>
+          <w:cantSplit/>
+        </w:trPr>
         <w:tc>
           <w:tcPr>
             <w:tcW w:type="dxa" w:w="2592"/>
@@ -3442,6 +3577,9 @@
         </w:tc>
       </w:tr>
       <w:tr>
+        <w:trPr>
+          <w:cantSplit/>
+        </w:trPr>
         <w:tc>
           <w:tcPr>
             <w:tcW w:type="dxa" w:w="2592"/>
@@ -3537,6 +3675,9 @@
         </w:tc>
       </w:tr>
       <w:tr>
+        <w:trPr>
+          <w:cantSplit/>
+        </w:trPr>
         <w:tc>
           <w:tcPr>
             <w:tcW w:type="dxa" w:w="2592"/>
@@ -3632,6 +3773,9 @@
         </w:tc>
       </w:tr>
       <w:tr>
+        <w:trPr>
+          <w:cantSplit/>
+        </w:trPr>
         <w:tc>
           <w:tcPr>
             <w:tcW w:type="dxa" w:w="2592"/>
@@ -3727,6 +3871,9 @@
         </w:tc>
       </w:tr>
       <w:tr>
+        <w:trPr>
+          <w:cantSplit/>
+        </w:trPr>
         <w:tc>
           <w:tcPr>
             <w:tcW w:type="dxa" w:w="2592"/>
@@ -3822,6 +3969,9 @@
         </w:tc>
       </w:tr>
       <w:tr>
+        <w:trPr>
+          <w:cantSplit/>
+        </w:trPr>
         <w:tc>
           <w:tcPr>
             <w:tcW w:type="dxa" w:w="2592"/>
@@ -3917,6 +4067,9 @@
         </w:tc>
       </w:tr>
       <w:tr>
+        <w:trPr>
+          <w:cantSplit/>
+        </w:trPr>
         <w:tc>
           <w:tcPr>
             <w:tcW w:type="dxa" w:w="2592"/>
@@ -4012,6 +4165,9 @@
         </w:tc>
       </w:tr>
       <w:tr>
+        <w:trPr>
+          <w:cantSplit/>
+        </w:trPr>
         <w:tc>
           <w:tcPr>
             <w:tcW w:type="dxa" w:w="2592"/>
@@ -4107,6 +4263,9 @@
         </w:tc>
       </w:tr>
       <w:tr>
+        <w:trPr>
+          <w:cantSplit/>
+        </w:trPr>
         <w:tc>
           <w:tcPr>
             <w:tcW w:type="dxa" w:w="2592"/>
@@ -4202,6 +4361,9 @@
         </w:tc>
       </w:tr>
       <w:tr>
+        <w:trPr>
+          <w:cantSplit/>
+        </w:trPr>
         <w:tc>
           <w:tcPr>
             <w:tcW w:type="dxa" w:w="2592"/>
@@ -4276,6 +4438,9 @@
         </w:tc>
       </w:tr>
       <w:tr>
+        <w:trPr>
+          <w:cantSplit/>
+        </w:trPr>
         <w:tc>
           <w:tcPr>
             <w:tcW w:type="dxa" w:w="2592"/>
@@ -4350,6 +4515,9 @@
         </w:tc>
       </w:tr>
       <w:tr>
+        <w:trPr>
+          <w:cantSplit/>
+        </w:trPr>
         <w:tc>
           <w:tcPr>
             <w:tcW w:type="dxa" w:w="2592"/>
@@ -4424,6 +4592,9 @@
         </w:tc>
       </w:tr>
       <w:tr>
+        <w:trPr>
+          <w:cantSplit/>
+        </w:trPr>
         <w:tc>
           <w:tcPr>
             <w:tcW w:type="dxa" w:w="2592"/>
@@ -4498,6 +4669,9 @@
         </w:tc>
       </w:tr>
       <w:tr>
+        <w:trPr>
+          <w:cantSplit/>
+        </w:trPr>
         <w:tc>
           <w:tcPr>
             <w:tcW w:type="dxa" w:w="2592"/>
@@ -4572,6 +4746,9 @@
         </w:tc>
       </w:tr>
       <w:tr>
+        <w:trPr>
+          <w:cantSplit/>
+        </w:trPr>
         <w:tc>
           <w:tcPr>
             <w:tcW w:type="dxa" w:w="3331"/>
@@ -4625,6 +4802,9 @@
         </w:tc>
       </w:tr>
       <w:tr>
+        <w:trPr>
+          <w:cantSplit/>
+        </w:trPr>
         <w:tc>
           <w:tcPr>
             <w:tcW w:type="dxa" w:w="3331"/>
@@ -4678,6 +4858,9 @@
         </w:tc>
       </w:tr>
       <w:tr>
+        <w:trPr>
+          <w:cantSplit/>
+        </w:trPr>
         <w:tc>
           <w:tcPr>
             <w:tcW w:type="dxa" w:w="3331"/>
@@ -4731,6 +4914,9 @@
         </w:tc>
       </w:tr>
       <w:tr>
+        <w:trPr>
+          <w:cantSplit/>
+        </w:trPr>
         <w:tc>
           <w:tcPr>
             <w:tcW w:type="dxa" w:w="3331"/>
@@ -4784,6 +4970,9 @@
         </w:tc>
       </w:tr>
       <w:tr>
+        <w:trPr>
+          <w:cantSplit/>
+        </w:trPr>
         <w:tc>
           <w:tcPr>
             <w:tcW w:type="dxa" w:w="3331"/>
@@ -4837,6 +5026,9 @@
         </w:tc>
       </w:tr>
       <w:tr>
+        <w:trPr>
+          <w:cantSplit/>
+        </w:trPr>
         <w:tc>
           <w:tcPr>
             <w:tcW w:type="dxa" w:w="3331"/>
@@ -4890,6 +5082,9 @@
         </w:tc>
       </w:tr>
       <w:tr>
+        <w:trPr>
+          <w:cantSplit/>
+        </w:trPr>
         <w:tc>
           <w:tcPr>
             <w:tcW w:type="dxa" w:w="3331"/>
@@ -4934,6 +5129,9 @@
         </w:tc>
       </w:tr>
       <w:tr>
+        <w:trPr>
+          <w:cantSplit/>
+        </w:trPr>
         <w:tc>
           <w:tcPr>
             <w:tcW w:type="dxa" w:w="3331"/>
@@ -4978,6 +5176,9 @@
         </w:tc>
       </w:tr>
       <w:tr>
+        <w:trPr>
+          <w:cantSplit/>
+        </w:trPr>
         <w:tc>
           <w:tcPr>
             <w:tcW w:type="dxa" w:w="3331"/>
@@ -5022,6 +5223,9 @@
         </w:tc>
       </w:tr>
       <w:tr>
+        <w:trPr>
+          <w:cantSplit/>
+        </w:trPr>
         <w:tc>
           <w:tcPr>
             <w:tcW w:type="dxa" w:w="3331"/>
@@ -5066,6 +5270,9 @@
         </w:tc>
       </w:tr>
       <w:tr>
+        <w:trPr>
+          <w:cantSplit/>
+        </w:trPr>
         <w:tc>
           <w:tcPr>
             <w:tcW w:type="dxa" w:w="3331"/>
@@ -5110,6 +5317,9 @@
         </w:tc>
       </w:tr>
       <w:tr>
+        <w:trPr>
+          <w:cantSplit/>
+        </w:trPr>
         <w:tc>
           <w:tcPr>
             <w:tcW w:type="dxa" w:w="3331"/>
@@ -5142,6 +5352,9 @@
         </w:tc>
       </w:tr>
       <w:tr>
+        <w:trPr>
+          <w:cantSplit/>
+        </w:trPr>
         <w:tc>
           <w:tcPr>
             <w:tcW w:type="dxa" w:w="3331"/>
@@ -5174,6 +5387,9 @@
         </w:tc>
       </w:tr>
       <w:tr>
+        <w:trPr>
+          <w:cantSplit/>
+        </w:trPr>
         <w:tc>
           <w:tcPr>
             <w:tcW w:type="dxa" w:w="3331"/>
@@ -5206,6 +5422,9 @@
         </w:tc>
       </w:tr>
       <w:tr>
+        <w:trPr>
+          <w:cantSplit/>
+        </w:trPr>
         <w:tc>
           <w:tcPr>
             <w:tcW w:type="dxa" w:w="3331"/>
@@ -5233,6 +5452,41 @@
           <w:p>
             <w:r>
               <w:t>Say Runtime Boundary preserves clause provenance for review; do not say it evaluates Lat clauses, executes Lat/LIR, enforces policy, permits effects, or grants authority.</w:t>
+            </w:r>
+          </w:p>
+        </w:tc>
+      </w:tr>
+      <w:tr>
+        <w:trPr>
+          <w:cantSplit/>
+        </w:trPr>
+        <w:tc>
+          <w:tcPr>
+            <w:tcW w:type="dxa" w:w="3331"/>
+          </w:tcPr>
+          <w:p>
+            <w:r>
+              <w:t>Seal signing operation metadata</w:t>
+            </w:r>
+          </w:p>
+        </w:tc>
+        <w:tc>
+          <w:tcPr>
+            <w:tcW w:type="dxa" w:w="3331"/>
+          </w:tcPr>
+          <w:p>
+            <w:r>
+              <w:t>Status-guarded metadata checkpoint after signer invocation; signing_operation_ready=1 with signature_performed=0, signer_invoked=0, private_key_handling=0, and runtime_authority_granted=0.</w:t>
+            </w:r>
+          </w:p>
+        </w:tc>
+        <w:tc>
+          <w:tcPr>
+            <w:tcW w:type="dxa" w:w="3331"/>
+          </w:tcPr>
+          <w:p>
+            <w:r>
+              <w:t>Say signing-operation path classification is guarded; do not say Seal signs, invokes a signer, handles keys, verifies signatures, or grants authority.</w:t>
             </w:r>
           </w:p>
         </w:tc>
@@ -5308,6 +5562,10 @@
         <w:gridCol w:w="9994"/>
       </w:tblGrid>
       <w:tr>
+        <w:trPr>
+          <w:tblHeader/>
+          <w:cantSplit/>
+        </w:trPr>
         <w:tc>
           <w:tcPr>
             <w:tcW w:type="dxa" w:w="9994"/>
@@ -5458,6 +5716,10 @@
         <w:gridCol w:w="3331"/>
       </w:tblGrid>
       <w:tr>
+        <w:trPr>
+          <w:tblHeader/>
+          <w:cantSplit/>
+        </w:trPr>
         <w:tc>
           <w:tcPr>
             <w:tcW w:type="dxa" w:w="2088"/>
@@ -5535,6 +5797,9 @@
         </w:tc>
       </w:tr>
       <w:tr>
+        <w:trPr>
+          <w:cantSplit/>
+        </w:trPr>
         <w:tc>
           <w:tcPr>
             <w:tcW w:type="dxa" w:w="2088"/>
@@ -5615,6 +5880,9 @@
         </w:tc>
       </w:tr>
       <w:tr>
+        <w:trPr>
+          <w:cantSplit/>
+        </w:trPr>
         <w:tc>
           <w:tcPr>
             <w:tcW w:type="dxa" w:w="2088"/>
@@ -5695,6 +5963,9 @@
         </w:tc>
       </w:tr>
       <w:tr>
+        <w:trPr>
+          <w:cantSplit/>
+        </w:trPr>
         <w:tc>
           <w:tcPr>
             <w:tcW w:type="dxa" w:w="2088"/>
@@ -5766,6 +6037,9 @@
         </w:tc>
       </w:tr>
       <w:tr>
+        <w:trPr>
+          <w:cantSplit/>
+        </w:trPr>
         <w:tc>
           <w:tcPr>
             <w:tcW w:type="dxa" w:w="2088"/>
@@ -5837,6 +6111,9 @@
         </w:tc>
       </w:tr>
       <w:tr>
+        <w:trPr>
+          <w:cantSplit/>
+        </w:trPr>
         <w:tc>
           <w:tcPr>
             <w:tcW w:type="dxa" w:w="2088"/>
@@ -5917,6 +6194,9 @@
         </w:tc>
       </w:tr>
       <w:tr>
+        <w:trPr>
+          <w:cantSplit/>
+        </w:trPr>
         <w:tc>
           <w:tcPr>
             <w:tcW w:type="dxa" w:w="2088"/>
@@ -5997,6 +6277,9 @@
         </w:tc>
       </w:tr>
       <w:tr>
+        <w:trPr>
+          <w:cantSplit/>
+        </w:trPr>
         <w:tc>
           <w:tcPr>
             <w:tcW w:type="dxa" w:w="2088"/>
@@ -6077,6 +6360,9 @@
         </w:tc>
       </w:tr>
       <w:tr>
+        <w:trPr>
+          <w:cantSplit/>
+        </w:trPr>
         <w:tc>
           <w:tcPr>
             <w:tcW w:type="dxa" w:w="2088"/>
@@ -6157,6 +6443,9 @@
         </w:tc>
       </w:tr>
       <w:tr>
+        <w:trPr>
+          <w:cantSplit/>
+        </w:trPr>
         <w:tc>
           <w:tcPr>
             <w:tcW w:type="dxa" w:w="3331"/>
@@ -6194,6 +6483,9 @@
         </w:tc>
       </w:tr>
       <w:tr>
+        <w:trPr>
+          <w:cantSplit/>
+        </w:trPr>
         <w:tc>
           <w:tcPr>
             <w:tcW w:type="dxa" w:w="3331"/>
@@ -6241,6 +6533,9 @@
         </w:tc>
       </w:tr>
       <w:tr>
+        <w:trPr>
+          <w:cantSplit/>
+        </w:trPr>
         <w:tc>
           <w:tcPr>
             <w:tcW w:type="dxa" w:w="3331"/>
@@ -6288,6 +6583,9 @@
         </w:tc>
       </w:tr>
       <w:tr>
+        <w:trPr>
+          <w:cantSplit/>
+        </w:trPr>
         <w:tc>
           <w:tcPr>
             <w:tcW w:type="dxa" w:w="3331"/>
@@ -6372,6 +6670,10 @@
         <w:gridCol w:w="9994"/>
       </w:tblGrid>
       <w:tr>
+        <w:trPr>
+          <w:tblHeader/>
+          <w:cantSplit/>
+        </w:trPr>
         <w:tc>
           <w:tcPr>
             <w:tcW w:type="dxa" w:w="9994"/>
@@ -6783,6 +7085,10 @@
         <w:gridCol w:w="9994"/>
       </w:tblGrid>
       <w:tr>
+        <w:trPr>
+          <w:tblHeader/>
+          <w:cantSplit/>
+        </w:trPr>
         <w:tc>
           <w:tcPr>
             <w:tcW w:type="dxa" w:w="9994"/>
@@ -6908,6 +7214,10 @@
         <w:gridCol w:w="9994"/>
       </w:tblGrid>
       <w:tr>
+        <w:trPr>
+          <w:tblHeader/>
+          <w:cantSplit/>
+        </w:trPr>
         <w:tc>
           <w:tcPr>
             <w:tcW w:type="dxa" w:w="9994"/>
@@ -7170,6 +7480,10 @@
         <w:gridCol w:w="9994"/>
       </w:tblGrid>
       <w:tr>
+        <w:trPr>
+          <w:tblHeader/>
+          <w:cantSplit/>
+        </w:trPr>
         <w:tc>
           <w:tcPr>
             <w:tcW w:type="dxa" w:w="9994"/>
@@ -7347,6 +7661,10 @@
         <w:gridCol w:w="9994"/>
       </w:tblGrid>
       <w:tr>
+        <w:trPr>
+          <w:tblHeader/>
+          <w:cantSplit/>
+        </w:trPr>
         <w:tc>
           <w:tcPr>
             <w:tcW w:type="dxa" w:w="9994"/>
@@ -7735,6 +8053,30 @@
       </w:pPr>
       <w:r>
         <w:t>The signature request layer consumes ready report-envelope metadata and classifies an Ed25519-development request label as signature_request_state=requested-metadata-only with signature_request_ready=1. It is request classification, not signing or verification. It must preserve signature_performed=0, verification_performed=0, private_key_handling=0, handoff_performed=0, effect_performed=0, runtime_authority_granted=0, host_read_performed=0, host_write_performed=0, and network_performed=0.</w:t>
+      </w:r>
+    </w:p>
+    <w:p>
+      <w:pPr>
+        <w:pStyle w:val="Heading2"/>
+      </w:pPr>
+      <w:r>
+        <w:t>5.12 Signing operation metadata still does not sign</w:t>
+      </w:r>
+    </w:p>
+    <w:p>
+      <w:pPr>
+        <w:pStyle w:val="BodyTight"/>
+      </w:pPr>
+      <w:r>
+        <w:t>Seal now carries the signing path beyond signature-request metadata through signing authorization, signer handoff, signer invocation, and signing operation metadata. The latest status guard ties signing-operation readiness to the guarded signer-invocation predecessor and records the CI/status workflow that checks the public evidence surface.</w:t>
+      </w:r>
+    </w:p>
+    <w:p>
+      <w:pPr>
+        <w:pStyle w:val="BodyTight"/>
+      </w:pPr>
+      <w:r>
+        <w:t>The successful metadata path may show signing_authorization_ready=1, signer_handoff_ready=1, signer_invocation_ready=1, and signing_operation_ready=1. Those are classification checkpoints only. They preserve signature_performed=0, verification_performed=0, signer_invoked=0, private_key_handling=0, key_generation_performed=0, trust_store_loaded=0, revocation_lookup_performed=0, host_read_performed=0, host_write_performed=0, network_performed=0, and runtime_authority_granted=0.</w:t>
       </w:r>
     </w:p>
     <w:p>
@@ -7805,6 +8147,10 @@
         <w:gridCol w:w="3331"/>
       </w:tblGrid>
       <w:tr>
+        <w:trPr>
+          <w:tblHeader/>
+          <w:cantSplit/>
+        </w:trPr>
         <w:tc>
           <w:tcPr>
             <w:tcW w:type="dxa" w:w="2448"/>
@@ -7882,6 +8228,9 @@
         </w:tc>
       </w:tr>
       <w:tr>
+        <w:trPr>
+          <w:cantSplit/>
+        </w:trPr>
         <w:tc>
           <w:tcPr>
             <w:tcW w:type="dxa" w:w="2448"/>
@@ -7962,6 +8311,9 @@
         </w:tc>
       </w:tr>
       <w:tr>
+        <w:trPr>
+          <w:cantSplit/>
+        </w:trPr>
         <w:tc>
           <w:tcPr>
             <w:tcW w:type="dxa" w:w="2448"/>
@@ -8042,6 +8394,9 @@
         </w:tc>
       </w:tr>
       <w:tr>
+        <w:trPr>
+          <w:cantSplit/>
+        </w:trPr>
         <w:tc>
           <w:tcPr>
             <w:tcW w:type="dxa" w:w="2448"/>
@@ -8122,6 +8477,9 @@
         </w:tc>
       </w:tr>
       <w:tr>
+        <w:trPr>
+          <w:cantSplit/>
+        </w:trPr>
         <w:tc>
           <w:tcPr>
             <w:tcW w:type="dxa" w:w="2448"/>
@@ -8202,6 +8560,9 @@
         </w:tc>
       </w:tr>
       <w:tr>
+        <w:trPr>
+          <w:cantSplit/>
+        </w:trPr>
         <w:tc>
           <w:tcPr>
             <w:tcW w:type="dxa" w:w="2448"/>
@@ -8282,6 +8643,9 @@
         </w:tc>
       </w:tr>
       <w:tr>
+        <w:trPr>
+          <w:cantSplit/>
+        </w:trPr>
         <w:tc>
           <w:tcPr>
             <w:tcW w:type="dxa" w:w="2448"/>
@@ -8410,6 +8774,10 @@
         <w:gridCol w:w="9994"/>
       </w:tblGrid>
       <w:tr>
+        <w:trPr>
+          <w:tblHeader/>
+          <w:cantSplit/>
+        </w:trPr>
         <w:tc>
           <w:tcPr>
             <w:tcW w:type="dxa" w:w="9994"/>
@@ -8575,6 +8943,10 @@
         <w:gridCol w:w="4997"/>
       </w:tblGrid>
       <w:tr>
+        <w:trPr>
+          <w:tblHeader/>
+          <w:cantSplit/>
+        </w:trPr>
         <w:tc>
           <w:tcPr>
             <w:tcW w:type="dxa" w:w="2304"/>
@@ -8627,6 +8999,9 @@
         </w:tc>
       </w:tr>
       <w:tr>
+        <w:trPr>
+          <w:cantSplit/>
+        </w:trPr>
         <w:tc>
           <w:tcPr>
             <w:tcW w:type="dxa" w:w="2304"/>
@@ -8681,6 +9056,9 @@
         </w:tc>
       </w:tr>
       <w:tr>
+        <w:trPr>
+          <w:cantSplit/>
+        </w:trPr>
         <w:tc>
           <w:tcPr>
             <w:tcW w:type="dxa" w:w="2304"/>
@@ -8735,6 +9113,9 @@
         </w:tc>
       </w:tr>
       <w:tr>
+        <w:trPr>
+          <w:cantSplit/>
+        </w:trPr>
         <w:tc>
           <w:tcPr>
             <w:tcW w:type="dxa" w:w="2304"/>
@@ -8789,6 +9170,9 @@
         </w:tc>
       </w:tr>
       <w:tr>
+        <w:trPr>
+          <w:cantSplit/>
+        </w:trPr>
         <w:tc>
           <w:tcPr>
             <w:tcW w:type="dxa" w:w="2304"/>
@@ -8843,6 +9227,9 @@
         </w:tc>
       </w:tr>
       <w:tr>
+        <w:trPr>
+          <w:cantSplit/>
+        </w:trPr>
         <w:tc>
           <w:tcPr>
             <w:tcW w:type="dxa" w:w="2304"/>
@@ -8897,6 +9284,9 @@
         </w:tc>
       </w:tr>
       <w:tr>
+        <w:trPr>
+          <w:cantSplit/>
+        </w:trPr>
         <w:tc>
           <w:tcPr>
             <w:tcW w:type="dxa" w:w="2304"/>
@@ -8951,6 +9341,9 @@
         </w:tc>
       </w:tr>
       <w:tr>
+        <w:trPr>
+          <w:cantSplit/>
+        </w:trPr>
         <w:tc>
           <w:tcPr>
             <w:tcW w:type="dxa" w:w="2304"/>
@@ -9232,6 +9625,10 @@
         <w:gridCol w:w="4997"/>
       </w:tblGrid>
       <w:tr>
+        <w:trPr>
+          <w:tblHeader/>
+          <w:cantSplit/>
+        </w:trPr>
         <w:tc>
           <w:tcPr>
             <w:tcW w:type="dxa" w:w="2448"/>
@@ -9284,6 +9681,9 @@
         </w:tc>
       </w:tr>
       <w:tr>
+        <w:trPr>
+          <w:cantSplit/>
+        </w:trPr>
         <w:tc>
           <w:tcPr>
             <w:tcW w:type="dxa" w:w="2448"/>
@@ -9338,6 +9738,9 @@
         </w:tc>
       </w:tr>
       <w:tr>
+        <w:trPr>
+          <w:cantSplit/>
+        </w:trPr>
         <w:tc>
           <w:tcPr>
             <w:tcW w:type="dxa" w:w="2448"/>
@@ -9392,6 +9795,9 @@
         </w:tc>
       </w:tr>
       <w:tr>
+        <w:trPr>
+          <w:cantSplit/>
+        </w:trPr>
         <w:tc>
           <w:tcPr>
             <w:tcW w:type="dxa" w:w="2448"/>
@@ -9446,6 +9852,9 @@
         </w:tc>
       </w:tr>
       <w:tr>
+        <w:trPr>
+          <w:cantSplit/>
+        </w:trPr>
         <w:tc>
           <w:tcPr>
             <w:tcW w:type="dxa" w:w="2448"/>
@@ -9500,6 +9909,9 @@
         </w:tc>
       </w:tr>
       <w:tr>
+        <w:trPr>
+          <w:cantSplit/>
+        </w:trPr>
         <w:tc>
           <w:tcPr>
             <w:tcW w:type="dxa" w:w="2448"/>
@@ -9591,6 +10003,10 @@
         <w:gridCol w:w="9994"/>
       </w:tblGrid>
       <w:tr>
+        <w:trPr>
+          <w:tblHeader/>
+          <w:cantSplit/>
+        </w:trPr>
         <w:tc>
           <w:tcPr>
             <w:tcW w:type="dxa" w:w="9994"/>
@@ -9811,6 +10227,10 @@
         <w:gridCol w:w="4997"/>
       </w:tblGrid>
       <w:tr>
+        <w:trPr>
+          <w:tblHeader/>
+          <w:cantSplit/>
+        </w:trPr>
         <w:tc>
           <w:tcPr>
             <w:tcW w:type="dxa" w:w="2880"/>
@@ -9863,6 +10283,9 @@
         </w:tc>
       </w:tr>
       <w:tr>
+        <w:trPr>
+          <w:cantSplit/>
+        </w:trPr>
         <w:tc>
           <w:tcPr>
             <w:tcW w:type="dxa" w:w="2880"/>
@@ -9917,6 +10340,9 @@
         </w:tc>
       </w:tr>
       <w:tr>
+        <w:trPr>
+          <w:cantSplit/>
+        </w:trPr>
         <w:tc>
           <w:tcPr>
             <w:tcW w:type="dxa" w:w="2880"/>
@@ -9971,6 +10397,9 @@
         </w:tc>
       </w:tr>
       <w:tr>
+        <w:trPr>
+          <w:cantSplit/>
+        </w:trPr>
         <w:tc>
           <w:tcPr>
             <w:tcW w:type="dxa" w:w="2880"/>
@@ -10025,6 +10454,9 @@
         </w:tc>
       </w:tr>
       <w:tr>
+        <w:trPr>
+          <w:cantSplit/>
+        </w:trPr>
         <w:tc>
           <w:tcPr>
             <w:tcW w:type="dxa" w:w="2880"/>
@@ -10079,6 +10511,9 @@
         </w:tc>
       </w:tr>
       <w:tr>
+        <w:trPr>
+          <w:cantSplit/>
+        </w:trPr>
         <w:tc>
           <w:tcPr>
             <w:tcW w:type="dxa" w:w="2880"/>
@@ -10133,6 +10568,9 @@
         </w:tc>
       </w:tr>
       <w:tr>
+        <w:trPr>
+          <w:cantSplit/>
+        </w:trPr>
         <w:tc>
           <w:tcPr>
             <w:tcW w:type="dxa" w:w="2880"/>
@@ -10301,6 +10739,10 @@
         <w:gridCol w:w="9994"/>
       </w:tblGrid>
       <w:tr>
+        <w:trPr>
+          <w:tblHeader/>
+          <w:cantSplit/>
+        </w:trPr>
         <w:tc>
           <w:tcPr>
             <w:tcW w:type="dxa" w:w="9994"/>
@@ -10456,6 +10898,10 @@
         <w:gridCol w:w="9994"/>
       </w:tblGrid>
       <w:tr>
+        <w:trPr>
+          <w:tblHeader/>
+          <w:cantSplit/>
+        </w:trPr>
         <w:tc>
           <w:tcPr>
             <w:tcW w:type="dxa" w:w="9994"/>
@@ -10563,6 +11009,10 @@
         <w:gridCol w:w="3331"/>
       </w:tblGrid>
       <w:tr>
+        <w:trPr>
+          <w:tblHeader/>
+          <w:cantSplit/>
+        </w:trPr>
         <w:tc>
           <w:tcPr>
             <w:tcW w:type="dxa" w:w="2304"/>
@@ -10640,6 +11090,9 @@
         </w:tc>
       </w:tr>
       <w:tr>
+        <w:trPr>
+          <w:cantSplit/>
+        </w:trPr>
         <w:tc>
           <w:tcPr>
             <w:tcW w:type="dxa" w:w="2304"/>
@@ -10720,6 +11173,9 @@
         </w:tc>
       </w:tr>
       <w:tr>
+        <w:trPr>
+          <w:cantSplit/>
+        </w:trPr>
         <w:tc>
           <w:tcPr>
             <w:tcW w:type="dxa" w:w="2304"/>
@@ -10800,6 +11256,9 @@
         </w:tc>
       </w:tr>
       <w:tr>
+        <w:trPr>
+          <w:cantSplit/>
+        </w:trPr>
         <w:tc>
           <w:tcPr>
             <w:tcW w:type="dxa" w:w="2304"/>
@@ -10880,6 +11339,9 @@
         </w:tc>
       </w:tr>
       <w:tr>
+        <w:trPr>
+          <w:cantSplit/>
+        </w:trPr>
         <w:tc>
           <w:tcPr>
             <w:tcW w:type="dxa" w:w="2304"/>
@@ -10960,6 +11422,9 @@
         </w:tc>
       </w:tr>
       <w:tr>
+        <w:trPr>
+          <w:cantSplit/>
+        </w:trPr>
         <w:tc>
           <w:tcPr>
             <w:tcW w:type="dxa" w:w="2304"/>
@@ -11121,6 +11586,10 @@
         <w:gridCol w:w="9994"/>
       </w:tblGrid>
       <w:tr>
+        <w:trPr>
+          <w:tblHeader/>
+          <w:cantSplit/>
+        </w:trPr>
         <w:tc>
           <w:tcPr>
             <w:tcW w:type="dxa" w:w="9994"/>
@@ -11287,6 +11756,10 @@
         <w:gridCol w:w="3331"/>
       </w:tblGrid>
       <w:tr>
+        <w:trPr>
+          <w:tblHeader/>
+          <w:cantSplit/>
+        </w:trPr>
         <w:tc>
           <w:tcPr>
             <w:tcW w:type="dxa" w:w="2736"/>
@@ -11364,6 +11837,9 @@
         </w:tc>
       </w:tr>
       <w:tr>
+        <w:trPr>
+          <w:cantSplit/>
+        </w:trPr>
         <w:tc>
           <w:tcPr>
             <w:tcW w:type="dxa" w:w="2736"/>
@@ -11444,6 +11920,9 @@
         </w:tc>
       </w:tr>
       <w:tr>
+        <w:trPr>
+          <w:cantSplit/>
+        </w:trPr>
         <w:tc>
           <w:tcPr>
             <w:tcW w:type="dxa" w:w="2736"/>
@@ -11524,6 +12003,9 @@
         </w:tc>
       </w:tr>
       <w:tr>
+        <w:trPr>
+          <w:cantSplit/>
+        </w:trPr>
         <w:tc>
           <w:tcPr>
             <w:tcW w:type="dxa" w:w="2736"/>
@@ -11604,6 +12086,9 @@
         </w:tc>
       </w:tr>
       <w:tr>
+        <w:trPr>
+          <w:cantSplit/>
+        </w:trPr>
         <w:tc>
           <w:tcPr>
             <w:tcW w:type="dxa" w:w="2736"/>
@@ -11684,6 +12169,9 @@
         </w:tc>
       </w:tr>
       <w:tr>
+        <w:trPr>
+          <w:cantSplit/>
+        </w:trPr>
         <w:tc>
           <w:tcPr>
             <w:tcW w:type="dxa" w:w="2736"/>
@@ -11764,6 +12252,9 @@
         </w:tc>
       </w:tr>
       <w:tr>
+        <w:trPr>
+          <w:cantSplit/>
+        </w:trPr>
         <w:tc>
           <w:tcPr>
             <w:tcW w:type="dxa" w:w="2736"/>
@@ -11844,6 +12335,9 @@
         </w:tc>
       </w:tr>
       <w:tr>
+        <w:trPr>
+          <w:cantSplit/>
+        </w:trPr>
         <w:tc>
           <w:tcPr>
             <w:tcW w:type="dxa" w:w="2736"/>
@@ -12019,6 +12513,10 @@
         <w:gridCol w:w="3331"/>
       </w:tblGrid>
       <w:tr>
+        <w:trPr>
+          <w:tblHeader/>
+          <w:cantSplit/>
+        </w:trPr>
         <w:tc>
           <w:tcPr>
             <w:tcW w:type="dxa" w:w="1584"/>
@@ -12096,6 +12594,9 @@
         </w:tc>
       </w:tr>
       <w:tr>
+        <w:trPr>
+          <w:cantSplit/>
+        </w:trPr>
         <w:tc>
           <w:tcPr>
             <w:tcW w:type="dxa" w:w="1584"/>
@@ -12176,6 +12677,9 @@
         </w:tc>
       </w:tr>
       <w:tr>
+        <w:trPr>
+          <w:cantSplit/>
+        </w:trPr>
         <w:tc>
           <w:tcPr>
             <w:tcW w:type="dxa" w:w="1584"/>
@@ -12256,6 +12760,9 @@
         </w:tc>
       </w:tr>
       <w:tr>
+        <w:trPr>
+          <w:cantSplit/>
+        </w:trPr>
         <w:tc>
           <w:tcPr>
             <w:tcW w:type="dxa" w:w="1584"/>
@@ -12336,6 +12843,9 @@
         </w:tc>
       </w:tr>
       <w:tr>
+        <w:trPr>
+          <w:cantSplit/>
+        </w:trPr>
         <w:tc>
           <w:tcPr>
             <w:tcW w:type="dxa" w:w="1584"/>
@@ -12475,6 +12985,10 @@
         <w:gridCol w:w="9994"/>
       </w:tblGrid>
       <w:tr>
+        <w:trPr>
+          <w:tblHeader/>
+          <w:cantSplit/>
+        </w:trPr>
         <w:tc>
           <w:tcPr>
             <w:tcW w:type="dxa" w:w="9994"/>
@@ -12752,6 +13266,30 @@
       </w:pPr>
       <w:r>
         <w:t>The Console witness edge is therefore a request edge, not an evidence edge. The current evidence is the presence of metadata-only contracts and the persistence of denial fields such as payload_artifact_present=0, signature_request_binding_allowed=0, seal_signature_request_ready=0, receipt_write_allowed=0, receipt_signed=0, file_write_allowed=0, and runtime_authority_granted=0.</w:t>
+      </w:r>
+    </w:p>
+    <w:p>
+      <w:pPr>
+        <w:pStyle w:val="Heading2"/>
+      </w:pPr>
+      <w:r>
+        <w:t>11.10 Signing path readiness is not signing</w:t>
+      </w:r>
+    </w:p>
+    <w:p>
+      <w:pPr>
+        <w:pStyle w:val="BodyTight"/>
+      </w:pPr>
+      <w:r>
+        <w:t>The Seal signing path now has several ready-looking metadata states, so the handbook needs the same separation rule again. signing_authorization_ready, signer_handoff_ready, signer_invocation_ready, and signing_operation_ready are witness states about predecessor review and metadata classification, not evidence that a signature was produced.</w:t>
+      </w:r>
+    </w:p>
+    <w:p>
+      <w:pPr>
+        <w:pStyle w:val="BodyTight"/>
+      </w:pPr>
+      <w:r>
+        <w:t>A reviewer should reject any claim that crosses from signing_operation_ready=1 to Ed25519 signing, signer process execution, private-key loading, key generation, trust-store loading, revocation lookup, receipt signing, object sealing, host or network behavior, runtime handoff execution, or authority. Those transitions require separate implementation and tests.</w:t>
       </w:r>
     </w:p>
     <w:p>
@@ -12859,6 +13397,10 @@
         <w:gridCol w:w="3331"/>
       </w:tblGrid>
       <w:tr>
+        <w:trPr>
+          <w:tblHeader/>
+          <w:cantSplit/>
+        </w:trPr>
         <w:tc>
           <w:tcPr>
             <w:tcW w:type="dxa" w:w="2448"/>
@@ -12936,6 +13478,9 @@
         </w:tc>
       </w:tr>
       <w:tr>
+        <w:trPr>
+          <w:cantSplit/>
+        </w:trPr>
         <w:tc>
           <w:tcPr>
             <w:tcW w:type="dxa" w:w="2448"/>
@@ -13016,6 +13561,9 @@
         </w:tc>
       </w:tr>
       <w:tr>
+        <w:trPr>
+          <w:cantSplit/>
+        </w:trPr>
         <w:tc>
           <w:tcPr>
             <w:tcW w:type="dxa" w:w="2448"/>
@@ -13096,6 +13644,9 @@
         </w:tc>
       </w:tr>
       <w:tr>
+        <w:trPr>
+          <w:cantSplit/>
+        </w:trPr>
         <w:tc>
           <w:tcPr>
             <w:tcW w:type="dxa" w:w="2448"/>
@@ -13176,6 +13727,9 @@
         </w:tc>
       </w:tr>
       <w:tr>
+        <w:trPr>
+          <w:cantSplit/>
+        </w:trPr>
         <w:tc>
           <w:tcPr>
             <w:tcW w:type="dxa" w:w="2448"/>
@@ -13256,6 +13810,9 @@
         </w:tc>
       </w:tr>
       <w:tr>
+        <w:trPr>
+          <w:cantSplit/>
+        </w:trPr>
         <w:tc>
           <w:tcPr>
             <w:tcW w:type="dxa" w:w="2448"/>
@@ -13336,6 +13893,9 @@
         </w:tc>
       </w:tr>
       <w:tr>
+        <w:trPr>
+          <w:cantSplit/>
+        </w:trPr>
         <w:tc>
           <w:tcPr>
             <w:tcW w:type="dxa" w:w="2448"/>
@@ -13475,6 +14035,10 @@
         <w:gridCol w:w="9994"/>
       </w:tblGrid>
       <w:tr>
+        <w:trPr>
+          <w:tblHeader/>
+          <w:cantSplit/>
+        </w:trPr>
         <w:tc>
           <w:tcPr>
             <w:tcW w:type="dxa" w:w="9994"/>
@@ -13777,6 +14341,10 @@
         <w:gridCol w:w="9994"/>
       </w:tblGrid>
       <w:tr>
+        <w:trPr>
+          <w:tblHeader/>
+          <w:cantSplit/>
+        </w:trPr>
         <w:tc>
           <w:tcPr>
             <w:tcW w:type="dxa" w:w="9994"/>
@@ -14052,6 +14620,10 @@
         <w:gridCol w:w="4997"/>
       </w:tblGrid>
       <w:tr>
+        <w:trPr>
+          <w:tblHeader/>
+          <w:cantSplit/>
+        </w:trPr>
         <w:tc>
           <w:tcPr>
             <w:tcW w:type="dxa" w:w="2016"/>
@@ -14104,6 +14676,9 @@
         </w:tc>
       </w:tr>
       <w:tr>
+        <w:trPr>
+          <w:cantSplit/>
+        </w:trPr>
         <w:tc>
           <w:tcPr>
             <w:tcW w:type="dxa" w:w="2016"/>
@@ -14158,6 +14733,9 @@
         </w:tc>
       </w:tr>
       <w:tr>
+        <w:trPr>
+          <w:cantSplit/>
+        </w:trPr>
         <w:tc>
           <w:tcPr>
             <w:tcW w:type="dxa" w:w="2016"/>
@@ -14212,6 +14790,9 @@
         </w:tc>
       </w:tr>
       <w:tr>
+        <w:trPr>
+          <w:cantSplit/>
+        </w:trPr>
         <w:tc>
           <w:tcPr>
             <w:tcW w:type="dxa" w:w="2016"/>
@@ -14266,6 +14847,9 @@
         </w:tc>
       </w:tr>
       <w:tr>
+        <w:trPr>
+          <w:cantSplit/>
+        </w:trPr>
         <w:tc>
           <w:tcPr>
             <w:tcW w:type="dxa" w:w="2016"/>
@@ -14320,6 +14904,9 @@
         </w:tc>
       </w:tr>
       <w:tr>
+        <w:trPr>
+          <w:cantSplit/>
+        </w:trPr>
         <w:tc>
           <w:tcPr>
             <w:tcW w:type="dxa" w:w="2016"/>
@@ -14374,6 +14961,9 @@
         </w:tc>
       </w:tr>
       <w:tr>
+        <w:trPr>
+          <w:cantSplit/>
+        </w:trPr>
         <w:tc>
           <w:tcPr>
             <w:tcW w:type="dxa" w:w="2016"/>
@@ -14428,6 +15018,9 @@
         </w:tc>
       </w:tr>
       <w:tr>
+        <w:trPr>
+          <w:cantSplit/>
+        </w:trPr>
         <w:tc>
           <w:tcPr>
             <w:tcW w:type="dxa" w:w="2016"/>
@@ -14510,6 +15103,10 @@
         <w:gridCol w:w="4997"/>
       </w:tblGrid>
       <w:tr>
+        <w:trPr>
+          <w:tblHeader/>
+          <w:cantSplit/>
+        </w:trPr>
         <w:tc>
           <w:tcPr>
             <w:tcW w:type="dxa" w:w="2016"/>
@@ -14562,6 +15159,9 @@
         </w:tc>
       </w:tr>
       <w:tr>
+        <w:trPr>
+          <w:cantSplit/>
+        </w:trPr>
         <w:tc>
           <w:tcPr>
             <w:tcW w:type="dxa" w:w="2016"/>
@@ -14616,6 +15216,9 @@
         </w:tc>
       </w:tr>
       <w:tr>
+        <w:trPr>
+          <w:cantSplit/>
+        </w:trPr>
         <w:tc>
           <w:tcPr>
             <w:tcW w:type="dxa" w:w="2016"/>
@@ -14670,6 +15273,9 @@
         </w:tc>
       </w:tr>
       <w:tr>
+        <w:trPr>
+          <w:cantSplit/>
+        </w:trPr>
         <w:tc>
           <w:tcPr>
             <w:tcW w:type="dxa" w:w="2016"/>
@@ -14724,6 +15330,9 @@
         </w:tc>
       </w:tr>
       <w:tr>
+        <w:trPr>
+          <w:cantSplit/>
+        </w:trPr>
         <w:tc>
           <w:tcPr>
             <w:tcW w:type="dxa" w:w="2016"/>
@@ -14778,6 +15387,9 @@
         </w:tc>
       </w:tr>
       <w:tr>
+        <w:trPr>
+          <w:cantSplit/>
+        </w:trPr>
         <w:tc>
           <w:tcPr>
             <w:tcW w:type="dxa" w:w="2016"/>
@@ -14832,6 +15444,9 @@
         </w:tc>
       </w:tr>
       <w:tr>
+        <w:trPr>
+          <w:cantSplit/>
+        </w:trPr>
         <w:tc>
           <w:tcPr>
             <w:tcW w:type="dxa" w:w="2016"/>
@@ -14886,6 +15501,9 @@
         </w:tc>
       </w:tr>
       <w:tr>
+        <w:trPr>
+          <w:cantSplit/>
+        </w:trPr>
         <w:tc>
           <w:tcPr>
             <w:tcW w:type="dxa" w:w="2016"/>
@@ -15354,6 +15972,10 @@
         <w:gridCol w:w="4997"/>
       </w:tblGrid>
       <w:tr>
+        <w:trPr>
+          <w:tblHeader/>
+          <w:cantSplit/>
+        </w:trPr>
         <w:tc>
           <w:tcPr>
             <w:tcW w:type="dxa" w:w="3240"/>
@@ -15406,6 +16028,9 @@
         </w:tc>
       </w:tr>
       <w:tr>
+        <w:trPr>
+          <w:cantSplit/>
+        </w:trPr>
         <w:tc>
           <w:tcPr>
             <w:tcW w:type="dxa" w:w="3240"/>
@@ -15460,6 +16085,9 @@
         </w:tc>
       </w:tr>
       <w:tr>
+        <w:trPr>
+          <w:cantSplit/>
+        </w:trPr>
         <w:tc>
           <w:tcPr>
             <w:tcW w:type="dxa" w:w="3240"/>
@@ -15514,6 +16142,9 @@
         </w:tc>
       </w:tr>
       <w:tr>
+        <w:trPr>
+          <w:cantSplit/>
+        </w:trPr>
         <w:tc>
           <w:tcPr>
             <w:tcW w:type="dxa" w:w="3240"/>
@@ -15568,6 +16199,9 @@
         </w:tc>
       </w:tr>
       <w:tr>
+        <w:trPr>
+          <w:cantSplit/>
+        </w:trPr>
         <w:tc>
           <w:tcPr>
             <w:tcW w:type="dxa" w:w="3240"/>
@@ -15622,6 +16256,9 @@
         </w:tc>
       </w:tr>
       <w:tr>
+        <w:trPr>
+          <w:cantSplit/>
+        </w:trPr>
         <w:tc>
           <w:tcPr>
             <w:tcW w:type="dxa" w:w="3240"/>
@@ -15676,6 +16313,9 @@
         </w:tc>
       </w:tr>
       <w:tr>
+        <w:trPr>
+          <w:cantSplit/>
+        </w:trPr>
         <w:tc>
           <w:tcPr>
             <w:tcW w:type="dxa" w:w="3240"/>
@@ -15730,6 +16370,9 @@
         </w:tc>
       </w:tr>
       <w:tr>
+        <w:trPr>
+          <w:cantSplit/>
+        </w:trPr>
         <w:tc>
           <w:tcPr>
             <w:tcW w:type="dxa" w:w="3240"/>
@@ -15832,6 +16475,10 @@
         <w:gridCol w:w="9994"/>
       </w:tblGrid>
       <w:tr>
+        <w:trPr>
+          <w:tblHeader/>
+          <w:cantSplit/>
+        </w:trPr>
         <w:tc>
           <w:tcPr>
             <w:tcW w:type="dxa" w:w="9994"/>
@@ -16226,6 +16873,30 @@
       </w:pPr>
       <w:r>
         <w:t>The schema rule is that role, effect, operator, and value are copied evidence. They do not mean the operator was evaluated, the clause was enforced, the effect was performed, LIR executed, file/network I/O occurred, or runtime_authority_granted changed from zero.</w:t>
+      </w:r>
+    </w:p>
+    <w:p>
+      <w:pPr>
+        <w:pStyle w:val="Heading2"/>
+      </w:pPr>
+      <w:r>
+        <w:t>14.13 Signing operation status schema</w:t>
+      </w:r>
+    </w:p>
+    <w:p>
+      <w:pPr>
+        <w:pStyle w:val="BodyTight"/>
+      </w:pPr>
+      <w:r>
+        <w:t>The signing operation schema extends the signature request lineage with signing_operation_profile, requested_signing_operation, signing_operation_state, signing_operation_ready, and predecessor fields for signing authorization, signer handoff, and signer invocation. The status guard also records seal_signing_operation_status_runner_present=1, seal_signing_operation_status_workflow_present=1, and signing_operation_predecessor_signer_invocation_status_present=1.</w:t>
+      </w:r>
+    </w:p>
+    <w:p>
+      <w:pPr>
+        <w:pStyle w:val="BodyTight"/>
+      </w:pPr>
+      <w:r>
+        <w:t>The invariant is simple: readiness fields may become one while all performed and authority fields stay zero. Schema consumers must preserve signature_performed=0, verification_performed=0, signer_invoked=0, private_key_handling=0, key_generation_performed=0, trust_store_loaded=0, revocation_lookup_performed=0, host_read_performed=0, host_write_performed=0, network_performed=0, and runtime_authority_granted=0.</w:t>
       </w:r>
     </w:p>
     <w:p>
@@ -16274,6 +16945,10 @@
         <w:gridCol w:w="3331"/>
       </w:tblGrid>
       <w:tr>
+        <w:trPr>
+          <w:tblHeader/>
+          <w:cantSplit/>
+        </w:trPr>
         <w:tc>
           <w:tcPr>
             <w:tcW w:type="dxa" w:w="2376"/>
@@ -16351,6 +17026,9 @@
         </w:tc>
       </w:tr>
       <w:tr>
+        <w:trPr>
+          <w:cantSplit/>
+        </w:trPr>
         <w:tc>
           <w:tcPr>
             <w:tcW w:type="dxa" w:w="2376"/>
@@ -16431,6 +17109,9 @@
         </w:tc>
       </w:tr>
       <w:tr>
+        <w:trPr>
+          <w:cantSplit/>
+        </w:trPr>
         <w:tc>
           <w:tcPr>
             <w:tcW w:type="dxa" w:w="2376"/>
@@ -16511,6 +17192,9 @@
         </w:tc>
       </w:tr>
       <w:tr>
+        <w:trPr>
+          <w:cantSplit/>
+        </w:trPr>
         <w:tc>
           <w:tcPr>
             <w:tcW w:type="dxa" w:w="2376"/>
@@ -16591,6 +17275,9 @@
         </w:tc>
       </w:tr>
       <w:tr>
+        <w:trPr>
+          <w:cantSplit/>
+        </w:trPr>
         <w:tc>
           <w:tcPr>
             <w:tcW w:type="dxa" w:w="2376"/>
@@ -16671,6 +17358,9 @@
         </w:tc>
       </w:tr>
       <w:tr>
+        <w:trPr>
+          <w:cantSplit/>
+        </w:trPr>
         <w:tc>
           <w:tcPr>
             <w:tcW w:type="dxa" w:w="2376"/>
@@ -16751,6 +17441,9 @@
         </w:tc>
       </w:tr>
       <w:tr>
+        <w:trPr>
+          <w:cantSplit/>
+        </w:trPr>
         <w:tc>
           <w:tcPr>
             <w:tcW w:type="dxa" w:w="2376"/>
@@ -16831,6 +17524,9 @@
         </w:tc>
       </w:tr>
       <w:tr>
+        <w:trPr>
+          <w:cantSplit/>
+        </w:trPr>
         <w:tc>
           <w:tcPr>
             <w:tcW w:type="dxa" w:w="2376"/>
@@ -16911,6 +17607,9 @@
         </w:tc>
       </w:tr>
       <w:tr>
+        <w:trPr>
+          <w:cantSplit/>
+        </w:trPr>
         <w:tc>
           <w:tcPr>
             <w:tcW w:type="dxa" w:w="3331"/>
@@ -16943,6 +17642,9 @@
         </w:tc>
       </w:tr>
       <w:tr>
+        <w:trPr>
+          <w:cantSplit/>
+        </w:trPr>
         <w:tc>
           <w:tcPr>
             <w:tcW w:type="dxa" w:w="3331"/>
@@ -16970,6 +17672,41 @@
           <w:p>
             <w:r>
               <w:t>Lat pipeline and Runtime Boundary transcripts with stable clause metadata and no-effect denial fields.</w:t>
+            </w:r>
+          </w:p>
+        </w:tc>
+      </w:tr>
+      <w:tr>
+        <w:trPr>
+          <w:cantSplit/>
+        </w:trPr>
+        <w:tc>
+          <w:tcPr>
+            <w:tcW w:type="dxa" w:w="3331"/>
+          </w:tcPr>
+          <w:p>
+            <w:r>
+              <w:t>Seal signing operation status guard</w:t>
+            </w:r>
+          </w:p>
+        </w:tc>
+        <w:tc>
+          <w:tcPr>
+            <w:tcW w:type="dxa" w:w="3331"/>
+          </w:tcPr>
+          <w:p>
+            <w:r>
+              <w:t>Validate signing-operation metadata and predecessor status alignment without adding signing behavior.</w:t>
+            </w:r>
+          </w:p>
+        </w:tc>
+        <w:tc>
+          <w:tcPr>
+            <w:tcW w:type="dxa" w:w="3331"/>
+          </w:tcPr>
+          <w:p>
+            <w:r>
+              <w:t>Status transcript showing signing_operation_ready=1 with signature/signing/key/host/network/runtime fields still zero.</w:t>
             </w:r>
           </w:p>
         </w:tc>
@@ -17023,6 +17760,10 @@
         <w:gridCol w:w="9994"/>
       </w:tblGrid>
       <w:tr>
+        <w:trPr>
+          <w:tblHeader/>
+          <w:cantSplit/>
+        </w:trPr>
         <w:tc>
           <w:tcPr>
             <w:tcW w:type="dxa" w:w="9994"/>
@@ -17445,6 +18186,30 @@
       </w:pPr>
       <w:r>
         <w:t>The important checks are field stability and non-effect preservation: first-clause role/effect/name/operator/value metadata may be copied, while operator evaluation, Lat execution, LIR execution, file I/O, network I/O, host mutation, hardware behavior, boot behavior, and runtime authority stay denied.</w:t>
+      </w:r>
+    </w:p>
+    <w:p>
+      <w:pPr>
+        <w:pStyle w:val="Heading2"/>
+      </w:pPr>
+      <w:r>
+        <w:t>15.13 Signing operation status guard validation</w:t>
+      </w:r>
+    </w:p>
+    <w:p>
+      <w:pPr>
+        <w:pStyle w:val="BodyTight"/>
+      </w:pPr>
+      <w:r>
+        <w:t>The signing operation validation lane should prove status alignment and non-effect preservation together. The current guard is sh scripts/test-latticra-seal-signing-operation-status.sh, backed by the signing-operation, key-handling, and signer-invocation invariant/status lanes.</w:t>
+      </w:r>
+    </w:p>
+    <w:p>
+      <w:pPr>
+        <w:pStyle w:val="BodyTight"/>
+      </w:pPr>
+      <w:r>
+        <w:t>The lane should fail if public/status records omit the predecessor chain or if any signing-adjacent behavior appears early: signature_performed, verification_performed, signer_invoked, private_key_handling, key_generation_performed, trust_store_loaded, revocation_lookup_performed, host/network behavior, or runtime authority.</w:t>
       </w:r>
     </w:p>
     <w:p>
@@ -17493,6 +18258,10 @@
         <w:gridCol w:w="3331"/>
       </w:tblGrid>
       <w:tr>
+        <w:trPr>
+          <w:tblHeader/>
+          <w:cantSplit/>
+        </w:trPr>
         <w:tc>
           <w:tcPr>
             <w:tcW w:type="dxa" w:w="2304"/>
@@ -17570,6 +18339,9 @@
         </w:tc>
       </w:tr>
       <w:tr>
+        <w:trPr>
+          <w:cantSplit/>
+        </w:trPr>
         <w:tc>
           <w:tcPr>
             <w:tcW w:type="dxa" w:w="2304"/>
@@ -17650,6 +18422,9 @@
         </w:tc>
       </w:tr>
       <w:tr>
+        <w:trPr>
+          <w:cantSplit/>
+        </w:trPr>
         <w:tc>
           <w:tcPr>
             <w:tcW w:type="dxa" w:w="2304"/>
@@ -17730,6 +18505,9 @@
         </w:tc>
       </w:tr>
       <w:tr>
+        <w:trPr>
+          <w:cantSplit/>
+        </w:trPr>
         <w:tc>
           <w:tcPr>
             <w:tcW w:type="dxa" w:w="2304"/>
@@ -17810,6 +18588,9 @@
         </w:tc>
       </w:tr>
       <w:tr>
+        <w:trPr>
+          <w:cantSplit/>
+        </w:trPr>
         <w:tc>
           <w:tcPr>
             <w:tcW w:type="dxa" w:w="2304"/>
@@ -17890,6 +18671,9 @@
         </w:tc>
       </w:tr>
       <w:tr>
+        <w:trPr>
+          <w:cantSplit/>
+        </w:trPr>
         <w:tc>
           <w:tcPr>
             <w:tcW w:type="dxa" w:w="2304"/>
@@ -17970,6 +18754,9 @@
         </w:tc>
       </w:tr>
       <w:tr>
+        <w:trPr>
+          <w:cantSplit/>
+        </w:trPr>
         <w:tc>
           <w:tcPr>
             <w:tcW w:type="dxa" w:w="2304"/>
@@ -18050,6 +18837,9 @@
         </w:tc>
       </w:tr>
       <w:tr>
+        <w:trPr>
+          <w:cantSplit/>
+        </w:trPr>
         <w:tc>
           <w:tcPr>
             <w:tcW w:type="dxa" w:w="2304"/>
@@ -18135,6 +18925,9 @@
         </w:tc>
       </w:tr>
       <w:tr>
+        <w:trPr>
+          <w:cantSplit/>
+        </w:trPr>
         <w:tc>
           <w:tcPr>
             <w:tcW w:type="dxa" w:w="2304"/>
@@ -18215,6 +19008,9 @@
         </w:tc>
       </w:tr>
       <w:tr>
+        <w:trPr>
+          <w:cantSplit/>
+        </w:trPr>
         <w:tc>
           <w:tcPr>
             <w:tcW w:type="dxa" w:w="3331"/>
@@ -18247,6 +19043,9 @@
         </w:tc>
       </w:tr>
       <w:tr>
+        <w:trPr>
+          <w:cantSplit/>
+        </w:trPr>
         <w:tc>
           <w:tcPr>
             <w:tcW w:type="dxa" w:w="3331"/>
@@ -18274,6 +19073,41 @@
           <w:p>
             <w:r>
               <w:t>First-clause, first-declaration, comment, stage, module, and count evidence remain stable across Lat pipeline and Runtime Boundary tests with no execution authority.</w:t>
+            </w:r>
+          </w:p>
+        </w:tc>
+      </w:tr>
+      <w:tr>
+        <w:trPr>
+          <w:cantSplit/>
+        </w:trPr>
+        <w:tc>
+          <w:tcPr>
+            <w:tcW w:type="dxa" w:w="3331"/>
+          </w:tcPr>
+          <w:p>
+            <w:r>
+              <w:t>11. Seal signing path status guards</w:t>
+            </w:r>
+          </w:p>
+        </w:tc>
+        <w:tc>
+          <w:tcPr>
+            <w:tcW w:type="dxa" w:w="3331"/>
+          </w:tcPr>
+          <w:p>
+            <w:r>
+              <w:t>Keep signing-path readiness fields chained to guarded predecessors before any signing exists.</w:t>
+            </w:r>
+          </w:p>
+        </w:tc>
+        <w:tc>
+          <w:tcPr>
+            <w:tcW w:type="dxa" w:w="3331"/>
+          </w:tcPr>
+          <w:p>
+            <w:r>
+              <w:t>Signature request, signing authorization, signer handoff, signer invocation, and signing operation status guards all pass while signing and key authority remain zero.</w:t>
             </w:r>
           </w:p>
         </w:tc>
@@ -18464,6 +19298,10 @@
         <w:gridCol w:w="4997"/>
       </w:tblGrid>
       <w:tr>
+        <w:trPr>
+          <w:tblHeader/>
+          <w:cantSplit/>
+        </w:trPr>
         <w:tc>
           <w:tcPr>
             <w:tcW w:type="dxa" w:w="2304"/>
@@ -18516,6 +19354,9 @@
         </w:tc>
       </w:tr>
       <w:tr>
+        <w:trPr>
+          <w:cantSplit/>
+        </w:trPr>
         <w:tc>
           <w:tcPr>
             <w:tcW w:type="dxa" w:w="2304"/>
@@ -18580,6 +19421,9 @@
         </w:tc>
       </w:tr>
       <w:tr>
+        <w:trPr>
+          <w:cantSplit/>
+        </w:trPr>
         <w:tc>
           <w:tcPr>
             <w:tcW w:type="dxa" w:w="2304"/>
@@ -18644,6 +19488,9 @@
         </w:tc>
       </w:tr>
       <w:tr>
+        <w:trPr>
+          <w:cantSplit/>
+        </w:trPr>
         <w:tc>
           <w:tcPr>
             <w:tcW w:type="dxa" w:w="2304"/>
@@ -18708,6 +19555,9 @@
         </w:tc>
       </w:tr>
       <w:tr>
+        <w:trPr>
+          <w:cantSplit/>
+        </w:trPr>
         <w:tc>
           <w:tcPr>
             <w:tcW w:type="dxa" w:w="2304"/>
@@ -18772,6 +19622,9 @@
         </w:tc>
       </w:tr>
       <w:tr>
+        <w:trPr>
+          <w:cantSplit/>
+        </w:trPr>
         <w:tc>
           <w:tcPr>
             <w:tcW w:type="dxa" w:w="2304"/>
@@ -18836,6 +19689,9 @@
         </w:tc>
       </w:tr>
       <w:tr>
+        <w:trPr>
+          <w:cantSplit/>
+        </w:trPr>
         <w:tc>
           <w:tcPr>
             <w:tcW w:type="dxa" w:w="2304"/>
@@ -18900,6 +19756,9 @@
         </w:tc>
       </w:tr>
       <w:tr>
+        <w:trPr>
+          <w:cantSplit/>
+        </w:trPr>
         <w:tc>
           <w:tcPr>
             <w:tcW w:type="dxa" w:w="2304"/>
@@ -18964,6 +19823,9 @@
         </w:tc>
       </w:tr>
       <w:tr>
+        <w:trPr>
+          <w:cantSplit/>
+        </w:trPr>
         <w:tc>
           <w:tcPr>
             <w:tcW w:type="dxa" w:w="2304"/>
@@ -19028,6 +19890,9 @@
         </w:tc>
       </w:tr>
       <w:tr>
+        <w:trPr>
+          <w:cantSplit/>
+        </w:trPr>
         <w:tc>
           <w:tcPr>
             <w:tcW w:type="dxa" w:w="2304"/>
@@ -19092,6 +19957,9 @@
         </w:tc>
       </w:tr>
       <w:tr>
+        <w:trPr>
+          <w:cantSplit/>
+        </w:trPr>
         <w:tc>
           <w:tcPr>
             <w:tcW w:type="dxa" w:w="2304"/>
@@ -19156,6 +20024,9 @@
         </w:tc>
       </w:tr>
       <w:tr>
+        <w:trPr>
+          <w:cantSplit/>
+        </w:trPr>
         <w:tc>
           <w:tcPr>
             <w:tcW w:type="dxa" w:w="2304"/>
@@ -19220,6 +20091,9 @@
         </w:tc>
       </w:tr>
       <w:tr>
+        <w:trPr>
+          <w:cantSplit/>
+        </w:trPr>
         <w:tc>
           <w:tcPr>
             <w:tcW w:type="dxa" w:w="2304"/>
@@ -19284,6 +20158,9 @@
         </w:tc>
       </w:tr>
       <w:tr>
+        <w:trPr>
+          <w:cantSplit/>
+        </w:trPr>
         <w:tc>
           <w:tcPr>
             <w:tcW w:type="dxa" w:w="4997"/>
@@ -19320,6 +20197,9 @@
         </w:tc>
       </w:tr>
       <w:tr>
+        <w:trPr>
+          <w:cantSplit/>
+        </w:trPr>
         <w:tc>
           <w:tcPr>
             <w:tcW w:type="dxa" w:w="4997"/>
@@ -19356,6 +20236,9 @@
         </w:tc>
       </w:tr>
       <w:tr>
+        <w:trPr>
+          <w:cantSplit/>
+        </w:trPr>
         <w:tc>
           <w:tcPr>
             <w:tcW w:type="dxa" w:w="4997"/>
@@ -19392,6 +20275,9 @@
         </w:tc>
       </w:tr>
       <w:tr>
+        <w:trPr>
+          <w:cantSplit/>
+        </w:trPr>
         <w:tc>
           <w:tcPr>
             <w:tcW w:type="dxa" w:w="4997"/>
@@ -19428,6 +20314,9 @@
         </w:tc>
       </w:tr>
       <w:tr>
+        <w:trPr>
+          <w:cantSplit/>
+        </w:trPr>
         <w:tc>
           <w:tcPr>
             <w:tcW w:type="dxa" w:w="4997"/>
@@ -19464,6 +20353,9 @@
         </w:tc>
       </w:tr>
       <w:tr>
+        <w:trPr>
+          <w:cantSplit/>
+        </w:trPr>
         <w:tc>
           <w:tcPr>
             <w:tcW w:type="dxa" w:w="4997"/>
@@ -19500,6 +20392,9 @@
         </w:tc>
       </w:tr>
       <w:tr>
+        <w:trPr>
+          <w:cantSplit/>
+        </w:trPr>
         <w:tc>
           <w:tcPr>
             <w:tcW w:type="dxa" w:w="4997"/>
@@ -19530,6 +20425,9 @@
         </w:tc>
       </w:tr>
       <w:tr>
+        <w:trPr>
+          <w:cantSplit/>
+        </w:trPr>
         <w:tc>
           <w:tcPr>
             <w:tcW w:type="dxa" w:w="4997"/>
@@ -19560,6 +20458,9 @@
         </w:tc>
       </w:tr>
       <w:tr>
+        <w:trPr>
+          <w:cantSplit/>
+        </w:trPr>
         <w:tc>
           <w:tcPr>
             <w:tcW w:type="dxa" w:w="4997"/>
@@ -19590,6 +20491,9 @@
         </w:tc>
       </w:tr>
       <w:tr>
+        <w:trPr>
+          <w:cantSplit/>
+        </w:trPr>
         <w:tc>
           <w:tcPr>
             <w:tcW w:type="dxa" w:w="4997"/>
@@ -19620,6 +20524,9 @@
         </w:tc>
       </w:tr>
       <w:tr>
+        <w:trPr>
+          <w:cantSplit/>
+        </w:trPr>
         <w:tc>
           <w:tcPr>
             <w:tcW w:type="dxa" w:w="4997"/>
@@ -19650,6 +20557,9 @@
         </w:tc>
       </w:tr>
       <w:tr>
+        <w:trPr>
+          <w:cantSplit/>
+        </w:trPr>
         <w:tc>
           <w:tcPr>
             <w:tcW w:type="dxa" w:w="4997"/>
@@ -19672,6 +20582,9 @@
         </w:tc>
       </w:tr>
       <w:tr>
+        <w:trPr>
+          <w:cantSplit/>
+        </w:trPr>
         <w:tc>
           <w:tcPr>
             <w:tcW w:type="dxa" w:w="4997"/>
@@ -19694,6 +20607,9 @@
         </w:tc>
       </w:tr>
       <w:tr>
+        <w:trPr>
+          <w:cantSplit/>
+        </w:trPr>
         <w:tc>
           <w:tcPr>
             <w:tcW w:type="dxa" w:w="4997"/>
@@ -19716,6 +20632,9 @@
         </w:tc>
       </w:tr>
       <w:tr>
+        <w:trPr>
+          <w:cantSplit/>
+        </w:trPr>
         <w:tc>
           <w:tcPr>
             <w:tcW w:type="dxa" w:w="4997"/>
@@ -19738,6 +20657,9 @@
         </w:tc>
       </w:tr>
       <w:tr>
+        <w:trPr>
+          <w:cantSplit/>
+        </w:trPr>
         <w:tc>
           <w:tcPr>
             <w:tcW w:type="dxa" w:w="4997"/>
@@ -19760,6 +20682,9 @@
         </w:tc>
       </w:tr>
       <w:tr>
+        <w:trPr>
+          <w:cantSplit/>
+        </w:trPr>
         <w:tc>
           <w:tcPr>
             <w:tcW w:type="dxa" w:w="4997"/>
@@ -19777,6 +20702,56 @@
           <w:p>
             <w:r>
               <w:t>A schema field that records where evidence came from or how it was classified without changing the allowed effect state.</w:t>
+            </w:r>
+          </w:p>
+        </w:tc>
+      </w:tr>
+      <w:tr>
+        <w:trPr>
+          <w:cantSplit/>
+        </w:trPr>
+        <w:tc>
+          <w:tcPr>
+            <w:tcW w:type="dxa" w:w="4997"/>
+          </w:tcPr>
+          <w:p>
+            <w:r>
+              <w:t>Signing operation metadata</w:t>
+            </w:r>
+          </w:p>
+        </w:tc>
+        <w:tc>
+          <w:tcPr>
+            <w:tcW w:type="dxa" w:w="4997"/>
+          </w:tcPr>
+          <w:p>
+            <w:r>
+              <w:t>A guarded Seal classification record for a future signing operation path; it may be ready as metadata while no signature, signer invocation, key handling, or authority exists.</w:t>
+            </w:r>
+          </w:p>
+        </w:tc>
+      </w:tr>
+      <w:tr>
+        <w:trPr>
+          <w:cantSplit/>
+        </w:trPr>
+        <w:tc>
+          <w:tcPr>
+            <w:tcW w:type="dxa" w:w="4997"/>
+          </w:tcPr>
+          <w:p>
+            <w:r>
+              <w:t>Status guard workflow</w:t>
+            </w:r>
+          </w:p>
+        </w:tc>
+        <w:tc>
+          <w:tcPr>
+            <w:tcW w:type="dxa" w:w="4997"/>
+          </w:tcPr>
+          <w:p>
+            <w:r>
+              <w:t>A CI/status lane that checks public and status records for required evidence and non-claim fields without changing implementation behavior.</w:t>
             </w:r>
           </w:p>
         </w:tc>
@@ -20068,6 +21043,10 @@
         <w:gridCol w:w="4997"/>
       </w:tblGrid>
       <w:tr>
+        <w:trPr>
+          <w:tblHeader/>
+          <w:cantSplit/>
+        </w:trPr>
         <w:tc>
           <w:tcPr>
             <w:tcW w:type="dxa" w:w="4680"/>
@@ -20120,6 +21099,9 @@
         </w:tc>
       </w:tr>
       <w:tr>
+        <w:trPr>
+          <w:cantSplit/>
+        </w:trPr>
         <w:tc>
           <w:tcPr>
             <w:tcW w:type="dxa" w:w="4680"/>
@@ -20174,6 +21156,9 @@
         </w:tc>
       </w:tr>
       <w:tr>
+        <w:trPr>
+          <w:cantSplit/>
+        </w:trPr>
         <w:tc>
           <w:tcPr>
             <w:tcW w:type="dxa" w:w="4680"/>
@@ -20228,6 +21213,9 @@
         </w:tc>
       </w:tr>
       <w:tr>
+        <w:trPr>
+          <w:cantSplit/>
+        </w:trPr>
         <w:tc>
           <w:tcPr>
             <w:tcW w:type="dxa" w:w="4680"/>
@@ -20282,6 +21270,9 @@
         </w:tc>
       </w:tr>
       <w:tr>
+        <w:trPr>
+          <w:cantSplit/>
+        </w:trPr>
         <w:tc>
           <w:tcPr>
             <w:tcW w:type="dxa" w:w="4680"/>
@@ -20336,6 +21327,9 @@
         </w:tc>
       </w:tr>
       <w:tr>
+        <w:trPr>
+          <w:cantSplit/>
+        </w:trPr>
         <w:tc>
           <w:tcPr>
             <w:tcW w:type="dxa" w:w="4680"/>
@@ -20390,6 +21384,9 @@
         </w:tc>
       </w:tr>
       <w:tr>
+        <w:trPr>
+          <w:cantSplit/>
+        </w:trPr>
         <w:tc>
           <w:tcPr>
             <w:tcW w:type="dxa" w:w="4680"/>
@@ -20444,6 +21441,9 @@
         </w:tc>
       </w:tr>
       <w:tr>
+        <w:trPr>
+          <w:cantSplit/>
+        </w:trPr>
         <w:tc>
           <w:tcPr>
             <w:tcW w:type="dxa" w:w="4680"/>
@@ -20508,7 +21508,7 @@
         <w:pStyle w:val="BodyTight"/>
       </w:pPr>
       <w:r>
-        <w:t>A strong public sentence: "Latticra is an early, local, evidence-bound substrate for report-only verification, policy regression, manifest/hash baselines, authority-neutral Ed25519 verification evidence, metadata-only Seal gate/effect/handoff/report/envelope/signature-request classification, metadata-only Console host/receipt/OS/VM contract surfaces, Lat/LIR provenance records, guarded user-local installation, and future runtime-boundary research."</w:t>
+        <w:t>A strong public sentence: "Latticra is an early, local, evidence-bound substrate for report-only verification, policy regression, manifest/hash baselines, authority-neutral Ed25519 verification evidence, metadata-only Seal gate/effect/handoff/report/envelope/signature/signing-operation classification, metadata-only Console host/receipt/OS/VM contract surfaces, Lat/LIR provenance records, guarded user-local installation, and future runtime-boundary research."</w:t>
       </w:r>
     </w:p>
     <w:p>
@@ -20549,7 +21549,7 @@
         <w:pStyle w:val="BodyTight"/>
       </w:pPr>
       <w:r>
-        <w:t>This edition was derived from the Latticra Seal handbook and recent repository material covering signed-request, freshness, verification, Seal metadata ladder extensions through signature request, Console host-adapter/receipt-request/payload/signature/OS/VM contract surfaces, Runtime Boundary Lat pipeline first-clause evidence propagation, installer, Panel, Nucleus, Nadia, macOS, Fedora/RPM, Lat/LIR, and one-pass field-engine evidence. It distinguishes implemented facts from inferred substrate architecture and preserves project non-claims.</w:t>
+        <w:t>This edition was derived from the Latticra Seal handbook and recent repository material covering signed-request, freshness, verification, Seal metadata ladder extensions through signature request and signing-operation status guards, Console host-adapter/receipt-request/payload/signature/OS/VM contract surfaces, Runtime Boundary Lat pipeline first-clause evidence propagation, installer, Panel, Nucleus, Nadia, macOS, Fedora/RPM, Lat/LIR, and one-pass field-engine evidence. It distinguishes implemented facts from inferred substrate architecture and preserves project non-claims.</w:t>
       </w:r>
     </w:p>
     <w:tbl>
@@ -20564,6 +21564,10 @@
         <w:gridCol w:w="4997"/>
       </w:tblGrid>
       <w:tr>
+        <w:trPr>
+          <w:tblHeader/>
+          <w:cantSplit/>
+        </w:trPr>
         <w:tc>
           <w:tcPr>
             <w:tcW w:type="dxa" w:w="3024"/>
@@ -20616,6 +21620,9 @@
         </w:tc>
       </w:tr>
       <w:tr>
+        <w:trPr>
+          <w:cantSplit/>
+        </w:trPr>
         <w:tc>
           <w:tcPr>
             <w:tcW w:type="dxa" w:w="3024"/>
@@ -20680,6 +21687,9 @@
         </w:tc>
       </w:tr>
       <w:tr>
+        <w:trPr>
+          <w:cantSplit/>
+        </w:trPr>
         <w:tc>
           <w:tcPr>
             <w:tcW w:type="dxa" w:w="3024"/>
@@ -20744,6 +21754,9 @@
         </w:tc>
       </w:tr>
       <w:tr>
+        <w:trPr>
+          <w:cantSplit/>
+        </w:trPr>
         <w:tc>
           <w:tcPr>
             <w:tcW w:type="dxa" w:w="3024"/>
@@ -20808,6 +21821,9 @@
         </w:tc>
       </w:tr>
       <w:tr>
+        <w:trPr>
+          <w:cantSplit/>
+        </w:trPr>
         <w:tc>
           <w:tcPr>
             <w:tcW w:type="dxa" w:w="3024"/>
@@ -20872,6 +21888,9 @@
         </w:tc>
       </w:tr>
       <w:tr>
+        <w:trPr>
+          <w:cantSplit/>
+        </w:trPr>
         <w:tc>
           <w:tcPr>
             <w:tcW w:type="dxa" w:w="3024"/>
@@ -20936,6 +21955,9 @@
         </w:tc>
       </w:tr>
       <w:tr>
+        <w:trPr>
+          <w:cantSplit/>
+        </w:trPr>
         <w:tc>
           <w:tcPr>
             <w:tcW w:type="dxa" w:w="4997"/>
@@ -20965,6 +21987,9 @@
         </w:tc>
       </w:tr>
       <w:tr>
+        <w:trPr>
+          <w:cantSplit/>
+        </w:trPr>
         <w:tc>
           <w:tcPr>
             <w:tcW w:type="dxa" w:w="4997"/>
@@ -21001,6 +22026,9 @@
         </w:tc>
       </w:tr>
       <w:tr>
+        <w:trPr>
+          <w:cantSplit/>
+        </w:trPr>
         <w:tc>
           <w:tcPr>
             <w:tcW w:type="dxa" w:w="4997"/>
@@ -21037,6 +22065,9 @@
         </w:tc>
       </w:tr>
       <w:tr>
+        <w:trPr>
+          <w:cantSplit/>
+        </w:trPr>
         <w:tc>
           <w:tcPr>
             <w:tcW w:type="dxa" w:w="4997"/>
@@ -21073,6 +22104,9 @@
         </w:tc>
       </w:tr>
       <w:tr>
+        <w:trPr>
+          <w:cantSplit/>
+        </w:trPr>
         <w:tc>
           <w:tcPr>
             <w:tcW w:type="dxa" w:w="4997"/>
@@ -21109,6 +22143,9 @@
         </w:tc>
       </w:tr>
       <w:tr>
+        <w:trPr>
+          <w:cantSplit/>
+        </w:trPr>
         <w:tc>
           <w:tcPr>
             <w:tcW w:type="dxa" w:w="4997"/>
@@ -21145,6 +22182,9 @@
         </w:tc>
       </w:tr>
       <w:tr>
+        <w:trPr>
+          <w:cantSplit/>
+        </w:trPr>
         <w:tc>
           <w:tcPr>
             <w:tcW w:type="dxa" w:w="4997"/>
@@ -21175,6 +22215,9 @@
         </w:tc>
       </w:tr>
       <w:tr>
+        <w:trPr>
+          <w:cantSplit/>
+        </w:trPr>
         <w:tc>
           <w:tcPr>
             <w:tcW w:type="dxa" w:w="4997"/>
@@ -21205,6 +22248,9 @@
         </w:tc>
       </w:tr>
       <w:tr>
+        <w:trPr>
+          <w:cantSplit/>
+        </w:trPr>
         <w:tc>
           <w:tcPr>
             <w:tcW w:type="dxa" w:w="4997"/>
@@ -21222,6 +22268,31 @@
           <w:p>
             <w:r>
               <w:t>Record-level propagation of first lowered clause node, role, effect, name, operator, and value while preserving no-effect runtime posture.</w:t>
+            </w:r>
+          </w:p>
+        </w:tc>
+      </w:tr>
+      <w:tr>
+        <w:trPr>
+          <w:cantSplit/>
+        </w:trPr>
+        <w:tc>
+          <w:tcPr>
+            <w:tcW w:type="dxa" w:w="4997"/>
+          </w:tcPr>
+          <w:p>
+            <w:r>
+              <w:t>Seal signing operation status guard</w:t>
+            </w:r>
+          </w:p>
+        </w:tc>
+        <w:tc>
+          <w:tcPr>
+            <w:tcW w:type="dxa" w:w="4997"/>
+          </w:tcPr>
+          <w:p>
+            <w:r>
+              <w:t>Metadata-only signing operation checkpoint, signer-invocation predecessor alignment, status workflow, and no-signing authority denials.</w:t>
             </w:r>
           </w:p>
         </w:tc>
@@ -21344,7 +22415,7 @@
         <w:pStyle w:val="ListNumber"/>
       </w:pPr>
       <w:r>
-        <w:t>For Seal work, follow the ladder through verified receipt, gate, effect, handoff, report, envelope, and signature-request metadata; never skip from evidence to authority.</w:t>
+        <w:t>For Seal work, follow the ladder through verified receipt, gate, effect, handoff, report, envelope, signature request, signing authorization, signer handoff, signer invocation, and signing-operation metadata; never skip from readiness to signing or authority.</w:t>
       </w:r>
     </w:p>
     <w:p>

</xml_diff>

<commit_message>
Prepare quality rollup and Panel run layout
</commit_message>
<xml_diff>
--- a/docs/latticra-system-substrate/the-latticra-system-substrate.docx
+++ b/docs/latticra-system-substrate/the-latticra-system-substrate.docx
@@ -104,7 +104,7 @@
         <w:jc w:val="center"/>
       </w:pPr>
       <w:r>
-        <w:t>Working Draft 0.13 - 2026-05-26</w:t>
+        <w:t>Working Draft 0.14 - 2026-05-26</w:t>
       </w:r>
     </w:p>
     <w:p>
@@ -153,7 +153,7 @@
         <w:pStyle w:val="BodyTight"/>
       </w:pPr>
       <w:r>
-        <w:t>Source posture: this edition draws from the Seal handbook plus current Seal signed-request, request-freshness, verification-receipt, crypto-verify-backend, Ed25519 verify-only, verified-receipt-promotion, verified-capability-gate, verified-effect-decision, runtime-handoff-evaluation, runtime-handoff-report, report-envelope, signature-request, signing-authorization, signer-handoff, signer-invocation, signing-operation, capability-gate, and effect-decision records; Latticra Console Stage-0 host-adapter, receipt-request, receipt-payload, signature-request-binding, OS-base, and VM-evidence contract surfaces; Runtime Boundary Lat pipeline first-clause evidence propagation; Panel/installer receipts; Fedora and macOS validation material; Lat/LIR, Nucleus, Nadia, runtime-boundary, kernel-lifecycle, and defensive threat-model notes; and the one-pass field engine research artifact.</w:t>
+        <w:t>Source posture: this edition draws from the Seal handbook plus current Seal signed-request, request-freshness, verification-receipt, crypto-verify-backend, Ed25519 verify-only, verified-receipt-promotion, verified-capability-gate, verified-effect-decision, runtime-handoff-evaluation, runtime-handoff-report, report-envelope, signature-request, signing-authorization, signer-handoff, signer-invocation, signing-operation, capability-gate, and effect-decision records; Latticra Console Stage-0 host-adapter, receipt-request, receipt-payload, signature-request-binding, OS-base, and VM-evidence contract surfaces; Runtime Boundary Lat pipeline first-clause evidence propagation; Fedora disposable VM CLI payload validation evidence and README/status alignment; Panel/installer receipts; Fedora and macOS validation material; Lat/LIR, Nucleus, Nadia, runtime-boundary, kernel-lifecycle, and defensive threat-model notes; and the one-pass field engine research artifact.</w:t>
       </w:r>
     </w:p>
     <w:p>
@@ -5491,6 +5491,41 @@
           </w:p>
         </w:tc>
       </w:tr>
+      <w:tr>
+        <w:trPr>
+          <w:cantSplit/>
+        </w:trPr>
+        <w:tc>
+          <w:tcPr>
+            <w:tcW w:type="dxa" w:w="3331"/>
+          </w:tcPr>
+          <w:p>
+            <w:r>
+              <w:t>Fedora VM CLI payload readiness</w:t>
+            </w:r>
+          </w:p>
+        </w:tc>
+        <w:tc>
+          <w:tcPr>
+            <w:tcW w:type="dxa" w:w="3331"/>
+          </w:tcPr>
+          <w:p>
+            <w:r>
+              <w:t>Accepted disposable Fedora VM evidence for the bounded CLI/documentation payload; host_install_ready_for_cli_payload=1 while production, Fedora distribution, approval, daily-driver, and immutable Fedora claims stay zero.</w:t>
+            </w:r>
+          </w:p>
+        </w:tc>
+        <w:tc>
+          <w:tcPr>
+            <w:tcW w:type="dxa" w:w="3331"/>
+          </w:tcPr>
+          <w:p>
+            <w:r>
+              <w:t>Say bounded CLI payload evidence; do not say Fedora approval, production installer readiness, daily-driver readiness, security capability, update/recovery safety, sandboxing, malware/ransomware prevention, or OS replacement.</w:t>
+            </w:r>
+          </w:p>
+        </w:tc>
+      </w:tr>
     </w:tbl>
     <w:p>
       <w:pPr>
@@ -9488,6 +9523,30 @@
     </w:p>
     <w:p>
       <w:pPr>
+        <w:pStyle w:val="Heading2"/>
+      </w:pPr>
+      <w:r>
+        <w:t>6.6 Fedora CLI payload evidence is payload-scoped</w:t>
+      </w:r>
+    </w:p>
+    <w:p>
+      <w:pPr>
+        <w:pStyle w:val="BodyTight"/>
+      </w:pPr>
+      <w:r>
+        <w:t>The Fedora VM CLI payload lane now has accepted disposable-VM evidence for the local RPM payload that installs /usr/bin/latticra and /usr/share/doc/latticra/README.md. That moves the narrow payload claim to host_install_ready_for_cli_payload=1 only inside the bounded evidence story: local RPM build, disposable Fedora VM install, CLI --status/--version/--report and invalid-command validation, RPM removal, and post-removal absence proof.</w:t>
+      </w:r>
+    </w:p>
+    <w:p>
+      <w:pPr>
+        <w:pStyle w:val="BodyTight"/>
+      </w:pPr>
+      <w:r>
+        <w:t>The claim is deliberately not a distribution claim. The same record keeps production_installer_ready=0, fedora_distribution_ready=0, fedora_approval_claimed=0, daily_driver_install_ready=0, and immutable_fedora_ready=0. It also does not claim update safety, recovery safety, sandboxing, malware prevention, ransomware prevention, security capability, boot integration, SELinux/systemd authority, or operating-system replacement readiness.</w:t>
+      </w:r>
+    </w:p>
+    <w:p>
+      <w:pPr>
         <w:pStyle w:val="Heading1"/>
       </w:pPr>
       <w:r>
@@ -13294,6 +13353,30 @@
     </w:p>
     <w:p>
       <w:pPr>
+        <w:pStyle w:val="Heading2"/>
+      </w:pPr>
+      <w:r>
+        <w:t>11.11 Host-install readiness can be payload-scoped</w:t>
+      </w:r>
+    </w:p>
+    <w:p>
+      <w:pPr>
+        <w:pStyle w:val="BodyTight"/>
+      </w:pPr>
+      <w:r>
+        <w:t>A readiness flag is safer when it names its object. The Fedora CLI payload record shows the pattern: host_install_ready_for_cli_payload=1 does not mean host install is broadly safe; it means the specific CLI payload and documentation payload were validated under a disposable VM transcript and removal proof.</w:t>
+      </w:r>
+    </w:p>
+    <w:p>
+      <w:pPr>
+        <w:pStyle w:val="BodyTight"/>
+      </w:pPr>
+      <w:r>
+        <w:t>Readers should reject any sentence that drops the qualifier "for CLI payload" or moves from the accepted payload to production installer readiness, Fedora approval, immutable-host support, daily-driver use, update/recovery safety, security protection, or OS replacement. The witness graph must keep package evidence, installed paths, command outputs, removal proof, and non-claim fields together.</w:t>
+      </w:r>
+    </w:p>
+    <w:p>
+      <w:pPr>
         <w:pStyle w:val="Heading1"/>
       </w:pPr>
       <w:r>
@@ -16901,6 +16984,30 @@
     </w:p>
     <w:p>
       <w:pPr>
+        <w:pStyle w:val="Heading2"/>
+      </w:pPr>
+      <w:r>
+        <w:t>14.14 Fedora CLI payload validation schema</w:t>
+      </w:r>
+    </w:p>
+    <w:p>
+      <w:pPr>
+        <w:pStyle w:val="BodyTight"/>
+      </w:pPr>
+      <w:r>
+        <w:t>The Fedora CLI payload evidence record should preserve both positive and negative fields. Positive fields include fedora_vm_cli_payload_validation_status=evidence-recorded, disposable_vm_cli_validation_transcript_present=1, disposable_vm_cli_validation_completed=1, host_install_ready_for_cli_payload=1, rpm_payload_contains_cli_binary=1, rpm_payload_contains_readme=1, cli_status_validation_performed=1, cli_version_validation_performed=1, cli_report_validation_performed=1, and removal_validation_performed=1.</w:t>
+      </w:r>
+    </w:p>
+    <w:p>
+      <w:pPr>
+        <w:pStyle w:val="BodyTight"/>
+      </w:pPr>
+      <w:r>
+        <w:t>Negative fields are not decoration: production_installer_ready=0, fedora_distribution_ready=0, fedora_approval_claimed=0, daily_driver_install_ready=0, immutable_fedora_ready=0, plus no service, kernel, boot, SELinux, network, update-safety, recovery-safety, sandboxing, malware-prevention, ransomware-prevention, or OS-replacement claim. Schema consumers should keep the payload paths visible: /usr/bin/latticra and /usr/share/doc/latticra/README.md.</w:t>
+      </w:r>
+    </w:p>
+    <w:p>
+      <w:pPr>
         <w:pStyle w:val="Heading1"/>
       </w:pPr>
       <w:r>
@@ -17711,6 +17818,41 @@
           </w:p>
         </w:tc>
       </w:tr>
+      <w:tr>
+        <w:trPr>
+          <w:cantSplit/>
+        </w:trPr>
+        <w:tc>
+          <w:tcPr>
+            <w:tcW w:type="dxa" w:w="3331"/>
+          </w:tcPr>
+          <w:p>
+            <w:r>
+              <w:t>Fedora VM CLI payload README alignment</w:t>
+            </w:r>
+          </w:p>
+        </w:tc>
+        <w:tc>
+          <w:tcPr>
+            <w:tcW w:type="dxa" w:w="3331"/>
+          </w:tcPr>
+          <w:p>
+            <w:r>
+              <w:t>Validate that root README/status wording reflects accepted disposable VM CLI payload evidence without widening claims.</w:t>
+            </w:r>
+          </w:p>
+        </w:tc>
+        <w:tc>
+          <w:tcPr>
+            <w:tcW w:type="dxa" w:w="3331"/>
+          </w:tcPr>
+          <w:p>
+            <w:r>
+              <w:t>Transcript/status guard showing host_install_ready_for_cli_payload=1 only for /usr/bin/latticra and /usr/share/doc/latticra/README.md, with production/Fedora/daily-driver claims zero.</w:t>
+            </w:r>
+          </w:p>
+        </w:tc>
+      </w:tr>
     </w:tbl>
     <w:p>
       <w:pPr>
@@ -18210,6 +18352,30 @@
       </w:pPr>
       <w:r>
         <w:t>The lane should fail if public/status records omit the predecessor chain or if any signing-adjacent behavior appears early: signature_performed, verification_performed, signer_invoked, private_key_handling, key_generation_performed, trust_store_loaded, revocation_lookup_performed, host/network behavior, or runtime authority.</w:t>
+      </w:r>
+    </w:p>
+    <w:p>
+      <w:pPr>
+        <w:pStyle w:val="Heading2"/>
+      </w:pPr>
+      <w:r>
+        <w:t>15.14 Fedora VM CLI payload README alignment validation</w:t>
+      </w:r>
+    </w:p>
+    <w:p>
+      <w:pPr>
+        <w:pStyle w:val="BodyTight"/>
+      </w:pPr>
+      <w:r>
+        <w:t>The README alignment guard should prove that public wording follows the accepted disposable VM evidence without widening it. The current guard is sh scripts/test-fedora-vm-cli-payload-readme-alignment.sh, paired with the validation evidence/status guards and the local no-effect CLI status-surface guard.</w:t>
+      </w:r>
+    </w:p>
+    <w:p>
+      <w:pPr>
+        <w:pStyle w:val="BodyTight"/>
+      </w:pPr>
+      <w:r>
+        <w:t>The lane should fail if the root README reverts to runner-readiness-only wording after evidence is accepted, omits the bounded payload paths, drops host_install_ready_for_cli_payload=1, or removes the zero claims for production_installer_ready, fedora_distribution_ready, fedora_approval_claimed, daily_driver_install_ready, and immutable_fedora_ready. It should also fail on production-ready, Fedora-approved, daily-driver-safe, immutable-Fedora-ready, security product, update-safety, recovery-safety, sandboxing, malware-prevention, ransomware-prevention, or OS-replacement language.</w:t>
       </w:r>
     </w:p>
     <w:p>
@@ -19112,6 +19278,41 @@
           </w:p>
         </w:tc>
       </w:tr>
+      <w:tr>
+        <w:trPr>
+          <w:cantSplit/>
+        </w:trPr>
+        <w:tc>
+          <w:tcPr>
+            <w:tcW w:type="dxa" w:w="3331"/>
+          </w:tcPr>
+          <w:p>
+            <w:r>
+              <w:t>12. Fedora CLI payload evidence alignment</w:t>
+            </w:r>
+          </w:p>
+        </w:tc>
+        <w:tc>
+          <w:tcPr>
+            <w:tcW w:type="dxa" w:w="3331"/>
+          </w:tcPr>
+          <w:p>
+            <w:r>
+              <w:t>Keep package-readiness language scoped to the validated disposable VM CLI payload.</w:t>
+            </w:r>
+          </w:p>
+        </w:tc>
+        <w:tc>
+          <w:tcPr>
+            <w:tcW w:type="dxa" w:w="3331"/>
+          </w:tcPr>
+          <w:p>
+            <w:r>
+              <w:t>README, status, validation evidence, and guard lanes agree on host_install_ready_for_cli_payload=1 while production/Fedora/daily-driver/immutable claims remain zero.</w:t>
+            </w:r>
+          </w:p>
+        </w:tc>
+      </w:tr>
     </w:tbl>
     <w:p>
       <w:pPr>
@@ -20756,6 +20957,56 @@
           </w:p>
         </w:tc>
       </w:tr>
+      <w:tr>
+        <w:trPr>
+          <w:cantSplit/>
+        </w:trPr>
+        <w:tc>
+          <w:tcPr>
+            <w:tcW w:type="dxa" w:w="4997"/>
+          </w:tcPr>
+          <w:p>
+            <w:r>
+              <w:t>Disposable Fedora VM CLI payload</w:t>
+            </w:r>
+          </w:p>
+        </w:tc>
+        <w:tc>
+          <w:tcPr>
+            <w:tcW w:type="dxa" w:w="4997"/>
+          </w:tcPr>
+          <w:p>
+            <w:r>
+              <w:t>The bounded local RPM payload validated inside a disposable Fedora VM: /usr/bin/latticra plus /usr/share/doc/latticra/README.md, with no production, approval, daily-driver, or OS-replacement claim.</w:t>
+            </w:r>
+          </w:p>
+        </w:tc>
+      </w:tr>
+      <w:tr>
+        <w:trPr>
+          <w:cantSplit/>
+        </w:trPr>
+        <w:tc>
+          <w:tcPr>
+            <w:tcW w:type="dxa" w:w="4997"/>
+          </w:tcPr>
+          <w:p>
+            <w:r>
+              <w:t>Host install ready for CLI payload</w:t>
+            </w:r>
+          </w:p>
+        </w:tc>
+        <w:tc>
+          <w:tcPr>
+            <w:tcW w:type="dxa" w:w="4997"/>
+          </w:tcPr>
+          <w:p>
+            <w:r>
+              <w:t>A payload-scoped readiness field meaning the specific CLI/documentation payload has disposable-VM install, command, removal, and absence evidence; it is not general host-install readiness.</w:t>
+            </w:r>
+          </w:p>
+        </w:tc>
+      </w:tr>
     </w:tbl>
     <w:p>
       <w:pPr>
@@ -21508,7 +21759,7 @@
         <w:pStyle w:val="BodyTight"/>
       </w:pPr>
       <w:r>
-        <w:t>A strong public sentence: "Latticra is an early, local, evidence-bound substrate for report-only verification, policy regression, manifest/hash baselines, authority-neutral Ed25519 verification evidence, metadata-only Seal gate/effect/handoff/report/envelope/signature/signing-operation classification, metadata-only Console host/receipt/OS/VM contract surfaces, Lat/LIR provenance records, guarded user-local installation, and future runtime-boundary research."</w:t>
+        <w:t>A strong public sentence: "Latticra is an early, local, evidence-bound substrate for report-only verification, policy regression, manifest/hash baselines, authority-neutral Ed25519 verification evidence, metadata-only Seal gate/effect/handoff/report/envelope/signature/signing-operation classification, metadata-only Console host/receipt/OS/VM contract surfaces, Lat/LIR provenance records, guarded user-local installation, disposable Fedora VM CLI payload evidence, and future runtime-boundary research."</w:t>
       </w:r>
     </w:p>
     <w:p>
@@ -21549,7 +21800,7 @@
         <w:pStyle w:val="BodyTight"/>
       </w:pPr>
       <w:r>
-        <w:t>This edition was derived from the Latticra Seal handbook and recent repository material covering signed-request, freshness, verification, Seal metadata ladder extensions through signature request and signing-operation status guards, Console host-adapter/receipt-request/payload/signature/OS/VM contract surfaces, Runtime Boundary Lat pipeline first-clause evidence propagation, installer, Panel, Nucleus, Nadia, macOS, Fedora/RPM, Lat/LIR, and one-pass field-engine evidence. It distinguishes implemented facts from inferred substrate architecture and preserves project non-claims.</w:t>
+        <w:t>This edition was derived from the Latticra Seal handbook and recent repository material covering signed-request, freshness, verification, Seal metadata ladder extensions through signature request and signing-operation status guards, Console host-adapter/receipt-request/payload/signature/OS/VM contract surfaces, Runtime Boundary Lat pipeline first-clause evidence propagation, Fedora VM CLI payload validation evidence and README/status alignment, installer, Panel, Nucleus, Nadia, macOS, Fedora/RPM, Lat/LIR, and one-pass field-engine evidence. It distinguishes implemented facts from inferred substrate architecture and preserves project non-claims.</w:t>
       </w:r>
     </w:p>
     <w:tbl>
@@ -22297,6 +22548,31 @@
           </w:p>
         </w:tc>
       </w:tr>
+      <w:tr>
+        <w:trPr>
+          <w:cantSplit/>
+        </w:trPr>
+        <w:tc>
+          <w:tcPr>
+            <w:tcW w:type="dxa" w:w="4997"/>
+          </w:tcPr>
+          <w:p>
+            <w:r>
+              <w:t>Fedora VM CLI payload evidence</w:t>
+            </w:r>
+          </w:p>
+        </w:tc>
+        <w:tc>
+          <w:tcPr>
+            <w:tcW w:type="dxa" w:w="4997"/>
+          </w:tcPr>
+          <w:p>
+            <w:r>
+              <w:t>Disposable Fedora VM transcript, README/status alignment, payload paths, command validation, removal proof, and non-claim fields for host_install_ready_for_cli_payload=1.</w:t>
+            </w:r>
+          </w:p>
+        </w:tc>
+      </w:tr>
     </w:tbl>
     <w:p>
       <w:pPr>
@@ -22408,6 +22684,14 @@
       </w:pPr>
       <w:r>
         <w:t>For platform work, distinguish dry-run, installroot, disposable-VM, manual-host, and production-installer evidence.</w:t>
+      </w:r>
+    </w:p>
+    <w:p>
+      <w:pPr>
+        <w:pStyle w:val="ListNumber"/>
+      </w:pPr>
+      <w:r>
+        <w:t>For Fedora packaging work, keep host_install_ready_for_cli_payload scoped to the validated /usr/bin/latticra and /usr/share/doc/latticra/README.md payload; do not convert it into Fedora approval, production readiness, daily-driver safety, security protection, or OS replacement.</w:t>
       </w:r>
     </w:p>
     <w:p>

</xml_diff>

<commit_message>
Prepare quality rollup and Panel run layout (#373)
</commit_message>
<xml_diff>
--- a/docs/latticra-system-substrate/the-latticra-system-substrate.docx
+++ b/docs/latticra-system-substrate/the-latticra-system-substrate.docx
@@ -104,7 +104,7 @@
         <w:jc w:val="center"/>
       </w:pPr>
       <w:r>
-        <w:t>Working Draft 0.13 - 2026-05-26</w:t>
+        <w:t>Working Draft 0.14 - 2026-05-26</w:t>
       </w:r>
     </w:p>
     <w:p>
@@ -153,7 +153,7 @@
         <w:pStyle w:val="BodyTight"/>
       </w:pPr>
       <w:r>
-        <w:t>Source posture: this edition draws from the Seal handbook plus current Seal signed-request, request-freshness, verification-receipt, crypto-verify-backend, Ed25519 verify-only, verified-receipt-promotion, verified-capability-gate, verified-effect-decision, runtime-handoff-evaluation, runtime-handoff-report, report-envelope, signature-request, signing-authorization, signer-handoff, signer-invocation, signing-operation, capability-gate, and effect-decision records; Latticra Console Stage-0 host-adapter, receipt-request, receipt-payload, signature-request-binding, OS-base, and VM-evidence contract surfaces; Runtime Boundary Lat pipeline first-clause evidence propagation; Panel/installer receipts; Fedora and macOS validation material; Lat/LIR, Nucleus, Nadia, runtime-boundary, kernel-lifecycle, and defensive threat-model notes; and the one-pass field engine research artifact.</w:t>
+        <w:t>Source posture: this edition draws from the Seal handbook plus current Seal signed-request, request-freshness, verification-receipt, crypto-verify-backend, Ed25519 verify-only, verified-receipt-promotion, verified-capability-gate, verified-effect-decision, runtime-handoff-evaluation, runtime-handoff-report, report-envelope, signature-request, signing-authorization, signer-handoff, signer-invocation, signing-operation, capability-gate, and effect-decision records; Latticra Console Stage-0 host-adapter, receipt-request, receipt-payload, signature-request-binding, OS-base, and VM-evidence contract surfaces; Runtime Boundary Lat pipeline first-clause evidence propagation; Fedora disposable VM CLI payload validation evidence and README/status alignment; Panel/installer receipts; Fedora and macOS validation material; Lat/LIR, Nucleus, Nadia, runtime-boundary, kernel-lifecycle, and defensive threat-model notes; and the one-pass field engine research artifact.</w:t>
       </w:r>
     </w:p>
     <w:p>
@@ -5491,6 +5491,41 @@
           </w:p>
         </w:tc>
       </w:tr>
+      <w:tr>
+        <w:trPr>
+          <w:cantSplit/>
+        </w:trPr>
+        <w:tc>
+          <w:tcPr>
+            <w:tcW w:type="dxa" w:w="3331"/>
+          </w:tcPr>
+          <w:p>
+            <w:r>
+              <w:t>Fedora VM CLI payload readiness</w:t>
+            </w:r>
+          </w:p>
+        </w:tc>
+        <w:tc>
+          <w:tcPr>
+            <w:tcW w:type="dxa" w:w="3331"/>
+          </w:tcPr>
+          <w:p>
+            <w:r>
+              <w:t>Accepted disposable Fedora VM evidence for the bounded CLI/documentation payload; host_install_ready_for_cli_payload=1 while production, Fedora distribution, approval, daily-driver, and immutable Fedora claims stay zero.</w:t>
+            </w:r>
+          </w:p>
+        </w:tc>
+        <w:tc>
+          <w:tcPr>
+            <w:tcW w:type="dxa" w:w="3331"/>
+          </w:tcPr>
+          <w:p>
+            <w:r>
+              <w:t>Say bounded CLI payload evidence; do not say Fedora approval, production installer readiness, daily-driver readiness, security capability, update/recovery safety, sandboxing, malware/ransomware prevention, or OS replacement.</w:t>
+            </w:r>
+          </w:p>
+        </w:tc>
+      </w:tr>
     </w:tbl>
     <w:p>
       <w:pPr>
@@ -9488,6 +9523,30 @@
     </w:p>
     <w:p>
       <w:pPr>
+        <w:pStyle w:val="Heading2"/>
+      </w:pPr>
+      <w:r>
+        <w:t>6.6 Fedora CLI payload evidence is payload-scoped</w:t>
+      </w:r>
+    </w:p>
+    <w:p>
+      <w:pPr>
+        <w:pStyle w:val="BodyTight"/>
+      </w:pPr>
+      <w:r>
+        <w:t>The Fedora VM CLI payload lane now has accepted disposable-VM evidence for the local RPM payload that installs /usr/bin/latticra and /usr/share/doc/latticra/README.md. That moves the narrow payload claim to host_install_ready_for_cli_payload=1 only inside the bounded evidence story: local RPM build, disposable Fedora VM install, CLI --status/--version/--report and invalid-command validation, RPM removal, and post-removal absence proof.</w:t>
+      </w:r>
+    </w:p>
+    <w:p>
+      <w:pPr>
+        <w:pStyle w:val="BodyTight"/>
+      </w:pPr>
+      <w:r>
+        <w:t>The claim is deliberately not a distribution claim. The same record keeps production_installer_ready=0, fedora_distribution_ready=0, fedora_approval_claimed=0, daily_driver_install_ready=0, and immutable_fedora_ready=0. It also does not claim update safety, recovery safety, sandboxing, malware prevention, ransomware prevention, security capability, boot integration, SELinux/systemd authority, or operating-system replacement readiness.</w:t>
+      </w:r>
+    </w:p>
+    <w:p>
+      <w:pPr>
         <w:pStyle w:val="Heading1"/>
       </w:pPr>
       <w:r>
@@ -13294,6 +13353,30 @@
     </w:p>
     <w:p>
       <w:pPr>
+        <w:pStyle w:val="Heading2"/>
+      </w:pPr>
+      <w:r>
+        <w:t>11.11 Host-install readiness can be payload-scoped</w:t>
+      </w:r>
+    </w:p>
+    <w:p>
+      <w:pPr>
+        <w:pStyle w:val="BodyTight"/>
+      </w:pPr>
+      <w:r>
+        <w:t>A readiness flag is safer when it names its object. The Fedora CLI payload record shows the pattern: host_install_ready_for_cli_payload=1 does not mean host install is broadly safe; it means the specific CLI payload and documentation payload were validated under a disposable VM transcript and removal proof.</w:t>
+      </w:r>
+    </w:p>
+    <w:p>
+      <w:pPr>
+        <w:pStyle w:val="BodyTight"/>
+      </w:pPr>
+      <w:r>
+        <w:t>Readers should reject any sentence that drops the qualifier "for CLI payload" or moves from the accepted payload to production installer readiness, Fedora approval, immutable-host support, daily-driver use, update/recovery safety, security protection, or OS replacement. The witness graph must keep package evidence, installed paths, command outputs, removal proof, and non-claim fields together.</w:t>
+      </w:r>
+    </w:p>
+    <w:p>
+      <w:pPr>
         <w:pStyle w:val="Heading1"/>
       </w:pPr>
       <w:r>
@@ -16901,6 +16984,30 @@
     </w:p>
     <w:p>
       <w:pPr>
+        <w:pStyle w:val="Heading2"/>
+      </w:pPr>
+      <w:r>
+        <w:t>14.14 Fedora CLI payload validation schema</w:t>
+      </w:r>
+    </w:p>
+    <w:p>
+      <w:pPr>
+        <w:pStyle w:val="BodyTight"/>
+      </w:pPr>
+      <w:r>
+        <w:t>The Fedora CLI payload evidence record should preserve both positive and negative fields. Positive fields include fedora_vm_cli_payload_validation_status=evidence-recorded, disposable_vm_cli_validation_transcript_present=1, disposable_vm_cli_validation_completed=1, host_install_ready_for_cli_payload=1, rpm_payload_contains_cli_binary=1, rpm_payload_contains_readme=1, cli_status_validation_performed=1, cli_version_validation_performed=1, cli_report_validation_performed=1, and removal_validation_performed=1.</w:t>
+      </w:r>
+    </w:p>
+    <w:p>
+      <w:pPr>
+        <w:pStyle w:val="BodyTight"/>
+      </w:pPr>
+      <w:r>
+        <w:t>Negative fields are not decoration: production_installer_ready=0, fedora_distribution_ready=0, fedora_approval_claimed=0, daily_driver_install_ready=0, immutable_fedora_ready=0, plus no service, kernel, boot, SELinux, network, update-safety, recovery-safety, sandboxing, malware-prevention, ransomware-prevention, or OS-replacement claim. Schema consumers should keep the payload paths visible: /usr/bin/latticra and /usr/share/doc/latticra/README.md.</w:t>
+      </w:r>
+    </w:p>
+    <w:p>
+      <w:pPr>
         <w:pStyle w:val="Heading1"/>
       </w:pPr>
       <w:r>
@@ -17711,6 +17818,41 @@
           </w:p>
         </w:tc>
       </w:tr>
+      <w:tr>
+        <w:trPr>
+          <w:cantSplit/>
+        </w:trPr>
+        <w:tc>
+          <w:tcPr>
+            <w:tcW w:type="dxa" w:w="3331"/>
+          </w:tcPr>
+          <w:p>
+            <w:r>
+              <w:t>Fedora VM CLI payload README alignment</w:t>
+            </w:r>
+          </w:p>
+        </w:tc>
+        <w:tc>
+          <w:tcPr>
+            <w:tcW w:type="dxa" w:w="3331"/>
+          </w:tcPr>
+          <w:p>
+            <w:r>
+              <w:t>Validate that root README/status wording reflects accepted disposable VM CLI payload evidence without widening claims.</w:t>
+            </w:r>
+          </w:p>
+        </w:tc>
+        <w:tc>
+          <w:tcPr>
+            <w:tcW w:type="dxa" w:w="3331"/>
+          </w:tcPr>
+          <w:p>
+            <w:r>
+              <w:t>Transcript/status guard showing host_install_ready_for_cli_payload=1 only for /usr/bin/latticra and /usr/share/doc/latticra/README.md, with production/Fedora/daily-driver claims zero.</w:t>
+            </w:r>
+          </w:p>
+        </w:tc>
+      </w:tr>
     </w:tbl>
     <w:p>
       <w:pPr>
@@ -18210,6 +18352,30 @@
       </w:pPr>
       <w:r>
         <w:t>The lane should fail if public/status records omit the predecessor chain or if any signing-adjacent behavior appears early: signature_performed, verification_performed, signer_invoked, private_key_handling, key_generation_performed, trust_store_loaded, revocation_lookup_performed, host/network behavior, or runtime authority.</w:t>
+      </w:r>
+    </w:p>
+    <w:p>
+      <w:pPr>
+        <w:pStyle w:val="Heading2"/>
+      </w:pPr>
+      <w:r>
+        <w:t>15.14 Fedora VM CLI payload README alignment validation</w:t>
+      </w:r>
+    </w:p>
+    <w:p>
+      <w:pPr>
+        <w:pStyle w:val="BodyTight"/>
+      </w:pPr>
+      <w:r>
+        <w:t>The README alignment guard should prove that public wording follows the accepted disposable VM evidence without widening it. The current guard is sh scripts/test-fedora-vm-cli-payload-readme-alignment.sh, paired with the validation evidence/status guards and the local no-effect CLI status-surface guard.</w:t>
+      </w:r>
+    </w:p>
+    <w:p>
+      <w:pPr>
+        <w:pStyle w:val="BodyTight"/>
+      </w:pPr>
+      <w:r>
+        <w:t>The lane should fail if the root README reverts to runner-readiness-only wording after evidence is accepted, omits the bounded payload paths, drops host_install_ready_for_cli_payload=1, or removes the zero claims for production_installer_ready, fedora_distribution_ready, fedora_approval_claimed, daily_driver_install_ready, and immutable_fedora_ready. It should also fail on production-ready, Fedora-approved, daily-driver-safe, immutable-Fedora-ready, security product, update-safety, recovery-safety, sandboxing, malware-prevention, ransomware-prevention, or OS-replacement language.</w:t>
       </w:r>
     </w:p>
     <w:p>
@@ -19112,6 +19278,41 @@
           </w:p>
         </w:tc>
       </w:tr>
+      <w:tr>
+        <w:trPr>
+          <w:cantSplit/>
+        </w:trPr>
+        <w:tc>
+          <w:tcPr>
+            <w:tcW w:type="dxa" w:w="3331"/>
+          </w:tcPr>
+          <w:p>
+            <w:r>
+              <w:t>12. Fedora CLI payload evidence alignment</w:t>
+            </w:r>
+          </w:p>
+        </w:tc>
+        <w:tc>
+          <w:tcPr>
+            <w:tcW w:type="dxa" w:w="3331"/>
+          </w:tcPr>
+          <w:p>
+            <w:r>
+              <w:t>Keep package-readiness language scoped to the validated disposable VM CLI payload.</w:t>
+            </w:r>
+          </w:p>
+        </w:tc>
+        <w:tc>
+          <w:tcPr>
+            <w:tcW w:type="dxa" w:w="3331"/>
+          </w:tcPr>
+          <w:p>
+            <w:r>
+              <w:t>README, status, validation evidence, and guard lanes agree on host_install_ready_for_cli_payload=1 while production/Fedora/daily-driver/immutable claims remain zero.</w:t>
+            </w:r>
+          </w:p>
+        </w:tc>
+      </w:tr>
     </w:tbl>
     <w:p>
       <w:pPr>
@@ -20756,6 +20957,56 @@
           </w:p>
         </w:tc>
       </w:tr>
+      <w:tr>
+        <w:trPr>
+          <w:cantSplit/>
+        </w:trPr>
+        <w:tc>
+          <w:tcPr>
+            <w:tcW w:type="dxa" w:w="4997"/>
+          </w:tcPr>
+          <w:p>
+            <w:r>
+              <w:t>Disposable Fedora VM CLI payload</w:t>
+            </w:r>
+          </w:p>
+        </w:tc>
+        <w:tc>
+          <w:tcPr>
+            <w:tcW w:type="dxa" w:w="4997"/>
+          </w:tcPr>
+          <w:p>
+            <w:r>
+              <w:t>The bounded local RPM payload validated inside a disposable Fedora VM: /usr/bin/latticra plus /usr/share/doc/latticra/README.md, with no production, approval, daily-driver, or OS-replacement claim.</w:t>
+            </w:r>
+          </w:p>
+        </w:tc>
+      </w:tr>
+      <w:tr>
+        <w:trPr>
+          <w:cantSplit/>
+        </w:trPr>
+        <w:tc>
+          <w:tcPr>
+            <w:tcW w:type="dxa" w:w="4997"/>
+          </w:tcPr>
+          <w:p>
+            <w:r>
+              <w:t>Host install ready for CLI payload</w:t>
+            </w:r>
+          </w:p>
+        </w:tc>
+        <w:tc>
+          <w:tcPr>
+            <w:tcW w:type="dxa" w:w="4997"/>
+          </w:tcPr>
+          <w:p>
+            <w:r>
+              <w:t>A payload-scoped readiness field meaning the specific CLI/documentation payload has disposable-VM install, command, removal, and absence evidence; it is not general host-install readiness.</w:t>
+            </w:r>
+          </w:p>
+        </w:tc>
+      </w:tr>
     </w:tbl>
     <w:p>
       <w:pPr>
@@ -21508,7 +21759,7 @@
         <w:pStyle w:val="BodyTight"/>
       </w:pPr>
       <w:r>
-        <w:t>A strong public sentence: "Latticra is an early, local, evidence-bound substrate for report-only verification, policy regression, manifest/hash baselines, authority-neutral Ed25519 verification evidence, metadata-only Seal gate/effect/handoff/report/envelope/signature/signing-operation classification, metadata-only Console host/receipt/OS/VM contract surfaces, Lat/LIR provenance records, guarded user-local installation, and future runtime-boundary research."</w:t>
+        <w:t>A strong public sentence: "Latticra is an early, local, evidence-bound substrate for report-only verification, policy regression, manifest/hash baselines, authority-neutral Ed25519 verification evidence, metadata-only Seal gate/effect/handoff/report/envelope/signature/signing-operation classification, metadata-only Console host/receipt/OS/VM contract surfaces, Lat/LIR provenance records, guarded user-local installation, disposable Fedora VM CLI payload evidence, and future runtime-boundary research."</w:t>
       </w:r>
     </w:p>
     <w:p>
@@ -21549,7 +21800,7 @@
         <w:pStyle w:val="BodyTight"/>
       </w:pPr>
       <w:r>
-        <w:t>This edition was derived from the Latticra Seal handbook and recent repository material covering signed-request, freshness, verification, Seal metadata ladder extensions through signature request and signing-operation status guards, Console host-adapter/receipt-request/payload/signature/OS/VM contract surfaces, Runtime Boundary Lat pipeline first-clause evidence propagation, installer, Panel, Nucleus, Nadia, macOS, Fedora/RPM, Lat/LIR, and one-pass field-engine evidence. It distinguishes implemented facts from inferred substrate architecture and preserves project non-claims.</w:t>
+        <w:t>This edition was derived from the Latticra Seal handbook and recent repository material covering signed-request, freshness, verification, Seal metadata ladder extensions through signature request and signing-operation status guards, Console host-adapter/receipt-request/payload/signature/OS/VM contract surfaces, Runtime Boundary Lat pipeline first-clause evidence propagation, Fedora VM CLI payload validation evidence and README/status alignment, installer, Panel, Nucleus, Nadia, macOS, Fedora/RPM, Lat/LIR, and one-pass field-engine evidence. It distinguishes implemented facts from inferred substrate architecture and preserves project non-claims.</w:t>
       </w:r>
     </w:p>
     <w:tbl>
@@ -22297,6 +22548,31 @@
           </w:p>
         </w:tc>
       </w:tr>
+      <w:tr>
+        <w:trPr>
+          <w:cantSplit/>
+        </w:trPr>
+        <w:tc>
+          <w:tcPr>
+            <w:tcW w:type="dxa" w:w="4997"/>
+          </w:tcPr>
+          <w:p>
+            <w:r>
+              <w:t>Fedora VM CLI payload evidence</w:t>
+            </w:r>
+          </w:p>
+        </w:tc>
+        <w:tc>
+          <w:tcPr>
+            <w:tcW w:type="dxa" w:w="4997"/>
+          </w:tcPr>
+          <w:p>
+            <w:r>
+              <w:t>Disposable Fedora VM transcript, README/status alignment, payload paths, command validation, removal proof, and non-claim fields for host_install_ready_for_cli_payload=1.</w:t>
+            </w:r>
+          </w:p>
+        </w:tc>
+      </w:tr>
     </w:tbl>
     <w:p>
       <w:pPr>
@@ -22408,6 +22684,14 @@
       </w:pPr>
       <w:r>
         <w:t>For platform work, distinguish dry-run, installroot, disposable-VM, manual-host, and production-installer evidence.</w:t>
+      </w:r>
+    </w:p>
+    <w:p>
+      <w:pPr>
+        <w:pStyle w:val="ListNumber"/>
+      </w:pPr>
+      <w:r>
+        <w:t>For Fedora packaging work, keep host_install_ready_for_cli_payload scoped to the validated /usr/bin/latticra and /usr/share/doc/latticra/README.md payload; do not convert it into Fedora approval, production readiness, daily-driver safety, security protection, or OS replacement.</w:t>
       </w:r>
     </w:p>
     <w:p>

</xml_diff>

<commit_message>
Prepare Latticra Panel v0.5.0 release checkpoint
</commit_message>
<xml_diff>
--- a/docs/latticra-system-substrate/the-latticra-system-substrate.docx
+++ b/docs/latticra-system-substrate/the-latticra-system-substrate.docx
@@ -68,8 +68,8 @@
       </w:tblGrid>
       <w:tr>
         <w:trPr>
-          <w:tblHeader/>
-          <w:cantSplit/>
+          <w:tblHeader w:val="true"/>
+          <w:cantSplit w:val="true"/>
         </w:trPr>
         <w:tc>
           <w:tcPr>
@@ -104,7 +104,7 @@
         <w:jc w:val="center"/>
       </w:pPr>
       <w:r>
-        <w:t>Working Draft 0.14 - 2026-05-26</w:t>
+        <w:t>Working Draft 0.16 - 2026-05-26</w:t>
       </w:r>
     </w:p>
     <w:p>
@@ -153,7 +153,7 @@
         <w:pStyle w:val="BodyTight"/>
       </w:pPr>
       <w:r>
-        <w:t>Source posture: this edition draws from the Seal handbook plus current Seal signed-request, request-freshness, verification-receipt, crypto-verify-backend, Ed25519 verify-only, verified-receipt-promotion, verified-capability-gate, verified-effect-decision, runtime-handoff-evaluation, runtime-handoff-report, report-envelope, signature-request, signing-authorization, signer-handoff, signer-invocation, signing-operation, capability-gate, and effect-decision records; Latticra Console Stage-0 host-adapter, receipt-request, receipt-payload, signature-request-binding, OS-base, and VM-evidence contract surfaces; Runtime Boundary Lat pipeline first-clause evidence propagation; Fedora disposable VM CLI payload validation evidence and README/status alignment; Panel/installer receipts; Fedora and macOS validation material; Lat/LIR, Nucleus, Nadia, runtime-boundary, kernel-lifecycle, and defensive threat-model notes; and the one-pass field engine research artifact.</w:t>
+        <w:t>Source posture: this edition draws from the Seal handbook plus current Seal signed-request, request-freshness, verification-receipt, crypto-verify-backend, Ed25519 verify-only, verified-receipt-promotion, verified-capability-gate, verified-effect-decision, runtime-handoff, report-envelope, signature-request, signing-authorization, signer-handoff, signer-invocation, signing-operation-readiness, signing-operation-status, Console host/receipt/signature/OS/VM contracts, Runtime Boundary Lat/LIR provenance, Fedora VM CLI payload evidence, and Nadia Stage-39 through Stage-44 release/receipt/review/disposition contract records. It treats all unimplemented runtime, host-protection, AI, signing, packaging, distribution, and production claims as non-claims unless a cited test or status record supports them.</w:t>
       </w:r>
     </w:p>
     <w:p>
@@ -204,8 +204,8 @@
       </w:tblGrid>
       <w:tr>
         <w:trPr>
-          <w:tblHeader/>
-          <w:cantSplit/>
+          <w:tblHeader w:val="true"/>
+          <w:cantSplit w:val="true"/>
         </w:trPr>
         <w:tc>
           <w:tcPr>
@@ -260,7 +260,7 @@
       </w:tr>
       <w:tr>
         <w:trPr>
-          <w:cantSplit/>
+          <w:cantSplit w:val="true"/>
         </w:trPr>
         <w:tc>
           <w:tcPr>
@@ -317,7 +317,7 @@
       </w:tr>
       <w:tr>
         <w:trPr>
-          <w:cantSplit/>
+          <w:cantSplit w:val="true"/>
         </w:trPr>
         <w:tc>
           <w:tcPr>
@@ -374,7 +374,7 @@
       </w:tr>
       <w:tr>
         <w:trPr>
-          <w:cantSplit/>
+          <w:cantSplit w:val="true"/>
         </w:trPr>
         <w:tc>
           <w:tcPr>
@@ -431,7 +431,7 @@
       </w:tr>
       <w:tr>
         <w:trPr>
-          <w:cantSplit/>
+          <w:cantSplit w:val="true"/>
         </w:trPr>
         <w:tc>
           <w:tcPr>
@@ -488,7 +488,7 @@
       </w:tr>
       <w:tr>
         <w:trPr>
-          <w:cantSplit/>
+          <w:cantSplit w:val="true"/>
         </w:trPr>
         <w:tc>
           <w:tcPr>
@@ -545,7 +545,7 @@
       </w:tr>
       <w:tr>
         <w:trPr>
-          <w:cantSplit/>
+          <w:cantSplit w:val="true"/>
         </w:trPr>
         <w:tc>
           <w:tcPr>
@@ -602,7 +602,7 @@
       </w:tr>
       <w:tr>
         <w:trPr>
-          <w:cantSplit/>
+          <w:cantSplit w:val="true"/>
         </w:trPr>
         <w:tc>
           <w:tcPr>
@@ -659,7 +659,7 @@
       </w:tr>
       <w:tr>
         <w:trPr>
-          <w:cantSplit/>
+          <w:cantSplit w:val="true"/>
         </w:trPr>
         <w:tc>
           <w:tcPr>
@@ -716,7 +716,7 @@
       </w:tr>
       <w:tr>
         <w:trPr>
-          <w:cantSplit/>
+          <w:cantSplit w:val="true"/>
         </w:trPr>
         <w:tc>
           <w:tcPr>
@@ -773,7 +773,7 @@
       </w:tr>
       <w:tr>
         <w:trPr>
-          <w:cantSplit/>
+          <w:cantSplit w:val="true"/>
         </w:trPr>
         <w:tc>
           <w:tcPr>
@@ -830,7 +830,7 @@
       </w:tr>
       <w:tr>
         <w:trPr>
-          <w:cantSplit/>
+          <w:cantSplit w:val="true"/>
         </w:trPr>
         <w:tc>
           <w:tcPr>
@@ -887,7 +887,7 @@
       </w:tr>
       <w:tr>
         <w:trPr>
-          <w:cantSplit/>
+          <w:cantSplit w:val="true"/>
         </w:trPr>
         <w:tc>
           <w:tcPr>
@@ -944,7 +944,7 @@
       </w:tr>
       <w:tr>
         <w:trPr>
-          <w:cantSplit/>
+          <w:cantSplit w:val="true"/>
         </w:trPr>
         <w:tc>
           <w:tcPr>
@@ -1001,7 +1001,7 @@
       </w:tr>
       <w:tr>
         <w:trPr>
-          <w:cantSplit/>
+          <w:cantSplit w:val="true"/>
         </w:trPr>
         <w:tc>
           <w:tcPr>
@@ -1058,7 +1058,7 @@
       </w:tr>
       <w:tr>
         <w:trPr>
-          <w:cantSplit/>
+          <w:cantSplit w:val="true"/>
         </w:trPr>
         <w:tc>
           <w:tcPr>
@@ -1115,7 +1115,7 @@
       </w:tr>
       <w:tr>
         <w:trPr>
-          <w:cantSplit/>
+          <w:cantSplit w:val="true"/>
         </w:trPr>
         <w:tc>
           <w:tcPr>
@@ -1172,7 +1172,7 @@
       </w:tr>
       <w:tr>
         <w:trPr>
-          <w:cantSplit/>
+          <w:cantSplit w:val="true"/>
         </w:trPr>
         <w:tc>
           <w:tcPr>
@@ -1229,7 +1229,7 @@
       </w:tr>
       <w:tr>
         <w:trPr>
-          <w:cantSplit/>
+          <w:cantSplit w:val="true"/>
         </w:trPr>
         <w:tc>
           <w:tcPr>
@@ -1286,7 +1286,7 @@
       </w:tr>
       <w:tr>
         <w:trPr>
-          <w:cantSplit/>
+          <w:cantSplit w:val="true"/>
         </w:trPr>
         <w:tc>
           <w:tcPr>
@@ -1343,7 +1343,7 @@
       </w:tr>
       <w:tr>
         <w:trPr>
-          <w:cantSplit/>
+          <w:cantSplit w:val="true"/>
         </w:trPr>
         <w:tc>
           <w:tcPr>
@@ -1400,7 +1400,7 @@
       </w:tr>
       <w:tr>
         <w:trPr>
-          <w:cantSplit/>
+          <w:cantSplit w:val="true"/>
         </w:trPr>
         <w:tc>
           <w:tcPr>
@@ -1680,8 +1680,8 @@
       </w:tblGrid>
       <w:tr>
         <w:trPr>
-          <w:tblHeader/>
-          <w:cantSplit/>
+          <w:tblHeader w:val="true"/>
+          <w:cantSplit w:val="true"/>
         </w:trPr>
         <w:tc>
           <w:tcPr>
@@ -1853,8 +1853,8 @@
       </w:tblGrid>
       <w:tr>
         <w:trPr>
-          <w:tblHeader/>
-          <w:cantSplit/>
+          <w:tblHeader w:val="true"/>
+          <w:cantSplit w:val="true"/>
         </w:trPr>
         <w:tc>
           <w:tcPr>
@@ -1934,7 +1934,7 @@
       </w:tr>
       <w:tr>
         <w:trPr>
-          <w:cantSplit/>
+          <w:cantSplit w:val="true"/>
         </w:trPr>
         <w:tc>
           <w:tcPr>
@@ -2017,7 +2017,7 @@
       </w:tr>
       <w:tr>
         <w:trPr>
-          <w:cantSplit/>
+          <w:cantSplit w:val="true"/>
         </w:trPr>
         <w:tc>
           <w:tcPr>
@@ -2100,7 +2100,7 @@
       </w:tr>
       <w:tr>
         <w:trPr>
-          <w:cantSplit/>
+          <w:cantSplit w:val="true"/>
         </w:trPr>
         <w:tc>
           <w:tcPr>
@@ -2183,7 +2183,7 @@
       </w:tr>
       <w:tr>
         <w:trPr>
-          <w:cantSplit/>
+          <w:cantSplit w:val="true"/>
         </w:trPr>
         <w:tc>
           <w:tcPr>
@@ -2266,7 +2266,7 @@
       </w:tr>
       <w:tr>
         <w:trPr>
-          <w:cantSplit/>
+          <w:cantSplit w:val="true"/>
         </w:trPr>
         <w:tc>
           <w:tcPr>
@@ -2349,7 +2349,7 @@
       </w:tr>
       <w:tr>
         <w:trPr>
-          <w:cantSplit/>
+          <w:cantSplit w:val="true"/>
         </w:trPr>
         <w:tc>
           <w:tcPr>
@@ -2432,7 +2432,7 @@
       </w:tr>
       <w:tr>
         <w:trPr>
-          <w:cantSplit/>
+          <w:cantSplit w:val="true"/>
         </w:trPr>
         <w:tc>
           <w:tcPr>
@@ -2566,8 +2566,8 @@
       </w:tblGrid>
       <w:tr>
         <w:trPr>
-          <w:tblHeader/>
-          <w:cantSplit/>
+          <w:tblHeader w:val="true"/>
+          <w:cantSplit w:val="true"/>
         </w:trPr>
         <w:tc>
           <w:tcPr>
@@ -2647,7 +2647,7 @@
       </w:tr>
       <w:tr>
         <w:trPr>
-          <w:cantSplit/>
+          <w:cantSplit w:val="true"/>
         </w:trPr>
         <w:tc>
           <w:tcPr>
@@ -2730,7 +2730,7 @@
       </w:tr>
       <w:tr>
         <w:trPr>
-          <w:cantSplit/>
+          <w:cantSplit w:val="true"/>
         </w:trPr>
         <w:tc>
           <w:tcPr>
@@ -2813,7 +2813,7 @@
       </w:tr>
       <w:tr>
         <w:trPr>
-          <w:cantSplit/>
+          <w:cantSplit w:val="true"/>
         </w:trPr>
         <w:tc>
           <w:tcPr>
@@ -2896,7 +2896,7 @@
       </w:tr>
       <w:tr>
         <w:trPr>
-          <w:cantSplit/>
+          <w:cantSplit w:val="true"/>
         </w:trPr>
         <w:tc>
           <w:tcPr>
@@ -2979,7 +2979,7 @@
       </w:tr>
       <w:tr>
         <w:trPr>
-          <w:cantSplit/>
+          <w:cantSplit w:val="true"/>
         </w:trPr>
         <w:tc>
           <w:tcPr>
@@ -3062,7 +3062,7 @@
       </w:tr>
       <w:tr>
         <w:trPr>
-          <w:cantSplit/>
+          <w:cantSplit w:val="true"/>
         </w:trPr>
         <w:tc>
           <w:tcPr>
@@ -3145,7 +3145,7 @@
       </w:tr>
       <w:tr>
         <w:trPr>
-          <w:cantSplit/>
+          <w:cantSplit w:val="true"/>
         </w:trPr>
         <w:tc>
           <w:tcPr>
@@ -3301,8 +3301,8 @@
       </w:tblGrid>
       <w:tr>
         <w:trPr>
-          <w:tblHeader/>
-          <w:cantSplit/>
+          <w:tblHeader w:val="true"/>
+          <w:cantSplit w:val="true"/>
         </w:trPr>
         <w:tc>
           <w:tcPr>
@@ -3382,7 +3382,7 @@
       </w:tr>
       <w:tr>
         <w:trPr>
-          <w:cantSplit/>
+          <w:cantSplit w:val="true"/>
         </w:trPr>
         <w:tc>
           <w:tcPr>
@@ -3480,7 +3480,7 @@
       </w:tr>
       <w:tr>
         <w:trPr>
-          <w:cantSplit/>
+          <w:cantSplit w:val="true"/>
         </w:trPr>
         <w:tc>
           <w:tcPr>
@@ -3578,7 +3578,7 @@
       </w:tr>
       <w:tr>
         <w:trPr>
-          <w:cantSplit/>
+          <w:cantSplit w:val="true"/>
         </w:trPr>
         <w:tc>
           <w:tcPr>
@@ -3676,7 +3676,7 @@
       </w:tr>
       <w:tr>
         <w:trPr>
-          <w:cantSplit/>
+          <w:cantSplit w:val="true"/>
         </w:trPr>
         <w:tc>
           <w:tcPr>
@@ -3774,7 +3774,7 @@
       </w:tr>
       <w:tr>
         <w:trPr>
-          <w:cantSplit/>
+          <w:cantSplit w:val="true"/>
         </w:trPr>
         <w:tc>
           <w:tcPr>
@@ -3872,7 +3872,7 @@
       </w:tr>
       <w:tr>
         <w:trPr>
-          <w:cantSplit/>
+          <w:cantSplit w:val="true"/>
         </w:trPr>
         <w:tc>
           <w:tcPr>
@@ -3970,7 +3970,7 @@
       </w:tr>
       <w:tr>
         <w:trPr>
-          <w:cantSplit/>
+          <w:cantSplit w:val="true"/>
         </w:trPr>
         <w:tc>
           <w:tcPr>
@@ -4068,7 +4068,7 @@
       </w:tr>
       <w:tr>
         <w:trPr>
-          <w:cantSplit/>
+          <w:cantSplit w:val="true"/>
         </w:trPr>
         <w:tc>
           <w:tcPr>
@@ -4166,7 +4166,7 @@
       </w:tr>
       <w:tr>
         <w:trPr>
-          <w:cantSplit/>
+          <w:cantSplit w:val="true"/>
         </w:trPr>
         <w:tc>
           <w:tcPr>
@@ -4264,7 +4264,7 @@
       </w:tr>
       <w:tr>
         <w:trPr>
-          <w:cantSplit/>
+          <w:cantSplit w:val="true"/>
         </w:trPr>
         <w:tc>
           <w:tcPr>
@@ -4362,7 +4362,7 @@
       </w:tr>
       <w:tr>
         <w:trPr>
-          <w:cantSplit/>
+          <w:cantSplit w:val="true"/>
         </w:trPr>
         <w:tc>
           <w:tcPr>
@@ -4439,7 +4439,7 @@
       </w:tr>
       <w:tr>
         <w:trPr>
-          <w:cantSplit/>
+          <w:cantSplit w:val="true"/>
         </w:trPr>
         <w:tc>
           <w:tcPr>
@@ -4453,14 +4453,7 @@
             <w:vAlign w:val="top"/>
           </w:tcPr>
           <w:p>
-            <w:pPr>
-              <w:spacing w:before="0" w:after="0" w:line="240" w:lineRule="auto"/>
-            </w:pPr>
-            <w:r>
-              <w:rPr>
-                <w:rFonts w:ascii="Liberation Sans" w:hAnsi="Liberation Sans" w:eastAsia="Liberation Sans"/>
-                <w:sz w:val="16"/>
-              </w:rPr>
+            <w:r>
               <w:t>Nadia offline AI</w:t>
             </w:r>
           </w:p>
@@ -4477,15 +4470,8 @@
             <w:vAlign w:val="top"/>
           </w:tcPr>
           <w:p>
-            <w:pPr>
-              <w:spacing w:before="0" w:after="0" w:line="240" w:lineRule="auto"/>
-            </w:pPr>
-            <w:r>
-              <w:rPr>
-                <w:rFonts w:ascii="Liberation Sans" w:hAnsi="Liberation Sans" w:eastAsia="Liberation Sans"/>
-                <w:sz w:val="16"/>
-              </w:rPr>
-              <w:t>Stage-0 through Stage-27 contract metadata; no model runtime, tokenization, context-window assembly, inference, dialogue, or tools.</w:t>
+            <w:r>
+              <w:t>Stage-0 through Stage-44 contract metadata; current top is a prompt-evaluation result release receipt review disposition release receipt review disposition release receipt review contract; no model runtime, prompt materialization, release/receipt/review/disposition recording, receipt signing/publication, token generation, inference, dialogue, source mutation, network, or tool execution.</w:t>
             </w:r>
           </w:p>
         </w:tc>
@@ -4501,22 +4487,15 @@
             <w:vAlign w:val="top"/>
           </w:tcPr>
           <w:p>
-            <w:pPr>
-              <w:spacing w:before="0" w:after="0" w:line="240" w:lineRule="auto"/>
-            </w:pPr>
-            <w:r>
-              <w:rPr>
-                <w:rFonts w:ascii="Liberation Sans" w:hAnsi="Liberation Sans" w:eastAsia="Liberation Sans"/>
-                <w:sz w:val="16"/>
-              </w:rPr>
-              <w:t>Say it is an offline-AI contract ladder; do not say it is an active AI assistant.</w:t>
+            <w:r>
+              <w:t>Say Nadia has a contract-only offline-AI evidence ladder and survivor-centered safety requirements; do not say it is an active assistant, evaluates prompts, records results, publishes receipts, generates answers, or executes tools.</w:t>
             </w:r>
           </w:p>
         </w:tc>
       </w:tr>
       <w:tr>
         <w:trPr>
-          <w:cantSplit/>
+          <w:cantSplit w:val="true"/>
         </w:trPr>
         <w:tc>
           <w:tcPr>
@@ -4593,7 +4572,7 @@
       </w:tr>
       <w:tr>
         <w:trPr>
-          <w:cantSplit/>
+          <w:cantSplit w:val="true"/>
         </w:trPr>
         <w:tc>
           <w:tcPr>
@@ -4670,7 +4649,7 @@
       </w:tr>
       <w:tr>
         <w:trPr>
-          <w:cantSplit/>
+          <w:cantSplit w:val="true"/>
         </w:trPr>
         <w:tc>
           <w:tcPr>
@@ -4747,7 +4726,7 @@
       </w:tr>
       <w:tr>
         <w:trPr>
-          <w:cantSplit/>
+          <w:cantSplit w:val="true"/>
         </w:trPr>
         <w:tc>
           <w:tcPr>
@@ -4803,7 +4782,7 @@
       </w:tr>
       <w:tr>
         <w:trPr>
-          <w:cantSplit/>
+          <w:cantSplit w:val="true"/>
         </w:trPr>
         <w:tc>
           <w:tcPr>
@@ -4859,7 +4838,7 @@
       </w:tr>
       <w:tr>
         <w:trPr>
-          <w:cantSplit/>
+          <w:cantSplit w:val="true"/>
         </w:trPr>
         <w:tc>
           <w:tcPr>
@@ -4915,7 +4894,7 @@
       </w:tr>
       <w:tr>
         <w:trPr>
-          <w:cantSplit/>
+          <w:cantSplit w:val="true"/>
         </w:trPr>
         <w:tc>
           <w:tcPr>
@@ -4971,7 +4950,7 @@
       </w:tr>
       <w:tr>
         <w:trPr>
-          <w:cantSplit/>
+          <w:cantSplit w:val="true"/>
         </w:trPr>
         <w:tc>
           <w:tcPr>
@@ -5027,7 +5006,7 @@
       </w:tr>
       <w:tr>
         <w:trPr>
-          <w:cantSplit/>
+          <w:cantSplit w:val="true"/>
         </w:trPr>
         <w:tc>
           <w:tcPr>
@@ -5083,7 +5062,7 @@
       </w:tr>
       <w:tr>
         <w:trPr>
-          <w:cantSplit/>
+          <w:cantSplit w:val="true"/>
         </w:trPr>
         <w:tc>
           <w:tcPr>
@@ -5130,7 +5109,7 @@
       </w:tr>
       <w:tr>
         <w:trPr>
-          <w:cantSplit/>
+          <w:cantSplit w:val="true"/>
         </w:trPr>
         <w:tc>
           <w:tcPr>
@@ -5177,7 +5156,7 @@
       </w:tr>
       <w:tr>
         <w:trPr>
-          <w:cantSplit/>
+          <w:cantSplit w:val="true"/>
         </w:trPr>
         <w:tc>
           <w:tcPr>
@@ -5224,7 +5203,7 @@
       </w:tr>
       <w:tr>
         <w:trPr>
-          <w:cantSplit/>
+          <w:cantSplit w:val="true"/>
         </w:trPr>
         <w:tc>
           <w:tcPr>
@@ -5271,7 +5250,7 @@
       </w:tr>
       <w:tr>
         <w:trPr>
-          <w:cantSplit/>
+          <w:cantSplit w:val="true"/>
         </w:trPr>
         <w:tc>
           <w:tcPr>
@@ -5318,7 +5297,7 @@
       </w:tr>
       <w:tr>
         <w:trPr>
-          <w:cantSplit/>
+          <w:cantSplit w:val="true"/>
         </w:trPr>
         <w:tc>
           <w:tcPr>
@@ -5353,7 +5332,7 @@
       </w:tr>
       <w:tr>
         <w:trPr>
-          <w:cantSplit/>
+          <w:cantSplit w:val="true"/>
         </w:trPr>
         <w:tc>
           <w:tcPr>
@@ -5388,7 +5367,7 @@
       </w:tr>
       <w:tr>
         <w:trPr>
-          <w:cantSplit/>
+          <w:cantSplit w:val="true"/>
         </w:trPr>
         <w:tc>
           <w:tcPr>
@@ -5423,7 +5402,7 @@
       </w:tr>
       <w:tr>
         <w:trPr>
-          <w:cantSplit/>
+          <w:cantSplit w:val="true"/>
         </w:trPr>
         <w:tc>
           <w:tcPr>
@@ -5458,7 +5437,7 @@
       </w:tr>
       <w:tr>
         <w:trPr>
-          <w:cantSplit/>
+          <w:cantSplit w:val="true"/>
         </w:trPr>
         <w:tc>
           <w:tcPr>
@@ -5493,7 +5472,7 @@
       </w:tr>
       <w:tr>
         <w:trPr>
-          <w:cantSplit/>
+          <w:cantSplit w:val="true"/>
         </w:trPr>
         <w:tc>
           <w:tcPr>
@@ -5598,8 +5577,8 @@
       </w:tblGrid>
       <w:tr>
         <w:trPr>
-          <w:tblHeader/>
-          <w:cantSplit/>
+          <w:tblHeader w:val="true"/>
+          <w:cantSplit w:val="true"/>
         </w:trPr>
         <w:tc>
           <w:tcPr>
@@ -5752,8 +5731,8 @@
       </w:tblGrid>
       <w:tr>
         <w:trPr>
-          <w:tblHeader/>
-          <w:cantSplit/>
+          <w:tblHeader w:val="true"/>
+          <w:cantSplit w:val="true"/>
         </w:trPr>
         <w:tc>
           <w:tcPr>
@@ -5833,7 +5812,7 @@
       </w:tr>
       <w:tr>
         <w:trPr>
-          <w:cantSplit/>
+          <w:cantSplit w:val="true"/>
         </w:trPr>
         <w:tc>
           <w:tcPr>
@@ -5916,7 +5895,7 @@
       </w:tr>
       <w:tr>
         <w:trPr>
-          <w:cantSplit/>
+          <w:cantSplit w:val="true"/>
         </w:trPr>
         <w:tc>
           <w:tcPr>
@@ -5999,7 +5978,7 @@
       </w:tr>
       <w:tr>
         <w:trPr>
-          <w:cantSplit/>
+          <w:cantSplit w:val="true"/>
         </w:trPr>
         <w:tc>
           <w:tcPr>
@@ -6073,7 +6052,7 @@
       </w:tr>
       <w:tr>
         <w:trPr>
-          <w:cantSplit/>
+          <w:cantSplit w:val="true"/>
         </w:trPr>
         <w:tc>
           <w:tcPr>
@@ -6147,7 +6126,7 @@
       </w:tr>
       <w:tr>
         <w:trPr>
-          <w:cantSplit/>
+          <w:cantSplit w:val="true"/>
         </w:trPr>
         <w:tc>
           <w:tcPr>
@@ -6230,7 +6209,7 @@
       </w:tr>
       <w:tr>
         <w:trPr>
-          <w:cantSplit/>
+          <w:cantSplit w:val="true"/>
         </w:trPr>
         <w:tc>
           <w:tcPr>
@@ -6313,7 +6292,7 @@
       </w:tr>
       <w:tr>
         <w:trPr>
-          <w:cantSplit/>
+          <w:cantSplit w:val="true"/>
         </w:trPr>
         <w:tc>
           <w:tcPr>
@@ -6396,7 +6375,7 @@
       </w:tr>
       <w:tr>
         <w:trPr>
-          <w:cantSplit/>
+          <w:cantSplit w:val="true"/>
         </w:trPr>
         <w:tc>
           <w:tcPr>
@@ -6479,7 +6458,7 @@
       </w:tr>
       <w:tr>
         <w:trPr>
-          <w:cantSplit/>
+          <w:cantSplit w:val="true"/>
         </w:trPr>
         <w:tc>
           <w:tcPr>
@@ -6519,7 +6498,7 @@
       </w:tr>
       <w:tr>
         <w:trPr>
-          <w:cantSplit/>
+          <w:cantSplit w:val="true"/>
         </w:trPr>
         <w:tc>
           <w:tcPr>
@@ -6569,19 +6548,14 @@
       </w:tr>
       <w:tr>
         <w:trPr>
-          <w:cantSplit/>
+          <w:cantSplit w:val="true"/>
         </w:trPr>
         <w:tc>
           <w:tcPr>
             <w:tcW w:type="dxa" w:w="3331"/>
           </w:tcPr>
           <w:p>
-            <w:pPr/>
-            <w:r>
-              <w:rPr>
-                <w:rFonts w:ascii="Liberation Sans" w:hAnsi="Liberation Sans"/>
-                <w:sz w:val="16"/>
-              </w:rPr>
+            <w:r>
               <w:t>Nadia</w:t>
             </w:r>
           </w:p>
@@ -6591,12 +6565,7 @@
             <w:tcW w:type="dxa" w:w="3331"/>
           </w:tcPr>
           <w:p>
-            <w:pPr/>
-            <w:r>
-              <w:rPr>
-                <w:rFonts w:ascii="Liberation Sans" w:hAnsi="Liberation Sans"/>
-                <w:sz w:val="16"/>
-              </w:rPr>
+            <w:r>
               <w:t>latticra-nadia, Panel component, Console metadata</w:t>
             </w:r>
           </w:p>
@@ -6606,20 +6575,15 @@
             <w:tcW w:type="dxa" w:w="3331"/>
           </w:tcPr>
           <w:p>
-            <w:pPr/>
-            <w:r>
-              <w:rPr>
-                <w:rFonts w:ascii="Liberation Sans" w:hAnsi="Liberation Sans"/>
-                <w:sz w:val="16"/>
-              </w:rPr>
-              <w:t>Offline-AI contract ladder with denied model, tokenizer, prompt, runtime, and tool authority.</w:t>
+            <w:r>
+              <w:t>Offline-AI contract ladder with denied model, tokenizer, prompt, runtime, release/receipt/review/disposition, dialogue, network, source, and tool authority.</w:t>
             </w:r>
           </w:p>
         </w:tc>
       </w:tr>
       <w:tr>
         <w:trPr>
-          <w:cantSplit/>
+          <w:cantSplit w:val="true"/>
         </w:trPr>
         <w:tc>
           <w:tcPr>
@@ -6706,8 +6670,8 @@
       </w:tblGrid>
       <w:tr>
         <w:trPr>
-          <w:tblHeader/>
-          <w:cantSplit/>
+          <w:tblHeader w:val="true"/>
+          <w:cantSplit w:val="true"/>
         </w:trPr>
         <w:tc>
           <w:tcPr>
@@ -7044,7 +7008,7 @@
         <w:pStyle w:val="ListBullet"/>
       </w:pPr>
       <w:r>
-        <w:t>Nadia is an optional offline-AI foundation, not an active AI assistant. Stage-0 through Stage-27 establish identity, Panel and Console surfaces, local context metadata, runtime/profile contracts, prompt and model contracts, tokenizer artifact contracts, prompt-tokenization contracts, and prompt-token-sequence contracts, and context-window assembly contracts while keeping model runtime, prompt reading, token creation, context-window assembly, prompt-evaluation-input creation, inference, dialogue generation, network access, source mutation, and tool execution denied.</w:t>
+        <w:t>Nadia is an optional offline-AI foundation, not an active AI assistant. The current verified ladder reaches Stage-44: prompt-evaluation result release receipt review disposition release receipt review disposition release receipt review contract metadata. Stages 0-44 reserve identity, Panel and Console surfaces, local context metadata, runtime/profile contracts, model/prompt/tokenizer contracts, prompt evaluation inputs/results, release/receipt/review/disposition/release-receipt/release-receipt-review contract boundaries, and survivor-centered safety requirements while keeping model runtime, prompt reading/materialization, token creation, context-window assembly, result recording, release/receipt/review/disposition recording, receipt signing/publication, inference, dialogue generation, network access, source mutation, and tool execution denied.</w:t>
       </w:r>
     </w:p>
     <w:p>
@@ -7121,8 +7085,8 @@
       </w:tblGrid>
       <w:tr>
         <w:trPr>
-          <w:tblHeader/>
-          <w:cantSplit/>
+          <w:tblHeader w:val="true"/>
+          <w:cantSplit w:val="true"/>
         </w:trPr>
         <w:tc>
           <w:tcPr>
@@ -7250,8 +7214,8 @@
       </w:tblGrid>
       <w:tr>
         <w:trPr>
-          <w:tblHeader/>
-          <w:cantSplit/>
+          <w:tblHeader w:val="true"/>
+          <w:cantSplit w:val="true"/>
         </w:trPr>
         <w:tc>
           <w:tcPr>
@@ -7516,8 +7480,8 @@
       </w:tblGrid>
       <w:tr>
         <w:trPr>
-          <w:tblHeader/>
-          <w:cantSplit/>
+          <w:tblHeader w:val="true"/>
+          <w:cantSplit w:val="true"/>
         </w:trPr>
         <w:tc>
           <w:tcPr>
@@ -7697,8 +7661,8 @@
       </w:tblGrid>
       <w:tr>
         <w:trPr>
-          <w:tblHeader/>
-          <w:cantSplit/>
+          <w:tblHeader w:val="true"/>
+          <w:cantSplit w:val="true"/>
         </w:trPr>
         <w:tc>
           <w:tcPr>
@@ -8183,8 +8147,8 @@
       </w:tblGrid>
       <w:tr>
         <w:trPr>
-          <w:tblHeader/>
-          <w:cantSplit/>
+          <w:tblHeader w:val="true"/>
+          <w:cantSplit w:val="true"/>
         </w:trPr>
         <w:tc>
           <w:tcPr>
@@ -8264,7 +8228,7 @@
       </w:tr>
       <w:tr>
         <w:trPr>
-          <w:cantSplit/>
+          <w:cantSplit w:val="true"/>
         </w:trPr>
         <w:tc>
           <w:tcPr>
@@ -8347,7 +8311,7 @@
       </w:tr>
       <w:tr>
         <w:trPr>
-          <w:cantSplit/>
+          <w:cantSplit w:val="true"/>
         </w:trPr>
         <w:tc>
           <w:tcPr>
@@ -8430,7 +8394,7 @@
       </w:tr>
       <w:tr>
         <w:trPr>
-          <w:cantSplit/>
+          <w:cantSplit w:val="true"/>
         </w:trPr>
         <w:tc>
           <w:tcPr>
@@ -8513,7 +8477,7 @@
       </w:tr>
       <w:tr>
         <w:trPr>
-          <w:cantSplit/>
+          <w:cantSplit w:val="true"/>
         </w:trPr>
         <w:tc>
           <w:tcPr>
@@ -8596,7 +8560,7 @@
       </w:tr>
       <w:tr>
         <w:trPr>
-          <w:cantSplit/>
+          <w:cantSplit w:val="true"/>
         </w:trPr>
         <w:tc>
           <w:tcPr>
@@ -8679,7 +8643,7 @@
       </w:tr>
       <w:tr>
         <w:trPr>
-          <w:cantSplit/>
+          <w:cantSplit w:val="true"/>
         </w:trPr>
         <w:tc>
           <w:tcPr>
@@ -8810,8 +8774,8 @@
       </w:tblGrid>
       <w:tr>
         <w:trPr>
-          <w:tblHeader/>
-          <w:cantSplit/>
+          <w:tblHeader w:val="true"/>
+          <w:cantSplit w:val="true"/>
         </w:trPr>
         <w:tc>
           <w:tcPr>
@@ -8979,8 +8943,8 @@
       </w:tblGrid>
       <w:tr>
         <w:trPr>
-          <w:tblHeader/>
-          <w:cantSplit/>
+          <w:tblHeader w:val="true"/>
+          <w:cantSplit w:val="true"/>
         </w:trPr>
         <w:tc>
           <w:tcPr>
@@ -9035,7 +8999,7 @@
       </w:tr>
       <w:tr>
         <w:trPr>
-          <w:cantSplit/>
+          <w:cantSplit w:val="true"/>
         </w:trPr>
         <w:tc>
           <w:tcPr>
@@ -9092,7 +9056,7 @@
       </w:tr>
       <w:tr>
         <w:trPr>
-          <w:cantSplit/>
+          <w:cantSplit w:val="true"/>
         </w:trPr>
         <w:tc>
           <w:tcPr>
@@ -9149,7 +9113,7 @@
       </w:tr>
       <w:tr>
         <w:trPr>
-          <w:cantSplit/>
+          <w:cantSplit w:val="true"/>
         </w:trPr>
         <w:tc>
           <w:tcPr>
@@ -9206,7 +9170,7 @@
       </w:tr>
       <w:tr>
         <w:trPr>
-          <w:cantSplit/>
+          <w:cantSplit w:val="true"/>
         </w:trPr>
         <w:tc>
           <w:tcPr>
@@ -9263,7 +9227,7 @@
       </w:tr>
       <w:tr>
         <w:trPr>
-          <w:cantSplit/>
+          <w:cantSplit w:val="true"/>
         </w:trPr>
         <w:tc>
           <w:tcPr>
@@ -9320,7 +9284,7 @@
       </w:tr>
       <w:tr>
         <w:trPr>
-          <w:cantSplit/>
+          <w:cantSplit w:val="true"/>
         </w:trPr>
         <w:tc>
           <w:tcPr>
@@ -9377,7 +9341,7 @@
       </w:tr>
       <w:tr>
         <w:trPr>
-          <w:cantSplit/>
+          <w:cantSplit w:val="true"/>
         </w:trPr>
         <w:tc>
           <w:tcPr>
@@ -9685,8 +9649,8 @@
       </w:tblGrid>
       <w:tr>
         <w:trPr>
-          <w:tblHeader/>
-          <w:cantSplit/>
+          <w:tblHeader w:val="true"/>
+          <w:cantSplit w:val="true"/>
         </w:trPr>
         <w:tc>
           <w:tcPr>
@@ -9741,7 +9705,7 @@
       </w:tr>
       <w:tr>
         <w:trPr>
-          <w:cantSplit/>
+          <w:cantSplit w:val="true"/>
         </w:trPr>
         <w:tc>
           <w:tcPr>
@@ -9798,7 +9762,7 @@
       </w:tr>
       <w:tr>
         <w:trPr>
-          <w:cantSplit/>
+          <w:cantSplit w:val="true"/>
         </w:trPr>
         <w:tc>
           <w:tcPr>
@@ -9855,7 +9819,7 @@
       </w:tr>
       <w:tr>
         <w:trPr>
-          <w:cantSplit/>
+          <w:cantSplit w:val="true"/>
         </w:trPr>
         <w:tc>
           <w:tcPr>
@@ -9912,7 +9876,7 @@
       </w:tr>
       <w:tr>
         <w:trPr>
-          <w:cantSplit/>
+          <w:cantSplit w:val="true"/>
         </w:trPr>
         <w:tc>
           <w:tcPr>
@@ -9969,7 +9933,7 @@
       </w:tr>
       <w:tr>
         <w:trPr>
-          <w:cantSplit/>
+          <w:cantSplit w:val="true"/>
         </w:trPr>
         <w:tc>
           <w:tcPr>
@@ -10063,8 +10027,8 @@
       </w:tblGrid>
       <w:tr>
         <w:trPr>
-          <w:tblHeader/>
-          <w:cantSplit/>
+          <w:tblHeader w:val="true"/>
+          <w:cantSplit w:val="true"/>
         </w:trPr>
         <w:tc>
           <w:tcPr>
@@ -10287,8 +10251,8 @@
       </w:tblGrid>
       <w:tr>
         <w:trPr>
-          <w:tblHeader/>
-          <w:cantSplit/>
+          <w:tblHeader w:val="true"/>
+          <w:cantSplit w:val="true"/>
         </w:trPr>
         <w:tc>
           <w:tcPr>
@@ -10343,7 +10307,7 @@
       </w:tr>
       <w:tr>
         <w:trPr>
-          <w:cantSplit/>
+          <w:cantSplit w:val="true"/>
         </w:trPr>
         <w:tc>
           <w:tcPr>
@@ -10400,7 +10364,7 @@
       </w:tr>
       <w:tr>
         <w:trPr>
-          <w:cantSplit/>
+          <w:cantSplit w:val="true"/>
         </w:trPr>
         <w:tc>
           <w:tcPr>
@@ -10457,7 +10421,7 @@
       </w:tr>
       <w:tr>
         <w:trPr>
-          <w:cantSplit/>
+          <w:cantSplit w:val="true"/>
         </w:trPr>
         <w:tc>
           <w:tcPr>
@@ -10514,7 +10478,7 @@
       </w:tr>
       <w:tr>
         <w:trPr>
-          <w:cantSplit/>
+          <w:cantSplit w:val="true"/>
         </w:trPr>
         <w:tc>
           <w:tcPr>
@@ -10571,7 +10535,7 @@
       </w:tr>
       <w:tr>
         <w:trPr>
-          <w:cantSplit/>
+          <w:cantSplit w:val="true"/>
         </w:trPr>
         <w:tc>
           <w:tcPr>
@@ -10628,7 +10592,7 @@
       </w:tr>
       <w:tr>
         <w:trPr>
-          <w:cantSplit/>
+          <w:cantSplit w:val="true"/>
         </w:trPr>
         <w:tc>
           <w:tcPr>
@@ -10799,8 +10763,8 @@
       </w:tblGrid>
       <w:tr>
         <w:trPr>
-          <w:tblHeader/>
-          <w:cantSplit/>
+          <w:tblHeader w:val="true"/>
+          <w:cantSplit w:val="true"/>
         </w:trPr>
         <w:tc>
           <w:tcPr>
@@ -10958,8 +10922,8 @@
       </w:tblGrid>
       <w:tr>
         <w:trPr>
-          <w:tblHeader/>
-          <w:cantSplit/>
+          <w:tblHeader w:val="true"/>
+          <w:cantSplit w:val="true"/>
         </w:trPr>
         <w:tc>
           <w:tcPr>
@@ -11069,8 +11033,8 @@
       </w:tblGrid>
       <w:tr>
         <w:trPr>
-          <w:tblHeader/>
-          <w:cantSplit/>
+          <w:tblHeader w:val="true"/>
+          <w:cantSplit w:val="true"/>
         </w:trPr>
         <w:tc>
           <w:tcPr>
@@ -11150,7 +11114,7 @@
       </w:tr>
       <w:tr>
         <w:trPr>
-          <w:cantSplit/>
+          <w:cantSplit w:val="true"/>
         </w:trPr>
         <w:tc>
           <w:tcPr>
@@ -11233,7 +11197,7 @@
       </w:tr>
       <w:tr>
         <w:trPr>
-          <w:cantSplit/>
+          <w:cantSplit w:val="true"/>
         </w:trPr>
         <w:tc>
           <w:tcPr>
@@ -11316,7 +11280,7 @@
       </w:tr>
       <w:tr>
         <w:trPr>
-          <w:cantSplit/>
+          <w:cantSplit w:val="true"/>
         </w:trPr>
         <w:tc>
           <w:tcPr>
@@ -11399,7 +11363,7 @@
       </w:tr>
       <w:tr>
         <w:trPr>
-          <w:cantSplit/>
+          <w:cantSplit w:val="true"/>
         </w:trPr>
         <w:tc>
           <w:tcPr>
@@ -11482,7 +11446,7 @@
       </w:tr>
       <w:tr>
         <w:trPr>
-          <w:cantSplit/>
+          <w:cantSplit w:val="true"/>
         </w:trPr>
         <w:tc>
           <w:tcPr>
@@ -11646,8 +11610,8 @@
       </w:tblGrid>
       <w:tr>
         <w:trPr>
-          <w:tblHeader/>
-          <w:cantSplit/>
+          <w:tblHeader w:val="true"/>
+          <w:cantSplit w:val="true"/>
         </w:trPr>
         <w:tc>
           <w:tcPr>
@@ -11816,8 +11780,8 @@
       </w:tblGrid>
       <w:tr>
         <w:trPr>
-          <w:tblHeader/>
-          <w:cantSplit/>
+          <w:tblHeader w:val="true"/>
+          <w:cantSplit w:val="true"/>
         </w:trPr>
         <w:tc>
           <w:tcPr>
@@ -11897,7 +11861,7 @@
       </w:tr>
       <w:tr>
         <w:trPr>
-          <w:cantSplit/>
+          <w:cantSplit w:val="true"/>
         </w:trPr>
         <w:tc>
           <w:tcPr>
@@ -11980,7 +11944,7 @@
       </w:tr>
       <w:tr>
         <w:trPr>
-          <w:cantSplit/>
+          <w:cantSplit w:val="true"/>
         </w:trPr>
         <w:tc>
           <w:tcPr>
@@ -12063,7 +12027,7 @@
       </w:tr>
       <w:tr>
         <w:trPr>
-          <w:cantSplit/>
+          <w:cantSplit w:val="true"/>
         </w:trPr>
         <w:tc>
           <w:tcPr>
@@ -12146,7 +12110,7 @@
       </w:tr>
       <w:tr>
         <w:trPr>
-          <w:cantSplit/>
+          <w:cantSplit w:val="true"/>
         </w:trPr>
         <w:tc>
           <w:tcPr>
@@ -12229,7 +12193,7 @@
       </w:tr>
       <w:tr>
         <w:trPr>
-          <w:cantSplit/>
+          <w:cantSplit w:val="true"/>
         </w:trPr>
         <w:tc>
           <w:tcPr>
@@ -12312,7 +12276,7 @@
       </w:tr>
       <w:tr>
         <w:trPr>
-          <w:cantSplit/>
+          <w:cantSplit w:val="true"/>
         </w:trPr>
         <w:tc>
           <w:tcPr>
@@ -12395,7 +12359,7 @@
       </w:tr>
       <w:tr>
         <w:trPr>
-          <w:cantSplit/>
+          <w:cantSplit w:val="true"/>
         </w:trPr>
         <w:tc>
           <w:tcPr>
@@ -12573,8 +12537,8 @@
       </w:tblGrid>
       <w:tr>
         <w:trPr>
-          <w:tblHeader/>
-          <w:cantSplit/>
+          <w:tblHeader w:val="true"/>
+          <w:cantSplit w:val="true"/>
         </w:trPr>
         <w:tc>
           <w:tcPr>
@@ -12654,7 +12618,7 @@
       </w:tr>
       <w:tr>
         <w:trPr>
-          <w:cantSplit/>
+          <w:cantSplit w:val="true"/>
         </w:trPr>
         <w:tc>
           <w:tcPr>
@@ -12737,7 +12701,7 @@
       </w:tr>
       <w:tr>
         <w:trPr>
-          <w:cantSplit/>
+          <w:cantSplit w:val="true"/>
         </w:trPr>
         <w:tc>
           <w:tcPr>
@@ -12820,7 +12784,7 @@
       </w:tr>
       <w:tr>
         <w:trPr>
-          <w:cantSplit/>
+          <w:cantSplit w:val="true"/>
         </w:trPr>
         <w:tc>
           <w:tcPr>
@@ -12903,7 +12867,7 @@
       </w:tr>
       <w:tr>
         <w:trPr>
-          <w:cantSplit/>
+          <w:cantSplit w:val="true"/>
         </w:trPr>
         <w:tc>
           <w:tcPr>
@@ -13045,8 +13009,8 @@
       </w:tblGrid>
       <w:tr>
         <w:trPr>
-          <w:tblHeader/>
-          <w:cantSplit/>
+          <w:tblHeader w:val="true"/>
+          <w:cantSplit w:val="true"/>
         </w:trPr>
         <w:tc>
           <w:tcPr>
@@ -13481,8 +13445,8 @@
       </w:tblGrid>
       <w:tr>
         <w:trPr>
-          <w:tblHeader/>
-          <w:cantSplit/>
+          <w:tblHeader w:val="true"/>
+          <w:cantSplit w:val="true"/>
         </w:trPr>
         <w:tc>
           <w:tcPr>
@@ -13562,7 +13526,7 @@
       </w:tr>
       <w:tr>
         <w:trPr>
-          <w:cantSplit/>
+          <w:cantSplit w:val="true"/>
         </w:trPr>
         <w:tc>
           <w:tcPr>
@@ -13645,7 +13609,7 @@
       </w:tr>
       <w:tr>
         <w:trPr>
-          <w:cantSplit/>
+          <w:cantSplit w:val="true"/>
         </w:trPr>
         <w:tc>
           <w:tcPr>
@@ -13728,7 +13692,7 @@
       </w:tr>
       <w:tr>
         <w:trPr>
-          <w:cantSplit/>
+          <w:cantSplit w:val="true"/>
         </w:trPr>
         <w:tc>
           <w:tcPr>
@@ -13811,7 +13775,7 @@
       </w:tr>
       <w:tr>
         <w:trPr>
-          <w:cantSplit/>
+          <w:cantSplit w:val="true"/>
         </w:trPr>
         <w:tc>
           <w:tcPr>
@@ -13894,7 +13858,7 @@
       </w:tr>
       <w:tr>
         <w:trPr>
-          <w:cantSplit/>
+          <w:cantSplit w:val="true"/>
         </w:trPr>
         <w:tc>
           <w:tcPr>
@@ -13977,7 +13941,7 @@
       </w:tr>
       <w:tr>
         <w:trPr>
-          <w:cantSplit/>
+          <w:cantSplit w:val="true"/>
         </w:trPr>
         <w:tc>
           <w:tcPr>
@@ -14119,8 +14083,8 @@
       </w:tblGrid>
       <w:tr>
         <w:trPr>
-          <w:tblHeader/>
-          <w:cantSplit/>
+          <w:tblHeader w:val="true"/>
+          <w:cantSplit w:val="true"/>
         </w:trPr>
         <w:tc>
           <w:tcPr>
@@ -14425,8 +14389,8 @@
       </w:tblGrid>
       <w:tr>
         <w:trPr>
-          <w:tblHeader/>
-          <w:cantSplit/>
+          <w:tblHeader w:val="true"/>
+          <w:cantSplit w:val="true"/>
         </w:trPr>
         <w:tc>
           <w:tcPr>
@@ -14704,8 +14668,8 @@
       </w:tblGrid>
       <w:tr>
         <w:trPr>
-          <w:tblHeader/>
-          <w:cantSplit/>
+          <w:tblHeader w:val="true"/>
+          <w:cantSplit w:val="true"/>
         </w:trPr>
         <w:tc>
           <w:tcPr>
@@ -14760,7 +14724,7 @@
       </w:tr>
       <w:tr>
         <w:trPr>
-          <w:cantSplit/>
+          <w:cantSplit w:val="true"/>
         </w:trPr>
         <w:tc>
           <w:tcPr>
@@ -14817,7 +14781,7 @@
       </w:tr>
       <w:tr>
         <w:trPr>
-          <w:cantSplit/>
+          <w:cantSplit w:val="true"/>
         </w:trPr>
         <w:tc>
           <w:tcPr>
@@ -14874,7 +14838,7 @@
       </w:tr>
       <w:tr>
         <w:trPr>
-          <w:cantSplit/>
+          <w:cantSplit w:val="true"/>
         </w:trPr>
         <w:tc>
           <w:tcPr>
@@ -14931,7 +14895,7 @@
       </w:tr>
       <w:tr>
         <w:trPr>
-          <w:cantSplit/>
+          <w:cantSplit w:val="true"/>
         </w:trPr>
         <w:tc>
           <w:tcPr>
@@ -14988,7 +14952,7 @@
       </w:tr>
       <w:tr>
         <w:trPr>
-          <w:cantSplit/>
+          <w:cantSplit w:val="true"/>
         </w:trPr>
         <w:tc>
           <w:tcPr>
@@ -15045,7 +15009,7 @@
       </w:tr>
       <w:tr>
         <w:trPr>
-          <w:cantSplit/>
+          <w:cantSplit w:val="true"/>
         </w:trPr>
         <w:tc>
           <w:tcPr>
@@ -15102,7 +15066,7 @@
       </w:tr>
       <w:tr>
         <w:trPr>
-          <w:cantSplit/>
+          <w:cantSplit w:val="true"/>
         </w:trPr>
         <w:tc>
           <w:tcPr>
@@ -15187,8 +15151,8 @@
       </w:tblGrid>
       <w:tr>
         <w:trPr>
-          <w:tblHeader/>
-          <w:cantSplit/>
+          <w:tblHeader w:val="true"/>
+          <w:cantSplit w:val="true"/>
         </w:trPr>
         <w:tc>
           <w:tcPr>
@@ -15243,7 +15207,7 @@
       </w:tr>
       <w:tr>
         <w:trPr>
-          <w:cantSplit/>
+          <w:cantSplit w:val="true"/>
         </w:trPr>
         <w:tc>
           <w:tcPr>
@@ -15300,7 +15264,7 @@
       </w:tr>
       <w:tr>
         <w:trPr>
-          <w:cantSplit/>
+          <w:cantSplit w:val="true"/>
         </w:trPr>
         <w:tc>
           <w:tcPr>
@@ -15357,7 +15321,7 @@
       </w:tr>
       <w:tr>
         <w:trPr>
-          <w:cantSplit/>
+          <w:cantSplit w:val="true"/>
         </w:trPr>
         <w:tc>
           <w:tcPr>
@@ -15414,7 +15378,7 @@
       </w:tr>
       <w:tr>
         <w:trPr>
-          <w:cantSplit/>
+          <w:cantSplit w:val="true"/>
         </w:trPr>
         <w:tc>
           <w:tcPr>
@@ -15471,7 +15435,7 @@
       </w:tr>
       <w:tr>
         <w:trPr>
-          <w:cantSplit/>
+          <w:cantSplit w:val="true"/>
         </w:trPr>
         <w:tc>
           <w:tcPr>
@@ -15528,7 +15492,7 @@
       </w:tr>
       <w:tr>
         <w:trPr>
-          <w:cantSplit/>
+          <w:cantSplit w:val="true"/>
         </w:trPr>
         <w:tc>
           <w:tcPr>
@@ -15585,7 +15549,7 @@
       </w:tr>
       <w:tr>
         <w:trPr>
-          <w:cantSplit/>
+          <w:cantSplit w:val="true"/>
         </w:trPr>
         <w:tc>
           <w:tcPr>
@@ -15822,7 +15786,7 @@
         <w:pStyle w:val="ListBullet"/>
       </w:pPr>
       <w:r>
-        <w:t>Nadia commands under the embedded Console and installed latticra-nadia wrapper must keep the current stage visible. Status, context-pack, runtime-profile, prompt-plan, tool-preflight, prompt, model, tokenizer, token-sequence, and context-window commands are metadata or contract surfaces until a later contract proves otherwise.</w:t>
+        <w:t>Nadia commands under the embedded Console and installed latticra-nadia wrapper must keep the current stage visible. Status, context-pack, runtime-profile, prompt-plan, tool-preflight, prompt, model, tokenizer, token-sequence, context-window, prompt-evaluation, result, release, receipt, review, disposition, release-receipt, and release-receipt-review outputs are contract artifacts. They must not become hidden runtime launches, prompt readers, tokenizer invocations, result recorders, release publishers, receipt signers, dialogue surfaces, source mutators, network clients, or tool executors.</w:t>
       </w:r>
     </w:p>
     <w:p>
@@ -16056,8 +16020,8 @@
       </w:tblGrid>
       <w:tr>
         <w:trPr>
-          <w:tblHeader/>
-          <w:cantSplit/>
+          <w:tblHeader w:val="true"/>
+          <w:cantSplit w:val="true"/>
         </w:trPr>
         <w:tc>
           <w:tcPr>
@@ -16112,7 +16076,7 @@
       </w:tr>
       <w:tr>
         <w:trPr>
-          <w:cantSplit/>
+          <w:cantSplit w:val="true"/>
         </w:trPr>
         <w:tc>
           <w:tcPr>
@@ -16169,7 +16133,7 @@
       </w:tr>
       <w:tr>
         <w:trPr>
-          <w:cantSplit/>
+          <w:cantSplit w:val="true"/>
         </w:trPr>
         <w:tc>
           <w:tcPr>
@@ -16226,7 +16190,7 @@
       </w:tr>
       <w:tr>
         <w:trPr>
-          <w:cantSplit/>
+          <w:cantSplit w:val="true"/>
         </w:trPr>
         <w:tc>
           <w:tcPr>
@@ -16283,7 +16247,7 @@
       </w:tr>
       <w:tr>
         <w:trPr>
-          <w:cantSplit/>
+          <w:cantSplit w:val="true"/>
         </w:trPr>
         <w:tc>
           <w:tcPr>
@@ -16340,7 +16304,7 @@
       </w:tr>
       <w:tr>
         <w:trPr>
-          <w:cantSplit/>
+          <w:cantSplit w:val="true"/>
         </w:trPr>
         <w:tc>
           <w:tcPr>
@@ -16397,7 +16361,7 @@
       </w:tr>
       <w:tr>
         <w:trPr>
-          <w:cantSplit/>
+          <w:cantSplit w:val="true"/>
         </w:trPr>
         <w:tc>
           <w:tcPr>
@@ -16454,7 +16418,7 @@
       </w:tr>
       <w:tr>
         <w:trPr>
-          <w:cantSplit/>
+          <w:cantSplit w:val="true"/>
         </w:trPr>
         <w:tc>
           <w:tcPr>
@@ -16559,8 +16523,8 @@
       </w:tblGrid>
       <w:tr>
         <w:trPr>
-          <w:tblHeader/>
-          <w:cantSplit/>
+          <w:tblHeader w:val="true"/>
+          <w:cantSplit w:val="true"/>
         </w:trPr>
         <w:tc>
           <w:tcPr>
@@ -17004,6 +16968,24 @@
       </w:pPr>
       <w:r>
         <w:t>Negative fields are not decoration: production_installer_ready=0, fedora_distribution_ready=0, fedora_approval_claimed=0, daily_driver_install_ready=0, immutable_fedora_ready=0, plus no service, kernel, boot, SELinux, network, update-safety, recovery-safety, sandboxing, malware-prevention, ransomware-prevention, or OS-replacement claim. Schema consumers should keep the payload paths visible: /usr/bin/latticra and /usr/share/doc/latticra/README.md.</w:t>
+      </w:r>
+    </w:p>
+    <w:p>
+      <w:pPr>
+        <w:pStyle w:val="Heading2"/>
+      </w:pPr>
+      <w:r>
+        <w:t>14.15 Nadia Stage-44 release-receipt review contract schema</w:t>
+      </w:r>
+    </w:p>
+    <w:p>
+      <w:r>
+        <w:t>The Nadia release-receipt ladder is intentionally verbose because every word names a future witness boundary. Stage-39 through Stage-44 extend the prompt-evaluation result chain through release receipt, release-receipt review, release-receipt review disposition, review-disposition release, review-disposition release receipt, and release-receipt review metadata. The current top field is nadia_stage_44_prompt_evaluation_result_release_receipt_review_disposition_release_receipt_review_disposition_release_receipt_review_contract_present=1, with prompt_evaluation_result_release_receipt_review_disposition_release_receipt_review_disposition_release_receipt_review_contract_status=contract_only and prompt_evaluation_result_release_receipt_review_disposition_release_receipt_review_disposition_release_receipt_review_decision=blocked_contract_only.</w:t>
+      </w:r>
+    </w:p>
+    <w:p>
+      <w:r>
+        <w:t>Schema consumers must preserve the zeros: prompt_evaluation_result_release_receipt_review_disposition_release_receipt_review_disposition_release_receipt_review_recorded=0, prompt_evaluation_result_release_receipt_review_disposition_release_receipt_review_disposition_release_receipt_review_created=0, prompt_evaluation_result_release_receipt_review_disposition_release_receipt_review_disposition_release_receipt_review_performed=0, prompt_evaluation_result_release_receipt_review_disposition_release_receipt_review_disposition_release_receipt_review_result_recorded=0, prompt_evaluation_result_release_receipt_review_disposition_release_receipt_review_disposition_release_receipt_review_runtime_invoked=0, prompt_evaluation_result_release_receipt_review_disposition_release_receipt_review_disposition_release_receipt_review_decision_recorded=0, prompt_evaluation_result_release_receipt_review_disposition_release_receipt_review_disposition_release_receipt_review_findings_recorded=0, prompt_evaluation_result_release_receipt_review_disposition_release_receipt_review_disposition_release_receipt_signed=0, prompt_evaluation_result_release_receipt_review_disposition_release_receipt_review_disposition_release_receipt_published=0, prompt_evaluation_result_model_output_recorded=0, runtime_invoked=0, prompt_evaluated=0, token_generation_performed=0, inference_performed=0, qa_dialogue_generated=0, answer_text_generated=0, network_authority=0, tool_execution_authority=0, and source_mutation_authority=0. Safety inheritance is also part of the schema: sexual_request_refusal=always, manipulation_resistance=required, policy_bypass_authority=0, and namesake_cause_awareness=1.</w:t>
       </w:r>
     </w:p>
     <w:p>
@@ -17053,8 +17035,8 @@
       </w:tblGrid>
       <w:tr>
         <w:trPr>
-          <w:tblHeader/>
-          <w:cantSplit/>
+          <w:tblHeader w:val="true"/>
+          <w:cantSplit w:val="true"/>
         </w:trPr>
         <w:tc>
           <w:tcPr>
@@ -17134,7 +17116,7 @@
       </w:tr>
       <w:tr>
         <w:trPr>
-          <w:cantSplit/>
+          <w:cantSplit w:val="true"/>
         </w:trPr>
         <w:tc>
           <w:tcPr>
@@ -17217,7 +17199,7 @@
       </w:tr>
       <w:tr>
         <w:trPr>
-          <w:cantSplit/>
+          <w:cantSplit w:val="true"/>
         </w:trPr>
         <w:tc>
           <w:tcPr>
@@ -17300,7 +17282,7 @@
       </w:tr>
       <w:tr>
         <w:trPr>
-          <w:cantSplit/>
+          <w:cantSplit w:val="true"/>
         </w:trPr>
         <w:tc>
           <w:tcPr>
@@ -17383,7 +17365,7 @@
       </w:tr>
       <w:tr>
         <w:trPr>
-          <w:cantSplit/>
+          <w:cantSplit w:val="true"/>
         </w:trPr>
         <w:tc>
           <w:tcPr>
@@ -17466,7 +17448,7 @@
       </w:tr>
       <w:tr>
         <w:trPr>
-          <w:cantSplit/>
+          <w:cantSplit w:val="true"/>
         </w:trPr>
         <w:tc>
           <w:tcPr>
@@ -17549,7 +17531,7 @@
       </w:tr>
       <w:tr>
         <w:trPr>
-          <w:cantSplit/>
+          <w:cantSplit w:val="true"/>
         </w:trPr>
         <w:tc>
           <w:tcPr>
@@ -17632,7 +17614,7 @@
       </w:tr>
       <w:tr>
         <w:trPr>
-          <w:cantSplit/>
+          <w:cantSplit w:val="true"/>
         </w:trPr>
         <w:tc>
           <w:tcPr>
@@ -17715,7 +17697,7 @@
       </w:tr>
       <w:tr>
         <w:trPr>
-          <w:cantSplit/>
+          <w:cantSplit w:val="true"/>
         </w:trPr>
         <w:tc>
           <w:tcPr>
@@ -17750,7 +17732,7 @@
       </w:tr>
       <w:tr>
         <w:trPr>
-          <w:cantSplit/>
+          <w:cantSplit w:val="true"/>
         </w:trPr>
         <w:tc>
           <w:tcPr>
@@ -17785,7 +17767,7 @@
       </w:tr>
       <w:tr>
         <w:trPr>
-          <w:cantSplit/>
+          <w:cantSplit w:val="true"/>
         </w:trPr>
         <w:tc>
           <w:tcPr>
@@ -17820,7 +17802,7 @@
       </w:tr>
       <w:tr>
         <w:trPr>
-          <w:cantSplit/>
+          <w:cantSplit w:val="true"/>
         </w:trPr>
         <w:tc>
           <w:tcPr>
@@ -17849,6 +17831,41 @@
           <w:p>
             <w:r>
               <w:t>Transcript/status guard showing host_install_ready_for_cli_payload=1 only for /usr/bin/latticra and /usr/share/doc/latticra/README.md, with production/Fedora/daily-driver claims zero.</w:t>
+            </w:r>
+          </w:p>
+        </w:tc>
+      </w:tr>
+      <w:tr>
+        <w:trPr>
+          <w:cantSplit w:val="true"/>
+        </w:trPr>
+        <w:tc>
+          <w:tcPr>
+            <w:tcW w:type="dxa" w:w="3331"/>
+          </w:tcPr>
+          <w:p>
+            <w:r>
+              <w:t>Nadia Stage 39-44 release-receipt review contract guards</w:t>
+            </w:r>
+          </w:p>
+        </w:tc>
+        <w:tc>
+          <w:tcPr>
+            <w:tcW w:type="dxa" w:w="3331"/>
+          </w:tcPr>
+          <w:p>
+            <w:r>
+              <w:t>Validate release-receipt, review, disposition, release, receipt, and review metadata chains without AI runtime behavior.</w:t>
+            </w:r>
+          </w:p>
+        </w:tc>
+        <w:tc>
+          <w:tcPr>
+            <w:tcW w:type="dxa" w:w="3331"/>
+          </w:tcPr>
+          <w:p>
+            <w:r>
+              <w:t>Stage transcripts showing contract_present=1 while runtime_invoked=0, prompt_evaluated=0, token_generation_performed=0, inference_performed=0, dialogue fields, receipt signing/publication, network, source, and tool authority remain zero.</w:t>
             </w:r>
           </w:p>
         </w:tc>
@@ -17903,8 +17920,8 @@
       </w:tblGrid>
       <w:tr>
         <w:trPr>
-          <w:tblHeader/>
-          <w:cantSplit/>
+          <w:tblHeader w:val="true"/>
+          <w:cantSplit w:val="true"/>
         </w:trPr>
         <w:tc>
           <w:tcPr>
@@ -18051,7 +18068,7 @@
         <w:pStyle w:val="ListBullet"/>
       </w:pPr>
       <w:r>
-        <w:t>Nadia focused tests should cover Stage-0 through Stage-27 contract outputs, inherited protective-safety fields, installed command names, Panel/Console metadata, and denial fields for model, tokenizer, prompt, runtime, network, source-mutation, and tool authority.</w:t>
+        <w:t>Nadia focused tests should cover Stage-0 through Stage-44 contract outputs, inherited protective-safety fields, installed command names, Panel/Console metadata, predecessor requirements, and denial fields for model, tokenizer, prompt, runtime, release/receipt/review/disposition recording, receipt signing/publication, network, source-mutation, dialogue, token-generation, inference, and tool authority. The important regression is not only a failing command; it is any new field that appears to imply behavior before the corresponding guard exists.</w:t>
       </w:r>
     </w:p>
     <w:p>
@@ -18376,6 +18393,24 @@
       </w:pPr>
       <w:r>
         <w:t>The lane should fail if the root README reverts to runner-readiness-only wording after evidence is accepted, omits the bounded payload paths, drops host_install_ready_for_cli_payload=1, or removes the zero claims for production_installer_ready, fedora_distribution_ready, fedora_approval_claimed, daily_driver_install_ready, and immutable_fedora_ready. It should also fail on production-ready, Fedora-approved, daily-driver-safe, immutable-Fedora-ready, security product, update-safety, recovery-safety, sandboxing, malware-prevention, ransomware-prevention, or OS-replacement language.</w:t>
+      </w:r>
+    </w:p>
+    <w:p>
+      <w:pPr>
+        <w:pStyle w:val="Heading2"/>
+      </w:pPr>
+      <w:r>
+        <w:t>15.15 Nadia Stage 39-44 contract validation</w:t>
+      </w:r>
+    </w:p>
+    <w:p>
+      <w:r>
+        <w:t>Nadia release-receipt validation should prove predecessor chaining and non-effect preservation together. Current guards are sh scripts/test-nadia-prompt-evaluation-result-release-receipt-review-disposition-release-receipt-contract-stage-39.sh through sh scripts/test-nadia-prompt-evaluation-result-release-receipt-review-disposition-release-receipt-review-disposition-release-receipt-review-contract-stage-44.sh.</w:t>
+      </w:r>
+    </w:p>
+    <w:p>
+      <w:r>
+        <w:t>These lanes should fail if a later stage drops its predecessor requirements, weakens survivor-centered safety inheritance, or records behavior early: runtime invocation, prompt evaluation, model-output recording, token generation, inference, dialogue, release/receipt/review/disposition recording, receipt signing, receipt publication, network authority, tool execution, or source mutation.</w:t>
       </w:r>
     </w:p>
     <w:p>
@@ -18425,8 +18460,8 @@
       </w:tblGrid>
       <w:tr>
         <w:trPr>
-          <w:tblHeader/>
-          <w:cantSplit/>
+          <w:tblHeader w:val="true"/>
+          <w:cantSplit w:val="true"/>
         </w:trPr>
         <w:tc>
           <w:tcPr>
@@ -18506,7 +18541,7 @@
       </w:tr>
       <w:tr>
         <w:trPr>
-          <w:cantSplit/>
+          <w:cantSplit w:val="true"/>
         </w:trPr>
         <w:tc>
           <w:tcPr>
@@ -18589,7 +18624,7 @@
       </w:tr>
       <w:tr>
         <w:trPr>
-          <w:cantSplit/>
+          <w:cantSplit w:val="true"/>
         </w:trPr>
         <w:tc>
           <w:tcPr>
@@ -18672,7 +18707,7 @@
       </w:tr>
       <w:tr>
         <w:trPr>
-          <w:cantSplit/>
+          <w:cantSplit w:val="true"/>
         </w:trPr>
         <w:tc>
           <w:tcPr>
@@ -18755,7 +18790,7 @@
       </w:tr>
       <w:tr>
         <w:trPr>
-          <w:cantSplit/>
+          <w:cantSplit w:val="true"/>
         </w:trPr>
         <w:tc>
           <w:tcPr>
@@ -18838,7 +18873,7 @@
       </w:tr>
       <w:tr>
         <w:trPr>
-          <w:cantSplit/>
+          <w:cantSplit w:val="true"/>
         </w:trPr>
         <w:tc>
           <w:tcPr>
@@ -18921,7 +18956,7 @@
       </w:tr>
       <w:tr>
         <w:trPr>
-          <w:cantSplit/>
+          <w:cantSplit w:val="true"/>
         </w:trPr>
         <w:tc>
           <w:tcPr>
@@ -19004,7 +19039,7 @@
       </w:tr>
       <w:tr>
         <w:trPr>
-          <w:cantSplit/>
+          <w:cantSplit w:val="true"/>
         </w:trPr>
         <w:tc>
           <w:tcPr>
@@ -19092,7 +19127,7 @@
       </w:tr>
       <w:tr>
         <w:trPr>
-          <w:cantSplit/>
+          <w:cantSplit w:val="true"/>
         </w:trPr>
         <w:tc>
           <w:tcPr>
@@ -19175,7 +19210,7 @@
       </w:tr>
       <w:tr>
         <w:trPr>
-          <w:cantSplit/>
+          <w:cantSplit w:val="true"/>
         </w:trPr>
         <w:tc>
           <w:tcPr>
@@ -19210,7 +19245,7 @@
       </w:tr>
       <w:tr>
         <w:trPr>
-          <w:cantSplit/>
+          <w:cantSplit w:val="true"/>
         </w:trPr>
         <w:tc>
           <w:tcPr>
@@ -19245,7 +19280,7 @@
       </w:tr>
       <w:tr>
         <w:trPr>
-          <w:cantSplit/>
+          <w:cantSplit w:val="true"/>
         </w:trPr>
         <w:tc>
           <w:tcPr>
@@ -19280,7 +19315,7 @@
       </w:tr>
       <w:tr>
         <w:trPr>
-          <w:cantSplit/>
+          <w:cantSplit w:val="true"/>
         </w:trPr>
         <w:tc>
           <w:tcPr>
@@ -19309,6 +19344,41 @@
           <w:p>
             <w:r>
               <w:t>README, status, validation evidence, and guard lanes agree on host_install_ready_for_cli_payload=1 while production/Fedora/daily-driver/immutable claims remain zero.</w:t>
+            </w:r>
+          </w:p>
+        </w:tc>
+      </w:tr>
+      <w:tr>
+        <w:trPr>
+          <w:cantSplit w:val="true"/>
+        </w:trPr>
+        <w:tc>
+          <w:tcPr>
+            <w:tcW w:type="dxa" w:w="3331"/>
+          </w:tcPr>
+          <w:p>
+            <w:r>
+              <w:t>13. Nadia release-receipt review contract ladder</w:t>
+            </w:r>
+          </w:p>
+        </w:tc>
+        <w:tc>
+          <w:tcPr>
+            <w:tcW w:type="dxa" w:w="3331"/>
+          </w:tcPr>
+          <w:p>
+            <w:r>
+              <w:t>Keep AI-adjacent publication/review vocabulary contract-only until real runtime and safety evidence exist.</w:t>
+            </w:r>
+          </w:p>
+        </w:tc>
+        <w:tc>
+          <w:tcPr>
+            <w:tcW w:type="dxa" w:w="3331"/>
+          </w:tcPr>
+          <w:p>
+            <w:r>
+              <w:t>Stage 39-44 guards pass with predecessor requirements, safety inheritance, and all runtime/prompt/token/dialogue/tool/source/network fields denied.</w:t>
             </w:r>
           </w:p>
         </w:tc>
@@ -19500,8 +19570,8 @@
       </w:tblGrid>
       <w:tr>
         <w:trPr>
-          <w:tblHeader/>
-          <w:cantSplit/>
+          <w:tblHeader w:val="true"/>
+          <w:cantSplit w:val="true"/>
         </w:trPr>
         <w:tc>
           <w:tcPr>
@@ -19556,7 +19626,7 @@
       </w:tr>
       <w:tr>
         <w:trPr>
-          <w:cantSplit/>
+          <w:cantSplit w:val="true"/>
         </w:trPr>
         <w:tc>
           <w:tcPr>
@@ -19623,7 +19693,7 @@
       </w:tr>
       <w:tr>
         <w:trPr>
-          <w:cantSplit/>
+          <w:cantSplit w:val="true"/>
         </w:trPr>
         <w:tc>
           <w:tcPr>
@@ -19690,7 +19760,7 @@
       </w:tr>
       <w:tr>
         <w:trPr>
-          <w:cantSplit/>
+          <w:cantSplit w:val="true"/>
         </w:trPr>
         <w:tc>
           <w:tcPr>
@@ -19757,7 +19827,7 @@
       </w:tr>
       <w:tr>
         <w:trPr>
-          <w:cantSplit/>
+          <w:cantSplit w:val="true"/>
         </w:trPr>
         <w:tc>
           <w:tcPr>
@@ -19824,7 +19894,7 @@
       </w:tr>
       <w:tr>
         <w:trPr>
-          <w:cantSplit/>
+          <w:cantSplit w:val="true"/>
         </w:trPr>
         <w:tc>
           <w:tcPr>
@@ -19891,7 +19961,7 @@
       </w:tr>
       <w:tr>
         <w:trPr>
-          <w:cantSplit/>
+          <w:cantSplit w:val="true"/>
         </w:trPr>
         <w:tc>
           <w:tcPr>
@@ -19958,7 +20028,7 @@
       </w:tr>
       <w:tr>
         <w:trPr>
-          <w:cantSplit/>
+          <w:cantSplit w:val="true"/>
         </w:trPr>
         <w:tc>
           <w:tcPr>
@@ -20025,7 +20095,7 @@
       </w:tr>
       <w:tr>
         <w:trPr>
-          <w:cantSplit/>
+          <w:cantSplit w:val="true"/>
         </w:trPr>
         <w:tc>
           <w:tcPr>
@@ -20092,7 +20162,7 @@
       </w:tr>
       <w:tr>
         <w:trPr>
-          <w:cantSplit/>
+          <w:cantSplit w:val="true"/>
         </w:trPr>
         <w:tc>
           <w:tcPr>
@@ -20159,7 +20229,7 @@
       </w:tr>
       <w:tr>
         <w:trPr>
-          <w:cantSplit/>
+          <w:cantSplit w:val="true"/>
         </w:trPr>
         <w:tc>
           <w:tcPr>
@@ -20226,7 +20296,7 @@
       </w:tr>
       <w:tr>
         <w:trPr>
-          <w:cantSplit/>
+          <w:cantSplit w:val="true"/>
         </w:trPr>
         <w:tc>
           <w:tcPr>
@@ -20293,7 +20363,7 @@
       </w:tr>
       <w:tr>
         <w:trPr>
-          <w:cantSplit/>
+          <w:cantSplit w:val="true"/>
         </w:trPr>
         <w:tc>
           <w:tcPr>
@@ -20360,7 +20430,7 @@
       </w:tr>
       <w:tr>
         <w:trPr>
-          <w:cantSplit/>
+          <w:cantSplit w:val="true"/>
         </w:trPr>
         <w:tc>
           <w:tcPr>
@@ -20399,7 +20469,7 @@
       </w:tr>
       <w:tr>
         <w:trPr>
-          <w:cantSplit/>
+          <w:cantSplit w:val="true"/>
         </w:trPr>
         <w:tc>
           <w:tcPr>
@@ -20438,7 +20508,7 @@
       </w:tr>
       <w:tr>
         <w:trPr>
-          <w:cantSplit/>
+          <w:cantSplit w:val="true"/>
         </w:trPr>
         <w:tc>
           <w:tcPr>
@@ -20477,7 +20547,7 @@
       </w:tr>
       <w:tr>
         <w:trPr>
-          <w:cantSplit/>
+          <w:cantSplit w:val="true"/>
         </w:trPr>
         <w:tc>
           <w:tcPr>
@@ -20516,7 +20586,7 @@
       </w:tr>
       <w:tr>
         <w:trPr>
-          <w:cantSplit/>
+          <w:cantSplit w:val="true"/>
         </w:trPr>
         <w:tc>
           <w:tcPr>
@@ -20555,7 +20625,7 @@
       </w:tr>
       <w:tr>
         <w:trPr>
-          <w:cantSplit/>
+          <w:cantSplit w:val="true"/>
         </w:trPr>
         <w:tc>
           <w:tcPr>
@@ -20594,7 +20664,7 @@
       </w:tr>
       <w:tr>
         <w:trPr>
-          <w:cantSplit/>
+          <w:cantSplit w:val="true"/>
         </w:trPr>
         <w:tc>
           <w:tcPr>
@@ -20627,7 +20697,7 @@
       </w:tr>
       <w:tr>
         <w:trPr>
-          <w:cantSplit/>
+          <w:cantSplit w:val="true"/>
         </w:trPr>
         <w:tc>
           <w:tcPr>
@@ -20660,7 +20730,7 @@
       </w:tr>
       <w:tr>
         <w:trPr>
-          <w:cantSplit/>
+          <w:cantSplit w:val="true"/>
         </w:trPr>
         <w:tc>
           <w:tcPr>
@@ -20693,7 +20763,7 @@
       </w:tr>
       <w:tr>
         <w:trPr>
-          <w:cantSplit/>
+          <w:cantSplit w:val="true"/>
         </w:trPr>
         <w:tc>
           <w:tcPr>
@@ -20726,7 +20796,7 @@
       </w:tr>
       <w:tr>
         <w:trPr>
-          <w:cantSplit/>
+          <w:cantSplit w:val="true"/>
         </w:trPr>
         <w:tc>
           <w:tcPr>
@@ -20759,7 +20829,7 @@
       </w:tr>
       <w:tr>
         <w:trPr>
-          <w:cantSplit/>
+          <w:cantSplit w:val="true"/>
         </w:trPr>
         <w:tc>
           <w:tcPr>
@@ -20784,7 +20854,7 @@
       </w:tr>
       <w:tr>
         <w:trPr>
-          <w:cantSplit/>
+          <w:cantSplit w:val="true"/>
         </w:trPr>
         <w:tc>
           <w:tcPr>
@@ -20809,7 +20879,7 @@
       </w:tr>
       <w:tr>
         <w:trPr>
-          <w:cantSplit/>
+          <w:cantSplit w:val="true"/>
         </w:trPr>
         <w:tc>
           <w:tcPr>
@@ -20834,7 +20904,7 @@
       </w:tr>
       <w:tr>
         <w:trPr>
-          <w:cantSplit/>
+          <w:cantSplit w:val="true"/>
         </w:trPr>
         <w:tc>
           <w:tcPr>
@@ -20859,7 +20929,7 @@
       </w:tr>
       <w:tr>
         <w:trPr>
-          <w:cantSplit/>
+          <w:cantSplit w:val="true"/>
         </w:trPr>
         <w:tc>
           <w:tcPr>
@@ -20884,7 +20954,7 @@
       </w:tr>
       <w:tr>
         <w:trPr>
-          <w:cantSplit/>
+          <w:cantSplit w:val="true"/>
         </w:trPr>
         <w:tc>
           <w:tcPr>
@@ -20909,7 +20979,7 @@
       </w:tr>
       <w:tr>
         <w:trPr>
-          <w:cantSplit/>
+          <w:cantSplit w:val="true"/>
         </w:trPr>
         <w:tc>
           <w:tcPr>
@@ -20934,7 +21004,7 @@
       </w:tr>
       <w:tr>
         <w:trPr>
-          <w:cantSplit/>
+          <w:cantSplit w:val="true"/>
         </w:trPr>
         <w:tc>
           <w:tcPr>
@@ -20959,7 +21029,7 @@
       </w:tr>
       <w:tr>
         <w:trPr>
-          <w:cantSplit/>
+          <w:cantSplit w:val="true"/>
         </w:trPr>
         <w:tc>
           <w:tcPr>
@@ -20984,7 +21054,7 @@
       </w:tr>
       <w:tr>
         <w:trPr>
-          <w:cantSplit/>
+          <w:cantSplit w:val="true"/>
         </w:trPr>
         <w:tc>
           <w:tcPr>
@@ -21003,6 +21073,56 @@
           <w:p>
             <w:r>
               <w:t>A payload-scoped readiness field meaning the specific CLI/documentation payload has disposable-VM install, command, removal, and absence evidence; it is not general host-install readiness.</w:t>
+            </w:r>
+          </w:p>
+        </w:tc>
+      </w:tr>
+      <w:tr>
+        <w:trPr>
+          <w:cantSplit w:val="true"/>
+        </w:trPr>
+        <w:tc>
+          <w:tcPr>
+            <w:tcW w:type="dxa" w:w="4997"/>
+          </w:tcPr>
+          <w:p>
+            <w:r>
+              <w:t>Nadia release-receipt review contract ladder</w:t>
+            </w:r>
+          </w:p>
+        </w:tc>
+        <w:tc>
+          <w:tcPr>
+            <w:tcW w:type="dxa" w:w="4997"/>
+          </w:tcPr>
+          <w:p>
+            <w:r>
+              <w:t>Stage-39 through Stage-44 metadata chain that names future release receipts, reviews, dispositions, releases, receipts, and reviews while preserving no runtime, prompt, token, dialogue, network, source, or tool authority.</w:t>
+            </w:r>
+          </w:p>
+        </w:tc>
+      </w:tr>
+      <w:tr>
+        <w:trPr>
+          <w:cantSplit w:val="true"/>
+        </w:trPr>
+        <w:tc>
+          <w:tcPr>
+            <w:tcW w:type="dxa" w:w="4997"/>
+          </w:tcPr>
+          <w:p>
+            <w:r>
+              <w:t>Contract-only AI release boundary</w:t>
+            </w:r>
+          </w:p>
+        </w:tc>
+        <w:tc>
+          <w:tcPr>
+            <w:tcW w:type="dxa" w:w="4997"/>
+          </w:tcPr>
+          <w:p>
+            <w:r>
+              <w:t>A Nadia state where metadata and prerequisite references exist, but no release, receipt, review, disposition, model output, runtime invocation, prompt evaluation, token generation, inference, dialogue, signing, publication, or tool execution is recorded.</w:t>
             </w:r>
           </w:p>
         </w:tc>
@@ -21295,8 +21415,8 @@
       </w:tblGrid>
       <w:tr>
         <w:trPr>
-          <w:tblHeader/>
-          <w:cantSplit/>
+          <w:tblHeader w:val="true"/>
+          <w:cantSplit w:val="true"/>
         </w:trPr>
         <w:tc>
           <w:tcPr>
@@ -21351,7 +21471,7 @@
       </w:tr>
       <w:tr>
         <w:trPr>
-          <w:cantSplit/>
+          <w:cantSplit w:val="true"/>
         </w:trPr>
         <w:tc>
           <w:tcPr>
@@ -21408,7 +21528,7 @@
       </w:tr>
       <w:tr>
         <w:trPr>
-          <w:cantSplit/>
+          <w:cantSplit w:val="true"/>
         </w:trPr>
         <w:tc>
           <w:tcPr>
@@ -21465,7 +21585,7 @@
       </w:tr>
       <w:tr>
         <w:trPr>
-          <w:cantSplit/>
+          <w:cantSplit w:val="true"/>
         </w:trPr>
         <w:tc>
           <w:tcPr>
@@ -21522,7 +21642,7 @@
       </w:tr>
       <w:tr>
         <w:trPr>
-          <w:cantSplit/>
+          <w:cantSplit w:val="true"/>
         </w:trPr>
         <w:tc>
           <w:tcPr>
@@ -21579,7 +21699,7 @@
       </w:tr>
       <w:tr>
         <w:trPr>
-          <w:cantSplit/>
+          <w:cantSplit w:val="true"/>
         </w:trPr>
         <w:tc>
           <w:tcPr>
@@ -21636,7 +21756,7 @@
       </w:tr>
       <w:tr>
         <w:trPr>
-          <w:cantSplit/>
+          <w:cantSplit w:val="true"/>
         </w:trPr>
         <w:tc>
           <w:tcPr>
@@ -21693,7 +21813,7 @@
       </w:tr>
       <w:tr>
         <w:trPr>
-          <w:cantSplit/>
+          <w:cantSplit w:val="true"/>
         </w:trPr>
         <w:tc>
           <w:tcPr>
@@ -21800,7 +21920,7 @@
         <w:pStyle w:val="BodyTight"/>
       </w:pPr>
       <w:r>
-        <w:t>This edition was derived from the Latticra Seal handbook and recent repository material covering signed-request, freshness, verification, Seal metadata ladder extensions through signature request and signing-operation status guards, Console host-adapter/receipt-request/payload/signature/OS/VM contract surfaces, Runtime Boundary Lat pipeline first-clause evidence propagation, Fedora VM CLI payload validation evidence and README/status alignment, installer, Panel, Nucleus, Nadia, macOS, Fedora/RPM, Lat/LIR, and one-pass field-engine evidence. It distinguishes implemented facts from inferred substrate architecture and preserves project non-claims.</w:t>
+        <w:t>This edition was derived from the Latticra Seal handbook and recent repository material covering signed-request, freshness, verification, Seal metadata ladder extensions through signature request and signing-operation status guards, Console host/receipt/signature/OS/VM contracts, Runtime Boundary Lat/LIR provenance, disposable Fedora VM CLI payload evidence, Nadia Stage-39 through Stage-44 release/receipt/review/disposition contract records, Panel and installer boundaries, platform validation, public-claims wording, and project status records.</w:t>
       </w:r>
     </w:p>
     <w:tbl>
@@ -21816,8 +21936,8 @@
       </w:tblGrid>
       <w:tr>
         <w:trPr>
-          <w:tblHeader/>
-          <w:cantSplit/>
+          <w:tblHeader w:val="true"/>
+          <w:cantSplit w:val="true"/>
         </w:trPr>
         <w:tc>
           <w:tcPr>
@@ -21872,7 +21992,7 @@
       </w:tr>
       <w:tr>
         <w:trPr>
-          <w:cantSplit/>
+          <w:cantSplit w:val="true"/>
         </w:trPr>
         <w:tc>
           <w:tcPr>
@@ -21939,7 +22059,7 @@
       </w:tr>
       <w:tr>
         <w:trPr>
-          <w:cantSplit/>
+          <w:cantSplit w:val="true"/>
         </w:trPr>
         <w:tc>
           <w:tcPr>
@@ -22006,7 +22126,7 @@
       </w:tr>
       <w:tr>
         <w:trPr>
-          <w:cantSplit/>
+          <w:cantSplit w:val="true"/>
         </w:trPr>
         <w:tc>
           <w:tcPr>
@@ -22073,7 +22193,7 @@
       </w:tr>
       <w:tr>
         <w:trPr>
-          <w:cantSplit/>
+          <w:cantSplit w:val="true"/>
         </w:trPr>
         <w:tc>
           <w:tcPr>
@@ -22140,7 +22260,7 @@
       </w:tr>
       <w:tr>
         <w:trPr>
-          <w:cantSplit/>
+          <w:cantSplit w:val="true"/>
         </w:trPr>
         <w:tc>
           <w:tcPr>
@@ -22207,7 +22327,7 @@
       </w:tr>
       <w:tr>
         <w:trPr>
-          <w:cantSplit/>
+          <w:cantSplit w:val="true"/>
         </w:trPr>
         <w:tc>
           <w:tcPr>
@@ -22239,7 +22359,7 @@
       </w:tr>
       <w:tr>
         <w:trPr>
-          <w:cantSplit/>
+          <w:cantSplit w:val="true"/>
         </w:trPr>
         <w:tc>
           <w:tcPr>
@@ -22278,7 +22398,32 @@
       </w:tr>
       <w:tr>
         <w:trPr>
-          <w:cantSplit/>
+          <w:cantSplit w:val="true"/>
+        </w:trPr>
+        <w:tc>
+          <w:tcPr>
+            <w:tcW w:type="dxa" w:w="4997"/>
+          </w:tcPr>
+          <w:p>
+            <w:r>
+              <w:t>Nadia offline AI contracts</w:t>
+            </w:r>
+          </w:p>
+        </w:tc>
+        <w:tc>
+          <w:tcPr>
+            <w:tcW w:type="dxa" w:w="4997"/>
+          </w:tcPr>
+          <w:p>
+            <w:r>
+              <w:t>Stage-0 through Stage-44 metadata ladder for Panel/Console visibility, local context, model/prompt/tokenizer contracts, prompt evaluation, release/receipt/review/disposition boundaries, and denied AI/tool authority.</w:t>
+            </w:r>
+          </w:p>
+        </w:tc>
+      </w:tr>
+      <w:tr>
+        <w:trPr>
+          <w:cantSplit w:val="true"/>
         </w:trPr>
         <w:tc>
           <w:tcPr>
@@ -22293,7 +22438,7 @@
                 <w:rFonts w:ascii="Liberation Sans" w:hAnsi="Liberation Sans" w:eastAsia="Liberation Sans"/>
                 <w:sz w:val="16"/>
               </w:rPr>
-              <w:t>Nadia offline AI contracts</w:t>
+              <w:t>macOS user-local app bundle lane</w:t>
             </w:r>
           </w:p>
         </w:tc>
@@ -22310,14 +22455,14 @@
                 <w:rFonts w:ascii="Liberation Sans" w:hAnsi="Liberation Sans" w:eastAsia="Liberation Sans"/>
                 <w:sz w:val="16"/>
               </w:rPr>
-              <w:t>Stage-0 through Stage-27 metadata ladder for Panel/Console visibility, local context, model/prompt/tokenizer contracts, prompt-token-sequence and context-window boundaries, and denied AI/tool authority.</w:t>
+              <w:t>Dry-run writer posture, user-local app bundle contract, commit gate, reset/uninstall contract, and verification transcript requirements.</w:t>
             </w:r>
           </w:p>
         </w:tc>
       </w:tr>
       <w:tr>
         <w:trPr>
-          <w:cantSplit/>
+          <w:cantSplit w:val="true"/>
         </w:trPr>
         <w:tc>
           <w:tcPr>
@@ -22332,7 +22477,7 @@
                 <w:rFonts w:ascii="Liberation Sans" w:hAnsi="Liberation Sans" w:eastAsia="Liberation Sans"/>
                 <w:sz w:val="16"/>
               </w:rPr>
-              <w:t>macOS user-local app bundle lane</w:t>
+              <w:t>Fedora RPM validation lanes</w:t>
             </w:r>
           </w:p>
         </w:tc>
@@ -22349,14 +22494,14 @@
                 <w:rFonts w:ascii="Liberation Sans" w:hAnsi="Liberation Sans" w:eastAsia="Liberation Sans"/>
                 <w:sz w:val="16"/>
               </w:rPr>
-              <w:t>Dry-run writer posture, user-local app bundle contract, commit gate, reset/uninstall contract, and verification transcript requirements.</w:t>
+              <w:t>Installroot and disposable-VM RPM lifecycle evidence, bounded host-facing validation vocabulary, and Fedora non-claims.</w:t>
             </w:r>
           </w:p>
         </w:tc>
       </w:tr>
       <w:tr>
         <w:trPr>
-          <w:cantSplit/>
+          <w:cantSplit w:val="true"/>
         </w:trPr>
         <w:tc>
           <w:tcPr>
@@ -22371,7 +22516,7 @@
                 <w:rFonts w:ascii="Liberation Sans" w:hAnsi="Liberation Sans" w:eastAsia="Liberation Sans"/>
                 <w:sz w:val="16"/>
               </w:rPr>
-              <w:t>Fedora RPM validation lanes</w:t>
+              <w:t>Production installer readiness contract</w:t>
             </w:r>
           </w:p>
         </w:tc>
@@ -22388,29 +22533,26 @@
                 <w:rFonts w:ascii="Liberation Sans" w:hAnsi="Liberation Sans" w:eastAsia="Liberation Sans"/>
                 <w:sz w:val="16"/>
               </w:rPr>
-              <w:t>Installroot and disposable-VM RPM lifecycle evidence, bounded host-facing validation vocabulary, and Fedora non-claims.</w:t>
+              <w:t>Promotion gates for future installer artifacts, signatures, SBOM, install/uninstall/rollback transcripts, multi-VM validation, and readiness non-claims.</w:t>
             </w:r>
           </w:p>
         </w:tc>
       </w:tr>
       <w:tr>
         <w:trPr>
-          <w:cantSplit/>
+          <w:cantSplit w:val="true"/>
         </w:trPr>
         <w:tc>
           <w:tcPr>
             <w:tcW w:type="dxa" w:w="4997"/>
           </w:tcPr>
           <w:p>
-            <w:pPr>
-              <w:spacing w:before="0" w:after="0" w:line="240" w:lineRule="auto"/>
-            </w:pPr>
-            <w:r>
-              <w:rPr>
-                <w:rFonts w:ascii="Liberation Sans" w:hAnsi="Liberation Sans" w:eastAsia="Liberation Sans"/>
-                <w:sz w:val="16"/>
-              </w:rPr>
-              <w:t>Production installer readiness contract</w:t>
+            <w:r>
+              <w:rPr>
+                <w:rFonts w:ascii="Liberation Sans" w:hAnsi="Liberation Sans"/>
+                <w:sz w:val="16"/>
+              </w:rPr>
+              <w:t>Seal trust and crypto metadata ladder</w:t>
             </w:r>
           </w:p>
         </w:tc>
@@ -22419,22 +22561,19 @@
             <w:tcW w:type="dxa" w:w="4997"/>
           </w:tcPr>
           <w:p>
-            <w:pPr>
-              <w:spacing w:before="0" w:after="0" w:line="240" w:lineRule="auto"/>
-            </w:pPr>
-            <w:r>
-              <w:rPr>
-                <w:rFonts w:ascii="Liberation Sans" w:hAnsi="Liberation Sans" w:eastAsia="Liberation Sans"/>
-                <w:sz w:val="16"/>
-              </w:rPr>
-              <w:t>Promotion gates for future installer artifacts, signatures, SBOM, install/uninstall/rollback transcripts, multi-VM validation, and readiness non-claims.</w:t>
+            <w:r>
+              <w:rPr>
+                <w:rFonts w:ascii="Liberation Sans" w:hAnsi="Liberation Sans"/>
+                <w:sz w:val="16"/>
+              </w:rPr>
+              <w:t>Signed request, freshness, receipt/backend, Ed25519 verify-only, verified receipt, gate, effect, handoff, report, envelope, and signature-request metadata boundaries.</w:t>
             </w:r>
           </w:p>
         </w:tc>
       </w:tr>
       <w:tr>
         <w:trPr>
-          <w:cantSplit/>
+          <w:cantSplit w:val="true"/>
         </w:trPr>
         <w:tc>
           <w:tcPr>
@@ -22446,7 +22585,7 @@
                 <w:rFonts w:ascii="Liberation Sans" w:hAnsi="Liberation Sans"/>
                 <w:sz w:val="16"/>
               </w:rPr>
-              <w:t>Seal trust and crypto metadata ladder</w:t>
+              <w:t>Seal authority non-claims</w:t>
             </w:r>
           </w:p>
         </w:tc>
@@ -22460,14 +22599,14 @@
                 <w:rFonts w:ascii="Liberation Sans" w:hAnsi="Liberation Sans"/>
                 <w:sz w:val="16"/>
               </w:rPr>
-              <w:t>Signed request, freshness, receipt/backend, Ed25519 verify-only, verified receipt, gate, effect, handoff, report, envelope, and signature-request metadata boundaries.</w:t>
+              <w:t>Readiness flags remain separated from signing, object sealing, effect execution, host/network behavior, and runtime authority.</w:t>
             </w:r>
           </w:p>
         </w:tc>
       </w:tr>
       <w:tr>
         <w:trPr>
-          <w:cantSplit/>
+          <w:cantSplit w:val="true"/>
         </w:trPr>
         <w:tc>
           <w:tcPr>
@@ -22475,11 +22614,7 @@
           </w:tcPr>
           <w:p>
             <w:r>
-              <w:rPr>
-                <w:rFonts w:ascii="Liberation Sans" w:hAnsi="Liberation Sans"/>
-                <w:sz w:val="16"/>
-              </w:rPr>
-              <w:t>Seal authority non-claims</w:t>
+              <w:t>Runtime Boundary Lat clause evidence</w:t>
             </w:r>
           </w:p>
         </w:tc>
@@ -22489,18 +22624,14 @@
           </w:tcPr>
           <w:p>
             <w:r>
-              <w:rPr>
-                <w:rFonts w:ascii="Liberation Sans" w:hAnsi="Liberation Sans"/>
-                <w:sz w:val="16"/>
-              </w:rPr>
-              <w:t>Readiness flags remain separated from signing, object sealing, effect execution, host/network behavior, and runtime authority.</w:t>
+              <w:t>Record-level propagation of first lowered clause node, role, effect, name, operator, and value while preserving no-effect runtime posture.</w:t>
             </w:r>
           </w:p>
         </w:tc>
       </w:tr>
       <w:tr>
         <w:trPr>
-          <w:cantSplit/>
+          <w:cantSplit w:val="true"/>
         </w:trPr>
         <w:tc>
           <w:tcPr>
@@ -22508,7 +22639,7 @@
           </w:tcPr>
           <w:p>
             <w:r>
-              <w:t>Runtime Boundary Lat clause evidence</w:t>
+              <w:t>Seal signing operation status guard</w:t>
             </w:r>
           </w:p>
         </w:tc>
@@ -22518,14 +22649,14 @@
           </w:tcPr>
           <w:p>
             <w:r>
-              <w:t>Record-level propagation of first lowered clause node, role, effect, name, operator, and value while preserving no-effect runtime posture.</w:t>
+              <w:t>Metadata-only signing operation checkpoint, signer-invocation predecessor alignment, status workflow, and no-signing authority denials.</w:t>
             </w:r>
           </w:p>
         </w:tc>
       </w:tr>
       <w:tr>
         <w:trPr>
-          <w:cantSplit/>
+          <w:cantSplit w:val="true"/>
         </w:trPr>
         <w:tc>
           <w:tcPr>
@@ -22533,7 +22664,7 @@
           </w:tcPr>
           <w:p>
             <w:r>
-              <w:t>Seal signing operation status guard</w:t>
+              <w:t>Fedora VM CLI payload evidence</w:t>
             </w:r>
           </w:p>
         </w:tc>
@@ -22543,14 +22674,14 @@
           </w:tcPr>
           <w:p>
             <w:r>
-              <w:t>Metadata-only signing operation checkpoint, signer-invocation predecessor alignment, status workflow, and no-signing authority denials.</w:t>
+              <w:t>Disposable Fedora VM transcript, README/status alignment, payload paths, command validation, removal proof, and non-claim fields for host_install_ready_for_cli_payload=1.</w:t>
             </w:r>
           </w:p>
         </w:tc>
       </w:tr>
       <w:tr>
         <w:trPr>
-          <w:cantSplit/>
+          <w:cantSplit w:val="true"/>
         </w:trPr>
         <w:tc>
           <w:tcPr>
@@ -22558,7 +22689,7 @@
           </w:tcPr>
           <w:p>
             <w:r>
-              <w:t>Fedora VM CLI payload evidence</w:t>
+              <w:t>Nadia Stage 39-44 release-receipt review chain</w:t>
             </w:r>
           </w:p>
         </w:tc>
@@ -22568,7 +22699,7 @@
           </w:tcPr>
           <w:p>
             <w:r>
-              <w:t>Disposable Fedora VM transcript, README/status alignment, payload paths, command validation, removal proof, and non-claim fields for host_install_ready_for_cli_payload=1.</w:t>
+              <w:t>Stage-39 through Stage-44 status records and tests for contract-only release receipt, review, disposition, release, receipt, and review metadata with runtime, prompt, token, inference, dialogue, signing, publication, network, source, and tool effects denied.</w:t>
             </w:r>
           </w:p>
         </w:tc>
@@ -22584,7 +22715,7 @@
         <w:pStyle w:val="BodyTight"/>
       </w:pPr>
       <w:r>
-        <w:t>Future editions should replace inferred connective tissue with canonical specs for root architecture, Lat/LIR, Panel, Console, Nucleus, Nadia, Seal, installers, platform validation, reports, receipts, and runtime handoff.</w:t>
+        <w:t>Future editions should replace inferred connective tissue with canonical specs for root architecture, Lat/LIR, Panel, Console, Nucleus, Nadia, Seal, installers, platform validation, reports, receipts, AI release/receipt review lanes, and runtime handoff.</w:t>
       </w:r>
     </w:p>
     <w:p>
@@ -22675,7 +22806,7 @@
         <w:pStyle w:val="ListNumber"/>
       </w:pPr>
       <w:r>
-        <w:t>For AI-era surfaces, distinguish contract metadata from model loading, prompt tokenization, inference, dialogue generation, source mutation, and tool execution.</w:t>
+        <w:t>For AI-era surfaces, distinguish contract metadata from model loading, prompt tokenization, release/receipt/review/disposition recording, receipt signing/publication, inference, dialogue generation, source mutation, and tool execution.</w:t>
       </w:r>
     </w:p>
     <w:p>

</xml_diff>

<commit_message>
Expand assurance gates and workflow safeguards
</commit_message>
<xml_diff>
--- a/docs/latticra-system-substrate/the-latticra-system-substrate.docx
+++ b/docs/latticra-system-substrate/the-latticra-system-substrate.docx
@@ -104,7 +104,7 @@
         <w:jc w:val="center"/>
       </w:pPr>
       <w:r>
-        <w:t>Working Draft 0.16 - 2026-05-26</w:t>
+        <w:t>Working Draft 0.17 - 2026-05-28</w:t>
       </w:r>
     </w:p>
     <w:p>
@@ -153,7 +153,7 @@
         <w:pStyle w:val="BodyTight"/>
       </w:pPr>
       <w:r>
-        <w:t>Source posture: this edition draws from the Seal handbook plus current Seal signed-request, request-freshness, verification-receipt, crypto-verify-backend, Ed25519 verify-only, verified-receipt-promotion, verified-capability-gate, verified-effect-decision, runtime-handoff, report-envelope, signature-request, signing-authorization, signer-handoff, signer-invocation, signing-operation-readiness, signing-operation-status, Console host/receipt/signature/OS/VM contracts, Runtime Boundary Lat/LIR provenance, Fedora VM CLI payload evidence, and Nadia Stage-39 through Stage-44 release/receipt/review/disposition contract records. It treats all unimplemented runtime, host-protection, AI, signing, packaging, distribution, and production claims as non-claims unless a cited test or status record supports them.</w:t>
+        <w:t>Source posture: this edition draws from the Seal handbook plus current Seal signed-request, request-freshness, verification-receipt, crypto-verify-backend, Ed25519 verify-only, verified-receipt-promotion, verified-capability-gate, verified-effect-decision, runtime-handoff, report-envelope, signature-request, signing-authorization, signer-handoff, signer-invocation, signing-operation-readiness, signing-operation-status, Console host/receipt/signature/OS/VM contracts, Runtime Boundary Lat/LIR provenance, Fedora VM CLI payload evidence, and Nadia Stage-39 through Stage-51 release/receipt/review/disposition contract records. It treats all unimplemented runtime, host-protection, AI, signing, packaging, distribution, and production claims as non-claims unless a cited test or status record supports them.</w:t>
       </w:r>
     </w:p>
     <w:p>
@@ -4471,7 +4471,7 @@
           </w:tcPr>
           <w:p>
             <w:r>
-              <w:t>Stage-0 through Stage-44 contract metadata; current top is a prompt-evaluation result release receipt review disposition release receipt review disposition release receipt review contract; no model runtime, prompt materialization, release/receipt/review/disposition recording, receipt signing/publication, token generation, inference, dialogue, source mutation, network, or tool execution.</w:t>
+              <w:t>Stage-0 through Stage-51 contract metadata; current top is a prompt-evaluation result release receipt review disposition release receipt review disposition release receipt review disposition release receipt review disposition release receipt contract; no model runtime, prompt materialization, release/receipt/review/disposition recording, receipt signing/publication, token generation, inference, dialogue, source mutation, network, or tool execution.</w:t>
             </w:r>
           </w:p>
         </w:tc>
@@ -7008,7 +7008,7 @@
         <w:pStyle w:val="ListBullet"/>
       </w:pPr>
       <w:r>
-        <w:t>Nadia is an optional offline-AI foundation, not an active AI assistant. The current verified ladder reaches Stage-44: prompt-evaluation result release receipt review disposition release receipt review disposition release receipt review contract metadata. Stages 0-44 reserve identity, Panel and Console surfaces, local context metadata, runtime/profile contracts, model/prompt/tokenizer contracts, prompt evaluation inputs/results, release/receipt/review/disposition/release-receipt/release-receipt-review contract boundaries, and survivor-centered safety requirements while keeping model runtime, prompt reading/materialization, token creation, context-window assembly, result recording, release/receipt/review/disposition recording, receipt signing/publication, inference, dialogue generation, network access, source mutation, and tool execution denied.</w:t>
+        <w:t>Nadia is an optional offline-AI foundation, not an active AI assistant. The current verified ladder reaches Stage-51: prompt-evaluation result release receipt review disposition release receipt review disposition release receipt review disposition release receipt review disposition release receipt contract metadata. Stages 0-51 reserve identity, Panel and Console surfaces, local context metadata, runtime/profile contracts, model/prompt/tokenizer contracts, prompt evaluation inputs/results, release/receipt/review/disposition/release-receipt/release-receipt-review contract boundaries, and survivor-centered safety requirements while keeping model runtime, prompt reading/materialization, token creation, context-window assembly, result recording, release/receipt/review/disposition recording, receipt signing/publication, inference, dialogue generation, network access, source mutation, and tool execution denied.</w:t>
       </w:r>
     </w:p>
     <w:p>
@@ -16975,17 +16975,17 @@
         <w:pStyle w:val="Heading2"/>
       </w:pPr>
       <w:r>
-        <w:t>14.15 Nadia Stage-44 release-receipt review contract schema</w:t>
+        <w:t>14.15 Nadia Stage-51 release-receipt review/disposition contract schema</w:t>
       </w:r>
     </w:p>
     <w:p>
       <w:r>
-        <w:t>The Nadia release-receipt ladder is intentionally verbose because every word names a future witness boundary. Stage-39 through Stage-44 extend the prompt-evaluation result chain through release receipt, release-receipt review, release-receipt review disposition, review-disposition release, review-disposition release receipt, and release-receipt review metadata. The current top field is nadia_stage_44_prompt_evaluation_result_release_receipt_review_disposition_release_receipt_review_disposition_release_receipt_review_contract_present=1, with prompt_evaluation_result_release_receipt_review_disposition_release_receipt_review_disposition_release_receipt_review_contract_status=contract_only and prompt_evaluation_result_release_receipt_review_disposition_release_receipt_review_disposition_release_receipt_review_decision=blocked_contract_only.</w:t>
+        <w:t>The Nadia release-receipt ladder is intentionally verbose because every word names a future witness boundary. Stage-45 through Stage-51 extend the prompt-evaluation result chain beyond the Stage-44 release-receipt review contract through review disposition, disposition release, disposition release receipt, disposition release receipt review, review disposition, review disposition release, and review disposition release receipt metadata. The current top field is nadia_stage_51_prompt_evaluation_result_release_receipt_review_disposition_release_receipt_review_disposition_release_receipt_review_disposition_release_receipt_review_disposition_release_receipt_contract_present=1, with prompt_evaluation_result_release_receipt_review_disposition_release_receipt_review_disposition_release_receipt_review_disposition_release_receipt_review_disposition_release_receipt_contract_status=contract_only and prompt_evaluation_result_release_receipt_review_disposition_release_receipt_review_disposition_release_receipt_review_disposition_release_receipt_review_disposition_release_receipt_decision=blocked_contract_only.</w:t>
       </w:r>
     </w:p>
     <w:p>
       <w:r>
-        <w:t>Schema consumers must preserve the zeros: prompt_evaluation_result_release_receipt_review_disposition_release_receipt_review_disposition_release_receipt_review_recorded=0, prompt_evaluation_result_release_receipt_review_disposition_release_receipt_review_disposition_release_receipt_review_created=0, prompt_evaluation_result_release_receipt_review_disposition_release_receipt_review_disposition_release_receipt_review_performed=0, prompt_evaluation_result_release_receipt_review_disposition_release_receipt_review_disposition_release_receipt_review_result_recorded=0, prompt_evaluation_result_release_receipt_review_disposition_release_receipt_review_disposition_release_receipt_review_runtime_invoked=0, prompt_evaluation_result_release_receipt_review_disposition_release_receipt_review_disposition_release_receipt_review_decision_recorded=0, prompt_evaluation_result_release_receipt_review_disposition_release_receipt_review_disposition_release_receipt_review_findings_recorded=0, prompt_evaluation_result_release_receipt_review_disposition_release_receipt_review_disposition_release_receipt_signed=0, prompt_evaluation_result_release_receipt_review_disposition_release_receipt_review_disposition_release_receipt_published=0, prompt_evaluation_result_model_output_recorded=0, runtime_invoked=0, prompt_evaluated=0, token_generation_performed=0, inference_performed=0, qa_dialogue_generated=0, answer_text_generated=0, network_authority=0, tool_execution_authority=0, and source_mutation_authority=0. Safety inheritance is also part of the schema: sexual_request_refusal=always, manipulation_resistance=required, policy_bypass_authority=0, and namesake_cause_awareness=1.</w:t>
+        <w:t>Schema consumers must preserve the zeros: prompt_evaluation_result_release_receipt_review_disposition_release_receipt_review_disposition_release_receipt_review_disposition_release_receipt_review_disposition_release_receipt_recorded=0, prompt_evaluation_result_release_receipt_review_disposition_release_receipt_review_disposition_release_receipt_review_disposition_release_receipt_review_disposition_release_receipt_created=0, prompt_evaluation_result_release_receipt_review_disposition_release_receipt_review_disposition_release_receipt_review_disposition_release_receipt_review_disposition_release_receipt_emitted=0, prompt_evaluation_result_release_receipt_review_disposition_release_receipt_review_disposition_release_receipt_review_disposition_release_receipt_review_disposition_release_receipt_signed=0, prompt_evaluation_result_release_receipt_review_disposition_release_receipt_review_disposition_release_receipt_review_disposition_release_receipt_review_disposition_release_receipt_published=0, prompt_evaluation_result_release_receipt_review_disposition_release_receipt_review_disposition_release_receipt_review_disposition_release_receipt_review_disposition_release_receipt_packaged=0, prompt_evaluation_result_model_output_recorded=0, runtime_invoked=0, prompt_evaluated=0, token_generation_performed=0, inference_performed=0, qa_dialogue_generated=0, answer_text_generated=0, network_authority=0, tool_execution_authority=0, and source_mutation_authority=0. Safety inheritance is also part of the schema: sexual_request_refusal=always, manipulation_resistance=required, policy_bypass_authority=0, and namesake_cause_awareness=1.</w:t>
       </w:r>
     </w:p>
     <w:p>
@@ -17845,7 +17845,7 @@
           </w:tcPr>
           <w:p>
             <w:r>
-              <w:t>Nadia Stage 39-44 release-receipt review contract guards</w:t>
+              <w:t>Nadia Stage 39-51 release-receipt review/disposition contract guards</w:t>
             </w:r>
           </w:p>
         </w:tc>
@@ -17855,7 +17855,7 @@
           </w:tcPr>
           <w:p>
             <w:r>
-              <w:t>Validate release-receipt, review, disposition, release, receipt, and review metadata chains without AI runtime behavior.</w:t>
+              <w:t>Validate release-receipt, review, disposition, release, receipt, and follow-on review/disposition/release/receipt metadata chains without AI runtime behavior.</w:t>
             </w:r>
           </w:p>
         </w:tc>
@@ -18068,7 +18068,7 @@
         <w:pStyle w:val="ListBullet"/>
       </w:pPr>
       <w:r>
-        <w:t>Nadia focused tests should cover Stage-0 through Stage-44 contract outputs, inherited protective-safety fields, installed command names, Panel/Console metadata, predecessor requirements, and denial fields for model, tokenizer, prompt, runtime, release/receipt/review/disposition recording, receipt signing/publication, network, source-mutation, dialogue, token-generation, inference, and tool authority. The important regression is not only a failing command; it is any new field that appears to imply behavior before the corresponding guard exists.</w:t>
+        <w:t>Nadia focused tests should cover Stage-0 through Stage-51 contract outputs, inherited protective-safety fields, installed command names, Panel/Console metadata, predecessor requirements, and denial fields for model, tokenizer, prompt, runtime, release/receipt/review/disposition recording, receipt signing/publication, network, source-mutation, dialogue, token-generation, inference, and tool authority. The important regression is not only a failing command; it is any new field that appears to imply behavior before the corresponding guard exists.</w:t>
       </w:r>
     </w:p>
     <w:p>
@@ -18400,12 +18400,12 @@
         <w:pStyle w:val="Heading2"/>
       </w:pPr>
       <w:r>
-        <w:t>15.15 Nadia Stage 39-44 contract validation</w:t>
+        <w:t>15.15 Nadia Stage 39-51 contract validation</w:t>
       </w:r>
     </w:p>
     <w:p>
       <w:r>
-        <w:t>Nadia release-receipt validation should prove predecessor chaining and non-effect preservation together. Current guards are sh scripts/test-nadia-prompt-evaluation-result-release-receipt-review-disposition-release-receipt-contract-stage-39.sh through sh scripts/test-nadia-prompt-evaluation-result-release-receipt-review-disposition-release-receipt-review-disposition-release-receipt-review-contract-stage-44.sh.</w:t>
+        <w:t>Nadia release-receipt validation should prove predecessor chaining and non-effect preservation together. The current guard set covers Stage-39 through Stage-51, with the top guard at sh scripts/test-nadia-prompt-evaluation-result-release-receipt-review-disposition-release-receipt-review-disposition-release-receipt-review-disposition-release-receipt-review-disposition-release-receipt-contract-stage-51.sh.</w:t>
       </w:r>
     </w:p>
     <w:p>
@@ -19358,7 +19358,7 @@
           </w:tcPr>
           <w:p>
             <w:r>
-              <w:t>13. Nadia release-receipt review contract ladder</w:t>
+              <w:t>13. Nadia release-receipt review/disposition contract ladder</w:t>
             </w:r>
           </w:p>
         </w:tc>
@@ -19368,7 +19368,7 @@
           </w:tcPr>
           <w:p>
             <w:r>
-              <w:t>Keep AI-adjacent publication/review vocabulary contract-only until real runtime and safety evidence exist.</w:t>
+              <w:t>Keep AI-adjacent publication/review/disposition vocabulary contract-only until real runtime and safety evidence exist.</w:t>
             </w:r>
           </w:p>
         </w:tc>
@@ -19378,7 +19378,7 @@
           </w:tcPr>
           <w:p>
             <w:r>
-              <w:t>Stage 39-44 guards pass with predecessor requirements, safety inheritance, and all runtime/prompt/token/dialogue/tool/source/network fields denied.</w:t>
+              <w:t>Stage 39-51 guards pass with predecessor requirements, safety inheritance, and all runtime/prompt/token/dialogue/tool/source/network fields denied.</w:t>
             </w:r>
           </w:p>
         </w:tc>
@@ -21087,7 +21087,7 @@
           </w:tcPr>
           <w:p>
             <w:r>
-              <w:t>Nadia release-receipt review contract ladder</w:t>
+              <w:t>Nadia release-receipt review/disposition contract ladder</w:t>
             </w:r>
           </w:p>
         </w:tc>
@@ -21097,7 +21097,7 @@
           </w:tcPr>
           <w:p>
             <w:r>
-              <w:t>Stage-39 through Stage-44 metadata chain that names future release receipts, reviews, dispositions, releases, receipts, and reviews while preserving no runtime, prompt, token, dialogue, network, source, or tool authority.</w:t>
+              <w:t>Stage-39 through Stage-51 metadata chain that names future release receipts, reviews, dispositions, releases, receipts, and follow-on review/disposition/release/receipt boundaries while preserving no runtime, prompt, token, dialogue, network, source, or tool authority.</w:t>
             </w:r>
           </w:p>
         </w:tc>
@@ -21920,7 +21920,7 @@
         <w:pStyle w:val="BodyTight"/>
       </w:pPr>
       <w:r>
-        <w:t>This edition was derived from the Latticra Seal handbook and recent repository material covering signed-request, freshness, verification, Seal metadata ladder extensions through signature request and signing-operation status guards, Console host/receipt/signature/OS/VM contracts, Runtime Boundary Lat/LIR provenance, disposable Fedora VM CLI payload evidence, Nadia Stage-39 through Stage-44 release/receipt/review/disposition contract records, Panel and installer boundaries, platform validation, public-claims wording, and project status records.</w:t>
+        <w:t>This edition was derived from the Latticra Seal handbook and recent repository material covering signed-request, freshness, verification, Seal metadata ladder extensions through signature request and signing-operation status guards, Console host/receipt/signature/OS/VM contracts, Runtime Boundary Lat/LIR provenance, disposable Fedora VM CLI payload evidence, Nadia Stage-39 through Stage-51 release/receipt/review/disposition contract records, Panel and installer boundaries, platform validation, public-claims wording, and project status records.</w:t>
       </w:r>
     </w:p>
     <w:tbl>
@@ -22416,7 +22416,7 @@
           </w:tcPr>
           <w:p>
             <w:r>
-              <w:t>Stage-0 through Stage-44 metadata ladder for Panel/Console visibility, local context, model/prompt/tokenizer contracts, prompt evaluation, release/receipt/review/disposition boundaries, and denied AI/tool authority.</w:t>
+              <w:t>Stage-0 through Stage-51 metadata ladder for Panel/Console visibility, local context, model/prompt/tokenizer contracts, prompt evaluation, release/receipt/review/disposition boundaries, and denied AI/tool authority.</w:t>
             </w:r>
           </w:p>
         </w:tc>
@@ -22689,7 +22689,7 @@
           </w:tcPr>
           <w:p>
             <w:r>
-              <w:t>Nadia Stage 39-44 release-receipt review chain</w:t>
+              <w:t>Nadia Stage 39-51 release-receipt review/disposition chain</w:t>
             </w:r>
           </w:p>
         </w:tc>
@@ -22699,7 +22699,7 @@
           </w:tcPr>
           <w:p>
             <w:r>
-              <w:t>Stage-39 through Stage-44 status records and tests for contract-only release receipt, review, disposition, release, receipt, and review metadata with runtime, prompt, token, inference, dialogue, signing, publication, network, source, and tool effects denied.</w:t>
+              <w:t>Stage-39 through Stage-51 status records and tests for contract-only release receipt, review, disposition, release, receipt, and follow-on review/disposition/release/receipt metadata with runtime, prompt, token, inference, dialogue, signing, publication, network, source, and tool effects denied.</w:t>
             </w:r>
           </w:p>
         </w:tc>

</xml_diff>